<commit_message>
Rename My requests, add Task for me rule, sync technical design
- Design: "My requests" becomes "Requests I sent" with a how-it-works
  strip, Waiting/Answered groups and the lead's answer on each request;
  Add Work offers "Ask Chenda" or "Task for me" and sends to the lead
  by name
- Handover: fix duplicate const that stopped the screen rendering
- Blueprint: "Task for me" rule (anyone can add a task for themselves
  without approval; counts as added work in a locked week), new
  permission row and launch test, page rename; docx rebuilt
- Technical Design: tasks.created_by and self-created tasks,
  plan_baselines.revoked_at for the 10-minute lock undo, withdrawn
  leave status; docx rebuilt

Co-Authored-By: Claude Opus 5.5 <noreply@anthropic.com>
</commit_message>
<xml_diff>
--- a/docs/HopFlows_Product_Blueprint_v1.1.docx
+++ b/docs/HopFlows_Product_Blueprint_v1.1.docx
@@ -2,7 +2,7 @@
 <file path=word/document.xml><?xml version="1.0" encoding="utf-8"?>
 <w:document xmlns:w="http://schemas.openxmlformats.org/wordprocessingml/2006/main" xmlns:m="http://schemas.openxmlformats.org/officeDocument/2006/math" xmlns:r="http://schemas.openxmlformats.org/officeDocument/2006/relationships" xmlns:o="urn:schemas-microsoft-com:office:office" xmlns:v="urn:schemas-microsoft-com:vml" xmlns:w10="urn:schemas-microsoft-com:office:word" xmlns:a="http://schemas.openxmlformats.org/drawingml/2006/main" xmlns:pic="http://schemas.openxmlformats.org/drawingml/2006/picture" xmlns:wp="http://schemas.openxmlformats.org/drawingml/2006/wordprocessingDrawing">
   <w:body>
-    <w:bookmarkStart w:id="543" w:name="hopflows-product-blueprint"/>
+    <w:bookmarkStart w:id="987" w:name="hopflows-product-blueprint"/>
     <w:p>
       <w:pPr>
         <w:pStyle w:val="Heading1"/>
@@ -127,7 +127,7 @@
         <w:t xml:space="preserve">For the people who plan the product, design it, build it and roll it out.</w:t>
       </w:r>
     </w:p>
-    <w:bookmarkStart w:id="540" w:name="about-this-blueprint"/>
+    <w:bookmarkStart w:id="984" w:name="about-this-blueprint"/>
     <w:p>
       <w:pPr>
         <w:pStyle w:val="Heading2"/>
@@ -375,8 +375,8 @@
         <w:t xml:space="preserve">are new in v1.1 and still need a yes or no. The change log at the end lists what changed.</w:t>
       </w:r>
     </w:p>
-    <w:bookmarkEnd w:id="540"/>
-    <w:bookmarkStart w:id="541" w:name="the-big-idea"/>
+    <w:bookmarkEnd w:id="984"/>
+    <w:bookmarkStart w:id="985" w:name="the-big-idea"/>
     <w:p>
       <w:pPr>
         <w:pStyle w:val="Heading2"/>
@@ -405,8 +405,8 @@
         <w:t xml:space="preserve">Leaders care about results. Team leads care about getting work done and how busy their team is. Employees care about what to do next. Planned work and surprise work both count, without extra paperwork.</w:t>
       </w:r>
     </w:p>
-    <w:bookmarkEnd w:id="541"/>
-    <w:bookmarkStart w:id="542" w:name="decisions-already-made"/>
+    <w:bookmarkEnd w:id="985"/>
+    <w:bookmarkStart w:id="986" w:name="decisions-already-made"/>
     <w:p>
       <w:pPr>
         <w:pStyle w:val="Heading2"/>
@@ -628,9 +628,9 @@
         <w:t xml:space="preserve">The app keeps working when the internet is weak: people can add and update work offline, and they can find anything with one search. (Proposed)</w:t>
       </w:r>
     </w:p>
-    <w:bookmarkEnd w:id="542"/>
-    <w:bookmarkEnd w:id="543"/>
-    <w:bookmarkStart w:id="547" w:name="summary"/>
+    <w:bookmarkEnd w:id="986"/>
+    <w:bookmarkEnd w:id="987"/>
+    <w:bookmarkStart w:id="991" w:name="summary"/>
     <w:p>
       <w:pPr>
         <w:pStyle w:val="Heading1"/>
@@ -639,7 +639,7 @@
         <w:t xml:space="preserve">01 Summary</w:t>
       </w:r>
     </w:p>
-    <w:bookmarkStart w:id="544" w:name="the-problem"/>
+    <w:bookmarkStart w:id="988" w:name="the-problem"/>
     <w:p>
       <w:pPr>
         <w:pStyle w:val="Heading2"/>
@@ -656,8 +656,8 @@
         <w:t xml:space="preserve">Many teams don’t use task apps because the lists get too long, updating them feels like extra work, screens show too much, and work done outside the app never shows up in the plan. One complicated screen also can’t serve employees, team leads and bosses equally well.</w:t>
       </w:r>
     </w:p>
-    <w:bookmarkEnd w:id="544"/>
-    <w:bookmarkStart w:id="545" w:name="how-hopflows-answers-it"/>
+    <w:bookmarkEnd w:id="988"/>
+    <w:bookmarkStart w:id="989" w:name="how-hopflows-answers-it"/>
     <w:p>
       <w:pPr>
         <w:pStyle w:val="Heading2"/>
@@ -878,8 +878,8 @@
         </w:tc>
       </w:tr>
     </w:tbl>
-    <w:bookmarkEnd w:id="545"/>
-    <w:bookmarkStart w:id="546" w:name="in-one-sentence"/>
+    <w:bookmarkEnd w:id="989"/>
+    <w:bookmarkStart w:id="990" w:name="in-one-sentence"/>
     <w:p>
       <w:pPr>
         <w:pStyle w:val="Heading2"/>
@@ -908,9 +908,9 @@
         <w:t xml:space="preserve">A simple task app that makes work easy for employees, clear for managers and measurable for leaders, without making task tracking feel like another job.</w:t>
       </w:r>
     </w:p>
-    <w:bookmarkEnd w:id="546"/>
-    <w:bookmarkEnd w:id="547"/>
-    <w:bookmarkStart w:id="550" w:name="how-the-pieces-fit-together"/>
+    <w:bookmarkEnd w:id="990"/>
+    <w:bookmarkEnd w:id="991"/>
+    <w:bookmarkStart w:id="994" w:name="how-the-pieces-fit-together"/>
     <w:p>
       <w:pPr>
         <w:pStyle w:val="Heading1"/>
@@ -1081,7 +1081,7 @@
         <w:t xml:space="preserve">Figure 1. Three parts of a company linked to one system for work and reports.</w:t>
       </w:r>
     </w:p>
-    <w:bookmarkStart w:id="548" w:name="linked-not-stacked"/>
+    <w:bookmarkStart w:id="992" w:name="linked-not-stacked"/>
     <w:p>
       <w:pPr>
         <w:pStyle w:val="Heading2"/>
@@ -1098,8 +1098,8 @@
         <w:t xml:space="preserve">Don’t force everything into one tree. One Goal can help several products. One Deliverable can involve several departments. One person can be in several teams. HopFlows links these things instead of stacking them, and still keeps one clear owner for each Goal, Deliverable and active Task.</w:t>
       </w:r>
     </w:p>
-    <w:bookmarkEnd w:id="548"/>
-    <w:bookmarkStart w:id="549" w:name="Xd518698a0b64a922415221525837e1dabd77edc"/>
+    <w:bookmarkEnd w:id="992"/>
+    <w:bookmarkStart w:id="993" w:name="Xd518698a0b64a922415221525837e1dabd77edc"/>
     <w:p>
       <w:pPr>
         <w:pStyle w:val="Heading2"/>
@@ -1342,9 +1342,9 @@
         <w:t xml:space="preserve">that never end and fill up with unrelated work.</w:t>
       </w:r>
     </w:p>
-    <w:bookmarkEnd w:id="549"/>
-    <w:bookmarkEnd w:id="550"/>
-    <w:bookmarkStart w:id="553" w:name="main-words-we-use"/>
+    <w:bookmarkEnd w:id="993"/>
+    <w:bookmarkEnd w:id="994"/>
+    <w:bookmarkStart w:id="997" w:name="main-words-we-use"/>
     <w:p>
       <w:pPr>
         <w:pStyle w:val="Heading1"/>
@@ -1778,7 +1778,7 @@
         </w:tc>
       </w:tr>
     </w:tbl>
-    <w:bookmarkStart w:id="551" w:name="words-on-screen"/>
+    <w:bookmarkStart w:id="995" w:name="words-on-screen"/>
     <w:p>
       <w:pPr>
         <w:pStyle w:val="Heading2"/>
@@ -1933,8 +1933,8 @@
         <w:t xml:space="preserve">only for checking finished work.</w:t>
       </w:r>
     </w:p>
-    <w:bookmarkEnd w:id="551"/>
-    <w:bookmarkStart w:id="552" w:name="words-about-time"/>
+    <w:bookmarkEnd w:id="995"/>
+    <w:bookmarkStart w:id="996" w:name="words-about-time"/>
     <w:p>
       <w:pPr>
         <w:pStyle w:val="Heading2"/>
@@ -2215,9 +2215,9 @@
         </w:tc>
       </w:tr>
     </w:tbl>
-    <w:bookmarkEnd w:id="552"/>
-    <w:bookmarkEnd w:id="553"/>
-    <w:bookmarkStart w:id="564" w:name="business-rules"/>
+    <w:bookmarkEnd w:id="996"/>
+    <w:bookmarkEnd w:id="997"/>
+    <w:bookmarkStart w:id="1008" w:name="business-rules"/>
     <w:p>
       <w:pPr>
         <w:pStyle w:val="Heading1"/>
@@ -2243,7 +2243,7 @@
         <w:t xml:space="preserve">) shows how they are built.</w:t>
       </w:r>
     </w:p>
-    <w:bookmarkStart w:id="554" w:name="people-and-access"/>
+    <w:bookmarkStart w:id="998" w:name="people-and-access"/>
     <w:p>
       <w:pPr>
         <w:pStyle w:val="Heading2"/>
@@ -2300,8 +2300,8 @@
         <w:t xml:space="preserve">A person can be in several departments, and each gets a share of their time. If no shares are set, their main department gets all of it. Leads can change the shares for a week.</w:t>
       </w:r>
     </w:p>
-    <w:bookmarkEnd w:id="554"/>
-    <w:bookmarkStart w:id="555" w:name="work"/>
+    <w:bookmarkEnd w:id="998"/>
+    <w:bookmarkStart w:id="999" w:name="work"/>
     <w:p>
       <w:pPr>
         <w:pStyle w:val="Heading2"/>
@@ -2427,7 +2427,7 @@
         </w:numPr>
       </w:pPr>
       <w:r>
-        <w:t xml:space="preserve">A Confidential Task can be seen only by its owner, its reviewer, its helpers, people given access, and company admins. Only the department lead and admins can give access.</w:t>
+        <w:t xml:space="preserve">Anyone can add a Task for themselves with Add Work → Task for me. It needs no approval and goes straight to their own list, with them as the owner. Their lead can see it, and if the week is already locked it counts as added work. Work for someone else, or anything the lead should decide, is sent as a request instead. (Proposed)</w:t>
       </w:r>
     </w:p>
     <w:p>
@@ -2439,19 +2439,7 @@
         </w:numPr>
       </w:pPr>
       <w:r>
-        <w:t xml:space="preserve">A Task’s size can be Small, Medium or Large (the company decides how many hours each means) or a number of hours. A Task with no size is shown as</w:t>
-      </w:r>
-      <w:r>
-        <w:t xml:space="preserve"> </w:t>
-      </w:r>
-      <w:r>
-        <w:t xml:space="preserve">“No estimate”</w:t>
-      </w:r>
-      <w:r>
-        <w:t xml:space="preserve"> </w:t>
-      </w:r>
-      <w:r>
-        <w:t xml:space="preserve">and counted on its own.</w:t>
+        <w:t xml:space="preserve">A Confidential Task can be seen only by its owner, its reviewer, its helpers, people given access, and company admins. Only the department lead and admins can give access.</w:t>
       </w:r>
     </w:p>
     <w:p>
@@ -2463,7 +2451,19 @@
         </w:numPr>
       </w:pPr>
       <w:r>
-        <w:t xml:space="preserve">A Task can wait on other Tasks in the same company. HopFlows refuses a wait that goes round in a circle.</w:t>
+        <w:t xml:space="preserve">A Task’s size can be Small, Medium or Large (the company decides how many hours each means) or a number of hours. A Task with no size is shown as</w:t>
+      </w:r>
+      <w:r>
+        <w:t xml:space="preserve"> </w:t>
+      </w:r>
+      <w:r>
+        <w:t xml:space="preserve">“No estimate”</w:t>
+      </w:r>
+      <w:r>
+        <w:t xml:space="preserve"> </w:t>
+      </w:r>
+      <w:r>
+        <w:t xml:space="preserve">and counted on its own.</w:t>
       </w:r>
     </w:p>
     <w:p>
@@ -2475,11 +2475,23 @@
         </w:numPr>
       </w:pPr>
       <w:r>
+        <w:t xml:space="preserve">A Task can wait on other Tasks in the same company. HopFlows refuses a wait that goes round in a circle.</w:t>
+      </w:r>
+    </w:p>
+    <w:p>
+      <w:pPr>
+        <w:pStyle w:val="Compact"/>
+        <w:numPr>
+          <w:ilvl w:val="0"/>
+          <w:numId w:val="1006"/>
+        </w:numPr>
+      </w:pPr>
+      <w:r>
         <w:t xml:space="preserve">Kudos: one per person, per teammate, per item. You can’t give kudos to yourself. Kudos are never ranked.</w:t>
       </w:r>
     </w:p>
-    <w:bookmarkEnd w:id="555"/>
-    <w:bookmarkStart w:id="556" w:name="new-requests"/>
+    <w:bookmarkEnd w:id="999"/>
+    <w:bookmarkStart w:id="1000" w:name="new-requests"/>
     <w:p>
       <w:pPr>
         <w:pStyle w:val="Heading2"/>
@@ -2612,14 +2624,14 @@
           <w:b/>
           <w:bCs/>
         </w:rPr>
-        <w:t xml:space="preserve">My requests</w:t>
+        <w:t xml:space="preserve">Requests I sent</w:t>
       </w:r>
       <w:r>
         <w:t xml:space="preserve">.</w:t>
       </w:r>
     </w:p>
-    <w:bookmarkEnd w:id="556"/>
-    <w:bookmarkStart w:id="557" w:name="planning-and-time"/>
+    <w:bookmarkEnd w:id="1000"/>
+    <w:bookmarkStart w:id="1001" w:name="planning-and-time"/>
     <w:p>
       <w:pPr>
         <w:pStyle w:val="Heading2"/>
@@ -2760,8 +2772,8 @@
         <w:t xml:space="preserve">Repeating daily work reserves its time in each week, so the weekly plan and the Workload view include it before any project work is locked.</w:t>
       </w:r>
     </w:p>
-    <w:bookmarkEnd w:id="557"/>
-    <w:bookmarkStart w:id="558" w:name="leave-proposed"/>
+    <w:bookmarkEnd w:id="1001"/>
+    <w:bookmarkStart w:id="1002" w:name="leave-proposed"/>
     <w:p>
       <w:pPr>
         <w:pStyle w:val="Heading2"/>
@@ -2875,8 +2887,8 @@
         <w:t xml:space="preserve">HopFlows records leave only for planning. It doesn’t track how many leave days are left, or pay. That stays with the company’s HR process.</w:t>
       </w:r>
     </w:p>
-    <w:bookmarkEnd w:id="558"/>
-    <w:bookmarkStart w:id="559" w:name="repeating-daily-work-proposed"/>
+    <w:bookmarkEnd w:id="1002"/>
+    <w:bookmarkStart w:id="1003" w:name="repeating-daily-work-proposed"/>
     <w:p>
       <w:pPr>
         <w:pStyle w:val="Heading2"/>
@@ -2993,8 +3005,8 @@
         <w:t xml:space="preserve">Changing a routine changes only future days. Pausing a routine stops new days until it is turned back on.</w:t>
       </w:r>
     </w:p>
-    <w:bookmarkEnd w:id="559"/>
-    <w:bookmarkStart w:id="560" w:name="handover-and-risk"/>
+    <w:bookmarkEnd w:id="1003"/>
+    <w:bookmarkStart w:id="1004" w:name="handover-and-risk"/>
     <w:p>
       <w:pPr>
         <w:pStyle w:val="Heading2"/>
@@ -3063,8 +3075,8 @@
         <w:t xml:space="preserve">A flag can be cleared by the person who set it, the item’s owner, or leaders. A Goal owner can’t clear a flag set by leaders. When a Deliverable is accepted or cancelled, its flag closes. When a Deliverable moves to another Goal, its flag moves with it.</w:t>
       </w:r>
     </w:p>
-    <w:bookmarkEnd w:id="560"/>
-    <w:bookmarkStart w:id="561" w:name="calendar"/>
+    <w:bookmarkEnd w:id="1004"/>
+    <w:bookmarkStart w:id="1005" w:name="calendar"/>
     <w:p>
       <w:pPr>
         <w:pStyle w:val="Heading2"/>
@@ -3154,8 +3166,8 @@
         <w:t xml:space="preserve">Each person can set their own reminders for events.</w:t>
       </w:r>
     </w:p>
-    <w:bookmarkEnd w:id="561"/>
-    <w:bookmarkStart w:id="562" w:name="notifications"/>
+    <w:bookmarkEnd w:id="1005"/>
+    <w:bookmarkStart w:id="1006" w:name="notifications"/>
     <w:p>
       <w:pPr>
         <w:pStyle w:val="Heading2"/>
@@ -3272,8 +3284,8 @@
         <w:t xml:space="preserve">Messages are in English by default. When other languages are added, each company picks its default and each person can choose their own.</w:t>
       </w:r>
     </w:p>
-    <w:bookmarkEnd w:id="562"/>
-    <w:bookmarkStart w:id="563" w:name="reports-search-and-offline-proposed"/>
+    <w:bookmarkEnd w:id="1006"/>
+    <w:bookmarkStart w:id="1007" w:name="reports-search-and-offline-proposed"/>
     <w:p>
       <w:pPr>
         <w:pStyle w:val="Heading2"/>
@@ -3378,9 +3390,9 @@
         <w:t xml:space="preserve">rules, and is deleted when the person signs out or leaves the company.</w:t>
       </w:r>
     </w:p>
-    <w:bookmarkEnd w:id="563"/>
-    <w:bookmarkEnd w:id="564"/>
-    <w:bookmarkStart w:id="566" w:name="how-things-connect"/>
+    <w:bookmarkEnd w:id="1007"/>
+    <w:bookmarkEnd w:id="1008"/>
+    <w:bookmarkStart w:id="1010" w:name="how-things-connect"/>
     <w:p>
       <w:pPr>
         <w:pStyle w:val="Heading1"/>
@@ -4397,7 +4409,7 @@
         </w:tc>
       </w:tr>
     </w:tbl>
-    <w:bookmarkStart w:id="565" w:name="rules-that-never-change"/>
+    <w:bookmarkStart w:id="1009" w:name="rules-that-never-change"/>
     <w:p>
       <w:pPr>
         <w:pStyle w:val="Heading2"/>
@@ -4595,9 +4607,9 @@
         <w:t xml:space="preserve">A button pressed in a push alert or chat does the same thing as in the app, with the same permission check and history. Buttons work once and expire.</w:t>
       </w:r>
     </w:p>
-    <w:bookmarkEnd w:id="565"/>
-    <w:bookmarkEnd w:id="566"/>
-    <w:bookmarkStart w:id="571" w:name="the-life-of-a-task"/>
+    <w:bookmarkEnd w:id="1009"/>
+    <w:bookmarkEnd w:id="1010"/>
+    <w:bookmarkStart w:id="1015" w:name="the-life-of-a-task"/>
     <w:p>
       <w:pPr>
         <w:pStyle w:val="Heading1"/>
@@ -4677,18 +4689,18 @@
           <wp:inline>
             <wp:extent cx="5486400" cy="4774556"/>
             <wp:effectExtent b="0" l="0" r="0" t="0"/>
-            <wp:docPr descr="Diagram" title="" id="568" name="Picture"/>
+            <wp:docPr descr="Diagram" title="" id="1012" name="Picture"/>
             <a:graphic>
               <a:graphicData uri="http://schemas.openxmlformats.org/drawingml/2006/picture">
                 <pic:pic>
                   <pic:nvPicPr>
-                    <pic:cNvPr descr="/private/tmp/claude-502/-Users-keanghok-Desktop-work-startup-hopflows-docs/e4a4cd31-69eb-498d-a6e4-c32390abc3bb/scratchpad/mmd2/d01.png" id="569" name="Picture"/>
+                    <pic:cNvPr descr="/private/tmp/claude-502/-Users-keanghok-Desktop-work-startup-hopflows-docs/e4a4cd31-69eb-498d-a6e4-c32390abc3bb/scratchpad/mmd2/d01.png" id="1013" name="Picture"/>
                     <pic:cNvPicPr>
                       <a:picLocks noChangeArrowheads="1" noChangeAspect="1"/>
                     </pic:cNvPicPr>
                   </pic:nvPicPr>
                   <pic:blipFill>
-                    <a:blip r:embed="rId567"/>
+                    <a:blip r:embed="rId1011"/>
                     <a:stretch>
                       <a:fillRect/>
                     </a:stretch>
@@ -4723,7 +4735,7 @@
         <w:t xml:space="preserve">Figure 2. The life of a Task. Blocked and Need Help are markers on a Task, not steps. Missed is only for repeating daily work.</w:t>
       </w:r>
     </w:p>
-    <w:bookmarkStart w:id="570" w:name="buttons-employees-use"/>
+    <w:bookmarkStart w:id="1014" w:name="buttons-employees-use"/>
     <w:p>
       <w:pPr>
         <w:pStyle w:val="Heading2"/>
@@ -4869,7 +4881,7 @@
               <w:pStyle w:val="Compact"/>
             </w:pPr>
             <w:r>
-              <w:t xml:space="preserve">Creates a new request without needing a Goal or Deliverable.</w:t>
+              <w:t xml:space="preserve">Asks the lead with a request, or adds a Task for yourself (Task for me). Neither needs a Goal or Deliverable.</w:t>
             </w:r>
           </w:p>
         </w:tc>
@@ -4947,9 +4959,9 @@
         </w:tc>
       </w:tr>
     </w:tbl>
-    <w:bookmarkEnd w:id="570"/>
-    <w:bookmarkEnd w:id="571"/>
-    <w:bookmarkStart w:id="577" w:name="planned-and-unplanned-work"/>
+    <w:bookmarkEnd w:id="1014"/>
+    <w:bookmarkEnd w:id="1015"/>
+    <w:bookmarkStart w:id="1021" w:name="planned-and-unplanned-work"/>
     <w:p>
       <w:pPr>
         <w:pStyle w:val="Heading1"/>
@@ -5076,7 +5088,7 @@
         <w:t xml:space="preserve">Figure 3. Two ways in, one way to do the work.</w:t>
       </w:r>
     </w:p>
-    <w:bookmarkStart w:id="572" w:name="three-separate-labels"/>
+    <w:bookmarkStart w:id="1016" w:name="three-separate-labels"/>
     <w:p>
       <w:pPr>
         <w:pStyle w:val="Heading2"/>
@@ -5273,8 +5285,8 @@
         <w:t xml:space="preserve">depends on a particular week, so the same Task can be added in one week and planned in the next.</w:t>
       </w:r>
     </w:p>
-    <w:bookmarkEnd w:id="572"/>
-    <w:bookmarkStart w:id="576" w:name="the-locking-rule"/>
+    <w:bookmarkEnd w:id="1016"/>
+    <w:bookmarkStart w:id="1020" w:name="the-locking-rule"/>
     <w:p>
       <w:pPr>
         <w:pStyle w:val="Heading2"/>
@@ -5303,7 +5315,7 @@
         <w:t xml:space="preserve">When the lead locks a week, HopFlows saves a copy of the planned work, the estimates and the owners. The live plan can still change, but reports always compare what really happened with that saved copy.</w:t>
       </w:r>
     </w:p>
-    <w:bookmarkStart w:id="573" w:name="example-something-urgent-arrives-midweek"/>
+    <w:bookmarkStart w:id="1017" w:name="example-something-urgent-arrives-midweek"/>
     <w:p>
       <w:pPr>
         <w:pStyle w:val="Heading3"/>
@@ -5368,8 +5380,8 @@
         <w:t xml:space="preserve">If the same request is planned into next week, it counts as planned there, and HopFlows still remembers it started as a surprise.</w:t>
       </w:r>
     </w:p>
-    <w:bookmarkEnd w:id="573"/>
-    <w:bookmarkStart w:id="574" w:name="X6546010788123f30940adaa831be091dcf8e07f"/>
+    <w:bookmarkEnd w:id="1017"/>
+    <w:bookmarkStart w:id="1018" w:name="X6546010788123f30940adaa831be091dcf8e07f"/>
     <w:p>
       <w:pPr>
         <w:pStyle w:val="Heading3"/>
@@ -5398,8 +5410,8 @@
         <w:t xml:space="preserve">and appear in the weekly review. The lead can remove them before locking the new week. If a week is never locked, there is no saved plan: all its work counts as unplanned, and the weekly review points out that the week wasn’t locked.</w:t>
       </w:r>
     </w:p>
-    <w:bookmarkEnd w:id="574"/>
-    <w:bookmarkStart w:id="575" w:name="repeating-daily-work-in-the-plan"/>
+    <w:bookmarkEnd w:id="1018"/>
+    <w:bookmarkStart w:id="1019" w:name="repeating-daily-work-in-the-plan"/>
     <w:p>
       <w:pPr>
         <w:pStyle w:val="Heading3"/>
@@ -5416,10 +5428,10 @@
         <w:t xml:space="preserve">When the lead locks a week, that week’s routines are included automatically, so the plan, the Workload view and the reports all include routine time. A routine created after the week is locked counts as added work.</w:t>
       </w:r>
     </w:p>
-    <w:bookmarkEnd w:id="575"/>
-    <w:bookmarkEnd w:id="576"/>
-    <w:bookmarkEnd w:id="577"/>
-    <w:bookmarkStart w:id="621" w:name="step-by-step-flows"/>
+    <w:bookmarkEnd w:id="1019"/>
+    <w:bookmarkEnd w:id="1020"/>
+    <w:bookmarkEnd w:id="1021"/>
+    <w:bookmarkStart w:id="1065" w:name="step-by-step-flows"/>
     <w:p>
       <w:pPr>
         <w:pStyle w:val="Heading1"/>
@@ -5445,18 +5457,18 @@
           <wp:inline>
             <wp:extent cx="1956816" cy="7760608"/>
             <wp:effectExtent b="0" l="0" r="0" t="0"/>
-            <wp:docPr descr="Diagram" title="" id="579" name="Picture"/>
+            <wp:docPr descr="Diagram" title="" id="1023" name="Picture"/>
             <a:graphic>
               <a:graphicData uri="http://schemas.openxmlformats.org/drawingml/2006/picture">
                 <pic:pic>
                   <pic:nvPicPr>
-                    <pic:cNvPr descr="/private/tmp/claude-502/-Users-keanghok-Desktop-work-startup-hopflows-docs/e4a4cd31-69eb-498d-a6e4-c32390abc3bb/scratchpad/mmd2/d02.png" id="580" name="Picture"/>
+                    <pic:cNvPr descr="/private/tmp/claude-502/-Users-keanghok-Desktop-work-startup-hopflows-docs/e4a4cd31-69eb-498d-a6e4-c32390abc3bb/scratchpad/mmd2/d02.png" id="1024" name="Picture"/>
                     <pic:cNvPicPr>
                       <a:picLocks noChangeArrowheads="1" noChangeAspect="1"/>
                     </pic:cNvPicPr>
                   </pic:nvPicPr>
                   <pic:blipFill>
-                    <a:blip r:embed="rId578"/>
+                    <a:blip r:embed="rId1022"/>
                     <a:stretch>
                       <a:fillRect/>
                     </a:stretch>
@@ -5491,7 +5503,7 @@
         <w:t xml:space="preserve">Figure 4. Who starts which flow.</w:t>
       </w:r>
     </w:p>
-    <w:bookmarkStart w:id="584" w:name="flow-a-planned-work"/>
+    <w:bookmarkStart w:id="1028" w:name="flow-a-planned-work"/>
     <w:p>
       <w:pPr>
         <w:pStyle w:val="Heading2"/>
@@ -5605,18 +5617,18 @@
           <wp:inline>
             <wp:extent cx="2953512" cy="7773284"/>
             <wp:effectExtent b="0" l="0" r="0" t="0"/>
-            <wp:docPr descr="Diagram" title="" id="582" name="Picture"/>
+            <wp:docPr descr="Diagram" title="" id="1026" name="Picture"/>
             <a:graphic>
               <a:graphicData uri="http://schemas.openxmlformats.org/drawingml/2006/picture">
                 <pic:pic>
                   <pic:nvPicPr>
-                    <pic:cNvPr descr="/private/tmp/claude-502/-Users-keanghok-Desktop-work-startup-hopflows-docs/e4a4cd31-69eb-498d-a6e4-c32390abc3bb/scratchpad/mmd2/d03.png" id="583" name="Picture"/>
+                    <pic:cNvPr descr="/private/tmp/claude-502/-Users-keanghok-Desktop-work-startup-hopflows-docs/e4a4cd31-69eb-498d-a6e4-c32390abc3bb/scratchpad/mmd2/d03.png" id="1027" name="Picture"/>
                     <pic:cNvPicPr>
                       <a:picLocks noChangeArrowheads="1" noChangeAspect="1"/>
                     </pic:cNvPicPr>
                   </pic:nvPicPr>
                   <pic:blipFill>
-                    <a:blip r:embed="rId581"/>
+                    <a:blip r:embed="rId1025"/>
                     <a:stretch>
                       <a:fillRect/>
                     </a:stretch>
@@ -5651,8 +5663,8 @@
         <w:t xml:space="preserve">Figure 5. Flow A, planned work.</w:t>
       </w:r>
     </w:p>
-    <w:bookmarkEnd w:id="584"/>
-    <w:bookmarkStart w:id="588" w:name="flow-b-surprise-work"/>
+    <w:bookmarkEnd w:id="1028"/>
+    <w:bookmarkStart w:id="1032" w:name="flow-b-surprise-work"/>
     <w:p>
       <w:pPr>
         <w:pStyle w:val="Heading2"/>
@@ -5811,18 +5823,18 @@
           <wp:inline>
             <wp:extent cx="5074920" cy="7767734"/>
             <wp:effectExtent b="0" l="0" r="0" t="0"/>
-            <wp:docPr descr="Diagram" title="" id="586" name="Picture"/>
+            <wp:docPr descr="Diagram" title="" id="1030" name="Picture"/>
             <a:graphic>
               <a:graphicData uri="http://schemas.openxmlformats.org/drawingml/2006/picture">
                 <pic:pic>
                   <pic:nvPicPr>
-                    <pic:cNvPr descr="/private/tmp/claude-502/-Users-keanghok-Desktop-work-startup-hopflows-docs/e4a4cd31-69eb-498d-a6e4-c32390abc3bb/scratchpad/mmd2/d04.png" id="587" name="Picture"/>
+                    <pic:cNvPr descr="/private/tmp/claude-502/-Users-keanghok-Desktop-work-startup-hopflows-docs/e4a4cd31-69eb-498d-a6e4-c32390abc3bb/scratchpad/mmd2/d04.png" id="1031" name="Picture"/>
                     <pic:cNvPicPr>
                       <a:picLocks noChangeArrowheads="1" noChangeAspect="1"/>
                     </pic:cNvPicPr>
                   </pic:nvPicPr>
                   <pic:blipFill>
-                    <a:blip r:embed="rId585"/>
+                    <a:blip r:embed="rId1029"/>
                     <a:stretch>
                       <a:fillRect/>
                     </a:stretch>
@@ -5857,8 +5869,8 @@
         <w:t xml:space="preserve">Figure 6. Flow B, surprise work.</w:t>
       </w:r>
     </w:p>
-    <w:bookmarkEnd w:id="588"/>
-    <w:bookmarkStart w:id="592" w:name="flow-c-weekly-review"/>
+    <w:bookmarkEnd w:id="1032"/>
+    <w:bookmarkStart w:id="1036" w:name="flow-c-weekly-review"/>
     <w:p>
       <w:pPr>
         <w:pStyle w:val="Heading2"/>
@@ -5884,18 +5896,18 @@
           <wp:inline>
             <wp:extent cx="3867912" cy="7769225"/>
             <wp:effectExtent b="0" l="0" r="0" t="0"/>
-            <wp:docPr descr="Diagram" title="" id="590" name="Picture"/>
+            <wp:docPr descr="Diagram" title="" id="1034" name="Picture"/>
             <a:graphic>
               <a:graphicData uri="http://schemas.openxmlformats.org/drawingml/2006/picture">
                 <pic:pic>
                   <pic:nvPicPr>
-                    <pic:cNvPr descr="/private/tmp/claude-502/-Users-keanghok-Desktop-work-startup-hopflows-docs/e4a4cd31-69eb-498d-a6e4-c32390abc3bb/scratchpad/mmd2/d05.png" id="591" name="Picture"/>
+                    <pic:cNvPr descr="/private/tmp/claude-502/-Users-keanghok-Desktop-work-startup-hopflows-docs/e4a4cd31-69eb-498d-a6e4-c32390abc3bb/scratchpad/mmd2/d05.png" id="1035" name="Picture"/>
                     <pic:cNvPicPr>
                       <a:picLocks noChangeArrowheads="1" noChangeAspect="1"/>
                     </pic:cNvPicPr>
                   </pic:nvPicPr>
                   <pic:blipFill>
-                    <a:blip r:embed="rId589"/>
+                    <a:blip r:embed="rId1033"/>
                     <a:stretch>
                       <a:fillRect/>
                     </a:stretch>
@@ -5930,8 +5942,8 @@
         <w:t xml:space="preserve">Figure 7. Flow C, weekly review.</w:t>
       </w:r>
     </w:p>
-    <w:bookmarkEnd w:id="592"/>
-    <w:bookmarkStart w:id="596" w:name="flow-d-handover-leave-or-leaving"/>
+    <w:bookmarkEnd w:id="1036"/>
+    <w:bookmarkStart w:id="1040" w:name="flow-d-handover-leave-or-leaving"/>
     <w:p>
       <w:pPr>
         <w:pStyle w:val="Heading2"/>
@@ -6063,18 +6075,18 @@
           <wp:inline>
             <wp:extent cx="2852928" cy="7781389"/>
             <wp:effectExtent b="0" l="0" r="0" t="0"/>
-            <wp:docPr descr="Diagram" title="" id="594" name="Picture"/>
+            <wp:docPr descr="Diagram" title="" id="1038" name="Picture"/>
             <a:graphic>
               <a:graphicData uri="http://schemas.openxmlformats.org/drawingml/2006/picture">
                 <pic:pic>
                   <pic:nvPicPr>
-                    <pic:cNvPr descr="/private/tmp/claude-502/-Users-keanghok-Desktop-work-startup-hopflows-docs/e4a4cd31-69eb-498d-a6e4-c32390abc3bb/scratchpad/mmd2/d06.png" id="595" name="Picture"/>
+                    <pic:cNvPr descr="/private/tmp/claude-502/-Users-keanghok-Desktop-work-startup-hopflows-docs/e4a4cd31-69eb-498d-a6e4-c32390abc3bb/scratchpad/mmd2/d06.png" id="1039" name="Picture"/>
                     <pic:cNvPicPr>
                       <a:picLocks noChangeArrowheads="1" noChangeAspect="1"/>
                     </pic:cNvPicPr>
                   </pic:nvPicPr>
                   <pic:blipFill>
-                    <a:blip r:embed="rId593"/>
+                    <a:blip r:embed="rId1037"/>
                     <a:stretch>
                       <a:fillRect/>
                     </a:stretch>
@@ -6109,8 +6121,8 @@
         <w:t xml:space="preserve">Figure 8. Flow D, handover.</w:t>
       </w:r>
     </w:p>
-    <w:bookmarkEnd w:id="596"/>
-    <w:bookmarkStart w:id="600" w:name="flow-e-risk-flags"/>
+    <w:bookmarkEnd w:id="1040"/>
+    <w:bookmarkStart w:id="1044" w:name="flow-e-risk-flags"/>
     <w:p>
       <w:pPr>
         <w:pStyle w:val="Heading2"/>
@@ -6188,18 +6200,18 @@
           <wp:inline>
             <wp:extent cx="3118104" cy="7768098"/>
             <wp:effectExtent b="0" l="0" r="0" t="0"/>
-            <wp:docPr descr="Diagram" title="" id="598" name="Picture"/>
+            <wp:docPr descr="Diagram" title="" id="1042" name="Picture"/>
             <a:graphic>
               <a:graphicData uri="http://schemas.openxmlformats.org/drawingml/2006/picture">
                 <pic:pic>
                   <pic:nvPicPr>
-                    <pic:cNvPr descr="/private/tmp/claude-502/-Users-keanghok-Desktop-work-startup-hopflows-docs/e4a4cd31-69eb-498d-a6e4-c32390abc3bb/scratchpad/mmd2/d07.png" id="599" name="Picture"/>
+                    <pic:cNvPr descr="/private/tmp/claude-502/-Users-keanghok-Desktop-work-startup-hopflows-docs/e4a4cd31-69eb-498d-a6e4-c32390abc3bb/scratchpad/mmd2/d07.png" id="1043" name="Picture"/>
                     <pic:cNvPicPr>
                       <a:picLocks noChangeArrowheads="1" noChangeAspect="1"/>
                     </pic:cNvPicPr>
                   </pic:nvPicPr>
                   <pic:blipFill>
-                    <a:blip r:embed="rId597"/>
+                    <a:blip r:embed="rId1041"/>
                     <a:stretch>
                       <a:fillRect/>
                     </a:stretch>
@@ -6234,8 +6246,8 @@
         <w:t xml:space="preserve">Figure 9. Flow E, risk flags.</w:t>
       </w:r>
     </w:p>
-    <w:bookmarkEnd w:id="600"/>
-    <w:bookmarkStart w:id="604" w:name="flow-f-calendar"/>
+    <w:bookmarkEnd w:id="1044"/>
+    <w:bookmarkStart w:id="1048" w:name="flow-f-calendar"/>
     <w:p>
       <w:pPr>
         <w:pStyle w:val="Heading2"/>
@@ -6373,18 +6385,18 @@
           <wp:inline>
             <wp:extent cx="5486400" cy="3673928"/>
             <wp:effectExtent b="0" l="0" r="0" t="0"/>
-            <wp:docPr descr="Diagram" title="" id="602" name="Picture"/>
+            <wp:docPr descr="Diagram" title="" id="1046" name="Picture"/>
             <a:graphic>
               <a:graphicData uri="http://schemas.openxmlformats.org/drawingml/2006/picture">
                 <pic:pic>
                   <pic:nvPicPr>
-                    <pic:cNvPr descr="/private/tmp/claude-502/-Users-keanghok-Desktop-work-startup-hopflows-docs/e4a4cd31-69eb-498d-a6e4-c32390abc3bb/scratchpad/mmd2/d08.png" id="603" name="Picture"/>
+                    <pic:cNvPr descr="/private/tmp/claude-502/-Users-keanghok-Desktop-work-startup-hopflows-docs/e4a4cd31-69eb-498d-a6e4-c32390abc3bb/scratchpad/mmd2/d08.png" id="1047" name="Picture"/>
                     <pic:cNvPicPr>
                       <a:picLocks noChangeArrowheads="1" noChangeAspect="1"/>
                     </pic:cNvPicPr>
                   </pic:nvPicPr>
                   <pic:blipFill>
-                    <a:blip r:embed="rId601"/>
+                    <a:blip r:embed="rId1045"/>
                     <a:stretch>
                       <a:fillRect/>
                     </a:stretch>
@@ -6419,8 +6431,8 @@
         <w:t xml:space="preserve">Figure 10. Flow F, calendar.</w:t>
       </w:r>
     </w:p>
-    <w:bookmarkEnd w:id="604"/>
-    <w:bookmarkStart w:id="608" w:name="flow-g-alerts"/>
+    <w:bookmarkEnd w:id="1048"/>
+    <w:bookmarkStart w:id="1052" w:name="flow-g-alerts"/>
     <w:p>
       <w:pPr>
         <w:pStyle w:val="Heading2"/>
@@ -6510,18 +6522,18 @@
           <wp:inline>
             <wp:extent cx="5486400" cy="5962261"/>
             <wp:effectExtent b="0" l="0" r="0" t="0"/>
-            <wp:docPr descr="Diagram" title="" id="606" name="Picture"/>
+            <wp:docPr descr="Diagram" title="" id="1050" name="Picture"/>
             <a:graphic>
               <a:graphicData uri="http://schemas.openxmlformats.org/drawingml/2006/picture">
                 <pic:pic>
                   <pic:nvPicPr>
-                    <pic:cNvPr descr="/private/tmp/claude-502/-Users-keanghok-Desktop-work-startup-hopflows-docs/e4a4cd31-69eb-498d-a6e4-c32390abc3bb/scratchpad/mmd2/d09.png" id="607" name="Picture"/>
+                    <pic:cNvPr descr="/private/tmp/claude-502/-Users-keanghok-Desktop-work-startup-hopflows-docs/e4a4cd31-69eb-498d-a6e4-c32390abc3bb/scratchpad/mmd2/d09.png" id="1051" name="Picture"/>
                     <pic:cNvPicPr>
                       <a:picLocks noChangeArrowheads="1" noChangeAspect="1"/>
                     </pic:cNvPicPr>
                   </pic:nvPicPr>
                   <pic:blipFill>
-                    <a:blip r:embed="rId605"/>
+                    <a:blip r:embed="rId1049"/>
                     <a:stretch>
                       <a:fillRect/>
                     </a:stretch>
@@ -6556,8 +6568,8 @@
         <w:t xml:space="preserve">Figure 11. Flow G, alerts.</w:t>
       </w:r>
     </w:p>
-    <w:bookmarkEnd w:id="608"/>
-    <w:bookmarkStart w:id="612" w:name="flow-h-leave-proposed"/>
+    <w:bookmarkEnd w:id="1052"/>
+    <w:bookmarkStart w:id="1056" w:name="flow-h-leave-proposed"/>
     <w:p>
       <w:pPr>
         <w:pStyle w:val="Heading2"/>
@@ -6644,18 +6656,18 @@
           <wp:inline>
             <wp:extent cx="3227832" cy="7782867"/>
             <wp:effectExtent b="0" l="0" r="0" t="0"/>
-            <wp:docPr descr="Diagram" title="" id="610" name="Picture"/>
+            <wp:docPr descr="Diagram" title="" id="1054" name="Picture"/>
             <a:graphic>
               <a:graphicData uri="http://schemas.openxmlformats.org/drawingml/2006/picture">
                 <pic:pic>
                   <pic:nvPicPr>
-                    <pic:cNvPr descr="/private/tmp/claude-502/-Users-keanghok-Desktop-work-startup-hopflows-docs/e4a4cd31-69eb-498d-a6e4-c32390abc3bb/scratchpad/mmd2/d10.png" id="611" name="Picture"/>
+                    <pic:cNvPr descr="/private/tmp/claude-502/-Users-keanghok-Desktop-work-startup-hopflows-docs/e4a4cd31-69eb-498d-a6e4-c32390abc3bb/scratchpad/mmd2/d10.png" id="1055" name="Picture"/>
                     <pic:cNvPicPr>
                       <a:picLocks noChangeArrowheads="1" noChangeAspect="1"/>
                     </pic:cNvPicPr>
                   </pic:nvPicPr>
                   <pic:blipFill>
-                    <a:blip r:embed="rId609"/>
+                    <a:blip r:embed="rId1053"/>
                     <a:stretch>
                       <a:fillRect/>
                     </a:stretch>
@@ -6690,8 +6702,8 @@
         <w:t xml:space="preserve">Figure 12. Flow H, leave.</w:t>
       </w:r>
     </w:p>
-    <w:bookmarkEnd w:id="612"/>
-    <w:bookmarkStart w:id="616" w:name="flow-i-repeating-daily-work-proposed"/>
+    <w:bookmarkEnd w:id="1056"/>
+    <w:bookmarkStart w:id="1060" w:name="flow-i-repeating-daily-work-proposed"/>
     <w:p>
       <w:pPr>
         <w:pStyle w:val="Heading2"/>
@@ -6778,18 +6790,18 @@
           <wp:inline>
             <wp:extent cx="2706624" cy="7770951"/>
             <wp:effectExtent b="0" l="0" r="0" t="0"/>
-            <wp:docPr descr="Diagram" title="" id="614" name="Picture"/>
+            <wp:docPr descr="Diagram" title="" id="1058" name="Picture"/>
             <a:graphic>
               <a:graphicData uri="http://schemas.openxmlformats.org/drawingml/2006/picture">
                 <pic:pic>
                   <pic:nvPicPr>
-                    <pic:cNvPr descr="/private/tmp/claude-502/-Users-keanghok-Desktop-work-startup-hopflows-docs/e4a4cd31-69eb-498d-a6e4-c32390abc3bb/scratchpad/mmd2/d11.png" id="615" name="Picture"/>
+                    <pic:cNvPr descr="/private/tmp/claude-502/-Users-keanghok-Desktop-work-startup-hopflows-docs/e4a4cd31-69eb-498d-a6e4-c32390abc3bb/scratchpad/mmd2/d11.png" id="1059" name="Picture"/>
                     <pic:cNvPicPr>
                       <a:picLocks noChangeArrowheads="1" noChangeAspect="1"/>
                     </pic:cNvPicPr>
                   </pic:nvPicPr>
                   <pic:blipFill>
-                    <a:blip r:embed="rId613"/>
+                    <a:blip r:embed="rId1057"/>
                     <a:stretch>
                       <a:fillRect/>
                     </a:stretch>
@@ -6824,8 +6836,8 @@
         <w:t xml:space="preserve">Figure 13. Flow I, repeating daily work.</w:t>
       </w:r>
     </w:p>
-    <w:bookmarkEnd w:id="616"/>
-    <w:bookmarkStart w:id="620" w:name="Xee151c202ff32b2b502fcc1220710a61d3b4311"/>
+    <w:bookmarkEnd w:id="1060"/>
+    <w:bookmarkStart w:id="1064" w:name="Xee151c202ff32b2b502fcc1220710a61d3b4311"/>
     <w:p>
       <w:pPr>
         <w:pStyle w:val="Heading2"/>
@@ -6891,18 +6903,18 @@
           <wp:inline>
             <wp:extent cx="3054096" cy="7769485"/>
             <wp:effectExtent b="0" l="0" r="0" t="0"/>
-            <wp:docPr descr="Diagram" title="" id="618" name="Picture"/>
+            <wp:docPr descr="Diagram" title="" id="1062" name="Picture"/>
             <a:graphic>
               <a:graphicData uri="http://schemas.openxmlformats.org/drawingml/2006/picture">
                 <pic:pic>
                   <pic:nvPicPr>
-                    <pic:cNvPr descr="/private/tmp/claude-502/-Users-keanghok-Desktop-work-startup-hopflows-docs/e4a4cd31-69eb-498d-a6e4-c32390abc3bb/scratchpad/mmd2/d12.png" id="619" name="Picture"/>
+                    <pic:cNvPr descr="/private/tmp/claude-502/-Users-keanghok-Desktop-work-startup-hopflows-docs/e4a4cd31-69eb-498d-a6e4-c32390abc3bb/scratchpad/mmd2/d12.png" id="1063" name="Picture"/>
                     <pic:cNvPicPr>
                       <a:picLocks noChangeArrowheads="1" noChangeAspect="1"/>
                     </pic:cNvPicPr>
                   </pic:nvPicPr>
                   <pic:blipFill>
-                    <a:blip r:embed="rId617"/>
+                    <a:blip r:embed="rId1061"/>
                     <a:stretch>
                       <a:fillRect/>
                     </a:stretch>
@@ -6937,9 +6949,9 @@
         <w:t xml:space="preserve">Figure 14. Flow J, weekly summary for leaders.</w:t>
       </w:r>
     </w:p>
-    <w:bookmarkEnd w:id="620"/>
-    <w:bookmarkEnd w:id="621"/>
-    <w:bookmarkStart w:id="638" w:name="what-each-role-sees-and-can-do"/>
+    <w:bookmarkEnd w:id="1064"/>
+    <w:bookmarkEnd w:id="1065"/>
+    <w:bookmarkStart w:id="1082" w:name="what-each-role-sees-and-can-do"/>
     <w:p>
       <w:pPr>
         <w:pStyle w:val="Heading1"/>
@@ -6948,7 +6960,7 @@
         <w:t xml:space="preserve">09 What each role sees and can do</w:t>
       </w:r>
     </w:p>
-    <w:bookmarkStart w:id="622" w:name="main-screens"/>
+    <w:bookmarkStart w:id="1066" w:name="main-screens"/>
     <w:p>
       <w:pPr>
         <w:pStyle w:val="Heading2"/>
@@ -7168,8 +7180,8 @@
         <w:t xml:space="preserve">Managers also get their own Today screen. Different roles get different starting screens, not three separate apps, and nobody is locked out of moving around.</w:t>
       </w:r>
     </w:p>
-    <w:bookmarkEnd w:id="622"/>
-    <w:bookmarkStart w:id="623" w:name="simple-by-default-one-question-per-role"/>
+    <w:bookmarkEnd w:id="1066"/>
+    <w:bookmarkStart w:id="1067" w:name="simple-by-default-one-question-per-role"/>
     <w:p>
       <w:pPr>
         <w:pStyle w:val="Heading2"/>
@@ -7284,7 +7296,7 @@
               <w:pStyle w:val="Compact"/>
             </w:pPr>
             <w:r>
-              <w:t xml:space="preserve">Full task list, My requests, leave, Goals and Deliverables, other people’s work, reports, time numbers</w:t>
+              <w:t xml:space="preserve">Full task list, Requests I sent, leave, Goals and Deliverables, other people’s work, reports, time numbers</w:t>
             </w:r>
           </w:p>
         </w:tc>
@@ -7624,8 +7636,8 @@
         <w:t xml:space="preserve">One in, one out: every new feature must say which role sees it on their home screen. If it adds something there, something else moves one tap deeper.</w:t>
       </w:r>
     </w:p>
-    <w:bookmarkEnd w:id="623"/>
-    <w:bookmarkStart w:id="627" w:name="Xafc6df188b68060a074162f0ed46c452143f4ca"/>
+    <w:bookmarkEnd w:id="1067"/>
+    <w:bookmarkStart w:id="1071" w:name="Xafc6df188b68060a074162f0ed46c452143f4ca"/>
     <w:p>
       <w:pPr>
         <w:pStyle w:val="Heading2"/>
@@ -8013,18 +8025,18 @@
           <wp:inline>
             <wp:extent cx="3813048" cy="7770093"/>
             <wp:effectExtent b="0" l="0" r="0" t="0"/>
-            <wp:docPr descr="Diagram" title="" id="625" name="Picture"/>
+            <wp:docPr descr="Diagram" title="" id="1069" name="Picture"/>
             <a:graphic>
               <a:graphicData uri="http://schemas.openxmlformats.org/drawingml/2006/picture">
                 <pic:pic>
                   <pic:nvPicPr>
-                    <pic:cNvPr descr="/private/tmp/claude-502/-Users-keanghok-Desktop-work-startup-hopflows-docs/e4a4cd31-69eb-498d-a6e4-c32390abc3bb/scratchpad/mmd2/d13.png" id="626" name="Picture"/>
+                    <pic:cNvPr descr="/private/tmp/claude-502/-Users-keanghok-Desktop-work-startup-hopflows-docs/e4a4cd31-69eb-498d-a6e4-c32390abc3bb/scratchpad/mmd2/d13.png" id="1070" name="Picture"/>
                     <pic:cNvPicPr>
                       <a:picLocks noChangeArrowheads="1" noChangeAspect="1"/>
                     </pic:cNvPicPr>
                   </pic:nvPicPr>
                   <pic:blipFill>
-                    <a:blip r:embed="rId624"/>
+                    <a:blip r:embed="rId1068"/>
                     <a:stretch>
                       <a:fillRect/>
                     </a:stretch>
@@ -8059,8 +8071,8 @@
         <w:t xml:space="preserve">Figure 15. Dragging on the Board follows the same rules as the buttons.</w:t>
       </w:r>
     </w:p>
-    <w:bookmarkEnd w:id="627"/>
-    <w:bookmarkStart w:id="628" w:name="workload-view"/>
+    <w:bookmarkEnd w:id="1071"/>
+    <w:bookmarkStart w:id="1072" w:name="workload-view"/>
     <w:p>
       <w:pPr>
         <w:pStyle w:val="Heading2"/>
@@ -8501,8 +8513,8 @@
         <w:t xml:space="preserve">list asks them to look. (Proposed)</w:t>
       </w:r>
     </w:p>
-    <w:bookmarkEnd w:id="628"/>
-    <w:bookmarkStart w:id="629" w:name="risk-flags-for-leaders"/>
+    <w:bookmarkEnd w:id="1072"/>
+    <w:bookmarkStart w:id="1073" w:name="risk-flags-for-leaders"/>
     <w:p>
       <w:pPr>
         <w:pStyle w:val="Heading2"/>
@@ -8771,8 +8783,8 @@
         <w:t xml:space="preserve">In a later stage, suggested flags are never set automatically. Flags not looked at for a while (see §14) remind the lead to confirm or clear them.</w:t>
       </w:r>
     </w:p>
-    <w:bookmarkEnd w:id="629"/>
-    <w:bookmarkStart w:id="630" w:name="calendar-1"/>
+    <w:bookmarkEnd w:id="1073"/>
+    <w:bookmarkStart w:id="1074" w:name="calendar-1"/>
     <w:p>
       <w:pPr>
         <w:pStyle w:val="Heading2"/>
@@ -9105,8 +9117,8 @@
         <w:t xml:space="preserve">Times show in each person’s local time. Holidays and all-day events stay as dates.</w:t>
       </w:r>
     </w:p>
-    <w:bookmarkEnd w:id="630"/>
-    <w:bookmarkStart w:id="631" w:name="alerts-and-the-mobile-app"/>
+    <w:bookmarkEnd w:id="1074"/>
+    <w:bookmarkStart w:id="1075" w:name="alerts-and-the-mobile-app"/>
     <w:p>
       <w:pPr>
         <w:pStyle w:val="Heading2"/>
@@ -9900,8 +9912,8 @@
         <w:t xml:space="preserve">Chat apps (Telegram, Slack and Microsoft Teams, later stage) will all use the same messages, buttons and team chat settings.</w:t>
       </w:r>
     </w:p>
-    <w:bookmarkEnd w:id="631"/>
-    <w:bookmarkStart w:id="632" w:name="search-proposed"/>
+    <w:bookmarkEnd w:id="1075"/>
+    <w:bookmarkStart w:id="1076" w:name="search-proposed"/>
     <w:p>
       <w:pPr>
         <w:pStyle w:val="Heading2"/>
@@ -9982,8 +9994,8 @@
         <w:t xml:space="preserve">Without internet, search looks through the items saved on the phone, and says so.</w:t>
       </w:r>
     </w:p>
-    <w:bookmarkEnd w:id="632"/>
-    <w:bookmarkStart w:id="636" w:name="working-offline-proposed"/>
+    <w:bookmarkEnd w:id="1076"/>
+    <w:bookmarkStart w:id="1080" w:name="working-offline-proposed"/>
     <w:p>
       <w:pPr>
         <w:pStyle w:val="Heading2"/>
@@ -10062,18 +10074,18 @@
           <wp:inline>
             <wp:extent cx="4727448" cy="7773612"/>
             <wp:effectExtent b="0" l="0" r="0" t="0"/>
-            <wp:docPr descr="Diagram" title="" id="634" name="Picture"/>
+            <wp:docPr descr="Diagram" title="" id="1078" name="Picture"/>
             <a:graphic>
               <a:graphicData uri="http://schemas.openxmlformats.org/drawingml/2006/picture">
                 <pic:pic>
                   <pic:nvPicPr>
-                    <pic:cNvPr descr="/private/tmp/claude-502/-Users-keanghok-Desktop-work-startup-hopflows-docs/e4a4cd31-69eb-498d-a6e4-c32390abc3bb/scratchpad/mmd2/d14.png" id="635" name="Picture"/>
+                    <pic:cNvPr descr="/private/tmp/claude-502/-Users-keanghok-Desktop-work-startup-hopflows-docs/e4a4cd31-69eb-498d-a6e4-c32390abc3bb/scratchpad/mmd2/d14.png" id="1079" name="Picture"/>
                     <pic:cNvPicPr>
                       <a:picLocks noChangeArrowheads="1" noChangeAspect="1"/>
                     </pic:cNvPicPr>
                   </pic:nvPicPr>
                   <pic:blipFill>
-                    <a:blip r:embed="rId633"/>
+                    <a:blip r:embed="rId1077"/>
                     <a:stretch>
                       <a:fillRect/>
                     </a:stretch>
@@ -10108,8 +10120,8 @@
         <w:t xml:space="preserve">Figure 16. Working offline.</w:t>
       </w:r>
     </w:p>
-    <w:bookmarkEnd w:id="636"/>
-    <w:bookmarkStart w:id="637" w:name="who-can-do-what-starting-settings"/>
+    <w:bookmarkEnd w:id="1080"/>
+    <w:bookmarkStart w:id="1081" w:name="who-can-do-what-starting-settings"/>
     <w:p>
       <w:pPr>
         <w:pStyle w:val="Heading2"/>
@@ -10342,6 +10354,52 @@
               <w:pStyle w:val="Compact"/>
             </w:pPr>
             <w:r>
+              <w:t xml:space="preserve">Add a Task for themselves</w:t>
+            </w:r>
+          </w:p>
+        </w:tc>
+        <w:tc>
+          <w:tcPr/>
+          <w:p>
+            <w:pPr>
+              <w:pStyle w:val="Compact"/>
+            </w:pPr>
+            <w:r>
+              <w:t xml:space="preserve">Yes</w:t>
+            </w:r>
+          </w:p>
+        </w:tc>
+        <w:tc>
+          <w:tcPr/>
+          <w:p>
+            <w:pPr>
+              <w:pStyle w:val="Compact"/>
+            </w:pPr>
+            <w:r>
+              <w:t xml:space="preserve">Yes</w:t>
+            </w:r>
+          </w:p>
+        </w:tc>
+        <w:tc>
+          <w:tcPr/>
+          <w:p>
+            <w:pPr>
+              <w:pStyle w:val="Compact"/>
+            </w:pPr>
+            <w:r>
+              <w:t xml:space="preserve">Yes</w:t>
+            </w:r>
+          </w:p>
+        </w:tc>
+      </w:tr>
+      <w:tr>
+        <w:tc>
+          <w:tcPr/>
+          <w:p>
+            <w:pPr>
+              <w:pStyle w:val="Compact"/>
+            </w:pPr>
+            <w:r>
               <w:t xml:space="preserve">Update their own Tasks</w:t>
             </w:r>
           </w:p>
@@ -11551,9 +11609,9 @@
         <w:t xml:space="preserve">rules on top of department and job title.</w:t>
       </w:r>
     </w:p>
-    <w:bookmarkEnd w:id="637"/>
-    <w:bookmarkEnd w:id="638"/>
-    <w:bookmarkStart w:id="643" w:name="time-and-measures"/>
+    <w:bookmarkEnd w:id="1081"/>
+    <w:bookmarkEnd w:id="1082"/>
+    <w:bookmarkStart w:id="1087" w:name="time-and-measures"/>
     <w:p>
       <w:pPr>
         <w:pStyle w:val="Heading1"/>
@@ -11562,7 +11620,7 @@
         <w:t xml:space="preserve">10 Time and measures</w:t>
       </w:r>
     </w:p>
-    <w:bookmarkStart w:id="639" w:name="talking-about-time"/>
+    <w:bookmarkStart w:id="1083" w:name="talking-about-time"/>
     <w:p>
       <w:pPr>
         <w:pStyle w:val="Heading2"/>
@@ -11797,8 +11855,8 @@
         <w:t xml:space="preserve">Holidays and leave reduce the working week before this calculation. For example, a public holiday on Tuesday cuts the working week to 32 hours for everyone on that holiday calendar, and the weekly planner shows the lower number before the week is locked.</w:t>
       </w:r>
     </w:p>
-    <w:bookmarkEnd w:id="639"/>
-    <w:bookmarkStart w:id="640" w:name="measures"/>
+    <w:bookmarkEnd w:id="1083"/>
+    <w:bookmarkStart w:id="1084" w:name="measures"/>
     <w:p>
       <w:pPr>
         <w:pStyle w:val="Heading2"/>
@@ -12186,8 +12244,8 @@
         <w:t xml:space="preserve">until people log real time. Cancelled work is shown separately and never counts as missed.</w:t>
       </w:r>
     </w:p>
-    <w:bookmarkEnd w:id="640"/>
-    <w:bookmarkStart w:id="641" w:name="standard-reports-proposed"/>
+    <w:bookmarkEnd w:id="1084"/>
+    <w:bookmarkStart w:id="1085" w:name="standard-reports-proposed"/>
     <w:p>
       <w:pPr>
         <w:pStyle w:val="Heading2"/>
@@ -12440,8 +12498,8 @@
         <w:t xml:space="preserve">, with their own planned, added and finished work.</w:t>
       </w:r>
     </w:p>
-    <w:bookmarkEnd w:id="641"/>
-    <w:bookmarkStart w:id="642" w:name="keeping-it-fair"/>
+    <w:bookmarkEnd w:id="1085"/>
+    <w:bookmarkStart w:id="1086" w:name="keeping-it-fair"/>
     <w:p>
       <w:pPr>
         <w:pStyle w:val="Heading2"/>
@@ -12510,9 +12568,9 @@
         <w:t xml:space="preserve">Don’t count a Deliverable that covers several products twice. Use its main product, or set shares.</w:t>
       </w:r>
     </w:p>
-    <w:bookmarkEnd w:id="642"/>
-    <w:bookmarkEnd w:id="643"/>
-    <w:bookmarkStart w:id="661" w:name="rewards-fun-and-the-mascot"/>
+    <w:bookmarkEnd w:id="1086"/>
+    <w:bookmarkEnd w:id="1087"/>
+    <w:bookmarkStart w:id="1105" w:name="rewards-fun-and-the-mascot"/>
     <w:p>
       <w:pPr>
         <w:pStyle w:val="Heading1"/>
@@ -12529,7 +12587,7 @@
         <w:t xml:space="preserve">Rewards help people adopt the app. They should follow real, checked work, and should never encourage splitting tasks, working extra hours or saying work is done when it isn’t.</w:t>
       </w:r>
     </w:p>
-    <w:bookmarkStart w:id="644" w:name="start-simple-first-version"/>
+    <w:bookmarkStart w:id="1088" w:name="start-simple-first-version"/>
     <w:p>
       <w:pPr>
         <w:pStyle w:val="Heading2"/>
@@ -12797,8 +12855,8 @@
         <w:t xml:space="preserve">Celebrations and streak days come only from real, checked events, each counted once, so repeating or undoing actions can’t be used to game them.</w:t>
       </w:r>
     </w:p>
-    <w:bookmarkEnd w:id="644"/>
-    <w:bookmarkStart w:id="654" w:name="mascot-punh-punh"/>
+    <w:bookmarkEnd w:id="1088"/>
+    <w:bookmarkStart w:id="1098" w:name="mascot-punh-punh"/>
     <w:p>
       <w:pPr>
         <w:pStyle w:val="Heading2"/>
@@ -12852,18 +12910,18 @@
                 <wp:inline>
                   <wp:extent cx="6134100" cy="6134100"/>
                   <wp:effectExtent b="0" l="0" r="0" t="0"/>
-                  <wp:docPr descr="Punh Punh holding a blank note" title="" id="646" name="Picture"/>
+                  <wp:docPr descr="Punh Punh holding a blank note" title="" id="1090" name="Picture"/>
                   <a:graphic>
                     <a:graphicData uri="http://schemas.openxmlformats.org/drawingml/2006/picture">
                       <pic:pic>
                         <pic:nvPicPr>
-                          <pic:cNvPr descr="../design/mascot/punh-punh-A1.png" id="647" name="Picture"/>
+                          <pic:cNvPr descr="../design/mascot/punh-punh-A1.png" id="1091" name="Picture"/>
                           <pic:cNvPicPr>
                             <a:picLocks noChangeArrowheads="1" noChangeAspect="1"/>
                           </pic:cNvPicPr>
                         </pic:nvPicPr>
                         <pic:blipFill>
-                          <a:blip r:embed="rId645"/>
+                          <a:blip r:embed="rId1089"/>
                           <a:stretch>
                             <a:fillRect/>
                           </a:stretch>
@@ -12903,18 +12961,18 @@
                 <wp:inline>
                   <wp:extent cx="6134100" cy="6134100"/>
                   <wp:effectExtent b="0" l="0" r="0" t="0"/>
-                  <wp:docPr descr="Punh Punh waving" title="" id="649" name="Picture"/>
+                  <wp:docPr descr="Punh Punh waving" title="" id="1093" name="Picture"/>
                   <a:graphic>
                     <a:graphicData uri="http://schemas.openxmlformats.org/drawingml/2006/picture">
                       <pic:pic>
                         <pic:nvPicPr>
-                          <pic:cNvPr descr="../design/mascot/punh-punh-B1.png" id="650" name="Picture"/>
+                          <pic:cNvPr descr="../design/mascot/punh-punh-B1.png" id="1094" name="Picture"/>
                           <pic:cNvPicPr>
                             <a:picLocks noChangeArrowheads="1" noChangeAspect="1"/>
                           </pic:cNvPicPr>
                         </pic:nvPicPr>
                         <pic:blipFill>
-                          <a:blip r:embed="rId648"/>
+                          <a:blip r:embed="rId1092"/>
                           <a:stretch>
                             <a:fillRect/>
                           </a:stretch>
@@ -12954,18 +13012,18 @@
                 <wp:inline>
                   <wp:extent cx="6134100" cy="6134100"/>
                   <wp:effectExtent b="0" l="0" r="0" t="0"/>
-                  <wp:docPr descr="Punh Punh holding a checked note" title="" id="652" name="Picture"/>
+                  <wp:docPr descr="Punh Punh holding a checked note" title="" id="1096" name="Picture"/>
                   <a:graphic>
                     <a:graphicData uri="http://schemas.openxmlformats.org/drawingml/2006/picture">
                       <pic:pic>
                         <pic:nvPicPr>
-                          <pic:cNvPr descr="../design/mascot/punh-punh-C1.png" id="653" name="Picture"/>
+                          <pic:cNvPr descr="../design/mascot/punh-punh-C1.png" id="1097" name="Picture"/>
                           <pic:cNvPicPr>
                             <a:picLocks noChangeArrowheads="1" noChangeAspect="1"/>
                           </pic:cNvPicPr>
                         </pic:nvPicPr>
                         <pic:blipFill>
-                          <a:blip r:embed="rId651"/>
+                          <a:blip r:embed="rId1095"/>
                           <a:stretch>
                             <a:fillRect/>
                           </a:stretch>
@@ -13401,8 +13459,8 @@
         <w:t xml:space="preserve">Design work for the first version: a character sheet, five main poses (welcome, celebrate, thinking, calm, resting for holidays and leave), light animations. A chat sticker set and the bot’s profile picture come with chat apps, and seasonal outfits come later.</w:t>
       </w:r>
     </w:p>
-    <w:bookmarkEnd w:id="654"/>
-    <w:bookmarkStart w:id="658" w:name="app-icon"/>
+    <w:bookmarkEnd w:id="1098"/>
+    <w:bookmarkStart w:id="1102" w:name="app-icon"/>
     <w:p>
       <w:pPr>
         <w:pStyle w:val="Heading2"/>
@@ -13420,18 +13478,18 @@
           <wp:inline>
             <wp:extent cx="6134100" cy="6134100"/>
             <wp:effectExtent b="0" l="0" r="0" t="0"/>
-            <wp:docPr descr="HopFlows app icon: Punh Punh leaning in beside a checklist on a sky tile" title="" id="656" name="Picture"/>
+            <wp:docPr descr="HopFlows app icon: Punh Punh leaning in beside a checklist on a sky tile" title="" id="1100" name="Picture"/>
             <a:graphic>
               <a:graphicData uri="http://schemas.openxmlformats.org/drawingml/2006/picture">
                 <pic:pic>
                   <pic:nvPicPr>
-                    <pic:cNvPr descr="../design/app-icon/png/icon-512.png" id="657" name="Picture"/>
+                    <pic:cNvPr descr="../design/app-icon/png/icon-512.png" id="1101" name="Picture"/>
                     <pic:cNvPicPr>
                       <a:picLocks noChangeArrowheads="1" noChangeAspect="1"/>
                     </pic:cNvPicPr>
                   </pic:nvPicPr>
                   <pic:blipFill>
-                    <a:blip r:embed="rId655"/>
+                    <a:blip r:embed="rId1099"/>
                     <a:stretch>
                       <a:fillRect/>
                     </a:stretch>
@@ -13583,8 +13641,8 @@
         <w:t xml:space="preserve">.</w:t>
       </w:r>
     </w:p>
-    <w:bookmarkEnd w:id="658"/>
-    <w:bookmarkStart w:id="659" w:name="more-rewards-later"/>
+    <w:bookmarkEnd w:id="1102"/>
+    <w:bookmarkStart w:id="1103" w:name="more-rewards-later"/>
     <w:p>
       <w:pPr>
         <w:pStyle w:val="Heading2"/>
@@ -13839,8 +13897,8 @@
         </w:tc>
       </w:tr>
     </w:tbl>
-    <w:bookmarkEnd w:id="659"/>
-    <w:bookmarkStart w:id="660" w:name="making-it-easy-to-start"/>
+    <w:bookmarkEnd w:id="1103"/>
+    <w:bookmarkStart w:id="1104" w:name="making-it-easy-to-start"/>
     <w:p>
       <w:pPr>
         <w:pStyle w:val="Heading2"/>
@@ -13885,9 +13943,9 @@
         <w:t xml:space="preserve">English and phone-friendly design are included from the start. Other languages can be added later.</w:t>
       </w:r>
     </w:p>
-    <w:bookmarkEnd w:id="660"/>
-    <w:bookmarkEnd w:id="661"/>
-    <w:bookmarkStart w:id="671" w:name="special-cases"/>
+    <w:bookmarkEnd w:id="1104"/>
+    <w:bookmarkEnd w:id="1105"/>
+    <w:bookmarkStart w:id="1115" w:name="special-cases"/>
     <w:p>
       <w:pPr>
         <w:pStyle w:val="Heading1"/>
@@ -13896,7 +13954,7 @@
         <w:t xml:space="preserve">12 Special cases</w:t>
       </w:r>
     </w:p>
-    <w:bookmarkStart w:id="662" w:name="work-and-requests"/>
+    <w:bookmarkStart w:id="1106" w:name="work-and-requests"/>
     <w:p>
       <w:pPr>
         <w:pStyle w:val="Heading2"/>
@@ -14426,8 +14484,8 @@
         </w:tc>
       </w:tr>
     </w:tbl>
-    <w:bookmarkEnd w:id="662"/>
-    <w:bookmarkStart w:id="663" w:name="planning-and-time-1"/>
+    <w:bookmarkEnd w:id="1106"/>
+    <w:bookmarkStart w:id="1107" w:name="planning-and-time-1"/>
     <w:p>
       <w:pPr>
         <w:pStyle w:val="Heading2"/>
@@ -14801,8 +14859,8 @@
         </w:tc>
       </w:tr>
     </w:tbl>
-    <w:bookmarkEnd w:id="663"/>
-    <w:bookmarkStart w:id="664" w:name="handover-and-leave"/>
+    <w:bookmarkEnd w:id="1107"/>
+    <w:bookmarkStart w:id="1108" w:name="handover-and-leave"/>
     <w:p>
       <w:pPr>
         <w:pStyle w:val="Heading2"/>
@@ -15026,8 +15084,8 @@
         </w:tc>
       </w:tr>
     </w:tbl>
-    <w:bookmarkEnd w:id="664"/>
-    <w:bookmarkStart w:id="665" w:name="risk-flags"/>
+    <w:bookmarkEnd w:id="1108"/>
+    <w:bookmarkStart w:id="1109" w:name="risk-flags"/>
     <w:p>
       <w:pPr>
         <w:pStyle w:val="Heading2"/>
@@ -15203,8 +15261,8 @@
         </w:tc>
       </w:tr>
     </w:tbl>
-    <w:bookmarkEnd w:id="665"/>
-    <w:bookmarkStart w:id="666" w:name="calendar-2"/>
+    <w:bookmarkEnd w:id="1109"/>
+    <w:bookmarkStart w:id="1110" w:name="calendar-2"/>
     <w:p>
       <w:pPr>
         <w:pStyle w:val="Heading2"/>
@@ -15368,8 +15426,8 @@
         </w:tc>
       </w:tr>
     </w:tbl>
-    <w:bookmarkEnd w:id="666"/>
-    <w:bookmarkStart w:id="667" w:name="alerts-and-chat"/>
+    <w:bookmarkEnd w:id="1110"/>
+    <w:bookmarkStart w:id="1111" w:name="alerts-and-chat"/>
     <w:p>
       <w:pPr>
         <w:pStyle w:val="Heading2"/>
@@ -15754,8 +15812,8 @@
         </w:tc>
       </w:tr>
     </w:tbl>
-    <w:bookmarkEnd w:id="667"/>
-    <w:bookmarkStart w:id="668" w:name="leave-routines-and-week-status"/>
+    <w:bookmarkEnd w:id="1111"/>
+    <w:bookmarkStart w:id="1112" w:name="leave-routines-and-week-status"/>
     <w:p>
       <w:pPr>
         <w:pStyle w:val="Heading2"/>
@@ -16123,8 +16181,8 @@
         </w:tc>
       </w:tr>
     </w:tbl>
-    <w:bookmarkEnd w:id="668"/>
-    <w:bookmarkStart w:id="669" w:name="reports-search-and-offline"/>
+    <w:bookmarkEnd w:id="1112"/>
+    <w:bookmarkStart w:id="1113" w:name="reports-search-and-offline"/>
     <w:p>
       <w:pPr>
         <w:pStyle w:val="Heading2"/>
@@ -16324,8 +16382,8 @@
         </w:tc>
       </w:tr>
     </w:tbl>
-    <w:bookmarkEnd w:id="669"/>
-    <w:bookmarkStart w:id="670" w:name="rewards"/>
+    <w:bookmarkEnd w:id="1113"/>
+    <w:bookmarkStart w:id="1114" w:name="rewards"/>
     <w:p>
       <w:pPr>
         <w:pStyle w:val="Heading2"/>
@@ -16453,9 +16511,9 @@
         </w:tc>
       </w:tr>
     </w:tbl>
-    <w:bookmarkEnd w:id="670"/>
-    <w:bookmarkEnd w:id="671"/>
-    <w:bookmarkStart w:id="675" w:name="what-we-build-first"/>
+    <w:bookmarkEnd w:id="1114"/>
+    <w:bookmarkEnd w:id="1115"/>
+    <w:bookmarkStart w:id="1119" w:name="what-we-build-first"/>
     <w:p>
       <w:pPr>
         <w:pStyle w:val="Heading1"/>
@@ -16464,7 +16522,7 @@
         <w:t xml:space="preserve">13 What we build first</w:t>
       </w:r>
     </w:p>
-    <w:bookmarkStart w:id="672" w:name="order-of-building"/>
+    <w:bookmarkStart w:id="1116" w:name="order-of-building"/>
     <w:p>
       <w:pPr>
         <w:pStyle w:val="Heading2"/>
@@ -16742,8 +16800,8 @@
         <w:t xml:space="preserve">apply once chat apps ship.</w:t>
       </w:r>
     </w:p>
-    <w:bookmarkEnd w:id="672"/>
-    <w:bookmarkStart w:id="673" w:name="seven-key-screens-to-sketch-first"/>
+    <w:bookmarkEnd w:id="1116"/>
+    <w:bookmarkStart w:id="1117" w:name="seven-key-screens-to-sketch-first"/>
     <w:p>
       <w:pPr>
         <w:pStyle w:val="Heading2"/>
@@ -16878,8 +16936,8 @@
         <w:t xml:space="preserve">act on an alert (Start, Done, Need Help, Accept) in one tap, without opening the full app.</w:t>
       </w:r>
     </w:p>
-    <w:bookmarkEnd w:id="673"/>
-    <w:bookmarkStart w:id="674" w:name="how-well-know-the-pilot-worked"/>
+    <w:bookmarkEnd w:id="1117"/>
+    <w:bookmarkStart w:id="1118" w:name="how-well-know-the-pilot-worked"/>
     <w:p>
       <w:pPr>
         <w:pStyle w:val="Heading2"/>
@@ -17014,9 +17072,9 @@
         <w:t xml:space="preserve">these targets are new in v1.1 and need a yes before the pilot. We’ll measure them by tracking when Add Work starts and finishes, which buttons people use and where, when alerts are sent and acted on, and how many people use the app each day in each role.</w:t>
       </w:r>
     </w:p>
-    <w:bookmarkEnd w:id="674"/>
-    <w:bookmarkEnd w:id="675"/>
-    <w:bookmarkStart w:id="678" w:name="default-settings-and-launch-tests"/>
+    <w:bookmarkEnd w:id="1118"/>
+    <w:bookmarkEnd w:id="1119"/>
+    <w:bookmarkStart w:id="1122" w:name="default-settings-and-launch-tests"/>
     <w:p>
       <w:pPr>
         <w:pStyle w:val="Heading1"/>
@@ -17025,7 +17083,7 @@
         <w:t xml:space="preserve">14 Default settings and launch tests</w:t>
       </w:r>
     </w:p>
-    <w:bookmarkStart w:id="676" w:name="default-settings-and-open-decisions"/>
+    <w:bookmarkStart w:id="1120" w:name="default-settings-and-open-decisions"/>
     <w:p>
       <w:pPr>
         <w:pStyle w:val="Heading2"/>
@@ -18717,8 +18775,8 @@
         <w:t xml:space="preserve">The system should be thorough enough to get owners, time and history right, while the employee’s screen stays as simple as possible. Complexity belongs in the system, not on the screen.</w:t>
       </w:r>
     </w:p>
-    <w:bookmarkEnd w:id="676"/>
-    <w:bookmarkStart w:id="677" w:name="launch-tests"/>
+    <w:bookmarkEnd w:id="1120"/>
+    <w:bookmarkStart w:id="1121" w:name="launch-tests"/>
     <w:p>
       <w:pPr>
         <w:pStyle w:val="Heading2"/>
@@ -18865,6 +18923,30 @@
               <w:pStyle w:val="Compact"/>
             </w:pPr>
             <w:r>
+              <w:t xml:space="preserve">Task for me</w:t>
+            </w:r>
+          </w:p>
+        </w:tc>
+        <w:tc>
+          <w:tcPr/>
+          <w:p>
+            <w:pPr>
+              <w:pStyle w:val="Compact"/>
+            </w:pPr>
+            <w:r>
+              <w:t xml:space="preserve">An employee adds a Task for themselves. It appears in their own list without the lead, the lead can see it, and in a locked week it counts as added work.</w:t>
+            </w:r>
+          </w:p>
+        </w:tc>
+      </w:tr>
+      <w:tr>
+        <w:tc>
+          <w:tcPr/>
+          <w:p>
+            <w:pPr>
+              <w:pStyle w:val="Compact"/>
+            </w:pPr>
+            <w:r>
               <w:t xml:space="preserve">One owner</w:t>
             </w:r>
           </w:p>
@@ -19737,9 +19819,9 @@
         </w:tc>
       </w:tr>
     </w:tbl>
-    <w:bookmarkEnd w:id="677"/>
-    <w:bookmarkEnd w:id="678"/>
-    <w:bookmarkStart w:id="684" w:name="sign-in-access-and-data"/>
+    <w:bookmarkEnd w:id="1121"/>
+    <w:bookmarkEnd w:id="1122"/>
+    <w:bookmarkStart w:id="1128" w:name="sign-in-access-and-data"/>
     <w:p>
       <w:pPr>
         <w:pStyle w:val="Heading1"/>
@@ -19766,7 +19848,7 @@
         <w:t xml:space="preserve">this section is new in v1.1 and needs a yes.</w:t>
       </w:r>
     </w:p>
-    <w:bookmarkStart w:id="682" w:name="sign-in-and-joining-a-company"/>
+    <w:bookmarkStart w:id="1126" w:name="sign-in-and-joining-a-company"/>
     <w:p>
       <w:pPr>
         <w:pStyle w:val="Heading2"/>
@@ -19844,18 +19926,18 @@
           <wp:inline>
             <wp:extent cx="4233672" cy="7768663"/>
             <wp:effectExtent b="0" l="0" r="0" t="0"/>
-            <wp:docPr descr="Diagram" title="" id="680" name="Picture"/>
+            <wp:docPr descr="Diagram" title="" id="1124" name="Picture"/>
             <a:graphic>
               <a:graphicData uri="http://schemas.openxmlformats.org/drawingml/2006/picture">
                 <pic:pic>
                   <pic:nvPicPr>
-                    <pic:cNvPr descr="/private/tmp/claude-502/-Users-keanghok-Desktop-work-startup-hopflows-docs/e4a4cd31-69eb-498d-a6e4-c32390abc3bb/scratchpad/mmd2/d15.png" id="681" name="Picture"/>
+                    <pic:cNvPr descr="/private/tmp/claude-502/-Users-keanghok-Desktop-work-startup-hopflows-docs/e4a4cd31-69eb-498d-a6e4-c32390abc3bb/scratchpad/mmd2/d15.png" id="1125" name="Picture"/>
                     <pic:cNvPicPr>
                       <a:picLocks noChangeArrowheads="1" noChangeAspect="1"/>
                     </pic:cNvPicPr>
                   </pic:nvPicPr>
                   <pic:blipFill>
-                    <a:blip r:embed="rId679"/>
+                    <a:blip r:embed="rId1123"/>
                     <a:stretch>
                       <a:fillRect/>
                     </a:stretch>
@@ -19890,8 +19972,8 @@
         <w:t xml:space="preserve">Figure 17. Signing in and joining a company.</w:t>
       </w:r>
     </w:p>
-    <w:bookmarkEnd w:id="682"/>
-    <w:bookmarkStart w:id="683" w:name="looking-after-data"/>
+    <w:bookmarkEnd w:id="1126"/>
+    <w:bookmarkStart w:id="1127" w:name="looking-after-data"/>
     <w:p>
       <w:pPr>
         <w:pStyle w:val="Heading2"/>
@@ -19948,9 +20030,9 @@
         <w:t xml:space="preserve">Where the data is stored, and any promises about which country it stays in, are decided before the first paying customer.</w:t>
       </w:r>
     </w:p>
-    <w:bookmarkEnd w:id="683"/>
-    <w:bookmarkEnd w:id="684"/>
-    <w:bookmarkStart w:id="685" w:name="change-log"/>
+    <w:bookmarkEnd w:id="1127"/>
+    <w:bookmarkEnd w:id="1128"/>
+    <w:bookmarkStart w:id="1129" w:name="change-log"/>
     <w:p>
       <w:pPr>
         <w:pStyle w:val="Heading1"/>
@@ -20055,7 +20137,22 @@
         </w:numPr>
       </w:pPr>
       <w:r>
-        <w:t xml:space="preserve">Mascot renamed from Hop to Punh Punh (14 October).</w:t>
+        <w:t xml:space="preserve">“My requests”</w:t>
+      </w:r>
+      <w:r>
+        <w:t xml:space="preserve"> </w:t>
+      </w:r>
+      <w:r>
+        <w:t xml:space="preserve">renamed</w:t>
+      </w:r>
+      <w:r>
+        <w:t xml:space="preserve"> </w:t>
+      </w:r>
+      <w:r>
+        <w:t xml:space="preserve">“Requests I sent”</w:t>
+      </w:r>
+      <w:r>
+        <w:t xml:space="preserve">, so it is clear these are things a person asked their lead to look at (17 October).</w:t>
       </w:r>
     </w:p>
     <w:p>
@@ -20067,7 +20164,13 @@
         </w:numPr>
       </w:pPr>
       <w:r>
-        <w:t xml:space="preserve">App icon chosen: Punh Checklist, with usage rules in §11 (15 October).</w:t>
+        <w:t xml:space="preserve">“Task for me”</w:t>
+      </w:r>
+      <w:r>
+        <w:t xml:space="preserve"> </w:t>
+      </w:r>
+      <w:r>
+        <w:t xml:space="preserve">(Proposed): anyone can add a Task for themselves without approval; work for others still goes to the lead as a request (17 October).</w:t>
       </w:r>
     </w:p>
     <w:p>
@@ -20079,28 +20182,7 @@
         </w:numPr>
       </w:pPr>
       <w:r>
-        <w:t xml:space="preserve">First version split into</w:t>
-      </w:r>
-      <w:r>
-        <w:t xml:space="preserve"> </w:t>
-      </w:r>
-      <w:r>
-        <w:t xml:space="preserve">“pilot core”</w:t>
-      </w:r>
-      <w:r>
-        <w:t xml:space="preserve"> </w:t>
-      </w:r>
-      <w:r>
-        <w:t xml:space="preserve">and</w:t>
-      </w:r>
-      <w:r>
-        <w:t xml:space="preserve"> </w:t>
-      </w:r>
-      <w:r>
-        <w:t xml:space="preserve">“soon after”</w:t>
-      </w:r>
-      <w:r>
-        <w:t xml:space="preserve">; later-stage features (Workload view for future weeks, temporary Handover, suggested risk flags) marked in the flows and special cases.</w:t>
+        <w:t xml:space="preserve">Mascot renamed from Hop to Punh Punh (14 October).</w:t>
       </w:r>
     </w:p>
     <w:p>
@@ -20112,7 +20194,7 @@
         </w:numPr>
       </w:pPr>
       <w:r>
-        <w:t xml:space="preserve">Rules for statuses, Confidential Task access, review and blocked markers, giving rights to named people, work schedules, time split across departments, task sizes, time zones, sorting and postponing requests.</w:t>
+        <w:t xml:space="preserve">App icon chosen: Punh Checklist, with usage rules in §11 (15 October).</w:t>
       </w:r>
     </w:p>
     <w:p>
@@ -20124,7 +20206,28 @@
         </w:numPr>
       </w:pPr>
       <w:r>
-        <w:t xml:space="preserve">Rules for carrying work over, weeks never locked, clearing flags, who gets urgent alerts next, snooze, people in several companies, handover receivers and overlapping time off.</w:t>
+        <w:t xml:space="preserve">First version split into</w:t>
+      </w:r>
+      <w:r>
+        <w:t xml:space="preserve"> </w:t>
+      </w:r>
+      <w:r>
+        <w:t xml:space="preserve">“pilot core”</w:t>
+      </w:r>
+      <w:r>
+        <w:t xml:space="preserve"> </w:t>
+      </w:r>
+      <w:r>
+        <w:t xml:space="preserve">and</w:t>
+      </w:r>
+      <w:r>
+        <w:t xml:space="preserve"> </w:t>
+      </w:r>
+      <w:r>
+        <w:t xml:space="preserve">“soon after”</w:t>
+      </w:r>
+      <w:r>
+        <w:t xml:space="preserve">; later-stage features (Workload view for future weeks, temporary Handover, suggested risk flags) marked in the flows and special cases.</w:t>
       </w:r>
     </w:p>
     <w:p>
@@ -20136,7 +20239,7 @@
         </w:numPr>
       </w:pPr>
       <w:r>
-        <w:t xml:space="preserve">Measures, time words and pilot targets written out.</w:t>
+        <w:t xml:space="preserve">Rules for statuses, Confidential Task access, review and blocked markers, giving rights to named people, work schedules, time split across departments, task sizes, time zones, sorting and postponing requests.</w:t>
       </w:r>
     </w:p>
     <w:p>
@@ -20148,7 +20251,7 @@
         </w:numPr>
       </w:pPr>
       <w:r>
-        <w:t xml:space="preserve">The streak no longer counts just starting work.</w:t>
+        <w:t xml:space="preserve">Rules for carrying work over, weeks never locked, clearing flags, who gets urgent alerts next, snooze, people in several companies, handover receivers and overlapping time off.</w:t>
       </w:r>
     </w:p>
     <w:p>
@@ -20160,7 +20263,7 @@
         </w:numPr>
       </w:pPr>
       <w:r>
-        <w:t xml:space="preserve">Special cases grouped by topic; all default numbers kept in §14; the life of a Task moved before planning.</w:t>
+        <w:t xml:space="preserve">Measures, time words and pilot targets written out.</w:t>
       </w:r>
     </w:p>
     <w:p>
@@ -20172,7 +20275,7 @@
         </w:numPr>
       </w:pPr>
       <w:r>
-        <w:t xml:space="preserve">New §15 Sign-in, access and data.</w:t>
+        <w:t xml:space="preserve">The streak no longer counts just starting work.</w:t>
       </w:r>
     </w:p>
     <w:p>
@@ -20184,19 +20287,7 @@
         </w:numPr>
       </w:pPr>
       <w:r>
-        <w:t xml:space="preserve">Words on screen: Add Work (employees), Incoming Queue and Sort (leads);</w:t>
-      </w:r>
-      <w:r>
-        <w:t xml:space="preserve"> </w:t>
-      </w:r>
-      <w:r>
-        <w:t xml:space="preserve">“intake”</w:t>
-      </w:r>
-      <w:r>
-        <w:t xml:space="preserve"> </w:t>
-      </w:r>
-      <w:r>
-        <w:t xml:space="preserve">only in reports.</w:t>
+        <w:t xml:space="preserve">Special cases grouped by topic; all default numbers kept in §14; the life of a Task moved before planning.</w:t>
       </w:r>
     </w:p>
     <w:p>
@@ -20208,19 +20299,7 @@
         </w:numPr>
       </w:pPr>
       <w:r>
-        <w:t xml:space="preserve">The blueprint now covers business and design rules only. The data model and engineering rules moved to</w:t>
-      </w:r>
-      <w:r>
-        <w:t xml:space="preserve"> </w:t>
-      </w:r>
-      <w:r>
-        <w:rPr>
-          <w:rStyle w:val="VerbatimChar"/>
-        </w:rPr>
-        <w:t xml:space="preserve">HopFlows_Technical_Design_v1.1.md</w:t>
-      </w:r>
-      <w:r>
-        <w:t xml:space="preserve">.</w:t>
+        <w:t xml:space="preserve">New §15 Sign-in, access and data.</w:t>
       </w:r>
     </w:p>
     <w:p>
@@ -20232,7 +20311,19 @@
         </w:numPr>
       </w:pPr>
       <w:r>
-        <w:t xml:space="preserve">Gap fixes (Proposed): updates to request senders, weekly summary for leaders, four standard reports with downloads, week status, leave requests and approval, repeating daily work (moved from a later stage into the first version), working offline and search.</w:t>
+        <w:t xml:space="preserve">Words on screen: Add Work (employees), Incoming Queue and Sort (leads);</w:t>
+      </w:r>
+      <w:r>
+        <w:t xml:space="preserve"> </w:t>
+      </w:r>
+      <w:r>
+        <w:t xml:space="preserve">“intake”</w:t>
+      </w:r>
+      <w:r>
+        <w:t xml:space="preserve"> </w:t>
+      </w:r>
+      <w:r>
+        <w:t xml:space="preserve">only in reports.</w:t>
       </w:r>
     </w:p>
     <w:p>
@@ -20244,7 +20335,19 @@
         </w:numPr>
       </w:pPr>
       <w:r>
-        <w:t xml:space="preserve">List, Board and Table views added for full work lists (Proposed).</w:t>
+        <w:t xml:space="preserve">The blueprint now covers business and design rules only. The data model and engineering rules moved to</w:t>
+      </w:r>
+      <w:r>
+        <w:t xml:space="preserve"> </w:t>
+      </w:r>
+      <w:r>
+        <w:rPr>
+          <w:rStyle w:val="VerbatimChar"/>
+        </w:rPr>
+        <w:t xml:space="preserve">HopFlows_Technical_Design_v1.1.md</w:t>
+      </w:r>
+      <w:r>
+        <w:t xml:space="preserve">.</w:t>
       </w:r>
     </w:p>
     <w:p>
@@ -20256,7 +20359,7 @@
         </w:numPr>
       </w:pPr>
       <w:r>
-        <w:t xml:space="preserve">Flow diagrams added: the life of a Task, a map of who starts which flow, Flows A–J, Board dragging, working offline, and signing in.</w:t>
+        <w:t xml:space="preserve">Gap fixes (Proposed): updates to request senders, weekly summary for leaders, four standard reports with downloads, week status, leave requests and approval, repeating daily work (moved from a later stage into the first version), working offline and search.</w:t>
       </w:r>
     </w:p>
     <w:p>
@@ -20268,6 +20371,30 @@
         </w:numPr>
       </w:pPr>
       <w:r>
+        <w:t xml:space="preserve">List, Board and Table views added for full work lists (Proposed).</w:t>
+      </w:r>
+    </w:p>
+    <w:p>
+      <w:pPr>
+        <w:pStyle w:val="Compact"/>
+        <w:numPr>
+          <w:ilvl w:val="0"/>
+          <w:numId w:val="1042"/>
+        </w:numPr>
+      </w:pPr>
+      <w:r>
+        <w:t xml:space="preserve">Flow diagrams added: the life of a Task, a map of who starts which flow, Flows A–J, Board dragging, working offline, and signing in.</w:t>
+      </w:r>
+    </w:p>
+    <w:p>
+      <w:pPr>
+        <w:pStyle w:val="Compact"/>
+        <w:numPr>
+          <w:ilvl w:val="0"/>
+          <w:numId w:val="1042"/>
+        </w:numPr>
+      </w:pPr>
+      <w:r>
         <w:t xml:space="preserve">Rewritten in simple, everyday language. Words changed:</w:t>
       </w:r>
       <w:r>
@@ -20380,7 +20507,7 @@
         <w:t xml:space="preserve">HopFlows / End of Blueprint</w:t>
       </w:r>
     </w:p>
-    <w:bookmarkEnd w:id="685"/>
+    <w:bookmarkEnd w:id="1129"/>
     <w:sectPr>
       <w:headerReference r:id="rId9" w:type="default"/>
       <w:footerReference r:id="rId10" w:type="default"/>
@@ -34366,6 +34493,684 @@
     <w:basedOn w:val="VerbatimChar"/>
     <w:rPr/>
   </w:style>
+  <w:style w:customStyle="1" w:styleId="KeywordTok" w:type="character">
+    <w:name w:val="KeywordTok"/>
+    <w:basedOn w:val="VerbatimChar"/>
+    <w:rPr>
+      <w:b/>
+      <w:color w:val="007020"/>
+    </w:rPr>
+  </w:style>
+  <w:style w:customStyle="1" w:styleId="DataTypeTok" w:type="character">
+    <w:name w:val="DataTypeTok"/>
+    <w:basedOn w:val="VerbatimChar"/>
+    <w:rPr>
+      <w:color w:val="902000"/>
+    </w:rPr>
+  </w:style>
+  <w:style w:customStyle="1" w:styleId="DecValTok" w:type="character">
+    <w:name w:val="DecValTok"/>
+    <w:basedOn w:val="VerbatimChar"/>
+    <w:rPr>
+      <w:color w:val="40a070"/>
+    </w:rPr>
+  </w:style>
+  <w:style w:customStyle="1" w:styleId="BaseNTok" w:type="character">
+    <w:name w:val="BaseNTok"/>
+    <w:basedOn w:val="VerbatimChar"/>
+    <w:rPr>
+      <w:color w:val="40a070"/>
+    </w:rPr>
+  </w:style>
+  <w:style w:customStyle="1" w:styleId="FloatTok" w:type="character">
+    <w:name w:val="FloatTok"/>
+    <w:basedOn w:val="VerbatimChar"/>
+    <w:rPr>
+      <w:color w:val="40a070"/>
+    </w:rPr>
+  </w:style>
+  <w:style w:customStyle="1" w:styleId="ConstantTok" w:type="character">
+    <w:name w:val="ConstantTok"/>
+    <w:basedOn w:val="VerbatimChar"/>
+    <w:rPr>
+      <w:color w:val="880000"/>
+    </w:rPr>
+  </w:style>
+  <w:style w:customStyle="1" w:styleId="CharTok" w:type="character">
+    <w:name w:val="CharTok"/>
+    <w:basedOn w:val="VerbatimChar"/>
+    <w:rPr>
+      <w:color w:val="4070a0"/>
+    </w:rPr>
+  </w:style>
+  <w:style w:customStyle="1" w:styleId="SpecialCharTok" w:type="character">
+    <w:name w:val="SpecialCharTok"/>
+    <w:basedOn w:val="VerbatimChar"/>
+    <w:rPr>
+      <w:color w:val="4070a0"/>
+    </w:rPr>
+  </w:style>
+  <w:style w:customStyle="1" w:styleId="StringTok" w:type="character">
+    <w:name w:val="StringTok"/>
+    <w:basedOn w:val="VerbatimChar"/>
+    <w:rPr>
+      <w:color w:val="4070a0"/>
+    </w:rPr>
+  </w:style>
+  <w:style w:customStyle="1" w:styleId="VerbatimStringTok" w:type="character">
+    <w:name w:val="VerbatimStringTok"/>
+    <w:basedOn w:val="VerbatimChar"/>
+    <w:rPr>
+      <w:color w:val="4070a0"/>
+    </w:rPr>
+  </w:style>
+  <w:style w:customStyle="1" w:styleId="SpecialStringTok" w:type="character">
+    <w:name w:val="SpecialStringTok"/>
+    <w:basedOn w:val="VerbatimChar"/>
+    <w:rPr>
+      <w:color w:val="bb6688"/>
+    </w:rPr>
+  </w:style>
+  <w:style w:customStyle="1" w:styleId="ImportTok" w:type="character">
+    <w:name w:val="ImportTok"/>
+    <w:basedOn w:val="VerbatimChar"/>
+    <w:rPr>
+      <w:b/>
+      <w:color w:val="008000"/>
+    </w:rPr>
+  </w:style>
+  <w:style w:customStyle="1" w:styleId="CommentTok" w:type="character">
+    <w:name w:val="CommentTok"/>
+    <w:basedOn w:val="VerbatimChar"/>
+    <w:rPr>
+      <w:i/>
+      <w:color w:val="60a0b0"/>
+    </w:rPr>
+  </w:style>
+  <w:style w:customStyle="1" w:styleId="DocumentationTok" w:type="character">
+    <w:name w:val="DocumentationTok"/>
+    <w:basedOn w:val="VerbatimChar"/>
+    <w:rPr>
+      <w:i/>
+      <w:color w:val="ba2121"/>
+    </w:rPr>
+  </w:style>
+  <w:style w:customStyle="1" w:styleId="AnnotationTok" w:type="character">
+    <w:name w:val="AnnotationTok"/>
+    <w:basedOn w:val="VerbatimChar"/>
+    <w:rPr>
+      <w:b/>
+      <w:i/>
+      <w:color w:val="60a0b0"/>
+    </w:rPr>
+  </w:style>
+  <w:style w:customStyle="1" w:styleId="CommentVarTok" w:type="character">
+    <w:name w:val="CommentVarTok"/>
+    <w:basedOn w:val="VerbatimChar"/>
+    <w:rPr>
+      <w:b/>
+      <w:i/>
+      <w:color w:val="60a0b0"/>
+    </w:rPr>
+  </w:style>
+  <w:style w:customStyle="1" w:styleId="OtherTok" w:type="character">
+    <w:name w:val="OtherTok"/>
+    <w:basedOn w:val="VerbatimChar"/>
+    <w:rPr>
+      <w:color w:val="007020"/>
+    </w:rPr>
+  </w:style>
+  <w:style w:customStyle="1" w:styleId="FunctionTok" w:type="character">
+    <w:name w:val="FunctionTok"/>
+    <w:basedOn w:val="VerbatimChar"/>
+    <w:rPr>
+      <w:color w:val="06287e"/>
+    </w:rPr>
+  </w:style>
+  <w:style w:customStyle="1" w:styleId="VariableTok" w:type="character">
+    <w:name w:val="VariableTok"/>
+    <w:basedOn w:val="VerbatimChar"/>
+    <w:rPr>
+      <w:color w:val="19177c"/>
+    </w:rPr>
+  </w:style>
+  <w:style w:customStyle="1" w:styleId="ControlFlowTok" w:type="character">
+    <w:name w:val="ControlFlowTok"/>
+    <w:basedOn w:val="VerbatimChar"/>
+    <w:rPr>
+      <w:b/>
+      <w:color w:val="007020"/>
+    </w:rPr>
+  </w:style>
+  <w:style w:customStyle="1" w:styleId="OperatorTok" w:type="character">
+    <w:name w:val="OperatorTok"/>
+    <w:basedOn w:val="VerbatimChar"/>
+    <w:rPr>
+      <w:color w:val="666666"/>
+    </w:rPr>
+  </w:style>
+  <w:style w:customStyle="1" w:styleId="BuiltInTok" w:type="character">
+    <w:name w:val="BuiltInTok"/>
+    <w:basedOn w:val="VerbatimChar"/>
+    <w:rPr>
+      <w:color w:val="008000"/>
+    </w:rPr>
+  </w:style>
+  <w:style w:customStyle="1" w:styleId="ExtensionTok" w:type="character">
+    <w:name w:val="ExtensionTok"/>
+    <w:basedOn w:val="VerbatimChar"/>
+    <w:rPr/>
+  </w:style>
+  <w:style w:customStyle="1" w:styleId="PreprocessorTok" w:type="character">
+    <w:name w:val="PreprocessorTok"/>
+    <w:basedOn w:val="VerbatimChar"/>
+    <w:rPr>
+      <w:color w:val="bc7a00"/>
+    </w:rPr>
+  </w:style>
+  <w:style w:customStyle="1" w:styleId="AttributeTok" w:type="character">
+    <w:name w:val="AttributeTok"/>
+    <w:basedOn w:val="VerbatimChar"/>
+    <w:rPr>
+      <w:color w:val="7d9029"/>
+    </w:rPr>
+  </w:style>
+  <w:style w:customStyle="1" w:styleId="RegionMarkerTok" w:type="character">
+    <w:name w:val="RegionMarkerTok"/>
+    <w:basedOn w:val="VerbatimChar"/>
+    <w:rPr/>
+  </w:style>
+  <w:style w:customStyle="1" w:styleId="InformationTok" w:type="character">
+    <w:name w:val="InformationTok"/>
+    <w:basedOn w:val="VerbatimChar"/>
+    <w:rPr>
+      <w:b/>
+      <w:i/>
+      <w:color w:val="60a0b0"/>
+    </w:rPr>
+  </w:style>
+  <w:style w:customStyle="1" w:styleId="WarningTok" w:type="character">
+    <w:name w:val="WarningTok"/>
+    <w:basedOn w:val="VerbatimChar"/>
+    <w:rPr>
+      <w:b/>
+      <w:i/>
+      <w:color w:val="60a0b0"/>
+    </w:rPr>
+  </w:style>
+  <w:style w:customStyle="1" w:styleId="AlertTok" w:type="character">
+    <w:name w:val="AlertTok"/>
+    <w:basedOn w:val="VerbatimChar"/>
+    <w:rPr>
+      <w:b/>
+      <w:color w:val="ff0000"/>
+    </w:rPr>
+  </w:style>
+  <w:style w:customStyle="1" w:styleId="ErrorTok" w:type="character">
+    <w:name w:val="ErrorTok"/>
+    <w:basedOn w:val="VerbatimChar"/>
+    <w:rPr>
+      <w:b/>
+      <w:color w:val="ff0000"/>
+    </w:rPr>
+  </w:style>
+  <w:style w:customStyle="1" w:styleId="NormalTok" w:type="character">
+    <w:name w:val="NormalTok"/>
+    <w:basedOn w:val="VerbatimChar"/>
+    <w:rPr/>
+  </w:style>
+  <w:style w:customStyle="1" w:styleId="KeywordTok" w:type="character">
+    <w:name w:val="KeywordTok"/>
+    <w:basedOn w:val="VerbatimChar"/>
+    <w:rPr>
+      <w:b/>
+      <w:color w:val="007020"/>
+    </w:rPr>
+  </w:style>
+  <w:style w:customStyle="1" w:styleId="DataTypeTok" w:type="character">
+    <w:name w:val="DataTypeTok"/>
+    <w:basedOn w:val="VerbatimChar"/>
+    <w:rPr>
+      <w:color w:val="902000"/>
+    </w:rPr>
+  </w:style>
+  <w:style w:customStyle="1" w:styleId="DecValTok" w:type="character">
+    <w:name w:val="DecValTok"/>
+    <w:basedOn w:val="VerbatimChar"/>
+    <w:rPr>
+      <w:color w:val="40a070"/>
+    </w:rPr>
+  </w:style>
+  <w:style w:customStyle="1" w:styleId="BaseNTok" w:type="character">
+    <w:name w:val="BaseNTok"/>
+    <w:basedOn w:val="VerbatimChar"/>
+    <w:rPr>
+      <w:color w:val="40a070"/>
+    </w:rPr>
+  </w:style>
+  <w:style w:customStyle="1" w:styleId="FloatTok" w:type="character">
+    <w:name w:val="FloatTok"/>
+    <w:basedOn w:val="VerbatimChar"/>
+    <w:rPr>
+      <w:color w:val="40a070"/>
+    </w:rPr>
+  </w:style>
+  <w:style w:customStyle="1" w:styleId="ConstantTok" w:type="character">
+    <w:name w:val="ConstantTok"/>
+    <w:basedOn w:val="VerbatimChar"/>
+    <w:rPr>
+      <w:color w:val="880000"/>
+    </w:rPr>
+  </w:style>
+  <w:style w:customStyle="1" w:styleId="CharTok" w:type="character">
+    <w:name w:val="CharTok"/>
+    <w:basedOn w:val="VerbatimChar"/>
+    <w:rPr>
+      <w:color w:val="4070a0"/>
+    </w:rPr>
+  </w:style>
+  <w:style w:customStyle="1" w:styleId="SpecialCharTok" w:type="character">
+    <w:name w:val="SpecialCharTok"/>
+    <w:basedOn w:val="VerbatimChar"/>
+    <w:rPr>
+      <w:color w:val="4070a0"/>
+    </w:rPr>
+  </w:style>
+  <w:style w:customStyle="1" w:styleId="StringTok" w:type="character">
+    <w:name w:val="StringTok"/>
+    <w:basedOn w:val="VerbatimChar"/>
+    <w:rPr>
+      <w:color w:val="4070a0"/>
+    </w:rPr>
+  </w:style>
+  <w:style w:customStyle="1" w:styleId="VerbatimStringTok" w:type="character">
+    <w:name w:val="VerbatimStringTok"/>
+    <w:basedOn w:val="VerbatimChar"/>
+    <w:rPr>
+      <w:color w:val="4070a0"/>
+    </w:rPr>
+  </w:style>
+  <w:style w:customStyle="1" w:styleId="SpecialStringTok" w:type="character">
+    <w:name w:val="SpecialStringTok"/>
+    <w:basedOn w:val="VerbatimChar"/>
+    <w:rPr>
+      <w:color w:val="bb6688"/>
+    </w:rPr>
+  </w:style>
+  <w:style w:customStyle="1" w:styleId="ImportTok" w:type="character">
+    <w:name w:val="ImportTok"/>
+    <w:basedOn w:val="VerbatimChar"/>
+    <w:rPr>
+      <w:b/>
+      <w:color w:val="008000"/>
+    </w:rPr>
+  </w:style>
+  <w:style w:customStyle="1" w:styleId="CommentTok" w:type="character">
+    <w:name w:val="CommentTok"/>
+    <w:basedOn w:val="VerbatimChar"/>
+    <w:rPr>
+      <w:i/>
+      <w:color w:val="60a0b0"/>
+    </w:rPr>
+  </w:style>
+  <w:style w:customStyle="1" w:styleId="DocumentationTok" w:type="character">
+    <w:name w:val="DocumentationTok"/>
+    <w:basedOn w:val="VerbatimChar"/>
+    <w:rPr>
+      <w:i/>
+      <w:color w:val="ba2121"/>
+    </w:rPr>
+  </w:style>
+  <w:style w:customStyle="1" w:styleId="AnnotationTok" w:type="character">
+    <w:name w:val="AnnotationTok"/>
+    <w:basedOn w:val="VerbatimChar"/>
+    <w:rPr>
+      <w:b/>
+      <w:i/>
+      <w:color w:val="60a0b0"/>
+    </w:rPr>
+  </w:style>
+  <w:style w:customStyle="1" w:styleId="CommentVarTok" w:type="character">
+    <w:name w:val="CommentVarTok"/>
+    <w:basedOn w:val="VerbatimChar"/>
+    <w:rPr>
+      <w:b/>
+      <w:i/>
+      <w:color w:val="60a0b0"/>
+    </w:rPr>
+  </w:style>
+  <w:style w:customStyle="1" w:styleId="OtherTok" w:type="character">
+    <w:name w:val="OtherTok"/>
+    <w:basedOn w:val="VerbatimChar"/>
+    <w:rPr>
+      <w:color w:val="007020"/>
+    </w:rPr>
+  </w:style>
+  <w:style w:customStyle="1" w:styleId="FunctionTok" w:type="character">
+    <w:name w:val="FunctionTok"/>
+    <w:basedOn w:val="VerbatimChar"/>
+    <w:rPr>
+      <w:color w:val="06287e"/>
+    </w:rPr>
+  </w:style>
+  <w:style w:customStyle="1" w:styleId="VariableTok" w:type="character">
+    <w:name w:val="VariableTok"/>
+    <w:basedOn w:val="VerbatimChar"/>
+    <w:rPr>
+      <w:color w:val="19177c"/>
+    </w:rPr>
+  </w:style>
+  <w:style w:customStyle="1" w:styleId="ControlFlowTok" w:type="character">
+    <w:name w:val="ControlFlowTok"/>
+    <w:basedOn w:val="VerbatimChar"/>
+    <w:rPr>
+      <w:b/>
+      <w:color w:val="007020"/>
+    </w:rPr>
+  </w:style>
+  <w:style w:customStyle="1" w:styleId="OperatorTok" w:type="character">
+    <w:name w:val="OperatorTok"/>
+    <w:basedOn w:val="VerbatimChar"/>
+    <w:rPr>
+      <w:color w:val="666666"/>
+    </w:rPr>
+  </w:style>
+  <w:style w:customStyle="1" w:styleId="BuiltInTok" w:type="character">
+    <w:name w:val="BuiltInTok"/>
+    <w:basedOn w:val="VerbatimChar"/>
+    <w:rPr>
+      <w:color w:val="008000"/>
+    </w:rPr>
+  </w:style>
+  <w:style w:customStyle="1" w:styleId="ExtensionTok" w:type="character">
+    <w:name w:val="ExtensionTok"/>
+    <w:basedOn w:val="VerbatimChar"/>
+    <w:rPr/>
+  </w:style>
+  <w:style w:customStyle="1" w:styleId="PreprocessorTok" w:type="character">
+    <w:name w:val="PreprocessorTok"/>
+    <w:basedOn w:val="VerbatimChar"/>
+    <w:rPr>
+      <w:color w:val="bc7a00"/>
+    </w:rPr>
+  </w:style>
+  <w:style w:customStyle="1" w:styleId="AttributeTok" w:type="character">
+    <w:name w:val="AttributeTok"/>
+    <w:basedOn w:val="VerbatimChar"/>
+    <w:rPr>
+      <w:color w:val="7d9029"/>
+    </w:rPr>
+  </w:style>
+  <w:style w:customStyle="1" w:styleId="RegionMarkerTok" w:type="character">
+    <w:name w:val="RegionMarkerTok"/>
+    <w:basedOn w:val="VerbatimChar"/>
+    <w:rPr/>
+  </w:style>
+  <w:style w:customStyle="1" w:styleId="InformationTok" w:type="character">
+    <w:name w:val="InformationTok"/>
+    <w:basedOn w:val="VerbatimChar"/>
+    <w:rPr>
+      <w:b/>
+      <w:i/>
+      <w:color w:val="60a0b0"/>
+    </w:rPr>
+  </w:style>
+  <w:style w:customStyle="1" w:styleId="WarningTok" w:type="character">
+    <w:name w:val="WarningTok"/>
+    <w:basedOn w:val="VerbatimChar"/>
+    <w:rPr>
+      <w:b/>
+      <w:i/>
+      <w:color w:val="60a0b0"/>
+    </w:rPr>
+  </w:style>
+  <w:style w:customStyle="1" w:styleId="AlertTok" w:type="character">
+    <w:name w:val="AlertTok"/>
+    <w:basedOn w:val="VerbatimChar"/>
+    <w:rPr>
+      <w:b/>
+      <w:color w:val="ff0000"/>
+    </w:rPr>
+  </w:style>
+  <w:style w:customStyle="1" w:styleId="ErrorTok" w:type="character">
+    <w:name w:val="ErrorTok"/>
+    <w:basedOn w:val="VerbatimChar"/>
+    <w:rPr>
+      <w:b/>
+      <w:color w:val="ff0000"/>
+    </w:rPr>
+  </w:style>
+  <w:style w:customStyle="1" w:styleId="NormalTok" w:type="character">
+    <w:name w:val="NormalTok"/>
+    <w:basedOn w:val="VerbatimChar"/>
+    <w:rPr/>
+  </w:style>
+  <w:style w:customStyle="1" w:styleId="KeywordTok" w:type="character">
+    <w:name w:val="KeywordTok"/>
+    <w:basedOn w:val="VerbatimChar"/>
+    <w:rPr>
+      <w:b/>
+      <w:color w:val="007020"/>
+    </w:rPr>
+  </w:style>
+  <w:style w:customStyle="1" w:styleId="DataTypeTok" w:type="character">
+    <w:name w:val="DataTypeTok"/>
+    <w:basedOn w:val="VerbatimChar"/>
+    <w:rPr>
+      <w:color w:val="902000"/>
+    </w:rPr>
+  </w:style>
+  <w:style w:customStyle="1" w:styleId="DecValTok" w:type="character">
+    <w:name w:val="DecValTok"/>
+    <w:basedOn w:val="VerbatimChar"/>
+    <w:rPr>
+      <w:color w:val="40a070"/>
+    </w:rPr>
+  </w:style>
+  <w:style w:customStyle="1" w:styleId="BaseNTok" w:type="character">
+    <w:name w:val="BaseNTok"/>
+    <w:basedOn w:val="VerbatimChar"/>
+    <w:rPr>
+      <w:color w:val="40a070"/>
+    </w:rPr>
+  </w:style>
+  <w:style w:customStyle="1" w:styleId="FloatTok" w:type="character">
+    <w:name w:val="FloatTok"/>
+    <w:basedOn w:val="VerbatimChar"/>
+    <w:rPr>
+      <w:color w:val="40a070"/>
+    </w:rPr>
+  </w:style>
+  <w:style w:customStyle="1" w:styleId="ConstantTok" w:type="character">
+    <w:name w:val="ConstantTok"/>
+    <w:basedOn w:val="VerbatimChar"/>
+    <w:rPr>
+      <w:color w:val="880000"/>
+    </w:rPr>
+  </w:style>
+  <w:style w:customStyle="1" w:styleId="CharTok" w:type="character">
+    <w:name w:val="CharTok"/>
+    <w:basedOn w:val="VerbatimChar"/>
+    <w:rPr>
+      <w:color w:val="4070a0"/>
+    </w:rPr>
+  </w:style>
+  <w:style w:customStyle="1" w:styleId="SpecialCharTok" w:type="character">
+    <w:name w:val="SpecialCharTok"/>
+    <w:basedOn w:val="VerbatimChar"/>
+    <w:rPr>
+      <w:color w:val="4070a0"/>
+    </w:rPr>
+  </w:style>
+  <w:style w:customStyle="1" w:styleId="StringTok" w:type="character">
+    <w:name w:val="StringTok"/>
+    <w:basedOn w:val="VerbatimChar"/>
+    <w:rPr>
+      <w:color w:val="4070a0"/>
+    </w:rPr>
+  </w:style>
+  <w:style w:customStyle="1" w:styleId="VerbatimStringTok" w:type="character">
+    <w:name w:val="VerbatimStringTok"/>
+    <w:basedOn w:val="VerbatimChar"/>
+    <w:rPr>
+      <w:color w:val="4070a0"/>
+    </w:rPr>
+  </w:style>
+  <w:style w:customStyle="1" w:styleId="SpecialStringTok" w:type="character">
+    <w:name w:val="SpecialStringTok"/>
+    <w:basedOn w:val="VerbatimChar"/>
+    <w:rPr>
+      <w:color w:val="bb6688"/>
+    </w:rPr>
+  </w:style>
+  <w:style w:customStyle="1" w:styleId="ImportTok" w:type="character">
+    <w:name w:val="ImportTok"/>
+    <w:basedOn w:val="VerbatimChar"/>
+    <w:rPr>
+      <w:b/>
+      <w:color w:val="008000"/>
+    </w:rPr>
+  </w:style>
+  <w:style w:customStyle="1" w:styleId="CommentTok" w:type="character">
+    <w:name w:val="CommentTok"/>
+    <w:basedOn w:val="VerbatimChar"/>
+    <w:rPr>
+      <w:i/>
+      <w:color w:val="60a0b0"/>
+    </w:rPr>
+  </w:style>
+  <w:style w:customStyle="1" w:styleId="DocumentationTok" w:type="character">
+    <w:name w:val="DocumentationTok"/>
+    <w:basedOn w:val="VerbatimChar"/>
+    <w:rPr>
+      <w:i/>
+      <w:color w:val="ba2121"/>
+    </w:rPr>
+  </w:style>
+  <w:style w:customStyle="1" w:styleId="AnnotationTok" w:type="character">
+    <w:name w:val="AnnotationTok"/>
+    <w:basedOn w:val="VerbatimChar"/>
+    <w:rPr>
+      <w:b/>
+      <w:i/>
+      <w:color w:val="60a0b0"/>
+    </w:rPr>
+  </w:style>
+  <w:style w:customStyle="1" w:styleId="CommentVarTok" w:type="character">
+    <w:name w:val="CommentVarTok"/>
+    <w:basedOn w:val="VerbatimChar"/>
+    <w:rPr>
+      <w:b/>
+      <w:i/>
+      <w:color w:val="60a0b0"/>
+    </w:rPr>
+  </w:style>
+  <w:style w:customStyle="1" w:styleId="OtherTok" w:type="character">
+    <w:name w:val="OtherTok"/>
+    <w:basedOn w:val="VerbatimChar"/>
+    <w:rPr>
+      <w:color w:val="007020"/>
+    </w:rPr>
+  </w:style>
+  <w:style w:customStyle="1" w:styleId="FunctionTok" w:type="character">
+    <w:name w:val="FunctionTok"/>
+    <w:basedOn w:val="VerbatimChar"/>
+    <w:rPr>
+      <w:color w:val="06287e"/>
+    </w:rPr>
+  </w:style>
+  <w:style w:customStyle="1" w:styleId="VariableTok" w:type="character">
+    <w:name w:val="VariableTok"/>
+    <w:basedOn w:val="VerbatimChar"/>
+    <w:rPr>
+      <w:color w:val="19177c"/>
+    </w:rPr>
+  </w:style>
+  <w:style w:customStyle="1" w:styleId="ControlFlowTok" w:type="character">
+    <w:name w:val="ControlFlowTok"/>
+    <w:basedOn w:val="VerbatimChar"/>
+    <w:rPr>
+      <w:b/>
+      <w:color w:val="007020"/>
+    </w:rPr>
+  </w:style>
+  <w:style w:customStyle="1" w:styleId="OperatorTok" w:type="character">
+    <w:name w:val="OperatorTok"/>
+    <w:basedOn w:val="VerbatimChar"/>
+    <w:rPr>
+      <w:color w:val="666666"/>
+    </w:rPr>
+  </w:style>
+  <w:style w:customStyle="1" w:styleId="BuiltInTok" w:type="character">
+    <w:name w:val="BuiltInTok"/>
+    <w:basedOn w:val="VerbatimChar"/>
+    <w:rPr>
+      <w:color w:val="008000"/>
+    </w:rPr>
+  </w:style>
+  <w:style w:customStyle="1" w:styleId="ExtensionTok" w:type="character">
+    <w:name w:val="ExtensionTok"/>
+    <w:basedOn w:val="VerbatimChar"/>
+    <w:rPr/>
+  </w:style>
+  <w:style w:customStyle="1" w:styleId="PreprocessorTok" w:type="character">
+    <w:name w:val="PreprocessorTok"/>
+    <w:basedOn w:val="VerbatimChar"/>
+    <w:rPr>
+      <w:color w:val="bc7a00"/>
+    </w:rPr>
+  </w:style>
+  <w:style w:customStyle="1" w:styleId="AttributeTok" w:type="character">
+    <w:name w:val="AttributeTok"/>
+    <w:basedOn w:val="VerbatimChar"/>
+    <w:rPr>
+      <w:color w:val="7d9029"/>
+    </w:rPr>
+  </w:style>
+  <w:style w:customStyle="1" w:styleId="RegionMarkerTok" w:type="character">
+    <w:name w:val="RegionMarkerTok"/>
+    <w:basedOn w:val="VerbatimChar"/>
+    <w:rPr/>
+  </w:style>
+  <w:style w:customStyle="1" w:styleId="InformationTok" w:type="character">
+    <w:name w:val="InformationTok"/>
+    <w:basedOn w:val="VerbatimChar"/>
+    <w:rPr>
+      <w:b/>
+      <w:i/>
+      <w:color w:val="60a0b0"/>
+    </w:rPr>
+  </w:style>
+  <w:style w:customStyle="1" w:styleId="WarningTok" w:type="character">
+    <w:name w:val="WarningTok"/>
+    <w:basedOn w:val="VerbatimChar"/>
+    <w:rPr>
+      <w:b/>
+      <w:i/>
+      <w:color w:val="60a0b0"/>
+    </w:rPr>
+  </w:style>
+  <w:style w:customStyle="1" w:styleId="AlertTok" w:type="character">
+    <w:name w:val="AlertTok"/>
+    <w:basedOn w:val="VerbatimChar"/>
+    <w:rPr>
+      <w:b/>
+      <w:color w:val="ff0000"/>
+    </w:rPr>
+  </w:style>
+  <w:style w:customStyle="1" w:styleId="ErrorTok" w:type="character">
+    <w:name w:val="ErrorTok"/>
+    <w:basedOn w:val="VerbatimChar"/>
+    <w:rPr>
+      <w:b/>
+      <w:color w:val="ff0000"/>
+    </w:rPr>
+  </w:style>
+  <w:style w:customStyle="1" w:styleId="NormalTok" w:type="character">
+    <w:name w:val="NormalTok"/>
+    <w:basedOn w:val="VerbatimChar"/>
+    <w:rPr/>
+  </w:style>
   <w:style w:type="character" w:customStyle="1" w:styleId="KeywordTok">
     <w:name w:val="KeywordTok"/>
     <w:basedOn w:val="VerbatimChar"/>

</xml_diff>

<commit_message>
Add checklist when creating a task; Add Work opens on Task for me
- Add Work: "Task for me" is the default and first option; it shows an
  optional Checklist (add/remove steps) and an "Add to my tasks" button.
  "Ask Chenda" keeps the request flow without a checklist
- Incoming Queue: "Make a Task" panel lets the lead add checklist steps
- Blueprint: rule that whoever creates a Task can add checklist steps
  (requests have none); Add Work starts on Task for me; docx rebuilt

Co-Authored-By: Claude Opus 5.5 <noreply@anthropic.com>
</commit_message>
<xml_diff>
--- a/docs/HopFlows_Product_Blueprint_v1.1.docx
+++ b/docs/HopFlows_Product_Blueprint_v1.1.docx
@@ -2,7 +2,7 @@
 <file path=word/document.xml><?xml version="1.0" encoding="utf-8"?>
 <w:document xmlns:w="http://schemas.openxmlformats.org/wordprocessingml/2006/main" xmlns:m="http://schemas.openxmlformats.org/officeDocument/2006/math" xmlns:r="http://schemas.openxmlformats.org/officeDocument/2006/relationships" xmlns:o="urn:schemas-microsoft-com:office:office" xmlns:v="urn:schemas-microsoft-com:vml" xmlns:w10="urn:schemas-microsoft-com:office:word" xmlns:a="http://schemas.openxmlformats.org/drawingml/2006/main" xmlns:pic="http://schemas.openxmlformats.org/drawingml/2006/picture" xmlns:wp="http://schemas.openxmlformats.org/drawingml/2006/wordprocessingDrawing">
   <w:body>
-    <w:bookmarkStart w:id="987" w:name="hopflows-product-blueprint"/>
+    <w:bookmarkStart w:id="1283" w:name="hopflows-product-blueprint"/>
     <w:p>
       <w:pPr>
         <w:pStyle w:val="Heading1"/>
@@ -127,7 +127,7 @@
         <w:t xml:space="preserve">For the people who plan the product, design it, build it and roll it out.</w:t>
       </w:r>
     </w:p>
-    <w:bookmarkStart w:id="984" w:name="about-this-blueprint"/>
+    <w:bookmarkStart w:id="1280" w:name="about-this-blueprint"/>
     <w:p>
       <w:pPr>
         <w:pStyle w:val="Heading2"/>
@@ -375,8 +375,8 @@
         <w:t xml:space="preserve">are new in v1.1 and still need a yes or no. The change log at the end lists what changed.</w:t>
       </w:r>
     </w:p>
-    <w:bookmarkEnd w:id="984"/>
-    <w:bookmarkStart w:id="985" w:name="the-big-idea"/>
+    <w:bookmarkEnd w:id="1280"/>
+    <w:bookmarkStart w:id="1281" w:name="the-big-idea"/>
     <w:p>
       <w:pPr>
         <w:pStyle w:val="Heading2"/>
@@ -405,8 +405,8 @@
         <w:t xml:space="preserve">Leaders care about results. Team leads care about getting work done and how busy their team is. Employees care about what to do next. Planned work and surprise work both count, without extra paperwork.</w:t>
       </w:r>
     </w:p>
-    <w:bookmarkEnd w:id="985"/>
-    <w:bookmarkStart w:id="986" w:name="decisions-already-made"/>
+    <w:bookmarkEnd w:id="1281"/>
+    <w:bookmarkStart w:id="1282" w:name="decisions-already-made"/>
     <w:p>
       <w:pPr>
         <w:pStyle w:val="Heading2"/>
@@ -628,9 +628,9 @@
         <w:t xml:space="preserve">The app keeps working when the internet is weak: people can add and update work offline, and they can find anything with one search. (Proposed)</w:t>
       </w:r>
     </w:p>
-    <w:bookmarkEnd w:id="986"/>
-    <w:bookmarkEnd w:id="987"/>
-    <w:bookmarkStart w:id="991" w:name="summary"/>
+    <w:bookmarkEnd w:id="1282"/>
+    <w:bookmarkEnd w:id="1283"/>
+    <w:bookmarkStart w:id="1287" w:name="summary"/>
     <w:p>
       <w:pPr>
         <w:pStyle w:val="Heading1"/>
@@ -639,7 +639,7 @@
         <w:t xml:space="preserve">01 Summary</w:t>
       </w:r>
     </w:p>
-    <w:bookmarkStart w:id="988" w:name="the-problem"/>
+    <w:bookmarkStart w:id="1284" w:name="the-problem"/>
     <w:p>
       <w:pPr>
         <w:pStyle w:val="Heading2"/>
@@ -656,8 +656,8 @@
         <w:t xml:space="preserve">Many teams don’t use task apps because the lists get too long, updating them feels like extra work, screens show too much, and work done outside the app never shows up in the plan. One complicated screen also can’t serve employees, team leads and bosses equally well.</w:t>
       </w:r>
     </w:p>
-    <w:bookmarkEnd w:id="988"/>
-    <w:bookmarkStart w:id="989" w:name="how-hopflows-answers-it"/>
+    <w:bookmarkEnd w:id="1284"/>
+    <w:bookmarkStart w:id="1285" w:name="how-hopflows-answers-it"/>
     <w:p>
       <w:pPr>
         <w:pStyle w:val="Heading2"/>
@@ -878,8 +878,8 @@
         </w:tc>
       </w:tr>
     </w:tbl>
-    <w:bookmarkEnd w:id="989"/>
-    <w:bookmarkStart w:id="990" w:name="in-one-sentence"/>
+    <w:bookmarkEnd w:id="1285"/>
+    <w:bookmarkStart w:id="1286" w:name="in-one-sentence"/>
     <w:p>
       <w:pPr>
         <w:pStyle w:val="Heading2"/>
@@ -908,9 +908,9 @@
         <w:t xml:space="preserve">A simple task app that makes work easy for employees, clear for managers and measurable for leaders, without making task tracking feel like another job.</w:t>
       </w:r>
     </w:p>
-    <w:bookmarkEnd w:id="990"/>
-    <w:bookmarkEnd w:id="991"/>
-    <w:bookmarkStart w:id="994" w:name="how-the-pieces-fit-together"/>
+    <w:bookmarkEnd w:id="1286"/>
+    <w:bookmarkEnd w:id="1287"/>
+    <w:bookmarkStart w:id="1290" w:name="how-the-pieces-fit-together"/>
     <w:p>
       <w:pPr>
         <w:pStyle w:val="Heading1"/>
@@ -1081,7 +1081,7 @@
         <w:t xml:space="preserve">Figure 1. Three parts of a company linked to one system for work and reports.</w:t>
       </w:r>
     </w:p>
-    <w:bookmarkStart w:id="992" w:name="linked-not-stacked"/>
+    <w:bookmarkStart w:id="1288" w:name="linked-not-stacked"/>
     <w:p>
       <w:pPr>
         <w:pStyle w:val="Heading2"/>
@@ -1098,8 +1098,8 @@
         <w:t xml:space="preserve">Don’t force everything into one tree. One Goal can help several products. One Deliverable can involve several departments. One person can be in several teams. HopFlows links these things instead of stacking them, and still keeps one clear owner for each Goal, Deliverable and active Task.</w:t>
       </w:r>
     </w:p>
-    <w:bookmarkEnd w:id="992"/>
-    <w:bookmarkStart w:id="993" w:name="Xd518698a0b64a922415221525837e1dabd77edc"/>
+    <w:bookmarkEnd w:id="1288"/>
+    <w:bookmarkStart w:id="1289" w:name="Xd518698a0b64a922415221525837e1dabd77edc"/>
     <w:p>
       <w:pPr>
         <w:pStyle w:val="Heading2"/>
@@ -1342,9 +1342,9 @@
         <w:t xml:space="preserve">that never end and fill up with unrelated work.</w:t>
       </w:r>
     </w:p>
-    <w:bookmarkEnd w:id="993"/>
-    <w:bookmarkEnd w:id="994"/>
-    <w:bookmarkStart w:id="997" w:name="main-words-we-use"/>
+    <w:bookmarkEnd w:id="1289"/>
+    <w:bookmarkEnd w:id="1290"/>
+    <w:bookmarkStart w:id="1293" w:name="main-words-we-use"/>
     <w:p>
       <w:pPr>
         <w:pStyle w:val="Heading1"/>
@@ -1778,7 +1778,7 @@
         </w:tc>
       </w:tr>
     </w:tbl>
-    <w:bookmarkStart w:id="995" w:name="words-on-screen"/>
+    <w:bookmarkStart w:id="1291" w:name="words-on-screen"/>
     <w:p>
       <w:pPr>
         <w:pStyle w:val="Heading2"/>
@@ -1836,7 +1836,36 @@
         <w:t xml:space="preserve"> </w:t>
       </w:r>
       <w:r>
-        <w:t xml:space="preserve">(it opens the Quick Capture screen). Leads see new requests in the</w:t>
+        <w:t xml:space="preserve">(it opens the Quick Capture screen). It starts on</w:t>
+      </w:r>
+      <w:r>
+        <w:t xml:space="preserve"> </w:t>
+      </w:r>
+      <w:r>
+        <w:rPr>
+          <w:b/>
+          <w:bCs/>
+        </w:rPr>
+        <w:t xml:space="preserve">Task for me</w:t>
+      </w:r>
+      <w:r>
+        <w:t xml:space="preserve">, because most of what employees add is their own work;</w:t>
+      </w:r>
+      <w:r>
+        <w:t xml:space="preserve"> </w:t>
+      </w:r>
+      <w:r>
+        <w:rPr>
+          <w:b/>
+          <w:bCs/>
+        </w:rPr>
+        <w:t xml:space="preserve">Ask</w:t>
+      </w:r>
+      <w:r>
+        <w:t xml:space="preserve"> </w:t>
+      </w:r>
+      <w:r>
+        <w:t xml:space="preserve">their lead sends a request instead. Leads see new requests in the</w:t>
       </w:r>
       <w:r>
         <w:t xml:space="preserve"> </w:t>
@@ -1933,8 +1962,8 @@
         <w:t xml:space="preserve">only for checking finished work.</w:t>
       </w:r>
     </w:p>
-    <w:bookmarkEnd w:id="995"/>
-    <w:bookmarkStart w:id="996" w:name="words-about-time"/>
+    <w:bookmarkEnd w:id="1291"/>
+    <w:bookmarkStart w:id="1292" w:name="words-about-time"/>
     <w:p>
       <w:pPr>
         <w:pStyle w:val="Heading2"/>
@@ -2215,9 +2244,9 @@
         </w:tc>
       </w:tr>
     </w:tbl>
-    <w:bookmarkEnd w:id="996"/>
-    <w:bookmarkEnd w:id="997"/>
-    <w:bookmarkStart w:id="1008" w:name="business-rules"/>
+    <w:bookmarkEnd w:id="1292"/>
+    <w:bookmarkEnd w:id="1293"/>
+    <w:bookmarkStart w:id="1304" w:name="business-rules"/>
     <w:p>
       <w:pPr>
         <w:pStyle w:val="Heading1"/>
@@ -2243,7 +2272,7 @@
         <w:t xml:space="preserve">) shows how they are built.</w:t>
       </w:r>
     </w:p>
-    <w:bookmarkStart w:id="998" w:name="people-and-access"/>
+    <w:bookmarkStart w:id="1294" w:name="people-and-access"/>
     <w:p>
       <w:pPr>
         <w:pStyle w:val="Heading2"/>
@@ -2300,8 +2329,8 @@
         <w:t xml:space="preserve">A person can be in several departments, and each gets a share of their time. If no shares are set, their main department gets all of it. Leads can change the shares for a week.</w:t>
       </w:r>
     </w:p>
-    <w:bookmarkEnd w:id="998"/>
-    <w:bookmarkStart w:id="999" w:name="work"/>
+    <w:bookmarkEnd w:id="1294"/>
+    <w:bookmarkStart w:id="1295" w:name="work"/>
     <w:p>
       <w:pPr>
         <w:pStyle w:val="Heading2"/>
@@ -2439,7 +2468,7 @@
         </w:numPr>
       </w:pPr>
       <w:r>
-        <w:t xml:space="preserve">A Confidential Task can be seen only by its owner, its reviewer, its helpers, people given access, and company admins. Only the department lead and admins can give access.</w:t>
+        <w:t xml:space="preserve">Whoever creates a Task (with Task for me, or a lead making one from a request or a Deliverable) can add Checklist steps right away. Steps are optional; the owner can add, tick or remove them later. A request has no checklist: the lead adds steps if it becomes a Task. (Proposed)</w:t>
       </w:r>
     </w:p>
     <w:p>
@@ -2451,19 +2480,7 @@
         </w:numPr>
       </w:pPr>
       <w:r>
-        <w:t xml:space="preserve">A Task’s size can be Small, Medium or Large (the company decides how many hours each means) or a number of hours. A Task with no size is shown as</w:t>
-      </w:r>
-      <w:r>
-        <w:t xml:space="preserve"> </w:t>
-      </w:r>
-      <w:r>
-        <w:t xml:space="preserve">“No estimate”</w:t>
-      </w:r>
-      <w:r>
-        <w:t xml:space="preserve"> </w:t>
-      </w:r>
-      <w:r>
-        <w:t xml:space="preserve">and counted on its own.</w:t>
+        <w:t xml:space="preserve">A Confidential Task can be seen only by its owner, its reviewer, its helpers, people given access, and company admins. Only the department lead and admins can give access.</w:t>
       </w:r>
     </w:p>
     <w:p>
@@ -2475,7 +2492,19 @@
         </w:numPr>
       </w:pPr>
       <w:r>
-        <w:t xml:space="preserve">A Task can wait on other Tasks in the same company. HopFlows refuses a wait that goes round in a circle.</w:t>
+        <w:t xml:space="preserve">A Task’s size can be Small, Medium or Large (the company decides how many hours each means) or a number of hours. A Task with no size is shown as</w:t>
+      </w:r>
+      <w:r>
+        <w:t xml:space="preserve"> </w:t>
+      </w:r>
+      <w:r>
+        <w:t xml:space="preserve">“No estimate”</w:t>
+      </w:r>
+      <w:r>
+        <w:t xml:space="preserve"> </w:t>
+      </w:r>
+      <w:r>
+        <w:t xml:space="preserve">and counted on its own.</w:t>
       </w:r>
     </w:p>
     <w:p>
@@ -2487,11 +2516,23 @@
         </w:numPr>
       </w:pPr>
       <w:r>
+        <w:t xml:space="preserve">A Task can wait on other Tasks in the same company. HopFlows refuses a wait that goes round in a circle.</w:t>
+      </w:r>
+    </w:p>
+    <w:p>
+      <w:pPr>
+        <w:pStyle w:val="Compact"/>
+        <w:numPr>
+          <w:ilvl w:val="0"/>
+          <w:numId w:val="1006"/>
+        </w:numPr>
+      </w:pPr>
+      <w:r>
         <w:t xml:space="preserve">Kudos: one per person, per teammate, per item. You can’t give kudos to yourself. Kudos are never ranked.</w:t>
       </w:r>
     </w:p>
-    <w:bookmarkEnd w:id="999"/>
-    <w:bookmarkStart w:id="1000" w:name="new-requests"/>
+    <w:bookmarkEnd w:id="1295"/>
+    <w:bookmarkStart w:id="1296" w:name="new-requests"/>
     <w:p>
       <w:pPr>
         <w:pStyle w:val="Heading2"/>
@@ -2630,8 +2671,8 @@
         <w:t xml:space="preserve">.</w:t>
       </w:r>
     </w:p>
-    <w:bookmarkEnd w:id="1000"/>
-    <w:bookmarkStart w:id="1001" w:name="planning-and-time"/>
+    <w:bookmarkEnd w:id="1296"/>
+    <w:bookmarkStart w:id="1297" w:name="planning-and-time"/>
     <w:p>
       <w:pPr>
         <w:pStyle w:val="Heading2"/>
@@ -2772,8 +2813,8 @@
         <w:t xml:space="preserve">Repeating daily work reserves its time in each week, so the weekly plan and the Workload view include it before any project work is locked.</w:t>
       </w:r>
     </w:p>
-    <w:bookmarkEnd w:id="1001"/>
-    <w:bookmarkStart w:id="1002" w:name="leave-proposed"/>
+    <w:bookmarkEnd w:id="1297"/>
+    <w:bookmarkStart w:id="1298" w:name="leave-proposed"/>
     <w:p>
       <w:pPr>
         <w:pStyle w:val="Heading2"/>
@@ -2887,8 +2928,8 @@
         <w:t xml:space="preserve">HopFlows records leave only for planning. It doesn’t track how many leave days are left, or pay. That stays with the company’s HR process.</w:t>
       </w:r>
     </w:p>
-    <w:bookmarkEnd w:id="1002"/>
-    <w:bookmarkStart w:id="1003" w:name="repeating-daily-work-proposed"/>
+    <w:bookmarkEnd w:id="1298"/>
+    <w:bookmarkStart w:id="1299" w:name="repeating-daily-work-proposed"/>
     <w:p>
       <w:pPr>
         <w:pStyle w:val="Heading2"/>
@@ -3005,8 +3046,8 @@
         <w:t xml:space="preserve">Changing a routine changes only future days. Pausing a routine stops new days until it is turned back on.</w:t>
       </w:r>
     </w:p>
-    <w:bookmarkEnd w:id="1003"/>
-    <w:bookmarkStart w:id="1004" w:name="handover-and-risk"/>
+    <w:bookmarkEnd w:id="1299"/>
+    <w:bookmarkStart w:id="1300" w:name="handover-and-risk"/>
     <w:p>
       <w:pPr>
         <w:pStyle w:val="Heading2"/>
@@ -3075,8 +3116,8 @@
         <w:t xml:space="preserve">A flag can be cleared by the person who set it, the item’s owner, or leaders. A Goal owner can’t clear a flag set by leaders. When a Deliverable is accepted or cancelled, its flag closes. When a Deliverable moves to another Goal, its flag moves with it.</w:t>
       </w:r>
     </w:p>
-    <w:bookmarkEnd w:id="1004"/>
-    <w:bookmarkStart w:id="1005" w:name="calendar"/>
+    <w:bookmarkEnd w:id="1300"/>
+    <w:bookmarkStart w:id="1301" w:name="calendar"/>
     <w:p>
       <w:pPr>
         <w:pStyle w:val="Heading2"/>
@@ -3166,8 +3207,8 @@
         <w:t xml:space="preserve">Each person can set their own reminders for events.</w:t>
       </w:r>
     </w:p>
-    <w:bookmarkEnd w:id="1005"/>
-    <w:bookmarkStart w:id="1006" w:name="notifications"/>
+    <w:bookmarkEnd w:id="1301"/>
+    <w:bookmarkStart w:id="1302" w:name="notifications"/>
     <w:p>
       <w:pPr>
         <w:pStyle w:val="Heading2"/>
@@ -3284,8 +3325,8 @@
         <w:t xml:space="preserve">Messages are in English by default. When other languages are added, each company picks its default and each person can choose their own.</w:t>
       </w:r>
     </w:p>
-    <w:bookmarkEnd w:id="1006"/>
-    <w:bookmarkStart w:id="1007" w:name="reports-search-and-offline-proposed"/>
+    <w:bookmarkEnd w:id="1302"/>
+    <w:bookmarkStart w:id="1303" w:name="reports-search-and-offline-proposed"/>
     <w:p>
       <w:pPr>
         <w:pStyle w:val="Heading2"/>
@@ -3390,9 +3431,9 @@
         <w:t xml:space="preserve">rules, and is deleted when the person signs out or leaves the company.</w:t>
       </w:r>
     </w:p>
-    <w:bookmarkEnd w:id="1007"/>
-    <w:bookmarkEnd w:id="1008"/>
-    <w:bookmarkStart w:id="1010" w:name="how-things-connect"/>
+    <w:bookmarkEnd w:id="1303"/>
+    <w:bookmarkEnd w:id="1304"/>
+    <w:bookmarkStart w:id="1306" w:name="how-things-connect"/>
     <w:p>
       <w:pPr>
         <w:pStyle w:val="Heading1"/>
@@ -4409,7 +4450,7 @@
         </w:tc>
       </w:tr>
     </w:tbl>
-    <w:bookmarkStart w:id="1009" w:name="rules-that-never-change"/>
+    <w:bookmarkStart w:id="1305" w:name="rules-that-never-change"/>
     <w:p>
       <w:pPr>
         <w:pStyle w:val="Heading2"/>
@@ -4607,9 +4648,9 @@
         <w:t xml:space="preserve">A button pressed in a push alert or chat does the same thing as in the app, with the same permission check and history. Buttons work once and expire.</w:t>
       </w:r>
     </w:p>
-    <w:bookmarkEnd w:id="1009"/>
-    <w:bookmarkEnd w:id="1010"/>
-    <w:bookmarkStart w:id="1015" w:name="the-life-of-a-task"/>
+    <w:bookmarkEnd w:id="1305"/>
+    <w:bookmarkEnd w:id="1306"/>
+    <w:bookmarkStart w:id="1311" w:name="the-life-of-a-task"/>
     <w:p>
       <w:pPr>
         <w:pStyle w:val="Heading1"/>
@@ -4689,18 +4730,18 @@
           <wp:inline>
             <wp:extent cx="5486400" cy="4774556"/>
             <wp:effectExtent b="0" l="0" r="0" t="0"/>
-            <wp:docPr descr="Diagram" title="" id="1012" name="Picture"/>
+            <wp:docPr descr="Diagram" title="" id="1308" name="Picture"/>
             <a:graphic>
               <a:graphicData uri="http://schemas.openxmlformats.org/drawingml/2006/picture">
                 <pic:pic>
                   <pic:nvPicPr>
-                    <pic:cNvPr descr="/private/tmp/claude-502/-Users-keanghok-Desktop-work-startup-hopflows-docs/e4a4cd31-69eb-498d-a6e4-c32390abc3bb/scratchpad/mmd2/d01.png" id="1013" name="Picture"/>
+                    <pic:cNvPr descr="/private/tmp/claude-502/-Users-keanghok-Desktop-work-startup-hopflows-docs/e4a4cd31-69eb-498d-a6e4-c32390abc3bb/scratchpad/mmd2/d01.png" id="1309" name="Picture"/>
                     <pic:cNvPicPr>
                       <a:picLocks noChangeArrowheads="1" noChangeAspect="1"/>
                     </pic:cNvPicPr>
                   </pic:nvPicPr>
                   <pic:blipFill>
-                    <a:blip r:embed="rId1011"/>
+                    <a:blip r:embed="rId1307"/>
                     <a:stretch>
                       <a:fillRect/>
                     </a:stretch>
@@ -4735,7 +4776,7 @@
         <w:t xml:space="preserve">Figure 2. The life of a Task. Blocked and Need Help are markers on a Task, not steps. Missed is only for repeating daily work.</w:t>
       </w:r>
     </w:p>
-    <w:bookmarkStart w:id="1014" w:name="buttons-employees-use"/>
+    <w:bookmarkStart w:id="1310" w:name="buttons-employees-use"/>
     <w:p>
       <w:pPr>
         <w:pStyle w:val="Heading2"/>
@@ -4959,9 +5000,9 @@
         </w:tc>
       </w:tr>
     </w:tbl>
-    <w:bookmarkEnd w:id="1014"/>
-    <w:bookmarkEnd w:id="1015"/>
-    <w:bookmarkStart w:id="1021" w:name="planned-and-unplanned-work"/>
+    <w:bookmarkEnd w:id="1310"/>
+    <w:bookmarkEnd w:id="1311"/>
+    <w:bookmarkStart w:id="1317" w:name="planned-and-unplanned-work"/>
     <w:p>
       <w:pPr>
         <w:pStyle w:val="Heading1"/>
@@ -5088,7 +5129,7 @@
         <w:t xml:space="preserve">Figure 3. Two ways in, one way to do the work.</w:t>
       </w:r>
     </w:p>
-    <w:bookmarkStart w:id="1016" w:name="three-separate-labels"/>
+    <w:bookmarkStart w:id="1312" w:name="three-separate-labels"/>
     <w:p>
       <w:pPr>
         <w:pStyle w:val="Heading2"/>
@@ -5285,8 +5326,8 @@
         <w:t xml:space="preserve">depends on a particular week, so the same Task can be added in one week and planned in the next.</w:t>
       </w:r>
     </w:p>
-    <w:bookmarkEnd w:id="1016"/>
-    <w:bookmarkStart w:id="1020" w:name="the-locking-rule"/>
+    <w:bookmarkEnd w:id="1312"/>
+    <w:bookmarkStart w:id="1316" w:name="the-locking-rule"/>
     <w:p>
       <w:pPr>
         <w:pStyle w:val="Heading2"/>
@@ -5315,7 +5356,7 @@
         <w:t xml:space="preserve">When the lead locks a week, HopFlows saves a copy of the planned work, the estimates and the owners. The live plan can still change, but reports always compare what really happened with that saved copy.</w:t>
       </w:r>
     </w:p>
-    <w:bookmarkStart w:id="1017" w:name="example-something-urgent-arrives-midweek"/>
+    <w:bookmarkStart w:id="1313" w:name="example-something-urgent-arrives-midweek"/>
     <w:p>
       <w:pPr>
         <w:pStyle w:val="Heading3"/>
@@ -5380,8 +5421,8 @@
         <w:t xml:space="preserve">If the same request is planned into next week, it counts as planned there, and HopFlows still remembers it started as a surprise.</w:t>
       </w:r>
     </w:p>
-    <w:bookmarkEnd w:id="1017"/>
-    <w:bookmarkStart w:id="1018" w:name="X6546010788123f30940adaa831be091dcf8e07f"/>
+    <w:bookmarkEnd w:id="1313"/>
+    <w:bookmarkStart w:id="1314" w:name="X6546010788123f30940adaa831be091dcf8e07f"/>
     <w:p>
       <w:pPr>
         <w:pStyle w:val="Heading3"/>
@@ -5410,8 +5451,8 @@
         <w:t xml:space="preserve">and appear in the weekly review. The lead can remove them before locking the new week. If a week is never locked, there is no saved plan: all its work counts as unplanned, and the weekly review points out that the week wasn’t locked.</w:t>
       </w:r>
     </w:p>
-    <w:bookmarkEnd w:id="1018"/>
-    <w:bookmarkStart w:id="1019" w:name="repeating-daily-work-in-the-plan"/>
+    <w:bookmarkEnd w:id="1314"/>
+    <w:bookmarkStart w:id="1315" w:name="repeating-daily-work-in-the-plan"/>
     <w:p>
       <w:pPr>
         <w:pStyle w:val="Heading3"/>
@@ -5428,10 +5469,10 @@
         <w:t xml:space="preserve">When the lead locks a week, that week’s routines are included automatically, so the plan, the Workload view and the reports all include routine time. A routine created after the week is locked counts as added work.</w:t>
       </w:r>
     </w:p>
-    <w:bookmarkEnd w:id="1019"/>
-    <w:bookmarkEnd w:id="1020"/>
-    <w:bookmarkEnd w:id="1021"/>
-    <w:bookmarkStart w:id="1065" w:name="step-by-step-flows"/>
+    <w:bookmarkEnd w:id="1315"/>
+    <w:bookmarkEnd w:id="1316"/>
+    <w:bookmarkEnd w:id="1317"/>
+    <w:bookmarkStart w:id="1361" w:name="step-by-step-flows"/>
     <w:p>
       <w:pPr>
         <w:pStyle w:val="Heading1"/>
@@ -5457,18 +5498,18 @@
           <wp:inline>
             <wp:extent cx="1956816" cy="7760608"/>
             <wp:effectExtent b="0" l="0" r="0" t="0"/>
-            <wp:docPr descr="Diagram" title="" id="1023" name="Picture"/>
+            <wp:docPr descr="Diagram" title="" id="1319" name="Picture"/>
             <a:graphic>
               <a:graphicData uri="http://schemas.openxmlformats.org/drawingml/2006/picture">
                 <pic:pic>
                   <pic:nvPicPr>
-                    <pic:cNvPr descr="/private/tmp/claude-502/-Users-keanghok-Desktop-work-startup-hopflows-docs/e4a4cd31-69eb-498d-a6e4-c32390abc3bb/scratchpad/mmd2/d02.png" id="1024" name="Picture"/>
+                    <pic:cNvPr descr="/private/tmp/claude-502/-Users-keanghok-Desktop-work-startup-hopflows-docs/e4a4cd31-69eb-498d-a6e4-c32390abc3bb/scratchpad/mmd2/d02.png" id="1320" name="Picture"/>
                     <pic:cNvPicPr>
                       <a:picLocks noChangeArrowheads="1" noChangeAspect="1"/>
                     </pic:cNvPicPr>
                   </pic:nvPicPr>
                   <pic:blipFill>
-                    <a:blip r:embed="rId1022"/>
+                    <a:blip r:embed="rId1318"/>
                     <a:stretch>
                       <a:fillRect/>
                     </a:stretch>
@@ -5503,7 +5544,7 @@
         <w:t xml:space="preserve">Figure 4. Who starts which flow.</w:t>
       </w:r>
     </w:p>
-    <w:bookmarkStart w:id="1028" w:name="flow-a-planned-work"/>
+    <w:bookmarkStart w:id="1324" w:name="flow-a-planned-work"/>
     <w:p>
       <w:pPr>
         <w:pStyle w:val="Heading2"/>
@@ -5617,18 +5658,18 @@
           <wp:inline>
             <wp:extent cx="2953512" cy="7773284"/>
             <wp:effectExtent b="0" l="0" r="0" t="0"/>
-            <wp:docPr descr="Diagram" title="" id="1026" name="Picture"/>
+            <wp:docPr descr="Diagram" title="" id="1322" name="Picture"/>
             <a:graphic>
               <a:graphicData uri="http://schemas.openxmlformats.org/drawingml/2006/picture">
                 <pic:pic>
                   <pic:nvPicPr>
-                    <pic:cNvPr descr="/private/tmp/claude-502/-Users-keanghok-Desktop-work-startup-hopflows-docs/e4a4cd31-69eb-498d-a6e4-c32390abc3bb/scratchpad/mmd2/d03.png" id="1027" name="Picture"/>
+                    <pic:cNvPr descr="/private/tmp/claude-502/-Users-keanghok-Desktop-work-startup-hopflows-docs/e4a4cd31-69eb-498d-a6e4-c32390abc3bb/scratchpad/mmd2/d03.png" id="1323" name="Picture"/>
                     <pic:cNvPicPr>
                       <a:picLocks noChangeArrowheads="1" noChangeAspect="1"/>
                     </pic:cNvPicPr>
                   </pic:nvPicPr>
                   <pic:blipFill>
-                    <a:blip r:embed="rId1025"/>
+                    <a:blip r:embed="rId1321"/>
                     <a:stretch>
                       <a:fillRect/>
                     </a:stretch>
@@ -5663,8 +5704,8 @@
         <w:t xml:space="preserve">Figure 5. Flow A, planned work.</w:t>
       </w:r>
     </w:p>
-    <w:bookmarkEnd w:id="1028"/>
-    <w:bookmarkStart w:id="1032" w:name="flow-b-surprise-work"/>
+    <w:bookmarkEnd w:id="1324"/>
+    <w:bookmarkStart w:id="1328" w:name="flow-b-surprise-work"/>
     <w:p>
       <w:pPr>
         <w:pStyle w:val="Heading2"/>
@@ -5823,18 +5864,18 @@
           <wp:inline>
             <wp:extent cx="5074920" cy="7767734"/>
             <wp:effectExtent b="0" l="0" r="0" t="0"/>
-            <wp:docPr descr="Diagram" title="" id="1030" name="Picture"/>
+            <wp:docPr descr="Diagram" title="" id="1326" name="Picture"/>
             <a:graphic>
               <a:graphicData uri="http://schemas.openxmlformats.org/drawingml/2006/picture">
                 <pic:pic>
                   <pic:nvPicPr>
-                    <pic:cNvPr descr="/private/tmp/claude-502/-Users-keanghok-Desktop-work-startup-hopflows-docs/e4a4cd31-69eb-498d-a6e4-c32390abc3bb/scratchpad/mmd2/d04.png" id="1031" name="Picture"/>
+                    <pic:cNvPr descr="/private/tmp/claude-502/-Users-keanghok-Desktop-work-startup-hopflows-docs/e4a4cd31-69eb-498d-a6e4-c32390abc3bb/scratchpad/mmd2/d04.png" id="1327" name="Picture"/>
                     <pic:cNvPicPr>
                       <a:picLocks noChangeArrowheads="1" noChangeAspect="1"/>
                     </pic:cNvPicPr>
                   </pic:nvPicPr>
                   <pic:blipFill>
-                    <a:blip r:embed="rId1029"/>
+                    <a:blip r:embed="rId1325"/>
                     <a:stretch>
                       <a:fillRect/>
                     </a:stretch>
@@ -5869,8 +5910,8 @@
         <w:t xml:space="preserve">Figure 6. Flow B, surprise work.</w:t>
       </w:r>
     </w:p>
-    <w:bookmarkEnd w:id="1032"/>
-    <w:bookmarkStart w:id="1036" w:name="flow-c-weekly-review"/>
+    <w:bookmarkEnd w:id="1328"/>
+    <w:bookmarkStart w:id="1332" w:name="flow-c-weekly-review"/>
     <w:p>
       <w:pPr>
         <w:pStyle w:val="Heading2"/>
@@ -5896,18 +5937,18 @@
           <wp:inline>
             <wp:extent cx="3867912" cy="7769225"/>
             <wp:effectExtent b="0" l="0" r="0" t="0"/>
-            <wp:docPr descr="Diagram" title="" id="1034" name="Picture"/>
+            <wp:docPr descr="Diagram" title="" id="1330" name="Picture"/>
             <a:graphic>
               <a:graphicData uri="http://schemas.openxmlformats.org/drawingml/2006/picture">
                 <pic:pic>
                   <pic:nvPicPr>
-                    <pic:cNvPr descr="/private/tmp/claude-502/-Users-keanghok-Desktop-work-startup-hopflows-docs/e4a4cd31-69eb-498d-a6e4-c32390abc3bb/scratchpad/mmd2/d05.png" id="1035" name="Picture"/>
+                    <pic:cNvPr descr="/private/tmp/claude-502/-Users-keanghok-Desktop-work-startup-hopflows-docs/e4a4cd31-69eb-498d-a6e4-c32390abc3bb/scratchpad/mmd2/d05.png" id="1331" name="Picture"/>
                     <pic:cNvPicPr>
                       <a:picLocks noChangeArrowheads="1" noChangeAspect="1"/>
                     </pic:cNvPicPr>
                   </pic:nvPicPr>
                   <pic:blipFill>
-                    <a:blip r:embed="rId1033"/>
+                    <a:blip r:embed="rId1329"/>
                     <a:stretch>
                       <a:fillRect/>
                     </a:stretch>
@@ -5942,8 +5983,8 @@
         <w:t xml:space="preserve">Figure 7. Flow C, weekly review.</w:t>
       </w:r>
     </w:p>
-    <w:bookmarkEnd w:id="1036"/>
-    <w:bookmarkStart w:id="1040" w:name="flow-d-handover-leave-or-leaving"/>
+    <w:bookmarkEnd w:id="1332"/>
+    <w:bookmarkStart w:id="1336" w:name="flow-d-handover-leave-or-leaving"/>
     <w:p>
       <w:pPr>
         <w:pStyle w:val="Heading2"/>
@@ -6075,18 +6116,18 @@
           <wp:inline>
             <wp:extent cx="2852928" cy="7781389"/>
             <wp:effectExtent b="0" l="0" r="0" t="0"/>
-            <wp:docPr descr="Diagram" title="" id="1038" name="Picture"/>
+            <wp:docPr descr="Diagram" title="" id="1334" name="Picture"/>
             <a:graphic>
               <a:graphicData uri="http://schemas.openxmlformats.org/drawingml/2006/picture">
                 <pic:pic>
                   <pic:nvPicPr>
-                    <pic:cNvPr descr="/private/tmp/claude-502/-Users-keanghok-Desktop-work-startup-hopflows-docs/e4a4cd31-69eb-498d-a6e4-c32390abc3bb/scratchpad/mmd2/d06.png" id="1039" name="Picture"/>
+                    <pic:cNvPr descr="/private/tmp/claude-502/-Users-keanghok-Desktop-work-startup-hopflows-docs/e4a4cd31-69eb-498d-a6e4-c32390abc3bb/scratchpad/mmd2/d06.png" id="1335" name="Picture"/>
                     <pic:cNvPicPr>
                       <a:picLocks noChangeArrowheads="1" noChangeAspect="1"/>
                     </pic:cNvPicPr>
                   </pic:nvPicPr>
                   <pic:blipFill>
-                    <a:blip r:embed="rId1037"/>
+                    <a:blip r:embed="rId1333"/>
                     <a:stretch>
                       <a:fillRect/>
                     </a:stretch>
@@ -6121,8 +6162,8 @@
         <w:t xml:space="preserve">Figure 8. Flow D, handover.</w:t>
       </w:r>
     </w:p>
-    <w:bookmarkEnd w:id="1040"/>
-    <w:bookmarkStart w:id="1044" w:name="flow-e-risk-flags"/>
+    <w:bookmarkEnd w:id="1336"/>
+    <w:bookmarkStart w:id="1340" w:name="flow-e-risk-flags"/>
     <w:p>
       <w:pPr>
         <w:pStyle w:val="Heading2"/>
@@ -6200,18 +6241,18 @@
           <wp:inline>
             <wp:extent cx="3118104" cy="7768098"/>
             <wp:effectExtent b="0" l="0" r="0" t="0"/>
-            <wp:docPr descr="Diagram" title="" id="1042" name="Picture"/>
+            <wp:docPr descr="Diagram" title="" id="1338" name="Picture"/>
             <a:graphic>
               <a:graphicData uri="http://schemas.openxmlformats.org/drawingml/2006/picture">
                 <pic:pic>
                   <pic:nvPicPr>
-                    <pic:cNvPr descr="/private/tmp/claude-502/-Users-keanghok-Desktop-work-startup-hopflows-docs/e4a4cd31-69eb-498d-a6e4-c32390abc3bb/scratchpad/mmd2/d07.png" id="1043" name="Picture"/>
+                    <pic:cNvPr descr="/private/tmp/claude-502/-Users-keanghok-Desktop-work-startup-hopflows-docs/e4a4cd31-69eb-498d-a6e4-c32390abc3bb/scratchpad/mmd2/d07.png" id="1339" name="Picture"/>
                     <pic:cNvPicPr>
                       <a:picLocks noChangeArrowheads="1" noChangeAspect="1"/>
                     </pic:cNvPicPr>
                   </pic:nvPicPr>
                   <pic:blipFill>
-                    <a:blip r:embed="rId1041"/>
+                    <a:blip r:embed="rId1337"/>
                     <a:stretch>
                       <a:fillRect/>
                     </a:stretch>
@@ -6246,8 +6287,8 @@
         <w:t xml:space="preserve">Figure 9. Flow E, risk flags.</w:t>
       </w:r>
     </w:p>
-    <w:bookmarkEnd w:id="1044"/>
-    <w:bookmarkStart w:id="1048" w:name="flow-f-calendar"/>
+    <w:bookmarkEnd w:id="1340"/>
+    <w:bookmarkStart w:id="1344" w:name="flow-f-calendar"/>
     <w:p>
       <w:pPr>
         <w:pStyle w:val="Heading2"/>
@@ -6385,18 +6426,18 @@
           <wp:inline>
             <wp:extent cx="5486400" cy="3673928"/>
             <wp:effectExtent b="0" l="0" r="0" t="0"/>
-            <wp:docPr descr="Diagram" title="" id="1046" name="Picture"/>
+            <wp:docPr descr="Diagram" title="" id="1342" name="Picture"/>
             <a:graphic>
               <a:graphicData uri="http://schemas.openxmlformats.org/drawingml/2006/picture">
                 <pic:pic>
                   <pic:nvPicPr>
-                    <pic:cNvPr descr="/private/tmp/claude-502/-Users-keanghok-Desktop-work-startup-hopflows-docs/e4a4cd31-69eb-498d-a6e4-c32390abc3bb/scratchpad/mmd2/d08.png" id="1047" name="Picture"/>
+                    <pic:cNvPr descr="/private/tmp/claude-502/-Users-keanghok-Desktop-work-startup-hopflows-docs/e4a4cd31-69eb-498d-a6e4-c32390abc3bb/scratchpad/mmd2/d08.png" id="1343" name="Picture"/>
                     <pic:cNvPicPr>
                       <a:picLocks noChangeArrowheads="1" noChangeAspect="1"/>
                     </pic:cNvPicPr>
                   </pic:nvPicPr>
                   <pic:blipFill>
-                    <a:blip r:embed="rId1045"/>
+                    <a:blip r:embed="rId1341"/>
                     <a:stretch>
                       <a:fillRect/>
                     </a:stretch>
@@ -6431,8 +6472,8 @@
         <w:t xml:space="preserve">Figure 10. Flow F, calendar.</w:t>
       </w:r>
     </w:p>
-    <w:bookmarkEnd w:id="1048"/>
-    <w:bookmarkStart w:id="1052" w:name="flow-g-alerts"/>
+    <w:bookmarkEnd w:id="1344"/>
+    <w:bookmarkStart w:id="1348" w:name="flow-g-alerts"/>
     <w:p>
       <w:pPr>
         <w:pStyle w:val="Heading2"/>
@@ -6522,18 +6563,18 @@
           <wp:inline>
             <wp:extent cx="5486400" cy="5962261"/>
             <wp:effectExtent b="0" l="0" r="0" t="0"/>
-            <wp:docPr descr="Diagram" title="" id="1050" name="Picture"/>
+            <wp:docPr descr="Diagram" title="" id="1346" name="Picture"/>
             <a:graphic>
               <a:graphicData uri="http://schemas.openxmlformats.org/drawingml/2006/picture">
                 <pic:pic>
                   <pic:nvPicPr>
-                    <pic:cNvPr descr="/private/tmp/claude-502/-Users-keanghok-Desktop-work-startup-hopflows-docs/e4a4cd31-69eb-498d-a6e4-c32390abc3bb/scratchpad/mmd2/d09.png" id="1051" name="Picture"/>
+                    <pic:cNvPr descr="/private/tmp/claude-502/-Users-keanghok-Desktop-work-startup-hopflows-docs/e4a4cd31-69eb-498d-a6e4-c32390abc3bb/scratchpad/mmd2/d09.png" id="1347" name="Picture"/>
                     <pic:cNvPicPr>
                       <a:picLocks noChangeArrowheads="1" noChangeAspect="1"/>
                     </pic:cNvPicPr>
                   </pic:nvPicPr>
                   <pic:blipFill>
-                    <a:blip r:embed="rId1049"/>
+                    <a:blip r:embed="rId1345"/>
                     <a:stretch>
                       <a:fillRect/>
                     </a:stretch>
@@ -6568,8 +6609,8 @@
         <w:t xml:space="preserve">Figure 11. Flow G, alerts.</w:t>
       </w:r>
     </w:p>
-    <w:bookmarkEnd w:id="1052"/>
-    <w:bookmarkStart w:id="1056" w:name="flow-h-leave-proposed"/>
+    <w:bookmarkEnd w:id="1348"/>
+    <w:bookmarkStart w:id="1352" w:name="flow-h-leave-proposed"/>
     <w:p>
       <w:pPr>
         <w:pStyle w:val="Heading2"/>
@@ -6656,18 +6697,18 @@
           <wp:inline>
             <wp:extent cx="3227832" cy="7782867"/>
             <wp:effectExtent b="0" l="0" r="0" t="0"/>
-            <wp:docPr descr="Diagram" title="" id="1054" name="Picture"/>
+            <wp:docPr descr="Diagram" title="" id="1350" name="Picture"/>
             <a:graphic>
               <a:graphicData uri="http://schemas.openxmlformats.org/drawingml/2006/picture">
                 <pic:pic>
                   <pic:nvPicPr>
-                    <pic:cNvPr descr="/private/tmp/claude-502/-Users-keanghok-Desktop-work-startup-hopflows-docs/e4a4cd31-69eb-498d-a6e4-c32390abc3bb/scratchpad/mmd2/d10.png" id="1055" name="Picture"/>
+                    <pic:cNvPr descr="/private/tmp/claude-502/-Users-keanghok-Desktop-work-startup-hopflows-docs/e4a4cd31-69eb-498d-a6e4-c32390abc3bb/scratchpad/mmd2/d10.png" id="1351" name="Picture"/>
                     <pic:cNvPicPr>
                       <a:picLocks noChangeArrowheads="1" noChangeAspect="1"/>
                     </pic:cNvPicPr>
                   </pic:nvPicPr>
                   <pic:blipFill>
-                    <a:blip r:embed="rId1053"/>
+                    <a:blip r:embed="rId1349"/>
                     <a:stretch>
                       <a:fillRect/>
                     </a:stretch>
@@ -6702,8 +6743,8 @@
         <w:t xml:space="preserve">Figure 12. Flow H, leave.</w:t>
       </w:r>
     </w:p>
-    <w:bookmarkEnd w:id="1056"/>
-    <w:bookmarkStart w:id="1060" w:name="flow-i-repeating-daily-work-proposed"/>
+    <w:bookmarkEnd w:id="1352"/>
+    <w:bookmarkStart w:id="1356" w:name="flow-i-repeating-daily-work-proposed"/>
     <w:p>
       <w:pPr>
         <w:pStyle w:val="Heading2"/>
@@ -6790,18 +6831,18 @@
           <wp:inline>
             <wp:extent cx="2706624" cy="7770951"/>
             <wp:effectExtent b="0" l="0" r="0" t="0"/>
-            <wp:docPr descr="Diagram" title="" id="1058" name="Picture"/>
+            <wp:docPr descr="Diagram" title="" id="1354" name="Picture"/>
             <a:graphic>
               <a:graphicData uri="http://schemas.openxmlformats.org/drawingml/2006/picture">
                 <pic:pic>
                   <pic:nvPicPr>
-                    <pic:cNvPr descr="/private/tmp/claude-502/-Users-keanghok-Desktop-work-startup-hopflows-docs/e4a4cd31-69eb-498d-a6e4-c32390abc3bb/scratchpad/mmd2/d11.png" id="1059" name="Picture"/>
+                    <pic:cNvPr descr="/private/tmp/claude-502/-Users-keanghok-Desktop-work-startup-hopflows-docs/e4a4cd31-69eb-498d-a6e4-c32390abc3bb/scratchpad/mmd2/d11.png" id="1355" name="Picture"/>
                     <pic:cNvPicPr>
                       <a:picLocks noChangeArrowheads="1" noChangeAspect="1"/>
                     </pic:cNvPicPr>
                   </pic:nvPicPr>
                   <pic:blipFill>
-                    <a:blip r:embed="rId1057"/>
+                    <a:blip r:embed="rId1353"/>
                     <a:stretch>
                       <a:fillRect/>
                     </a:stretch>
@@ -6836,8 +6877,8 @@
         <w:t xml:space="preserve">Figure 13. Flow I, repeating daily work.</w:t>
       </w:r>
     </w:p>
-    <w:bookmarkEnd w:id="1060"/>
-    <w:bookmarkStart w:id="1064" w:name="Xee151c202ff32b2b502fcc1220710a61d3b4311"/>
+    <w:bookmarkEnd w:id="1356"/>
+    <w:bookmarkStart w:id="1360" w:name="Xee151c202ff32b2b502fcc1220710a61d3b4311"/>
     <w:p>
       <w:pPr>
         <w:pStyle w:val="Heading2"/>
@@ -6903,18 +6944,18 @@
           <wp:inline>
             <wp:extent cx="3054096" cy="7769485"/>
             <wp:effectExtent b="0" l="0" r="0" t="0"/>
-            <wp:docPr descr="Diagram" title="" id="1062" name="Picture"/>
+            <wp:docPr descr="Diagram" title="" id="1358" name="Picture"/>
             <a:graphic>
               <a:graphicData uri="http://schemas.openxmlformats.org/drawingml/2006/picture">
                 <pic:pic>
                   <pic:nvPicPr>
-                    <pic:cNvPr descr="/private/tmp/claude-502/-Users-keanghok-Desktop-work-startup-hopflows-docs/e4a4cd31-69eb-498d-a6e4-c32390abc3bb/scratchpad/mmd2/d12.png" id="1063" name="Picture"/>
+                    <pic:cNvPr descr="/private/tmp/claude-502/-Users-keanghok-Desktop-work-startup-hopflows-docs/e4a4cd31-69eb-498d-a6e4-c32390abc3bb/scratchpad/mmd2/d12.png" id="1359" name="Picture"/>
                     <pic:cNvPicPr>
                       <a:picLocks noChangeArrowheads="1" noChangeAspect="1"/>
                     </pic:cNvPicPr>
                   </pic:nvPicPr>
                   <pic:blipFill>
-                    <a:blip r:embed="rId1061"/>
+                    <a:blip r:embed="rId1357"/>
                     <a:stretch>
                       <a:fillRect/>
                     </a:stretch>
@@ -6949,9 +6990,9 @@
         <w:t xml:space="preserve">Figure 14. Flow J, weekly summary for leaders.</w:t>
       </w:r>
     </w:p>
-    <w:bookmarkEnd w:id="1064"/>
-    <w:bookmarkEnd w:id="1065"/>
-    <w:bookmarkStart w:id="1082" w:name="what-each-role-sees-and-can-do"/>
+    <w:bookmarkEnd w:id="1360"/>
+    <w:bookmarkEnd w:id="1361"/>
+    <w:bookmarkStart w:id="1378" w:name="what-each-role-sees-and-can-do"/>
     <w:p>
       <w:pPr>
         <w:pStyle w:val="Heading1"/>
@@ -6960,7 +7001,7 @@
         <w:t xml:space="preserve">09 What each role sees and can do</w:t>
       </w:r>
     </w:p>
-    <w:bookmarkStart w:id="1066" w:name="main-screens"/>
+    <w:bookmarkStart w:id="1362" w:name="main-screens"/>
     <w:p>
       <w:pPr>
         <w:pStyle w:val="Heading2"/>
@@ -7180,8 +7221,8 @@
         <w:t xml:space="preserve">Managers also get their own Today screen. Different roles get different starting screens, not three separate apps, and nobody is locked out of moving around.</w:t>
       </w:r>
     </w:p>
-    <w:bookmarkEnd w:id="1066"/>
-    <w:bookmarkStart w:id="1067" w:name="simple-by-default-one-question-per-role"/>
+    <w:bookmarkEnd w:id="1362"/>
+    <w:bookmarkStart w:id="1363" w:name="simple-by-default-one-question-per-role"/>
     <w:p>
       <w:pPr>
         <w:pStyle w:val="Heading2"/>
@@ -7636,8 +7677,8 @@
         <w:t xml:space="preserve">One in, one out: every new feature must say which role sees it on their home screen. If it adds something there, something else moves one tap deeper.</w:t>
       </w:r>
     </w:p>
-    <w:bookmarkEnd w:id="1067"/>
-    <w:bookmarkStart w:id="1071" w:name="Xafc6df188b68060a074162f0ed46c452143f4ca"/>
+    <w:bookmarkEnd w:id="1363"/>
+    <w:bookmarkStart w:id="1367" w:name="Xafc6df188b68060a074162f0ed46c452143f4ca"/>
     <w:p>
       <w:pPr>
         <w:pStyle w:val="Heading2"/>
@@ -8025,18 +8066,18 @@
           <wp:inline>
             <wp:extent cx="3813048" cy="7770093"/>
             <wp:effectExtent b="0" l="0" r="0" t="0"/>
-            <wp:docPr descr="Diagram" title="" id="1069" name="Picture"/>
+            <wp:docPr descr="Diagram" title="" id="1365" name="Picture"/>
             <a:graphic>
               <a:graphicData uri="http://schemas.openxmlformats.org/drawingml/2006/picture">
                 <pic:pic>
                   <pic:nvPicPr>
-                    <pic:cNvPr descr="/private/tmp/claude-502/-Users-keanghok-Desktop-work-startup-hopflows-docs/e4a4cd31-69eb-498d-a6e4-c32390abc3bb/scratchpad/mmd2/d13.png" id="1070" name="Picture"/>
+                    <pic:cNvPr descr="/private/tmp/claude-502/-Users-keanghok-Desktop-work-startup-hopflows-docs/e4a4cd31-69eb-498d-a6e4-c32390abc3bb/scratchpad/mmd2/d13.png" id="1366" name="Picture"/>
                     <pic:cNvPicPr>
                       <a:picLocks noChangeArrowheads="1" noChangeAspect="1"/>
                     </pic:cNvPicPr>
                   </pic:nvPicPr>
                   <pic:blipFill>
-                    <a:blip r:embed="rId1068"/>
+                    <a:blip r:embed="rId1364"/>
                     <a:stretch>
                       <a:fillRect/>
                     </a:stretch>
@@ -8071,8 +8112,8 @@
         <w:t xml:space="preserve">Figure 15. Dragging on the Board follows the same rules as the buttons.</w:t>
       </w:r>
     </w:p>
-    <w:bookmarkEnd w:id="1071"/>
-    <w:bookmarkStart w:id="1072" w:name="workload-view"/>
+    <w:bookmarkEnd w:id="1367"/>
+    <w:bookmarkStart w:id="1368" w:name="workload-view"/>
     <w:p>
       <w:pPr>
         <w:pStyle w:val="Heading2"/>
@@ -8513,8 +8554,8 @@
         <w:t xml:space="preserve">list asks them to look. (Proposed)</w:t>
       </w:r>
     </w:p>
-    <w:bookmarkEnd w:id="1072"/>
-    <w:bookmarkStart w:id="1073" w:name="risk-flags-for-leaders"/>
+    <w:bookmarkEnd w:id="1368"/>
+    <w:bookmarkStart w:id="1369" w:name="risk-flags-for-leaders"/>
     <w:p>
       <w:pPr>
         <w:pStyle w:val="Heading2"/>
@@ -8783,8 +8824,8 @@
         <w:t xml:space="preserve">In a later stage, suggested flags are never set automatically. Flags not looked at for a while (see §14) remind the lead to confirm or clear them.</w:t>
       </w:r>
     </w:p>
-    <w:bookmarkEnd w:id="1073"/>
-    <w:bookmarkStart w:id="1074" w:name="calendar-1"/>
+    <w:bookmarkEnd w:id="1369"/>
+    <w:bookmarkStart w:id="1370" w:name="calendar-1"/>
     <w:p>
       <w:pPr>
         <w:pStyle w:val="Heading2"/>
@@ -9117,8 +9158,8 @@
         <w:t xml:space="preserve">Times show in each person’s local time. Holidays and all-day events stay as dates.</w:t>
       </w:r>
     </w:p>
-    <w:bookmarkEnd w:id="1074"/>
-    <w:bookmarkStart w:id="1075" w:name="alerts-and-the-mobile-app"/>
+    <w:bookmarkEnd w:id="1370"/>
+    <w:bookmarkStart w:id="1371" w:name="alerts-and-the-mobile-app"/>
     <w:p>
       <w:pPr>
         <w:pStyle w:val="Heading2"/>
@@ -9912,8 +9953,8 @@
         <w:t xml:space="preserve">Chat apps (Telegram, Slack and Microsoft Teams, later stage) will all use the same messages, buttons and team chat settings.</w:t>
       </w:r>
     </w:p>
-    <w:bookmarkEnd w:id="1075"/>
-    <w:bookmarkStart w:id="1076" w:name="search-proposed"/>
+    <w:bookmarkEnd w:id="1371"/>
+    <w:bookmarkStart w:id="1372" w:name="search-proposed"/>
     <w:p>
       <w:pPr>
         <w:pStyle w:val="Heading2"/>
@@ -9994,8 +10035,8 @@
         <w:t xml:space="preserve">Without internet, search looks through the items saved on the phone, and says so.</w:t>
       </w:r>
     </w:p>
-    <w:bookmarkEnd w:id="1076"/>
-    <w:bookmarkStart w:id="1080" w:name="working-offline-proposed"/>
+    <w:bookmarkEnd w:id="1372"/>
+    <w:bookmarkStart w:id="1376" w:name="working-offline-proposed"/>
     <w:p>
       <w:pPr>
         <w:pStyle w:val="Heading2"/>
@@ -10074,18 +10115,18 @@
           <wp:inline>
             <wp:extent cx="4727448" cy="7773612"/>
             <wp:effectExtent b="0" l="0" r="0" t="0"/>
-            <wp:docPr descr="Diagram" title="" id="1078" name="Picture"/>
+            <wp:docPr descr="Diagram" title="" id="1374" name="Picture"/>
             <a:graphic>
               <a:graphicData uri="http://schemas.openxmlformats.org/drawingml/2006/picture">
                 <pic:pic>
                   <pic:nvPicPr>
-                    <pic:cNvPr descr="/private/tmp/claude-502/-Users-keanghok-Desktop-work-startup-hopflows-docs/e4a4cd31-69eb-498d-a6e4-c32390abc3bb/scratchpad/mmd2/d14.png" id="1079" name="Picture"/>
+                    <pic:cNvPr descr="/private/tmp/claude-502/-Users-keanghok-Desktop-work-startup-hopflows-docs/e4a4cd31-69eb-498d-a6e4-c32390abc3bb/scratchpad/mmd2/d14.png" id="1375" name="Picture"/>
                     <pic:cNvPicPr>
                       <a:picLocks noChangeArrowheads="1" noChangeAspect="1"/>
                     </pic:cNvPicPr>
                   </pic:nvPicPr>
                   <pic:blipFill>
-                    <a:blip r:embed="rId1077"/>
+                    <a:blip r:embed="rId1373"/>
                     <a:stretch>
                       <a:fillRect/>
                     </a:stretch>
@@ -10120,8 +10161,8 @@
         <w:t xml:space="preserve">Figure 16. Working offline.</w:t>
       </w:r>
     </w:p>
-    <w:bookmarkEnd w:id="1080"/>
-    <w:bookmarkStart w:id="1081" w:name="who-can-do-what-starting-settings"/>
+    <w:bookmarkEnd w:id="1376"/>
+    <w:bookmarkStart w:id="1377" w:name="who-can-do-what-starting-settings"/>
     <w:p>
       <w:pPr>
         <w:pStyle w:val="Heading2"/>
@@ -11609,9 +11650,9 @@
         <w:t xml:space="preserve">rules on top of department and job title.</w:t>
       </w:r>
     </w:p>
-    <w:bookmarkEnd w:id="1081"/>
-    <w:bookmarkEnd w:id="1082"/>
-    <w:bookmarkStart w:id="1087" w:name="time-and-measures"/>
+    <w:bookmarkEnd w:id="1377"/>
+    <w:bookmarkEnd w:id="1378"/>
+    <w:bookmarkStart w:id="1383" w:name="time-and-measures"/>
     <w:p>
       <w:pPr>
         <w:pStyle w:val="Heading1"/>
@@ -11620,7 +11661,7 @@
         <w:t xml:space="preserve">10 Time and measures</w:t>
       </w:r>
     </w:p>
-    <w:bookmarkStart w:id="1083" w:name="talking-about-time"/>
+    <w:bookmarkStart w:id="1379" w:name="talking-about-time"/>
     <w:p>
       <w:pPr>
         <w:pStyle w:val="Heading2"/>
@@ -11855,8 +11896,8 @@
         <w:t xml:space="preserve">Holidays and leave reduce the working week before this calculation. For example, a public holiday on Tuesday cuts the working week to 32 hours for everyone on that holiday calendar, and the weekly planner shows the lower number before the week is locked.</w:t>
       </w:r>
     </w:p>
-    <w:bookmarkEnd w:id="1083"/>
-    <w:bookmarkStart w:id="1084" w:name="measures"/>
+    <w:bookmarkEnd w:id="1379"/>
+    <w:bookmarkStart w:id="1380" w:name="measures"/>
     <w:p>
       <w:pPr>
         <w:pStyle w:val="Heading2"/>
@@ -12244,8 +12285,8 @@
         <w:t xml:space="preserve">until people log real time. Cancelled work is shown separately and never counts as missed.</w:t>
       </w:r>
     </w:p>
-    <w:bookmarkEnd w:id="1084"/>
-    <w:bookmarkStart w:id="1085" w:name="standard-reports-proposed"/>
+    <w:bookmarkEnd w:id="1380"/>
+    <w:bookmarkStart w:id="1381" w:name="standard-reports-proposed"/>
     <w:p>
       <w:pPr>
         <w:pStyle w:val="Heading2"/>
@@ -12498,8 +12539,8 @@
         <w:t xml:space="preserve">, with their own planned, added and finished work.</w:t>
       </w:r>
     </w:p>
-    <w:bookmarkEnd w:id="1085"/>
-    <w:bookmarkStart w:id="1086" w:name="keeping-it-fair"/>
+    <w:bookmarkEnd w:id="1381"/>
+    <w:bookmarkStart w:id="1382" w:name="keeping-it-fair"/>
     <w:p>
       <w:pPr>
         <w:pStyle w:val="Heading2"/>
@@ -12568,9 +12609,9 @@
         <w:t xml:space="preserve">Don’t count a Deliverable that covers several products twice. Use its main product, or set shares.</w:t>
       </w:r>
     </w:p>
-    <w:bookmarkEnd w:id="1086"/>
-    <w:bookmarkEnd w:id="1087"/>
-    <w:bookmarkStart w:id="1105" w:name="rewards-fun-and-the-mascot"/>
+    <w:bookmarkEnd w:id="1382"/>
+    <w:bookmarkEnd w:id="1383"/>
+    <w:bookmarkStart w:id="1401" w:name="rewards-fun-and-the-mascot"/>
     <w:p>
       <w:pPr>
         <w:pStyle w:val="Heading1"/>
@@ -12587,7 +12628,7 @@
         <w:t xml:space="preserve">Rewards help people adopt the app. They should follow real, checked work, and should never encourage splitting tasks, working extra hours or saying work is done when it isn’t.</w:t>
       </w:r>
     </w:p>
-    <w:bookmarkStart w:id="1088" w:name="start-simple-first-version"/>
+    <w:bookmarkStart w:id="1384" w:name="start-simple-first-version"/>
     <w:p>
       <w:pPr>
         <w:pStyle w:val="Heading2"/>
@@ -12855,8 +12896,8 @@
         <w:t xml:space="preserve">Celebrations and streak days come only from real, checked events, each counted once, so repeating or undoing actions can’t be used to game them.</w:t>
       </w:r>
     </w:p>
-    <w:bookmarkEnd w:id="1088"/>
-    <w:bookmarkStart w:id="1098" w:name="mascot-punh-punh"/>
+    <w:bookmarkEnd w:id="1384"/>
+    <w:bookmarkStart w:id="1394" w:name="mascot-punh-punh"/>
     <w:p>
       <w:pPr>
         <w:pStyle w:val="Heading2"/>
@@ -12910,18 +12951,18 @@
                 <wp:inline>
                   <wp:extent cx="6134100" cy="6134100"/>
                   <wp:effectExtent b="0" l="0" r="0" t="0"/>
-                  <wp:docPr descr="Punh Punh holding a blank note" title="" id="1090" name="Picture"/>
+                  <wp:docPr descr="Punh Punh holding a blank note" title="" id="1386" name="Picture"/>
                   <a:graphic>
                     <a:graphicData uri="http://schemas.openxmlformats.org/drawingml/2006/picture">
                       <pic:pic>
                         <pic:nvPicPr>
-                          <pic:cNvPr descr="../design/mascot/punh-punh-A1.png" id="1091" name="Picture"/>
+                          <pic:cNvPr descr="../design/mascot/punh-punh-A1.png" id="1387" name="Picture"/>
                           <pic:cNvPicPr>
                             <a:picLocks noChangeArrowheads="1" noChangeAspect="1"/>
                           </pic:cNvPicPr>
                         </pic:nvPicPr>
                         <pic:blipFill>
-                          <a:blip r:embed="rId1089"/>
+                          <a:blip r:embed="rId1385"/>
                           <a:stretch>
                             <a:fillRect/>
                           </a:stretch>
@@ -12961,18 +13002,18 @@
                 <wp:inline>
                   <wp:extent cx="6134100" cy="6134100"/>
                   <wp:effectExtent b="0" l="0" r="0" t="0"/>
-                  <wp:docPr descr="Punh Punh waving" title="" id="1093" name="Picture"/>
+                  <wp:docPr descr="Punh Punh waving" title="" id="1389" name="Picture"/>
                   <a:graphic>
                     <a:graphicData uri="http://schemas.openxmlformats.org/drawingml/2006/picture">
                       <pic:pic>
                         <pic:nvPicPr>
-                          <pic:cNvPr descr="../design/mascot/punh-punh-B1.png" id="1094" name="Picture"/>
+                          <pic:cNvPr descr="../design/mascot/punh-punh-B1.png" id="1390" name="Picture"/>
                           <pic:cNvPicPr>
                             <a:picLocks noChangeArrowheads="1" noChangeAspect="1"/>
                           </pic:cNvPicPr>
                         </pic:nvPicPr>
                         <pic:blipFill>
-                          <a:blip r:embed="rId1092"/>
+                          <a:blip r:embed="rId1388"/>
                           <a:stretch>
                             <a:fillRect/>
                           </a:stretch>
@@ -13012,18 +13053,18 @@
                 <wp:inline>
                   <wp:extent cx="6134100" cy="6134100"/>
                   <wp:effectExtent b="0" l="0" r="0" t="0"/>
-                  <wp:docPr descr="Punh Punh holding a checked note" title="" id="1096" name="Picture"/>
+                  <wp:docPr descr="Punh Punh holding a checked note" title="" id="1392" name="Picture"/>
                   <a:graphic>
                     <a:graphicData uri="http://schemas.openxmlformats.org/drawingml/2006/picture">
                       <pic:pic>
                         <pic:nvPicPr>
-                          <pic:cNvPr descr="../design/mascot/punh-punh-C1.png" id="1097" name="Picture"/>
+                          <pic:cNvPr descr="../design/mascot/punh-punh-C1.png" id="1393" name="Picture"/>
                           <pic:cNvPicPr>
                             <a:picLocks noChangeArrowheads="1" noChangeAspect="1"/>
                           </pic:cNvPicPr>
                         </pic:nvPicPr>
                         <pic:blipFill>
-                          <a:blip r:embed="rId1095"/>
+                          <a:blip r:embed="rId1391"/>
                           <a:stretch>
                             <a:fillRect/>
                           </a:stretch>
@@ -13459,8 +13500,8 @@
         <w:t xml:space="preserve">Design work for the first version: a character sheet, five main poses (welcome, celebrate, thinking, calm, resting for holidays and leave), light animations. A chat sticker set and the bot’s profile picture come with chat apps, and seasonal outfits come later.</w:t>
       </w:r>
     </w:p>
-    <w:bookmarkEnd w:id="1098"/>
-    <w:bookmarkStart w:id="1102" w:name="app-icon"/>
+    <w:bookmarkEnd w:id="1394"/>
+    <w:bookmarkStart w:id="1398" w:name="app-icon"/>
     <w:p>
       <w:pPr>
         <w:pStyle w:val="Heading2"/>
@@ -13478,18 +13519,18 @@
           <wp:inline>
             <wp:extent cx="6134100" cy="6134100"/>
             <wp:effectExtent b="0" l="0" r="0" t="0"/>
-            <wp:docPr descr="HopFlows app icon: Punh Punh leaning in beside a checklist on a sky tile" title="" id="1100" name="Picture"/>
+            <wp:docPr descr="HopFlows app icon: Punh Punh leaning in beside a checklist on a sky tile" title="" id="1396" name="Picture"/>
             <a:graphic>
               <a:graphicData uri="http://schemas.openxmlformats.org/drawingml/2006/picture">
                 <pic:pic>
                   <pic:nvPicPr>
-                    <pic:cNvPr descr="../design/app-icon/png/icon-512.png" id="1101" name="Picture"/>
+                    <pic:cNvPr descr="../design/app-icon/png/icon-512.png" id="1397" name="Picture"/>
                     <pic:cNvPicPr>
                       <a:picLocks noChangeArrowheads="1" noChangeAspect="1"/>
                     </pic:cNvPicPr>
                   </pic:nvPicPr>
                   <pic:blipFill>
-                    <a:blip r:embed="rId1099"/>
+                    <a:blip r:embed="rId1395"/>
                     <a:stretch>
                       <a:fillRect/>
                     </a:stretch>
@@ -13641,8 +13682,8 @@
         <w:t xml:space="preserve">.</w:t>
       </w:r>
     </w:p>
-    <w:bookmarkEnd w:id="1102"/>
-    <w:bookmarkStart w:id="1103" w:name="more-rewards-later"/>
+    <w:bookmarkEnd w:id="1398"/>
+    <w:bookmarkStart w:id="1399" w:name="more-rewards-later"/>
     <w:p>
       <w:pPr>
         <w:pStyle w:val="Heading2"/>
@@ -13897,8 +13938,8 @@
         </w:tc>
       </w:tr>
     </w:tbl>
-    <w:bookmarkEnd w:id="1103"/>
-    <w:bookmarkStart w:id="1104" w:name="making-it-easy-to-start"/>
+    <w:bookmarkEnd w:id="1399"/>
+    <w:bookmarkStart w:id="1400" w:name="making-it-easy-to-start"/>
     <w:p>
       <w:pPr>
         <w:pStyle w:val="Heading2"/>
@@ -13943,9 +13984,9 @@
         <w:t xml:space="preserve">English and phone-friendly design are included from the start. Other languages can be added later.</w:t>
       </w:r>
     </w:p>
-    <w:bookmarkEnd w:id="1104"/>
-    <w:bookmarkEnd w:id="1105"/>
-    <w:bookmarkStart w:id="1115" w:name="special-cases"/>
+    <w:bookmarkEnd w:id="1400"/>
+    <w:bookmarkEnd w:id="1401"/>
+    <w:bookmarkStart w:id="1411" w:name="special-cases"/>
     <w:p>
       <w:pPr>
         <w:pStyle w:val="Heading1"/>
@@ -13954,7 +13995,7 @@
         <w:t xml:space="preserve">12 Special cases</w:t>
       </w:r>
     </w:p>
-    <w:bookmarkStart w:id="1106" w:name="work-and-requests"/>
+    <w:bookmarkStart w:id="1402" w:name="work-and-requests"/>
     <w:p>
       <w:pPr>
         <w:pStyle w:val="Heading2"/>
@@ -14484,8 +14525,8 @@
         </w:tc>
       </w:tr>
     </w:tbl>
-    <w:bookmarkEnd w:id="1106"/>
-    <w:bookmarkStart w:id="1107" w:name="planning-and-time-1"/>
+    <w:bookmarkEnd w:id="1402"/>
+    <w:bookmarkStart w:id="1403" w:name="planning-and-time-1"/>
     <w:p>
       <w:pPr>
         <w:pStyle w:val="Heading2"/>
@@ -14859,8 +14900,8 @@
         </w:tc>
       </w:tr>
     </w:tbl>
-    <w:bookmarkEnd w:id="1107"/>
-    <w:bookmarkStart w:id="1108" w:name="handover-and-leave"/>
+    <w:bookmarkEnd w:id="1403"/>
+    <w:bookmarkStart w:id="1404" w:name="handover-and-leave"/>
     <w:p>
       <w:pPr>
         <w:pStyle w:val="Heading2"/>
@@ -15084,8 +15125,8 @@
         </w:tc>
       </w:tr>
     </w:tbl>
-    <w:bookmarkEnd w:id="1108"/>
-    <w:bookmarkStart w:id="1109" w:name="risk-flags"/>
+    <w:bookmarkEnd w:id="1404"/>
+    <w:bookmarkStart w:id="1405" w:name="risk-flags"/>
     <w:p>
       <w:pPr>
         <w:pStyle w:val="Heading2"/>
@@ -15261,8 +15302,8 @@
         </w:tc>
       </w:tr>
     </w:tbl>
-    <w:bookmarkEnd w:id="1109"/>
-    <w:bookmarkStart w:id="1110" w:name="calendar-2"/>
+    <w:bookmarkEnd w:id="1405"/>
+    <w:bookmarkStart w:id="1406" w:name="calendar-2"/>
     <w:p>
       <w:pPr>
         <w:pStyle w:val="Heading2"/>
@@ -15426,8 +15467,8 @@
         </w:tc>
       </w:tr>
     </w:tbl>
-    <w:bookmarkEnd w:id="1110"/>
-    <w:bookmarkStart w:id="1111" w:name="alerts-and-chat"/>
+    <w:bookmarkEnd w:id="1406"/>
+    <w:bookmarkStart w:id="1407" w:name="alerts-and-chat"/>
     <w:p>
       <w:pPr>
         <w:pStyle w:val="Heading2"/>
@@ -15812,8 +15853,8 @@
         </w:tc>
       </w:tr>
     </w:tbl>
-    <w:bookmarkEnd w:id="1111"/>
-    <w:bookmarkStart w:id="1112" w:name="leave-routines-and-week-status"/>
+    <w:bookmarkEnd w:id="1407"/>
+    <w:bookmarkStart w:id="1408" w:name="leave-routines-and-week-status"/>
     <w:p>
       <w:pPr>
         <w:pStyle w:val="Heading2"/>
@@ -16181,8 +16222,8 @@
         </w:tc>
       </w:tr>
     </w:tbl>
-    <w:bookmarkEnd w:id="1112"/>
-    <w:bookmarkStart w:id="1113" w:name="reports-search-and-offline"/>
+    <w:bookmarkEnd w:id="1408"/>
+    <w:bookmarkStart w:id="1409" w:name="reports-search-and-offline"/>
     <w:p>
       <w:pPr>
         <w:pStyle w:val="Heading2"/>
@@ -16382,8 +16423,8 @@
         </w:tc>
       </w:tr>
     </w:tbl>
-    <w:bookmarkEnd w:id="1113"/>
-    <w:bookmarkStart w:id="1114" w:name="rewards"/>
+    <w:bookmarkEnd w:id="1409"/>
+    <w:bookmarkStart w:id="1410" w:name="rewards"/>
     <w:p>
       <w:pPr>
         <w:pStyle w:val="Heading2"/>
@@ -16511,9 +16552,9 @@
         </w:tc>
       </w:tr>
     </w:tbl>
-    <w:bookmarkEnd w:id="1114"/>
-    <w:bookmarkEnd w:id="1115"/>
-    <w:bookmarkStart w:id="1119" w:name="what-we-build-first"/>
+    <w:bookmarkEnd w:id="1410"/>
+    <w:bookmarkEnd w:id="1411"/>
+    <w:bookmarkStart w:id="1415" w:name="what-we-build-first"/>
     <w:p>
       <w:pPr>
         <w:pStyle w:val="Heading1"/>
@@ -16522,7 +16563,7 @@
         <w:t xml:space="preserve">13 What we build first</w:t>
       </w:r>
     </w:p>
-    <w:bookmarkStart w:id="1116" w:name="order-of-building"/>
+    <w:bookmarkStart w:id="1412" w:name="order-of-building"/>
     <w:p>
       <w:pPr>
         <w:pStyle w:val="Heading2"/>
@@ -16800,8 +16841,8 @@
         <w:t xml:space="preserve">apply once chat apps ship.</w:t>
       </w:r>
     </w:p>
-    <w:bookmarkEnd w:id="1116"/>
-    <w:bookmarkStart w:id="1117" w:name="seven-key-screens-to-sketch-first"/>
+    <w:bookmarkEnd w:id="1412"/>
+    <w:bookmarkStart w:id="1413" w:name="seven-key-screens-to-sketch-first"/>
     <w:p>
       <w:pPr>
         <w:pStyle w:val="Heading2"/>
@@ -16936,8 +16977,8 @@
         <w:t xml:space="preserve">act on an alert (Start, Done, Need Help, Accept) in one tap, without opening the full app.</w:t>
       </w:r>
     </w:p>
-    <w:bookmarkEnd w:id="1117"/>
-    <w:bookmarkStart w:id="1118" w:name="how-well-know-the-pilot-worked"/>
+    <w:bookmarkEnd w:id="1413"/>
+    <w:bookmarkStart w:id="1414" w:name="how-well-know-the-pilot-worked"/>
     <w:p>
       <w:pPr>
         <w:pStyle w:val="Heading2"/>
@@ -17072,9 +17113,9 @@
         <w:t xml:space="preserve">these targets are new in v1.1 and need a yes before the pilot. We’ll measure them by tracking when Add Work starts and finishes, which buttons people use and where, when alerts are sent and acted on, and how many people use the app each day in each role.</w:t>
       </w:r>
     </w:p>
-    <w:bookmarkEnd w:id="1118"/>
-    <w:bookmarkEnd w:id="1119"/>
-    <w:bookmarkStart w:id="1122" w:name="default-settings-and-launch-tests"/>
+    <w:bookmarkEnd w:id="1414"/>
+    <w:bookmarkEnd w:id="1415"/>
+    <w:bookmarkStart w:id="1418" w:name="default-settings-and-launch-tests"/>
     <w:p>
       <w:pPr>
         <w:pStyle w:val="Heading1"/>
@@ -17083,7 +17124,7 @@
         <w:t xml:space="preserve">14 Default settings and launch tests</w:t>
       </w:r>
     </w:p>
-    <w:bookmarkStart w:id="1120" w:name="default-settings-and-open-decisions"/>
+    <w:bookmarkStart w:id="1416" w:name="default-settings-and-open-decisions"/>
     <w:p>
       <w:pPr>
         <w:pStyle w:val="Heading2"/>
@@ -18775,8 +18816,8 @@
         <w:t xml:space="preserve">The system should be thorough enough to get owners, time and history right, while the employee’s screen stays as simple as possible. Complexity belongs in the system, not on the screen.</w:t>
       </w:r>
     </w:p>
-    <w:bookmarkEnd w:id="1120"/>
-    <w:bookmarkStart w:id="1121" w:name="launch-tests"/>
+    <w:bookmarkEnd w:id="1416"/>
+    <w:bookmarkStart w:id="1417" w:name="launch-tests"/>
     <w:p>
       <w:pPr>
         <w:pStyle w:val="Heading2"/>
@@ -19819,9 +19860,9 @@
         </w:tc>
       </w:tr>
     </w:tbl>
-    <w:bookmarkEnd w:id="1121"/>
-    <w:bookmarkEnd w:id="1122"/>
-    <w:bookmarkStart w:id="1128" w:name="sign-in-access-and-data"/>
+    <w:bookmarkEnd w:id="1417"/>
+    <w:bookmarkEnd w:id="1418"/>
+    <w:bookmarkStart w:id="1424" w:name="sign-in-access-and-data"/>
     <w:p>
       <w:pPr>
         <w:pStyle w:val="Heading1"/>
@@ -19848,7 +19889,7 @@
         <w:t xml:space="preserve">this section is new in v1.1 and needs a yes.</w:t>
       </w:r>
     </w:p>
-    <w:bookmarkStart w:id="1126" w:name="sign-in-and-joining-a-company"/>
+    <w:bookmarkStart w:id="1422" w:name="sign-in-and-joining-a-company"/>
     <w:p>
       <w:pPr>
         <w:pStyle w:val="Heading2"/>
@@ -19926,18 +19967,18 @@
           <wp:inline>
             <wp:extent cx="4233672" cy="7768663"/>
             <wp:effectExtent b="0" l="0" r="0" t="0"/>
-            <wp:docPr descr="Diagram" title="" id="1124" name="Picture"/>
+            <wp:docPr descr="Diagram" title="" id="1420" name="Picture"/>
             <a:graphic>
               <a:graphicData uri="http://schemas.openxmlformats.org/drawingml/2006/picture">
                 <pic:pic>
                   <pic:nvPicPr>
-                    <pic:cNvPr descr="/private/tmp/claude-502/-Users-keanghok-Desktop-work-startup-hopflows-docs/e4a4cd31-69eb-498d-a6e4-c32390abc3bb/scratchpad/mmd2/d15.png" id="1125" name="Picture"/>
+                    <pic:cNvPr descr="/private/tmp/claude-502/-Users-keanghok-Desktop-work-startup-hopflows-docs/e4a4cd31-69eb-498d-a6e4-c32390abc3bb/scratchpad/mmd2/d15.png" id="1421" name="Picture"/>
                     <pic:cNvPicPr>
                       <a:picLocks noChangeArrowheads="1" noChangeAspect="1"/>
                     </pic:cNvPicPr>
                   </pic:nvPicPr>
                   <pic:blipFill>
-                    <a:blip r:embed="rId1123"/>
+                    <a:blip r:embed="rId1419"/>
                     <a:stretch>
                       <a:fillRect/>
                     </a:stretch>
@@ -19972,8 +20013,8 @@
         <w:t xml:space="preserve">Figure 17. Signing in and joining a company.</w:t>
       </w:r>
     </w:p>
-    <w:bookmarkEnd w:id="1126"/>
-    <w:bookmarkStart w:id="1127" w:name="looking-after-data"/>
+    <w:bookmarkEnd w:id="1422"/>
+    <w:bookmarkStart w:id="1423" w:name="looking-after-data"/>
     <w:p>
       <w:pPr>
         <w:pStyle w:val="Heading2"/>
@@ -20030,9 +20071,9 @@
         <w:t xml:space="preserve">Where the data is stored, and any promises about which country it stays in, are decided before the first paying customer.</w:t>
       </w:r>
     </w:p>
-    <w:bookmarkEnd w:id="1127"/>
-    <w:bookmarkEnd w:id="1128"/>
-    <w:bookmarkStart w:id="1129" w:name="change-log"/>
+    <w:bookmarkEnd w:id="1423"/>
+    <w:bookmarkEnd w:id="1424"/>
+    <w:bookmarkStart w:id="1425" w:name="change-log"/>
     <w:p>
       <w:pPr>
         <w:pStyle w:val="Heading1"/>
@@ -20182,7 +20223,7 @@
         </w:numPr>
       </w:pPr>
       <w:r>
-        <w:t xml:space="preserve">Mascot renamed from Hop to Punh Punh (14 October).</w:t>
+        <w:t xml:space="preserve">Checklist steps can be added while creating a Task (17 October).</w:t>
       </w:r>
     </w:p>
     <w:p>
@@ -20194,7 +20235,7 @@
         </w:numPr>
       </w:pPr>
       <w:r>
-        <w:t xml:space="preserve">App icon chosen: Punh Checklist, with usage rules in §11 (15 October).</w:t>
+        <w:t xml:space="preserve">Add Work opens on Task for me; asking the lead is the second choice (17 October).</w:t>
       </w:r>
     </w:p>
     <w:p>
@@ -20206,28 +20247,7 @@
         </w:numPr>
       </w:pPr>
       <w:r>
-        <w:t xml:space="preserve">First version split into</w:t>
-      </w:r>
-      <w:r>
-        <w:t xml:space="preserve"> </w:t>
-      </w:r>
-      <w:r>
-        <w:t xml:space="preserve">“pilot core”</w:t>
-      </w:r>
-      <w:r>
-        <w:t xml:space="preserve"> </w:t>
-      </w:r>
-      <w:r>
-        <w:t xml:space="preserve">and</w:t>
-      </w:r>
-      <w:r>
-        <w:t xml:space="preserve"> </w:t>
-      </w:r>
-      <w:r>
-        <w:t xml:space="preserve">“soon after”</w:t>
-      </w:r>
-      <w:r>
-        <w:t xml:space="preserve">; later-stage features (Workload view for future weeks, temporary Handover, suggested risk flags) marked in the flows and special cases.</w:t>
+        <w:t xml:space="preserve">Mascot renamed from Hop to Punh Punh (14 October).</w:t>
       </w:r>
     </w:p>
     <w:p>
@@ -20239,7 +20259,7 @@
         </w:numPr>
       </w:pPr>
       <w:r>
-        <w:t xml:space="preserve">Rules for statuses, Confidential Task access, review and blocked markers, giving rights to named people, work schedules, time split across departments, task sizes, time zones, sorting and postponing requests.</w:t>
+        <w:t xml:space="preserve">App icon chosen: Punh Checklist, with usage rules in §11 (15 October).</w:t>
       </w:r>
     </w:p>
     <w:p>
@@ -20251,7 +20271,28 @@
         </w:numPr>
       </w:pPr>
       <w:r>
-        <w:t xml:space="preserve">Rules for carrying work over, weeks never locked, clearing flags, who gets urgent alerts next, snooze, people in several companies, handover receivers and overlapping time off.</w:t>
+        <w:t xml:space="preserve">First version split into</w:t>
+      </w:r>
+      <w:r>
+        <w:t xml:space="preserve"> </w:t>
+      </w:r>
+      <w:r>
+        <w:t xml:space="preserve">“pilot core”</w:t>
+      </w:r>
+      <w:r>
+        <w:t xml:space="preserve"> </w:t>
+      </w:r>
+      <w:r>
+        <w:t xml:space="preserve">and</w:t>
+      </w:r>
+      <w:r>
+        <w:t xml:space="preserve"> </w:t>
+      </w:r>
+      <w:r>
+        <w:t xml:space="preserve">“soon after”</w:t>
+      </w:r>
+      <w:r>
+        <w:t xml:space="preserve">; later-stage features (Workload view for future weeks, temporary Handover, suggested risk flags) marked in the flows and special cases.</w:t>
       </w:r>
     </w:p>
     <w:p>
@@ -20263,7 +20304,7 @@
         </w:numPr>
       </w:pPr>
       <w:r>
-        <w:t xml:space="preserve">Measures, time words and pilot targets written out.</w:t>
+        <w:t xml:space="preserve">Rules for statuses, Confidential Task access, review and blocked markers, giving rights to named people, work schedules, time split across departments, task sizes, time zones, sorting and postponing requests.</w:t>
       </w:r>
     </w:p>
     <w:p>
@@ -20275,7 +20316,7 @@
         </w:numPr>
       </w:pPr>
       <w:r>
-        <w:t xml:space="preserve">The streak no longer counts just starting work.</w:t>
+        <w:t xml:space="preserve">Rules for carrying work over, weeks never locked, clearing flags, who gets urgent alerts next, snooze, people in several companies, handover receivers and overlapping time off.</w:t>
       </w:r>
     </w:p>
     <w:p>
@@ -20287,7 +20328,7 @@
         </w:numPr>
       </w:pPr>
       <w:r>
-        <w:t xml:space="preserve">Special cases grouped by topic; all default numbers kept in §14; the life of a Task moved before planning.</w:t>
+        <w:t xml:space="preserve">Measures, time words and pilot targets written out.</w:t>
       </w:r>
     </w:p>
     <w:p>
@@ -20299,7 +20340,7 @@
         </w:numPr>
       </w:pPr>
       <w:r>
-        <w:t xml:space="preserve">New §15 Sign-in, access and data.</w:t>
+        <w:t xml:space="preserve">The streak no longer counts just starting work.</w:t>
       </w:r>
     </w:p>
     <w:p>
@@ -20311,19 +20352,7 @@
         </w:numPr>
       </w:pPr>
       <w:r>
-        <w:t xml:space="preserve">Words on screen: Add Work (employees), Incoming Queue and Sort (leads);</w:t>
-      </w:r>
-      <w:r>
-        <w:t xml:space="preserve"> </w:t>
-      </w:r>
-      <w:r>
-        <w:t xml:space="preserve">“intake”</w:t>
-      </w:r>
-      <w:r>
-        <w:t xml:space="preserve"> </w:t>
-      </w:r>
-      <w:r>
-        <w:t xml:space="preserve">only in reports.</w:t>
+        <w:t xml:space="preserve">Special cases grouped by topic; all default numbers kept in §14; the life of a Task moved before planning.</w:t>
       </w:r>
     </w:p>
     <w:p>
@@ -20335,19 +20364,7 @@
         </w:numPr>
       </w:pPr>
       <w:r>
-        <w:t xml:space="preserve">The blueprint now covers business and design rules only. The data model and engineering rules moved to</w:t>
-      </w:r>
-      <w:r>
-        <w:t xml:space="preserve"> </w:t>
-      </w:r>
-      <w:r>
-        <w:rPr>
-          <w:rStyle w:val="VerbatimChar"/>
-        </w:rPr>
-        <w:t xml:space="preserve">HopFlows_Technical_Design_v1.1.md</w:t>
-      </w:r>
-      <w:r>
-        <w:t xml:space="preserve">.</w:t>
+        <w:t xml:space="preserve">New §15 Sign-in, access and data.</w:t>
       </w:r>
     </w:p>
     <w:p>
@@ -20359,7 +20376,19 @@
         </w:numPr>
       </w:pPr>
       <w:r>
-        <w:t xml:space="preserve">Gap fixes (Proposed): updates to request senders, weekly summary for leaders, four standard reports with downloads, week status, leave requests and approval, repeating daily work (moved from a later stage into the first version), working offline and search.</w:t>
+        <w:t xml:space="preserve">Words on screen: Add Work (employees), Incoming Queue and Sort (leads);</w:t>
+      </w:r>
+      <w:r>
+        <w:t xml:space="preserve"> </w:t>
+      </w:r>
+      <w:r>
+        <w:t xml:space="preserve">“intake”</w:t>
+      </w:r>
+      <w:r>
+        <w:t xml:space="preserve"> </w:t>
+      </w:r>
+      <w:r>
+        <w:t xml:space="preserve">only in reports.</w:t>
       </w:r>
     </w:p>
     <w:p>
@@ -20371,7 +20400,19 @@
         </w:numPr>
       </w:pPr>
       <w:r>
-        <w:t xml:space="preserve">List, Board and Table views added for full work lists (Proposed).</w:t>
+        <w:t xml:space="preserve">The blueprint now covers business and design rules only. The data model and engineering rules moved to</w:t>
+      </w:r>
+      <w:r>
+        <w:t xml:space="preserve"> </w:t>
+      </w:r>
+      <w:r>
+        <w:rPr>
+          <w:rStyle w:val="VerbatimChar"/>
+        </w:rPr>
+        <w:t xml:space="preserve">HopFlows_Technical_Design_v1.1.md</w:t>
+      </w:r>
+      <w:r>
+        <w:t xml:space="preserve">.</w:t>
       </w:r>
     </w:p>
     <w:p>
@@ -20383,7 +20424,7 @@
         </w:numPr>
       </w:pPr>
       <w:r>
-        <w:t xml:space="preserve">Flow diagrams added: the life of a Task, a map of who starts which flow, Flows A–J, Board dragging, working offline, and signing in.</w:t>
+        <w:t xml:space="preserve">Gap fixes (Proposed): updates to request senders, weekly summary for leaders, four standard reports with downloads, week status, leave requests and approval, repeating daily work (moved from a later stage into the first version), working offline and search.</w:t>
       </w:r>
     </w:p>
     <w:p>
@@ -20395,6 +20436,30 @@
         </w:numPr>
       </w:pPr>
       <w:r>
+        <w:t xml:space="preserve">List, Board and Table views added for full work lists (Proposed).</w:t>
+      </w:r>
+    </w:p>
+    <w:p>
+      <w:pPr>
+        <w:pStyle w:val="Compact"/>
+        <w:numPr>
+          <w:ilvl w:val="0"/>
+          <w:numId w:val="1042"/>
+        </w:numPr>
+      </w:pPr>
+      <w:r>
+        <w:t xml:space="preserve">Flow diagrams added: the life of a Task, a map of who starts which flow, Flows A–J, Board dragging, working offline, and signing in.</w:t>
+      </w:r>
+    </w:p>
+    <w:p>
+      <w:pPr>
+        <w:pStyle w:val="Compact"/>
+        <w:numPr>
+          <w:ilvl w:val="0"/>
+          <w:numId w:val="1042"/>
+        </w:numPr>
+      </w:pPr>
+      <w:r>
         <w:t xml:space="preserve">Rewritten in simple, everyday language. Words changed:</w:t>
       </w:r>
       <w:r>
@@ -20507,7 +20572,7 @@
         <w:t xml:space="preserve">HopFlows / End of Blueprint</w:t>
       </w:r>
     </w:p>
-    <w:bookmarkEnd w:id="1129"/>
+    <w:bookmarkEnd w:id="1425"/>
     <w:sectPr>
       <w:headerReference r:id="rId9" w:type="default"/>
       <w:footerReference r:id="rId10" w:type="default"/>
@@ -35171,6 +35236,458 @@
     <w:basedOn w:val="VerbatimChar"/>
     <w:rPr/>
   </w:style>
+  <w:style w:customStyle="1" w:styleId="KeywordTok" w:type="character">
+    <w:name w:val="KeywordTok"/>
+    <w:basedOn w:val="VerbatimChar"/>
+    <w:rPr>
+      <w:b/>
+      <w:color w:val="007020"/>
+    </w:rPr>
+  </w:style>
+  <w:style w:customStyle="1" w:styleId="DataTypeTok" w:type="character">
+    <w:name w:val="DataTypeTok"/>
+    <w:basedOn w:val="VerbatimChar"/>
+    <w:rPr>
+      <w:color w:val="902000"/>
+    </w:rPr>
+  </w:style>
+  <w:style w:customStyle="1" w:styleId="DecValTok" w:type="character">
+    <w:name w:val="DecValTok"/>
+    <w:basedOn w:val="VerbatimChar"/>
+    <w:rPr>
+      <w:color w:val="40a070"/>
+    </w:rPr>
+  </w:style>
+  <w:style w:customStyle="1" w:styleId="BaseNTok" w:type="character">
+    <w:name w:val="BaseNTok"/>
+    <w:basedOn w:val="VerbatimChar"/>
+    <w:rPr>
+      <w:color w:val="40a070"/>
+    </w:rPr>
+  </w:style>
+  <w:style w:customStyle="1" w:styleId="FloatTok" w:type="character">
+    <w:name w:val="FloatTok"/>
+    <w:basedOn w:val="VerbatimChar"/>
+    <w:rPr>
+      <w:color w:val="40a070"/>
+    </w:rPr>
+  </w:style>
+  <w:style w:customStyle="1" w:styleId="ConstantTok" w:type="character">
+    <w:name w:val="ConstantTok"/>
+    <w:basedOn w:val="VerbatimChar"/>
+    <w:rPr>
+      <w:color w:val="880000"/>
+    </w:rPr>
+  </w:style>
+  <w:style w:customStyle="1" w:styleId="CharTok" w:type="character">
+    <w:name w:val="CharTok"/>
+    <w:basedOn w:val="VerbatimChar"/>
+    <w:rPr>
+      <w:color w:val="4070a0"/>
+    </w:rPr>
+  </w:style>
+  <w:style w:customStyle="1" w:styleId="SpecialCharTok" w:type="character">
+    <w:name w:val="SpecialCharTok"/>
+    <w:basedOn w:val="VerbatimChar"/>
+    <w:rPr>
+      <w:color w:val="4070a0"/>
+    </w:rPr>
+  </w:style>
+  <w:style w:customStyle="1" w:styleId="StringTok" w:type="character">
+    <w:name w:val="StringTok"/>
+    <w:basedOn w:val="VerbatimChar"/>
+    <w:rPr>
+      <w:color w:val="4070a0"/>
+    </w:rPr>
+  </w:style>
+  <w:style w:customStyle="1" w:styleId="VerbatimStringTok" w:type="character">
+    <w:name w:val="VerbatimStringTok"/>
+    <w:basedOn w:val="VerbatimChar"/>
+    <w:rPr>
+      <w:color w:val="4070a0"/>
+    </w:rPr>
+  </w:style>
+  <w:style w:customStyle="1" w:styleId="SpecialStringTok" w:type="character">
+    <w:name w:val="SpecialStringTok"/>
+    <w:basedOn w:val="VerbatimChar"/>
+    <w:rPr>
+      <w:color w:val="bb6688"/>
+    </w:rPr>
+  </w:style>
+  <w:style w:customStyle="1" w:styleId="ImportTok" w:type="character">
+    <w:name w:val="ImportTok"/>
+    <w:basedOn w:val="VerbatimChar"/>
+    <w:rPr>
+      <w:b/>
+      <w:color w:val="008000"/>
+    </w:rPr>
+  </w:style>
+  <w:style w:customStyle="1" w:styleId="CommentTok" w:type="character">
+    <w:name w:val="CommentTok"/>
+    <w:basedOn w:val="VerbatimChar"/>
+    <w:rPr>
+      <w:i/>
+      <w:color w:val="60a0b0"/>
+    </w:rPr>
+  </w:style>
+  <w:style w:customStyle="1" w:styleId="DocumentationTok" w:type="character">
+    <w:name w:val="DocumentationTok"/>
+    <w:basedOn w:val="VerbatimChar"/>
+    <w:rPr>
+      <w:i/>
+      <w:color w:val="ba2121"/>
+    </w:rPr>
+  </w:style>
+  <w:style w:customStyle="1" w:styleId="AnnotationTok" w:type="character">
+    <w:name w:val="AnnotationTok"/>
+    <w:basedOn w:val="VerbatimChar"/>
+    <w:rPr>
+      <w:b/>
+      <w:i/>
+      <w:color w:val="60a0b0"/>
+    </w:rPr>
+  </w:style>
+  <w:style w:customStyle="1" w:styleId="CommentVarTok" w:type="character">
+    <w:name w:val="CommentVarTok"/>
+    <w:basedOn w:val="VerbatimChar"/>
+    <w:rPr>
+      <w:b/>
+      <w:i/>
+      <w:color w:val="60a0b0"/>
+    </w:rPr>
+  </w:style>
+  <w:style w:customStyle="1" w:styleId="OtherTok" w:type="character">
+    <w:name w:val="OtherTok"/>
+    <w:basedOn w:val="VerbatimChar"/>
+    <w:rPr>
+      <w:color w:val="007020"/>
+    </w:rPr>
+  </w:style>
+  <w:style w:customStyle="1" w:styleId="FunctionTok" w:type="character">
+    <w:name w:val="FunctionTok"/>
+    <w:basedOn w:val="VerbatimChar"/>
+    <w:rPr>
+      <w:color w:val="06287e"/>
+    </w:rPr>
+  </w:style>
+  <w:style w:customStyle="1" w:styleId="VariableTok" w:type="character">
+    <w:name w:val="VariableTok"/>
+    <w:basedOn w:val="VerbatimChar"/>
+    <w:rPr>
+      <w:color w:val="19177c"/>
+    </w:rPr>
+  </w:style>
+  <w:style w:customStyle="1" w:styleId="ControlFlowTok" w:type="character">
+    <w:name w:val="ControlFlowTok"/>
+    <w:basedOn w:val="VerbatimChar"/>
+    <w:rPr>
+      <w:b/>
+      <w:color w:val="007020"/>
+    </w:rPr>
+  </w:style>
+  <w:style w:customStyle="1" w:styleId="OperatorTok" w:type="character">
+    <w:name w:val="OperatorTok"/>
+    <w:basedOn w:val="VerbatimChar"/>
+    <w:rPr>
+      <w:color w:val="666666"/>
+    </w:rPr>
+  </w:style>
+  <w:style w:customStyle="1" w:styleId="BuiltInTok" w:type="character">
+    <w:name w:val="BuiltInTok"/>
+    <w:basedOn w:val="VerbatimChar"/>
+    <w:rPr>
+      <w:color w:val="008000"/>
+    </w:rPr>
+  </w:style>
+  <w:style w:customStyle="1" w:styleId="ExtensionTok" w:type="character">
+    <w:name w:val="ExtensionTok"/>
+    <w:basedOn w:val="VerbatimChar"/>
+    <w:rPr/>
+  </w:style>
+  <w:style w:customStyle="1" w:styleId="PreprocessorTok" w:type="character">
+    <w:name w:val="PreprocessorTok"/>
+    <w:basedOn w:val="VerbatimChar"/>
+    <w:rPr>
+      <w:color w:val="bc7a00"/>
+    </w:rPr>
+  </w:style>
+  <w:style w:customStyle="1" w:styleId="AttributeTok" w:type="character">
+    <w:name w:val="AttributeTok"/>
+    <w:basedOn w:val="VerbatimChar"/>
+    <w:rPr>
+      <w:color w:val="7d9029"/>
+    </w:rPr>
+  </w:style>
+  <w:style w:customStyle="1" w:styleId="RegionMarkerTok" w:type="character">
+    <w:name w:val="RegionMarkerTok"/>
+    <w:basedOn w:val="VerbatimChar"/>
+    <w:rPr/>
+  </w:style>
+  <w:style w:customStyle="1" w:styleId="InformationTok" w:type="character">
+    <w:name w:val="InformationTok"/>
+    <w:basedOn w:val="VerbatimChar"/>
+    <w:rPr>
+      <w:b/>
+      <w:i/>
+      <w:color w:val="60a0b0"/>
+    </w:rPr>
+  </w:style>
+  <w:style w:customStyle="1" w:styleId="WarningTok" w:type="character">
+    <w:name w:val="WarningTok"/>
+    <w:basedOn w:val="VerbatimChar"/>
+    <w:rPr>
+      <w:b/>
+      <w:i/>
+      <w:color w:val="60a0b0"/>
+    </w:rPr>
+  </w:style>
+  <w:style w:customStyle="1" w:styleId="AlertTok" w:type="character">
+    <w:name w:val="AlertTok"/>
+    <w:basedOn w:val="VerbatimChar"/>
+    <w:rPr>
+      <w:b/>
+      <w:color w:val="ff0000"/>
+    </w:rPr>
+  </w:style>
+  <w:style w:customStyle="1" w:styleId="ErrorTok" w:type="character">
+    <w:name w:val="ErrorTok"/>
+    <w:basedOn w:val="VerbatimChar"/>
+    <w:rPr>
+      <w:b/>
+      <w:color w:val="ff0000"/>
+    </w:rPr>
+  </w:style>
+  <w:style w:customStyle="1" w:styleId="NormalTok" w:type="character">
+    <w:name w:val="NormalTok"/>
+    <w:basedOn w:val="VerbatimChar"/>
+    <w:rPr/>
+  </w:style>
+  <w:style w:customStyle="1" w:styleId="KeywordTok" w:type="character">
+    <w:name w:val="KeywordTok"/>
+    <w:basedOn w:val="VerbatimChar"/>
+    <w:rPr>
+      <w:b/>
+      <w:color w:val="007020"/>
+    </w:rPr>
+  </w:style>
+  <w:style w:customStyle="1" w:styleId="DataTypeTok" w:type="character">
+    <w:name w:val="DataTypeTok"/>
+    <w:basedOn w:val="VerbatimChar"/>
+    <w:rPr>
+      <w:color w:val="902000"/>
+    </w:rPr>
+  </w:style>
+  <w:style w:customStyle="1" w:styleId="DecValTok" w:type="character">
+    <w:name w:val="DecValTok"/>
+    <w:basedOn w:val="VerbatimChar"/>
+    <w:rPr>
+      <w:color w:val="40a070"/>
+    </w:rPr>
+  </w:style>
+  <w:style w:customStyle="1" w:styleId="BaseNTok" w:type="character">
+    <w:name w:val="BaseNTok"/>
+    <w:basedOn w:val="VerbatimChar"/>
+    <w:rPr>
+      <w:color w:val="40a070"/>
+    </w:rPr>
+  </w:style>
+  <w:style w:customStyle="1" w:styleId="FloatTok" w:type="character">
+    <w:name w:val="FloatTok"/>
+    <w:basedOn w:val="VerbatimChar"/>
+    <w:rPr>
+      <w:color w:val="40a070"/>
+    </w:rPr>
+  </w:style>
+  <w:style w:customStyle="1" w:styleId="ConstantTok" w:type="character">
+    <w:name w:val="ConstantTok"/>
+    <w:basedOn w:val="VerbatimChar"/>
+    <w:rPr>
+      <w:color w:val="880000"/>
+    </w:rPr>
+  </w:style>
+  <w:style w:customStyle="1" w:styleId="CharTok" w:type="character">
+    <w:name w:val="CharTok"/>
+    <w:basedOn w:val="VerbatimChar"/>
+    <w:rPr>
+      <w:color w:val="4070a0"/>
+    </w:rPr>
+  </w:style>
+  <w:style w:customStyle="1" w:styleId="SpecialCharTok" w:type="character">
+    <w:name w:val="SpecialCharTok"/>
+    <w:basedOn w:val="VerbatimChar"/>
+    <w:rPr>
+      <w:color w:val="4070a0"/>
+    </w:rPr>
+  </w:style>
+  <w:style w:customStyle="1" w:styleId="StringTok" w:type="character">
+    <w:name w:val="StringTok"/>
+    <w:basedOn w:val="VerbatimChar"/>
+    <w:rPr>
+      <w:color w:val="4070a0"/>
+    </w:rPr>
+  </w:style>
+  <w:style w:customStyle="1" w:styleId="VerbatimStringTok" w:type="character">
+    <w:name w:val="VerbatimStringTok"/>
+    <w:basedOn w:val="VerbatimChar"/>
+    <w:rPr>
+      <w:color w:val="4070a0"/>
+    </w:rPr>
+  </w:style>
+  <w:style w:customStyle="1" w:styleId="SpecialStringTok" w:type="character">
+    <w:name w:val="SpecialStringTok"/>
+    <w:basedOn w:val="VerbatimChar"/>
+    <w:rPr>
+      <w:color w:val="bb6688"/>
+    </w:rPr>
+  </w:style>
+  <w:style w:customStyle="1" w:styleId="ImportTok" w:type="character">
+    <w:name w:val="ImportTok"/>
+    <w:basedOn w:val="VerbatimChar"/>
+    <w:rPr>
+      <w:b/>
+      <w:color w:val="008000"/>
+    </w:rPr>
+  </w:style>
+  <w:style w:customStyle="1" w:styleId="CommentTok" w:type="character">
+    <w:name w:val="CommentTok"/>
+    <w:basedOn w:val="VerbatimChar"/>
+    <w:rPr>
+      <w:i/>
+      <w:color w:val="60a0b0"/>
+    </w:rPr>
+  </w:style>
+  <w:style w:customStyle="1" w:styleId="DocumentationTok" w:type="character">
+    <w:name w:val="DocumentationTok"/>
+    <w:basedOn w:val="VerbatimChar"/>
+    <w:rPr>
+      <w:i/>
+      <w:color w:val="ba2121"/>
+    </w:rPr>
+  </w:style>
+  <w:style w:customStyle="1" w:styleId="AnnotationTok" w:type="character">
+    <w:name w:val="AnnotationTok"/>
+    <w:basedOn w:val="VerbatimChar"/>
+    <w:rPr>
+      <w:b/>
+      <w:i/>
+      <w:color w:val="60a0b0"/>
+    </w:rPr>
+  </w:style>
+  <w:style w:customStyle="1" w:styleId="CommentVarTok" w:type="character">
+    <w:name w:val="CommentVarTok"/>
+    <w:basedOn w:val="VerbatimChar"/>
+    <w:rPr>
+      <w:b/>
+      <w:i/>
+      <w:color w:val="60a0b0"/>
+    </w:rPr>
+  </w:style>
+  <w:style w:customStyle="1" w:styleId="OtherTok" w:type="character">
+    <w:name w:val="OtherTok"/>
+    <w:basedOn w:val="VerbatimChar"/>
+    <w:rPr>
+      <w:color w:val="007020"/>
+    </w:rPr>
+  </w:style>
+  <w:style w:customStyle="1" w:styleId="FunctionTok" w:type="character">
+    <w:name w:val="FunctionTok"/>
+    <w:basedOn w:val="VerbatimChar"/>
+    <w:rPr>
+      <w:color w:val="06287e"/>
+    </w:rPr>
+  </w:style>
+  <w:style w:customStyle="1" w:styleId="VariableTok" w:type="character">
+    <w:name w:val="VariableTok"/>
+    <w:basedOn w:val="VerbatimChar"/>
+    <w:rPr>
+      <w:color w:val="19177c"/>
+    </w:rPr>
+  </w:style>
+  <w:style w:customStyle="1" w:styleId="ControlFlowTok" w:type="character">
+    <w:name w:val="ControlFlowTok"/>
+    <w:basedOn w:val="VerbatimChar"/>
+    <w:rPr>
+      <w:b/>
+      <w:color w:val="007020"/>
+    </w:rPr>
+  </w:style>
+  <w:style w:customStyle="1" w:styleId="OperatorTok" w:type="character">
+    <w:name w:val="OperatorTok"/>
+    <w:basedOn w:val="VerbatimChar"/>
+    <w:rPr>
+      <w:color w:val="666666"/>
+    </w:rPr>
+  </w:style>
+  <w:style w:customStyle="1" w:styleId="BuiltInTok" w:type="character">
+    <w:name w:val="BuiltInTok"/>
+    <w:basedOn w:val="VerbatimChar"/>
+    <w:rPr>
+      <w:color w:val="008000"/>
+    </w:rPr>
+  </w:style>
+  <w:style w:customStyle="1" w:styleId="ExtensionTok" w:type="character">
+    <w:name w:val="ExtensionTok"/>
+    <w:basedOn w:val="VerbatimChar"/>
+    <w:rPr/>
+  </w:style>
+  <w:style w:customStyle="1" w:styleId="PreprocessorTok" w:type="character">
+    <w:name w:val="PreprocessorTok"/>
+    <w:basedOn w:val="VerbatimChar"/>
+    <w:rPr>
+      <w:color w:val="bc7a00"/>
+    </w:rPr>
+  </w:style>
+  <w:style w:customStyle="1" w:styleId="AttributeTok" w:type="character">
+    <w:name w:val="AttributeTok"/>
+    <w:basedOn w:val="VerbatimChar"/>
+    <w:rPr>
+      <w:color w:val="7d9029"/>
+    </w:rPr>
+  </w:style>
+  <w:style w:customStyle="1" w:styleId="RegionMarkerTok" w:type="character">
+    <w:name w:val="RegionMarkerTok"/>
+    <w:basedOn w:val="VerbatimChar"/>
+    <w:rPr/>
+  </w:style>
+  <w:style w:customStyle="1" w:styleId="InformationTok" w:type="character">
+    <w:name w:val="InformationTok"/>
+    <w:basedOn w:val="VerbatimChar"/>
+    <w:rPr>
+      <w:b/>
+      <w:i/>
+      <w:color w:val="60a0b0"/>
+    </w:rPr>
+  </w:style>
+  <w:style w:customStyle="1" w:styleId="WarningTok" w:type="character">
+    <w:name w:val="WarningTok"/>
+    <w:basedOn w:val="VerbatimChar"/>
+    <w:rPr>
+      <w:b/>
+      <w:i/>
+      <w:color w:val="60a0b0"/>
+    </w:rPr>
+  </w:style>
+  <w:style w:customStyle="1" w:styleId="AlertTok" w:type="character">
+    <w:name w:val="AlertTok"/>
+    <w:basedOn w:val="VerbatimChar"/>
+    <w:rPr>
+      <w:b/>
+      <w:color w:val="ff0000"/>
+    </w:rPr>
+  </w:style>
+  <w:style w:customStyle="1" w:styleId="ErrorTok" w:type="character">
+    <w:name w:val="ErrorTok"/>
+    <w:basedOn w:val="VerbatimChar"/>
+    <w:rPr>
+      <w:b/>
+      <w:color w:val="ff0000"/>
+    </w:rPr>
+  </w:style>
+  <w:style w:customStyle="1" w:styleId="NormalTok" w:type="character">
+    <w:name w:val="NormalTok"/>
+    <w:basedOn w:val="VerbatimChar"/>
+    <w:rPr/>
+  </w:style>
   <w:style w:type="character" w:customStyle="1" w:styleId="KeywordTok">
     <w:name w:val="KeywordTok"/>
     <w:basedOn w:val="VerbatimChar"/>

</xml_diff>

<commit_message>
Fix lead flow data, links, leave approval and phone layouts
- One consistent set of sample data across the Lead screens: owners,
  sizes, hours and sums now agree; Queue flags requests that match
  existing work
- Handover is reachable from Needs you, Planner and Workload; the
  sidebar no longer marks it as Workload
- Approving leave first shows its effect on the week and lets the lead
  give away or move tasks due then; locking warns about pending leave
- Phone layouts: lead links first, Planner and Team table rows as
  cards, Workload keeps its status words
- Weekly review leads with what wasn't done and why instead of a score
- Fix masonry reading order and sideways scroll on small screens
- Sync docs/design with the canvas (version 1792505157-6aba)
- Blueprint: leave approval, lock warning and handover leave rules

Co-Authored-By: Claude Opus 5.5 <noreply@anthropic.com>
</commit_message>
<xml_diff>
--- a/docs/HopFlows_Product_Blueprint_v1.1.docx
+++ b/docs/HopFlows_Product_Blueprint_v1.1.docx
@@ -2,7 +2,7 @@
 <file path=word/document.xml><?xml version="1.0" encoding="utf-8"?>
 <w:document xmlns:w="http://schemas.openxmlformats.org/wordprocessingml/2006/main" xmlns:m="http://schemas.openxmlformats.org/officeDocument/2006/math" xmlns:r="http://schemas.openxmlformats.org/officeDocument/2006/relationships" xmlns:o="urn:schemas-microsoft-com:office:office" xmlns:v="urn:schemas-microsoft-com:vml" xmlns:w10="urn:schemas-microsoft-com:office:word" xmlns:a="http://schemas.openxmlformats.org/drawingml/2006/main" xmlns:pic="http://schemas.openxmlformats.org/drawingml/2006/picture" xmlns:wp="http://schemas.openxmlformats.org/drawingml/2006/wordprocessingDrawing">
   <w:body>
-    <w:bookmarkStart w:id="1579" w:name="hopflows-product-blueprint"/>
+    <w:bookmarkStart w:id="1727" w:name="hopflows-product-blueprint"/>
     <w:p>
       <w:pPr>
         <w:pStyle w:val="Heading1"/>
@@ -127,7 +127,7 @@
         <w:t xml:space="preserve">For the people who plan the product, design it, build it and roll it out.</w:t>
       </w:r>
     </w:p>
-    <w:bookmarkStart w:id="1576" w:name="about-this-blueprint"/>
+    <w:bookmarkStart w:id="1724" w:name="about-this-blueprint"/>
     <w:p>
       <w:pPr>
         <w:pStyle w:val="Heading2"/>
@@ -375,8 +375,8 @@
         <w:t xml:space="preserve">are new in v1.1 and still need a yes or no. The change log at the end lists what changed.</w:t>
       </w:r>
     </w:p>
-    <w:bookmarkEnd w:id="1576"/>
-    <w:bookmarkStart w:id="1577" w:name="the-big-idea"/>
+    <w:bookmarkEnd w:id="1724"/>
+    <w:bookmarkStart w:id="1725" w:name="the-big-idea"/>
     <w:p>
       <w:pPr>
         <w:pStyle w:val="Heading2"/>
@@ -405,8 +405,8 @@
         <w:t xml:space="preserve">Leaders care about results. Team leads care about getting work done and how busy their team is. Employees care about what to do next. Planned work and surprise work both count, without extra paperwork.</w:t>
       </w:r>
     </w:p>
-    <w:bookmarkEnd w:id="1577"/>
-    <w:bookmarkStart w:id="1578" w:name="decisions-already-made"/>
+    <w:bookmarkEnd w:id="1725"/>
+    <w:bookmarkStart w:id="1726" w:name="decisions-already-made"/>
     <w:p>
       <w:pPr>
         <w:pStyle w:val="Heading2"/>
@@ -628,9 +628,9 @@
         <w:t xml:space="preserve">The app keeps working when the internet is weak: people can add and update work offline, and they can find anything with one search. (Proposed)</w:t>
       </w:r>
     </w:p>
-    <w:bookmarkEnd w:id="1578"/>
-    <w:bookmarkEnd w:id="1579"/>
-    <w:bookmarkStart w:id="1583" w:name="summary"/>
+    <w:bookmarkEnd w:id="1726"/>
+    <w:bookmarkEnd w:id="1727"/>
+    <w:bookmarkStart w:id="1731" w:name="summary"/>
     <w:p>
       <w:pPr>
         <w:pStyle w:val="Heading1"/>
@@ -639,7 +639,7 @@
         <w:t xml:space="preserve">01 Summary</w:t>
       </w:r>
     </w:p>
-    <w:bookmarkStart w:id="1580" w:name="the-problem"/>
+    <w:bookmarkStart w:id="1728" w:name="the-problem"/>
     <w:p>
       <w:pPr>
         <w:pStyle w:val="Heading2"/>
@@ -656,8 +656,8 @@
         <w:t xml:space="preserve">Many teams don’t use task apps because the lists get too long, updating them feels like extra work, screens show too much, and work done outside the app never shows up in the plan. One complicated screen also can’t serve employees, team leads and bosses equally well.</w:t>
       </w:r>
     </w:p>
-    <w:bookmarkEnd w:id="1580"/>
-    <w:bookmarkStart w:id="1581" w:name="how-hopflows-answers-it"/>
+    <w:bookmarkEnd w:id="1728"/>
+    <w:bookmarkStart w:id="1729" w:name="how-hopflows-answers-it"/>
     <w:p>
       <w:pPr>
         <w:pStyle w:val="Heading2"/>
@@ -878,8 +878,8 @@
         </w:tc>
       </w:tr>
     </w:tbl>
-    <w:bookmarkEnd w:id="1581"/>
-    <w:bookmarkStart w:id="1582" w:name="in-one-sentence"/>
+    <w:bookmarkEnd w:id="1729"/>
+    <w:bookmarkStart w:id="1730" w:name="in-one-sentence"/>
     <w:p>
       <w:pPr>
         <w:pStyle w:val="Heading2"/>
@@ -908,9 +908,9 @@
         <w:t xml:space="preserve">A simple task app that makes work easy for employees, clear for managers and measurable for leaders, without making task tracking feel like another job.</w:t>
       </w:r>
     </w:p>
-    <w:bookmarkEnd w:id="1582"/>
-    <w:bookmarkEnd w:id="1583"/>
-    <w:bookmarkStart w:id="1586" w:name="how-the-pieces-fit-together"/>
+    <w:bookmarkEnd w:id="1730"/>
+    <w:bookmarkEnd w:id="1731"/>
+    <w:bookmarkStart w:id="1734" w:name="how-the-pieces-fit-together"/>
     <w:p>
       <w:pPr>
         <w:pStyle w:val="Heading1"/>
@@ -1081,7 +1081,7 @@
         <w:t xml:space="preserve">Figure 1. Three parts of a company linked to one system for work and reports.</w:t>
       </w:r>
     </w:p>
-    <w:bookmarkStart w:id="1584" w:name="linked-not-stacked"/>
+    <w:bookmarkStart w:id="1732" w:name="linked-not-stacked"/>
     <w:p>
       <w:pPr>
         <w:pStyle w:val="Heading2"/>
@@ -1098,8 +1098,8 @@
         <w:t xml:space="preserve">Don’t force everything into one tree. One Goal can help several products. One Deliverable can involve several departments. One person can be in several teams. HopFlows links these things instead of stacking them, and still keeps one clear owner for each Goal, Deliverable and active Task.</w:t>
       </w:r>
     </w:p>
-    <w:bookmarkEnd w:id="1584"/>
-    <w:bookmarkStart w:id="1585" w:name="Xd518698a0b64a922415221525837e1dabd77edc"/>
+    <w:bookmarkEnd w:id="1732"/>
+    <w:bookmarkStart w:id="1733" w:name="Xd518698a0b64a922415221525837e1dabd77edc"/>
     <w:p>
       <w:pPr>
         <w:pStyle w:val="Heading2"/>
@@ -1342,9 +1342,9 @@
         <w:t xml:space="preserve">that never end and fill up with unrelated work.</w:t>
       </w:r>
     </w:p>
-    <w:bookmarkEnd w:id="1585"/>
-    <w:bookmarkEnd w:id="1586"/>
-    <w:bookmarkStart w:id="1589" w:name="main-words-we-use"/>
+    <w:bookmarkEnd w:id="1733"/>
+    <w:bookmarkEnd w:id="1734"/>
+    <w:bookmarkStart w:id="1737" w:name="main-words-we-use"/>
     <w:p>
       <w:pPr>
         <w:pStyle w:val="Heading1"/>
@@ -1778,7 +1778,7 @@
         </w:tc>
       </w:tr>
     </w:tbl>
-    <w:bookmarkStart w:id="1587" w:name="words-on-screen"/>
+    <w:bookmarkStart w:id="1735" w:name="words-on-screen"/>
     <w:p>
       <w:pPr>
         <w:pStyle w:val="Heading2"/>
@@ -1962,8 +1962,8 @@
         <w:t xml:space="preserve">only for checking finished work.</w:t>
       </w:r>
     </w:p>
-    <w:bookmarkEnd w:id="1587"/>
-    <w:bookmarkStart w:id="1588" w:name="words-about-time"/>
+    <w:bookmarkEnd w:id="1735"/>
+    <w:bookmarkStart w:id="1736" w:name="words-about-time"/>
     <w:p>
       <w:pPr>
         <w:pStyle w:val="Heading2"/>
@@ -2244,9 +2244,9 @@
         </w:tc>
       </w:tr>
     </w:tbl>
-    <w:bookmarkEnd w:id="1588"/>
-    <w:bookmarkEnd w:id="1589"/>
-    <w:bookmarkStart w:id="1600" w:name="business-rules"/>
+    <w:bookmarkEnd w:id="1736"/>
+    <w:bookmarkEnd w:id="1737"/>
+    <w:bookmarkStart w:id="1748" w:name="business-rules"/>
     <w:p>
       <w:pPr>
         <w:pStyle w:val="Heading1"/>
@@ -2272,7 +2272,7 @@
         <w:t xml:space="preserve">) shows how they are built.</w:t>
       </w:r>
     </w:p>
-    <w:bookmarkStart w:id="1590" w:name="people-and-access"/>
+    <w:bookmarkStart w:id="1738" w:name="people-and-access"/>
     <w:p>
       <w:pPr>
         <w:pStyle w:val="Heading2"/>
@@ -2341,8 +2341,8 @@
         <w:t xml:space="preserve">People can look at other departments’ work, read-only (Proposed). Anyone in the company can open another department’s Goals, Deliverables and Tasks and see the title, owner, status, due date and the Blocked marker. From there they can only send a request or give kudos. Workload colours, time, reports, weekly plans and reviews stay inside the department, Confidential Tasks follow their own rules, and a Task for me that isn’t linked to a Deliverable is seen only inside its department. An admin can close a department’s work to people outside it (for example HR or Finance).</w:t>
       </w:r>
     </w:p>
-    <w:bookmarkEnd w:id="1590"/>
-    <w:bookmarkStart w:id="1591" w:name="work"/>
+    <w:bookmarkEnd w:id="1738"/>
+    <w:bookmarkStart w:id="1739" w:name="work"/>
     <w:p>
       <w:pPr>
         <w:pStyle w:val="Heading2"/>
@@ -2543,8 +2543,8 @@
         <w:t xml:space="preserve">Kudos: one per person, per teammate, per item. You can’t give kudos to yourself. Kudos are never ranked.</w:t>
       </w:r>
     </w:p>
-    <w:bookmarkEnd w:id="1591"/>
-    <w:bookmarkStart w:id="1592" w:name="new-requests"/>
+    <w:bookmarkEnd w:id="1739"/>
+    <w:bookmarkStart w:id="1740" w:name="new-requests"/>
     <w:p>
       <w:pPr>
         <w:pStyle w:val="Heading2"/>
@@ -2683,8 +2683,8 @@
         <w:t xml:space="preserve">.</w:t>
       </w:r>
     </w:p>
-    <w:bookmarkEnd w:id="1592"/>
-    <w:bookmarkStart w:id="1593" w:name="planning-and-time"/>
+    <w:bookmarkEnd w:id="1740"/>
+    <w:bookmarkStart w:id="1741" w:name="planning-and-time"/>
     <w:p>
       <w:pPr>
         <w:pStyle w:val="Heading2"/>
@@ -2714,7 +2714,7 @@
         </w:numPr>
       </w:pPr>
       <w:r>
-        <w:t xml:space="preserve">Before a lead locks a week, HopFlows lists anyone with more work than time and any Tasks with no estimate, and asks the lead to confirm. For 10 minutes after locking, and only while nothing in the week has changed, the lead can undo the lock. (Proposed)</w:t>
+        <w:t xml:space="preserve">Before a lead locks a week, HopFlows lists anyone with more work than time, any Tasks with no estimate, and any leave request for that week that is still waiting, and asks the lead to confirm. The lead can decide the leave first or lock anyway; leave approved after locking shows as a change in the weekly review, never as a miss. For 10 minutes after locking, and only while nothing in the week has changed, the lead can undo the lock. (Proposed)</w:t>
       </w:r>
     </w:p>
     <w:p>
@@ -2825,8 +2825,8 @@
         <w:t xml:space="preserve">Repeating daily work reserves its time in each week, so the weekly plan and the Workload view include it before any project work is locked.</w:t>
       </w:r>
     </w:p>
-    <w:bookmarkEnd w:id="1593"/>
-    <w:bookmarkStart w:id="1594" w:name="leave-proposed"/>
+    <w:bookmarkEnd w:id="1741"/>
+    <w:bookmarkStart w:id="1742" w:name="leave-proposed"/>
     <w:p>
       <w:pPr>
         <w:pStyle w:val="Heading2"/>
@@ -2940,8 +2940,8 @@
         <w:t xml:space="preserve">HopFlows records leave only for planning. It doesn’t track how many leave days are left, or pay. That stays with the company’s HR process.</w:t>
       </w:r>
     </w:p>
-    <w:bookmarkEnd w:id="1594"/>
-    <w:bookmarkStart w:id="1595" w:name="repeating-daily-work-proposed"/>
+    <w:bookmarkEnd w:id="1742"/>
+    <w:bookmarkStart w:id="1743" w:name="repeating-daily-work-proposed"/>
     <w:p>
       <w:pPr>
         <w:pStyle w:val="Heading2"/>
@@ -3058,8 +3058,8 @@
         <w:t xml:space="preserve">Changing a routine changes only future days. Pausing a routine stops new days until it is turned back on.</w:t>
       </w:r>
     </w:p>
-    <w:bookmarkEnd w:id="1595"/>
-    <w:bookmarkStart w:id="1596" w:name="handover-and-risk"/>
+    <w:bookmarkEnd w:id="1743"/>
+    <w:bookmarkStart w:id="1744" w:name="handover-and-risk"/>
     <w:p>
       <w:pPr>
         <w:pStyle w:val="Heading2"/>
@@ -3128,8 +3128,8 @@
         <w:t xml:space="preserve">A flag can be cleared by the person who set it, the item’s owner, or leaders. A Goal owner can’t clear a flag set by leaders. When a Deliverable is accepted or cancelled, its flag closes. When a Deliverable moves to another Goal, its flag moves with it.</w:t>
       </w:r>
     </w:p>
-    <w:bookmarkEnd w:id="1596"/>
-    <w:bookmarkStart w:id="1597" w:name="calendar"/>
+    <w:bookmarkEnd w:id="1744"/>
+    <w:bookmarkStart w:id="1745" w:name="calendar"/>
     <w:p>
       <w:pPr>
         <w:pStyle w:val="Heading2"/>
@@ -3219,8 +3219,8 @@
         <w:t xml:space="preserve">Each person can set their own reminders for events.</w:t>
       </w:r>
     </w:p>
-    <w:bookmarkEnd w:id="1597"/>
-    <w:bookmarkStart w:id="1598" w:name="notifications"/>
+    <w:bookmarkEnd w:id="1745"/>
+    <w:bookmarkStart w:id="1746" w:name="notifications"/>
     <w:p>
       <w:pPr>
         <w:pStyle w:val="Heading2"/>
@@ -3337,8 +3337,8 @@
         <w:t xml:space="preserve">Messages are in English by default. When other languages are added, each company picks its default and each person can choose their own.</w:t>
       </w:r>
     </w:p>
-    <w:bookmarkEnd w:id="1598"/>
-    <w:bookmarkStart w:id="1599" w:name="reports-search-and-offline-proposed"/>
+    <w:bookmarkEnd w:id="1746"/>
+    <w:bookmarkStart w:id="1747" w:name="reports-search-and-offline-proposed"/>
     <w:p>
       <w:pPr>
         <w:pStyle w:val="Heading2"/>
@@ -3443,9 +3443,9 @@
         <w:t xml:space="preserve">rules, and is deleted when the person signs out or leaves the company.</w:t>
       </w:r>
     </w:p>
-    <w:bookmarkEnd w:id="1599"/>
-    <w:bookmarkEnd w:id="1600"/>
-    <w:bookmarkStart w:id="1602" w:name="how-things-connect"/>
+    <w:bookmarkEnd w:id="1747"/>
+    <w:bookmarkEnd w:id="1748"/>
+    <w:bookmarkStart w:id="1750" w:name="how-things-connect"/>
     <w:p>
       <w:pPr>
         <w:pStyle w:val="Heading1"/>
@@ -4462,7 +4462,7 @@
         </w:tc>
       </w:tr>
     </w:tbl>
-    <w:bookmarkStart w:id="1601" w:name="rules-that-never-change"/>
+    <w:bookmarkStart w:id="1749" w:name="rules-that-never-change"/>
     <w:p>
       <w:pPr>
         <w:pStyle w:val="Heading2"/>
@@ -4660,9 +4660,9 @@
         <w:t xml:space="preserve">A button pressed in a push alert or chat does the same thing as in the app, with the same permission check and history. Buttons work once and expire.</w:t>
       </w:r>
     </w:p>
-    <w:bookmarkEnd w:id="1601"/>
-    <w:bookmarkEnd w:id="1602"/>
-    <w:bookmarkStart w:id="1607" w:name="the-life-of-a-task"/>
+    <w:bookmarkEnd w:id="1749"/>
+    <w:bookmarkEnd w:id="1750"/>
+    <w:bookmarkStart w:id="1755" w:name="the-life-of-a-task"/>
     <w:p>
       <w:pPr>
         <w:pStyle w:val="Heading1"/>
@@ -4742,18 +4742,18 @@
           <wp:inline>
             <wp:extent cx="5486400" cy="4774556"/>
             <wp:effectExtent b="0" l="0" r="0" t="0"/>
-            <wp:docPr descr="Diagram" title="" id="1604" name="Picture"/>
+            <wp:docPr descr="Diagram" title="" id="1752" name="Picture"/>
             <a:graphic>
               <a:graphicData uri="http://schemas.openxmlformats.org/drawingml/2006/picture">
                 <pic:pic>
                   <pic:nvPicPr>
-                    <pic:cNvPr descr="/private/tmp/claude-502/-Users-keanghok-Desktop-work-startup-hopflows-docs/3d393b65-89b1-46eb-9486-b2f325668eb0/scratchpad/docx/old/media/rId1455.png" id="1605" name="Picture"/>
+                    <pic:cNvPr descr="media/media/rId1603.png" id="1753" name="Picture"/>
                     <pic:cNvPicPr>
                       <a:picLocks noChangeArrowheads="1" noChangeAspect="1"/>
                     </pic:cNvPicPr>
                   </pic:nvPicPr>
                   <pic:blipFill>
-                    <a:blip r:embed="rId1603"/>
+                    <a:blip r:embed="rId1751"/>
                     <a:stretch>
                       <a:fillRect/>
                     </a:stretch>
@@ -4788,7 +4788,7 @@
         <w:t xml:space="preserve">Figure 2. The life of a Task. Blocked and Need Help are markers on a Task, not steps. Missed is only for repeating daily work.</w:t>
       </w:r>
     </w:p>
-    <w:bookmarkStart w:id="1606" w:name="buttons-employees-use"/>
+    <w:bookmarkStart w:id="1754" w:name="buttons-employees-use"/>
     <w:p>
       <w:pPr>
         <w:pStyle w:val="Heading2"/>
@@ -5012,9 +5012,9 @@
         </w:tc>
       </w:tr>
     </w:tbl>
-    <w:bookmarkEnd w:id="1606"/>
-    <w:bookmarkEnd w:id="1607"/>
-    <w:bookmarkStart w:id="1613" w:name="planned-and-unplanned-work"/>
+    <w:bookmarkEnd w:id="1754"/>
+    <w:bookmarkEnd w:id="1755"/>
+    <w:bookmarkStart w:id="1761" w:name="planned-and-unplanned-work"/>
     <w:p>
       <w:pPr>
         <w:pStyle w:val="Heading1"/>
@@ -5141,7 +5141,7 @@
         <w:t xml:space="preserve">Figure 3. Two ways in, one way to do the work.</w:t>
       </w:r>
     </w:p>
-    <w:bookmarkStart w:id="1608" w:name="three-separate-labels"/>
+    <w:bookmarkStart w:id="1756" w:name="three-separate-labels"/>
     <w:p>
       <w:pPr>
         <w:pStyle w:val="Heading2"/>
@@ -5338,8 +5338,8 @@
         <w:t xml:space="preserve">depends on a particular week, so the same Task can be added in one week and planned in the next.</w:t>
       </w:r>
     </w:p>
-    <w:bookmarkEnd w:id="1608"/>
-    <w:bookmarkStart w:id="1612" w:name="the-locking-rule"/>
+    <w:bookmarkEnd w:id="1756"/>
+    <w:bookmarkStart w:id="1760" w:name="the-locking-rule"/>
     <w:p>
       <w:pPr>
         <w:pStyle w:val="Heading2"/>
@@ -5368,7 +5368,7 @@
         <w:t xml:space="preserve">When the lead locks a week, HopFlows saves a copy of the planned work, the estimates and the owners. The live plan can still change, but reports always compare what really happened with that saved copy.</w:t>
       </w:r>
     </w:p>
-    <w:bookmarkStart w:id="1609" w:name="example-something-urgent-arrives-midweek"/>
+    <w:bookmarkStart w:id="1757" w:name="example-something-urgent-arrives-midweek"/>
     <w:p>
       <w:pPr>
         <w:pStyle w:val="Heading3"/>
@@ -5433,8 +5433,8 @@
         <w:t xml:space="preserve">If the same request is planned into next week, it counts as planned there, and HopFlows still remembers it started as a surprise.</w:t>
       </w:r>
     </w:p>
-    <w:bookmarkEnd w:id="1609"/>
-    <w:bookmarkStart w:id="1610" w:name="X6546010788123f30940adaa831be091dcf8e07f"/>
+    <w:bookmarkEnd w:id="1757"/>
+    <w:bookmarkStart w:id="1758" w:name="X6546010788123f30940adaa831be091dcf8e07f"/>
     <w:p>
       <w:pPr>
         <w:pStyle w:val="Heading3"/>
@@ -5463,8 +5463,8 @@
         <w:t xml:space="preserve">and appear in the weekly review. The lead can remove them before locking the new week. If a week is never locked, there is no saved plan: all its work counts as unplanned, and the weekly review points out that the week wasn’t locked.</w:t>
       </w:r>
     </w:p>
-    <w:bookmarkEnd w:id="1610"/>
-    <w:bookmarkStart w:id="1611" w:name="repeating-daily-work-in-the-plan"/>
+    <w:bookmarkEnd w:id="1758"/>
+    <w:bookmarkStart w:id="1759" w:name="repeating-daily-work-in-the-plan"/>
     <w:p>
       <w:pPr>
         <w:pStyle w:val="Heading3"/>
@@ -5481,10 +5481,10 @@
         <w:t xml:space="preserve">When the lead locks a week, that week’s routines are included automatically, so the plan, the Workload view and the reports all include routine time. A routine created after the week is locked counts as added work.</w:t>
       </w:r>
     </w:p>
-    <w:bookmarkEnd w:id="1611"/>
-    <w:bookmarkEnd w:id="1612"/>
-    <w:bookmarkEnd w:id="1613"/>
-    <w:bookmarkStart w:id="1657" w:name="step-by-step-flows"/>
+    <w:bookmarkEnd w:id="1759"/>
+    <w:bookmarkEnd w:id="1760"/>
+    <w:bookmarkEnd w:id="1761"/>
+    <w:bookmarkStart w:id="1805" w:name="step-by-step-flows"/>
     <w:p>
       <w:pPr>
         <w:pStyle w:val="Heading1"/>
@@ -5508,20 +5508,20 @@
       <w:r>
         <w:drawing>
           <wp:inline>
-            <wp:extent cx="1956816" cy="7760608"/>
+            <wp:extent cx="1956816" cy="7760607"/>
             <wp:effectExtent b="0" l="0" r="0" t="0"/>
-            <wp:docPr descr="Diagram" title="" id="1615" name="Picture"/>
+            <wp:docPr descr="Diagram" title="" id="1763" name="Picture"/>
             <a:graphic>
               <a:graphicData uri="http://schemas.openxmlformats.org/drawingml/2006/picture">
                 <pic:pic>
                   <pic:nvPicPr>
-                    <pic:cNvPr descr="/private/tmp/claude-502/-Users-keanghok-Desktop-work-startup-hopflows-docs/3d393b65-89b1-46eb-9486-b2f325668eb0/scratchpad/docx/old/media/rId1466.png" id="1616" name="Picture"/>
+                    <pic:cNvPr descr="media/media/rId1614.png" id="1764" name="Picture"/>
                     <pic:cNvPicPr>
                       <a:picLocks noChangeArrowheads="1" noChangeAspect="1"/>
                     </pic:cNvPicPr>
                   </pic:nvPicPr>
                   <pic:blipFill>
-                    <a:blip r:embed="rId1614"/>
+                    <a:blip r:embed="rId1762"/>
                     <a:stretch>
                       <a:fillRect/>
                     </a:stretch>
@@ -5529,7 +5529,7 @@
                   <pic:spPr bwMode="auto">
                     <a:xfrm>
                       <a:off x="0" y="0"/>
-                      <a:ext cx="1956816" cy="7760608"/>
+                      <a:ext cx="1956816" cy="7760607"/>
                     </a:xfrm>
                     <a:prstGeom prst="rect">
                       <a:avLst/>
@@ -5556,7 +5556,7 @@
         <w:t xml:space="preserve">Figure 4. Who starts which flow.</w:t>
       </w:r>
     </w:p>
-    <w:bookmarkStart w:id="1620" w:name="flow-a-planned-work"/>
+    <w:bookmarkStart w:id="1768" w:name="flow-a-planned-work"/>
     <w:p>
       <w:pPr>
         <w:pStyle w:val="Heading2"/>
@@ -5668,20 +5668,20 @@
       <w:r>
         <w:drawing>
           <wp:inline>
-            <wp:extent cx="2953512" cy="7773284"/>
+            <wp:extent cx="2953512" cy="7773283"/>
             <wp:effectExtent b="0" l="0" r="0" t="0"/>
-            <wp:docPr descr="Diagram" title="" id="1618" name="Picture"/>
+            <wp:docPr descr="Diagram" title="" id="1766" name="Picture"/>
             <a:graphic>
               <a:graphicData uri="http://schemas.openxmlformats.org/drawingml/2006/picture">
                 <pic:pic>
                   <pic:nvPicPr>
-                    <pic:cNvPr descr="/private/tmp/claude-502/-Users-keanghok-Desktop-work-startup-hopflows-docs/3d393b65-89b1-46eb-9486-b2f325668eb0/scratchpad/docx/old/media/rId1469.png" id="1619" name="Picture"/>
+                    <pic:cNvPr descr="media/media/rId1617.png" id="1767" name="Picture"/>
                     <pic:cNvPicPr>
                       <a:picLocks noChangeArrowheads="1" noChangeAspect="1"/>
                     </pic:cNvPicPr>
                   </pic:nvPicPr>
                   <pic:blipFill>
-                    <a:blip r:embed="rId1617"/>
+                    <a:blip r:embed="rId1765"/>
                     <a:stretch>
                       <a:fillRect/>
                     </a:stretch>
@@ -5689,7 +5689,7 @@
                   <pic:spPr bwMode="auto">
                     <a:xfrm>
                       <a:off x="0" y="0"/>
-                      <a:ext cx="2953512" cy="7773284"/>
+                      <a:ext cx="2953512" cy="7773283"/>
                     </a:xfrm>
                     <a:prstGeom prst="rect">
                       <a:avLst/>
@@ -5716,8 +5716,8 @@
         <w:t xml:space="preserve">Figure 5. Flow A, planned work.</w:t>
       </w:r>
     </w:p>
-    <w:bookmarkEnd w:id="1620"/>
-    <w:bookmarkStart w:id="1624" w:name="flow-b-surprise-work"/>
+    <w:bookmarkEnd w:id="1768"/>
+    <w:bookmarkStart w:id="1772" w:name="flow-b-surprise-work"/>
     <w:p>
       <w:pPr>
         <w:pStyle w:val="Heading2"/>
@@ -5876,18 +5876,18 @@
           <wp:inline>
             <wp:extent cx="5074920" cy="7767734"/>
             <wp:effectExtent b="0" l="0" r="0" t="0"/>
-            <wp:docPr descr="Diagram" title="" id="1622" name="Picture"/>
+            <wp:docPr descr="Diagram" title="" id="1770" name="Picture"/>
             <a:graphic>
               <a:graphicData uri="http://schemas.openxmlformats.org/drawingml/2006/picture">
                 <pic:pic>
                   <pic:nvPicPr>
-                    <pic:cNvPr descr="/private/tmp/claude-502/-Users-keanghok-Desktop-work-startup-hopflows-docs/3d393b65-89b1-46eb-9486-b2f325668eb0/scratchpad/docx/old/media/rId1473.png" id="1623" name="Picture"/>
+                    <pic:cNvPr descr="media/media/rId1621.png" id="1771" name="Picture"/>
                     <pic:cNvPicPr>
                       <a:picLocks noChangeArrowheads="1" noChangeAspect="1"/>
                     </pic:cNvPicPr>
                   </pic:nvPicPr>
                   <pic:blipFill>
-                    <a:blip r:embed="rId1621"/>
+                    <a:blip r:embed="rId1769"/>
                     <a:stretch>
                       <a:fillRect/>
                     </a:stretch>
@@ -5922,8 +5922,8 @@
         <w:t xml:space="preserve">Figure 6. Flow B, surprise work.</w:t>
       </w:r>
     </w:p>
-    <w:bookmarkEnd w:id="1624"/>
-    <w:bookmarkStart w:id="1628" w:name="flow-c-weekly-review"/>
+    <w:bookmarkEnd w:id="1772"/>
+    <w:bookmarkStart w:id="1776" w:name="flow-c-weekly-review"/>
     <w:p>
       <w:pPr>
         <w:pStyle w:val="Heading2"/>
@@ -5949,18 +5949,18 @@
           <wp:inline>
             <wp:extent cx="3867912" cy="7769225"/>
             <wp:effectExtent b="0" l="0" r="0" t="0"/>
-            <wp:docPr descr="Diagram" title="" id="1626" name="Picture"/>
+            <wp:docPr descr="Diagram" title="" id="1774" name="Picture"/>
             <a:graphic>
               <a:graphicData uri="http://schemas.openxmlformats.org/drawingml/2006/picture">
                 <pic:pic>
                   <pic:nvPicPr>
-                    <pic:cNvPr descr="/private/tmp/claude-502/-Users-keanghok-Desktop-work-startup-hopflows-docs/3d393b65-89b1-46eb-9486-b2f325668eb0/scratchpad/docx/old/media/rId1477.png" id="1627" name="Picture"/>
+                    <pic:cNvPr descr="media/media/rId1625.png" id="1775" name="Picture"/>
                     <pic:cNvPicPr>
                       <a:picLocks noChangeArrowheads="1" noChangeAspect="1"/>
                     </pic:cNvPicPr>
                   </pic:nvPicPr>
                   <pic:blipFill>
-                    <a:blip r:embed="rId1625"/>
+                    <a:blip r:embed="rId1773"/>
                     <a:stretch>
                       <a:fillRect/>
                     </a:stretch>
@@ -5995,8 +5995,8 @@
         <w:t xml:space="preserve">Figure 7. Flow C, weekly review.</w:t>
       </w:r>
     </w:p>
-    <w:bookmarkEnd w:id="1628"/>
-    <w:bookmarkStart w:id="1632" w:name="flow-d-handover-leave-or-leaving"/>
+    <w:bookmarkEnd w:id="1776"/>
+    <w:bookmarkStart w:id="1780" w:name="flow-d-handover-leave-or-leaving"/>
     <w:p>
       <w:pPr>
         <w:pStyle w:val="Heading2"/>
@@ -6038,7 +6038,7 @@
         </w:numPr>
       </w:pPr>
       <w:r>
-        <w:t xml:space="preserve">The lead picks one person to receive everything, or a person for each item. The Workload view shows how busy each possible receiver is (this week only at first; future weeks once that view is built) and warns if they would be too busy. The receiver must be another active team member.</w:t>
+        <w:t xml:space="preserve">The lead picks one person to receive everything, or a person for each item. The Workload view shows how busy each possible receiver is (this week only at first; future weeks once that view is built) and warns if they would be too busy or are on leave when the work is due. The receiver must be another active team member.</w:t>
       </w:r>
     </w:p>
     <w:p>
@@ -6128,18 +6128,18 @@
           <wp:inline>
             <wp:extent cx="2852928" cy="7781389"/>
             <wp:effectExtent b="0" l="0" r="0" t="0"/>
-            <wp:docPr descr="Diagram" title="" id="1630" name="Picture"/>
+            <wp:docPr descr="Diagram" title="" id="1778" name="Picture"/>
             <a:graphic>
               <a:graphicData uri="http://schemas.openxmlformats.org/drawingml/2006/picture">
                 <pic:pic>
                   <pic:nvPicPr>
-                    <pic:cNvPr descr="/private/tmp/claude-502/-Users-keanghok-Desktop-work-startup-hopflows-docs/3d393b65-89b1-46eb-9486-b2f325668eb0/scratchpad/docx/old/media/rId1481.png" id="1631" name="Picture"/>
+                    <pic:cNvPr descr="media/media/rId1629.png" id="1779" name="Picture"/>
                     <pic:cNvPicPr>
                       <a:picLocks noChangeArrowheads="1" noChangeAspect="1"/>
                     </pic:cNvPicPr>
                   </pic:nvPicPr>
                   <pic:blipFill>
-                    <a:blip r:embed="rId1629"/>
+                    <a:blip r:embed="rId1777"/>
                     <a:stretch>
                       <a:fillRect/>
                     </a:stretch>
@@ -6174,8 +6174,8 @@
         <w:t xml:space="preserve">Figure 8. Flow D, handover.</w:t>
       </w:r>
     </w:p>
-    <w:bookmarkEnd w:id="1632"/>
-    <w:bookmarkStart w:id="1636" w:name="flow-e-risk-flags"/>
+    <w:bookmarkEnd w:id="1780"/>
+    <w:bookmarkStart w:id="1784" w:name="flow-e-risk-flags"/>
     <w:p>
       <w:pPr>
         <w:pStyle w:val="Heading2"/>
@@ -6253,18 +6253,18 @@
           <wp:inline>
             <wp:extent cx="3118104" cy="7768098"/>
             <wp:effectExtent b="0" l="0" r="0" t="0"/>
-            <wp:docPr descr="Diagram" title="" id="1634" name="Picture"/>
+            <wp:docPr descr="Diagram" title="" id="1782" name="Picture"/>
             <a:graphic>
               <a:graphicData uri="http://schemas.openxmlformats.org/drawingml/2006/picture">
                 <pic:pic>
                   <pic:nvPicPr>
-                    <pic:cNvPr descr="/private/tmp/claude-502/-Users-keanghok-Desktop-work-startup-hopflows-docs/3d393b65-89b1-46eb-9486-b2f325668eb0/scratchpad/docx/old/media/rId1485.png" id="1635" name="Picture"/>
+                    <pic:cNvPr descr="media/media/rId1633.png" id="1783" name="Picture"/>
                     <pic:cNvPicPr>
                       <a:picLocks noChangeArrowheads="1" noChangeAspect="1"/>
                     </pic:cNvPicPr>
                   </pic:nvPicPr>
                   <pic:blipFill>
-                    <a:blip r:embed="rId1633"/>
+                    <a:blip r:embed="rId1781"/>
                     <a:stretch>
                       <a:fillRect/>
                     </a:stretch>
@@ -6299,8 +6299,8 @@
         <w:t xml:space="preserve">Figure 9. Flow E, risk flags.</w:t>
       </w:r>
     </w:p>
-    <w:bookmarkEnd w:id="1636"/>
-    <w:bookmarkStart w:id="1640" w:name="flow-f-calendar"/>
+    <w:bookmarkEnd w:id="1784"/>
+    <w:bookmarkStart w:id="1788" w:name="flow-f-calendar"/>
     <w:p>
       <w:pPr>
         <w:pStyle w:val="Heading2"/>
@@ -6438,18 +6438,18 @@
           <wp:inline>
             <wp:extent cx="5486400" cy="3673928"/>
             <wp:effectExtent b="0" l="0" r="0" t="0"/>
-            <wp:docPr descr="Diagram" title="" id="1638" name="Picture"/>
+            <wp:docPr descr="Diagram" title="" id="1786" name="Picture"/>
             <a:graphic>
               <a:graphicData uri="http://schemas.openxmlformats.org/drawingml/2006/picture">
                 <pic:pic>
                   <pic:nvPicPr>
-                    <pic:cNvPr descr="/private/tmp/claude-502/-Users-keanghok-Desktop-work-startup-hopflows-docs/3d393b65-89b1-46eb-9486-b2f325668eb0/scratchpad/docx/old/media/rId1489.png" id="1639" name="Picture"/>
+                    <pic:cNvPr descr="media/media/rId1637.png" id="1787" name="Picture"/>
                     <pic:cNvPicPr>
                       <a:picLocks noChangeArrowheads="1" noChangeAspect="1"/>
                     </pic:cNvPicPr>
                   </pic:nvPicPr>
                   <pic:blipFill>
-                    <a:blip r:embed="rId1637"/>
+                    <a:blip r:embed="rId1785"/>
                     <a:stretch>
                       <a:fillRect/>
                     </a:stretch>
@@ -6484,8 +6484,8 @@
         <w:t xml:space="preserve">Figure 10. Flow F, calendar.</w:t>
       </w:r>
     </w:p>
-    <w:bookmarkEnd w:id="1640"/>
-    <w:bookmarkStart w:id="1644" w:name="flow-g-alerts"/>
+    <w:bookmarkEnd w:id="1788"/>
+    <w:bookmarkStart w:id="1792" w:name="flow-g-alerts"/>
     <w:p>
       <w:pPr>
         <w:pStyle w:val="Heading2"/>
@@ -6575,18 +6575,18 @@
           <wp:inline>
             <wp:extent cx="5486400" cy="5962261"/>
             <wp:effectExtent b="0" l="0" r="0" t="0"/>
-            <wp:docPr descr="Diagram" title="" id="1642" name="Picture"/>
+            <wp:docPr descr="Diagram" title="" id="1790" name="Picture"/>
             <a:graphic>
               <a:graphicData uri="http://schemas.openxmlformats.org/drawingml/2006/picture">
                 <pic:pic>
                   <pic:nvPicPr>
-                    <pic:cNvPr descr="/private/tmp/claude-502/-Users-keanghok-Desktop-work-startup-hopflows-docs/3d393b65-89b1-46eb-9486-b2f325668eb0/scratchpad/docx/old/media/rId1493.png" id="1643" name="Picture"/>
+                    <pic:cNvPr descr="media/media/rId1641.png" id="1791" name="Picture"/>
                     <pic:cNvPicPr>
                       <a:picLocks noChangeArrowheads="1" noChangeAspect="1"/>
                     </pic:cNvPicPr>
                   </pic:nvPicPr>
                   <pic:blipFill>
-                    <a:blip r:embed="rId1641"/>
+                    <a:blip r:embed="rId1789"/>
                     <a:stretch>
                       <a:fillRect/>
                     </a:stretch>
@@ -6621,8 +6621,8 @@
         <w:t xml:space="preserve">Figure 11. Flow G, alerts.</w:t>
       </w:r>
     </w:p>
-    <w:bookmarkEnd w:id="1644"/>
-    <w:bookmarkStart w:id="1648" w:name="flow-h-leave-proposed"/>
+    <w:bookmarkEnd w:id="1792"/>
+    <w:bookmarkStart w:id="1796" w:name="flow-h-leave-proposed"/>
     <w:p>
       <w:pPr>
         <w:pStyle w:val="Heading2"/>
@@ -6652,7 +6652,7 @@
         </w:numPr>
       </w:pPr>
       <w:r>
-        <w:t xml:space="preserve">The approver gets the request with Approve and Decline buttons in the app and in a push alert. They also see the person’s Tasks due in those days and how busy the team is in those weeks.</w:t>
+        <w:t xml:space="preserve">The approver gets the request with Approve and Decline buttons in the app and in a push alert. Before approving, they see what the leave changes: the person’s time to plan and planned work for that week, before and after, and each Task due on those days, with a choice to give it to someone with room or move it to a later week. Approving applies those choices and tells the people involved. (Proposed)</w:t>
       </w:r>
     </w:p>
     <w:p>
@@ -6709,18 +6709,18 @@
           <wp:inline>
             <wp:extent cx="3227832" cy="7782867"/>
             <wp:effectExtent b="0" l="0" r="0" t="0"/>
-            <wp:docPr descr="Diagram" title="" id="1646" name="Picture"/>
+            <wp:docPr descr="Diagram" title="" id="1794" name="Picture"/>
             <a:graphic>
               <a:graphicData uri="http://schemas.openxmlformats.org/drawingml/2006/picture">
                 <pic:pic>
                   <pic:nvPicPr>
-                    <pic:cNvPr descr="/private/tmp/claude-502/-Users-keanghok-Desktop-work-startup-hopflows-docs/3d393b65-89b1-46eb-9486-b2f325668eb0/scratchpad/docx/old/media/rId1497.png" id="1647" name="Picture"/>
+                    <pic:cNvPr descr="media/media/rId1645.png" id="1795" name="Picture"/>
                     <pic:cNvPicPr>
                       <a:picLocks noChangeArrowheads="1" noChangeAspect="1"/>
                     </pic:cNvPicPr>
                   </pic:nvPicPr>
                   <pic:blipFill>
-                    <a:blip r:embed="rId1645"/>
+                    <a:blip r:embed="rId1793"/>
                     <a:stretch>
                       <a:fillRect/>
                     </a:stretch>
@@ -6755,8 +6755,8 @@
         <w:t xml:space="preserve">Figure 12. Flow H, leave.</w:t>
       </w:r>
     </w:p>
-    <w:bookmarkEnd w:id="1648"/>
-    <w:bookmarkStart w:id="1652" w:name="flow-i-repeating-daily-work-proposed"/>
+    <w:bookmarkEnd w:id="1796"/>
+    <w:bookmarkStart w:id="1800" w:name="flow-i-repeating-daily-work-proposed"/>
     <w:p>
       <w:pPr>
         <w:pStyle w:val="Heading2"/>
@@ -6841,20 +6841,20 @@
       <w:r>
         <w:drawing>
           <wp:inline>
-            <wp:extent cx="2706624" cy="7770951"/>
+            <wp:extent cx="2706624" cy="7770950"/>
             <wp:effectExtent b="0" l="0" r="0" t="0"/>
-            <wp:docPr descr="Diagram" title="" id="1650" name="Picture"/>
+            <wp:docPr descr="Diagram" title="" id="1798" name="Picture"/>
             <a:graphic>
               <a:graphicData uri="http://schemas.openxmlformats.org/drawingml/2006/picture">
                 <pic:pic>
                   <pic:nvPicPr>
-                    <pic:cNvPr descr="/private/tmp/claude-502/-Users-keanghok-Desktop-work-startup-hopflows-docs/3d393b65-89b1-46eb-9486-b2f325668eb0/scratchpad/docx/old/media/rId1501.png" id="1651" name="Picture"/>
+                    <pic:cNvPr descr="media/media/rId1649.png" id="1799" name="Picture"/>
                     <pic:cNvPicPr>
                       <a:picLocks noChangeArrowheads="1" noChangeAspect="1"/>
                     </pic:cNvPicPr>
                   </pic:nvPicPr>
                   <pic:blipFill>
-                    <a:blip r:embed="rId1649"/>
+                    <a:blip r:embed="rId1797"/>
                     <a:stretch>
                       <a:fillRect/>
                     </a:stretch>
@@ -6862,7 +6862,7 @@
                   <pic:spPr bwMode="auto">
                     <a:xfrm>
                       <a:off x="0" y="0"/>
-                      <a:ext cx="2706624" cy="7770951"/>
+                      <a:ext cx="2706624" cy="7770950"/>
                     </a:xfrm>
                     <a:prstGeom prst="rect">
                       <a:avLst/>
@@ -6889,8 +6889,8 @@
         <w:t xml:space="preserve">Figure 13. Flow I, repeating daily work.</w:t>
       </w:r>
     </w:p>
-    <w:bookmarkEnd w:id="1652"/>
-    <w:bookmarkStart w:id="1656" w:name="Xee151c202ff32b2b502fcc1220710a61d3b4311"/>
+    <w:bookmarkEnd w:id="1800"/>
+    <w:bookmarkStart w:id="1804" w:name="Xee151c202ff32b2b502fcc1220710a61d3b4311"/>
     <w:p>
       <w:pPr>
         <w:pStyle w:val="Heading2"/>
@@ -6956,18 +6956,18 @@
           <wp:inline>
             <wp:extent cx="3054096" cy="7769485"/>
             <wp:effectExtent b="0" l="0" r="0" t="0"/>
-            <wp:docPr descr="Diagram" title="" id="1654" name="Picture"/>
+            <wp:docPr descr="Diagram" title="" id="1802" name="Picture"/>
             <a:graphic>
               <a:graphicData uri="http://schemas.openxmlformats.org/drawingml/2006/picture">
                 <pic:pic>
                   <pic:nvPicPr>
-                    <pic:cNvPr descr="/private/tmp/claude-502/-Users-keanghok-Desktop-work-startup-hopflows-docs/3d393b65-89b1-46eb-9486-b2f325668eb0/scratchpad/docx/old/media/rId1505.png" id="1655" name="Picture"/>
+                    <pic:cNvPr descr="media/media/rId1653.png" id="1803" name="Picture"/>
                     <pic:cNvPicPr>
                       <a:picLocks noChangeArrowheads="1" noChangeAspect="1"/>
                     </pic:cNvPicPr>
                   </pic:nvPicPr>
                   <pic:blipFill>
-                    <a:blip r:embed="rId1653"/>
+                    <a:blip r:embed="rId1801"/>
                     <a:stretch>
                       <a:fillRect/>
                     </a:stretch>
@@ -7002,9 +7002,9 @@
         <w:t xml:space="preserve">Figure 14. Flow J, weekly summary for leaders.</w:t>
       </w:r>
     </w:p>
-    <w:bookmarkEnd w:id="1656"/>
-    <w:bookmarkEnd w:id="1657"/>
-    <w:bookmarkStart w:id="1674" w:name="what-each-role-sees-and-can-do"/>
+    <w:bookmarkEnd w:id="1804"/>
+    <w:bookmarkEnd w:id="1805"/>
+    <w:bookmarkStart w:id="1822" w:name="what-each-role-sees-and-can-do"/>
     <w:p>
       <w:pPr>
         <w:pStyle w:val="Heading1"/>
@@ -7013,7 +7013,7 @@
         <w:t xml:space="preserve">09 What each role sees and can do</w:t>
       </w:r>
     </w:p>
-    <w:bookmarkStart w:id="1658" w:name="main-screens"/>
+    <w:bookmarkStart w:id="1806" w:name="main-screens"/>
     <w:p>
       <w:pPr>
         <w:pStyle w:val="Heading2"/>
@@ -7233,8 +7233,8 @@
         <w:t xml:space="preserve">Managers also get their own Today screen. Different roles get different starting screens, not three separate apps, and nobody is locked out of moving around.</w:t>
       </w:r>
     </w:p>
-    <w:bookmarkEnd w:id="1658"/>
-    <w:bookmarkStart w:id="1659" w:name="simple-by-default-one-question-per-role"/>
+    <w:bookmarkEnd w:id="1806"/>
+    <w:bookmarkStart w:id="1807" w:name="simple-by-default-one-question-per-role"/>
     <w:p>
       <w:pPr>
         <w:pStyle w:val="Heading2"/>
@@ -7689,8 +7689,8 @@
         <w:t xml:space="preserve">One in, one out: every new feature must say which role sees it on their home screen. If it adds something there, something else moves one tap deeper.</w:t>
       </w:r>
     </w:p>
-    <w:bookmarkEnd w:id="1659"/>
-    <w:bookmarkStart w:id="1663" w:name="Xafc6df188b68060a074162f0ed46c452143f4ca"/>
+    <w:bookmarkEnd w:id="1807"/>
+    <w:bookmarkStart w:id="1811" w:name="Xafc6df188b68060a074162f0ed46c452143f4ca"/>
     <w:p>
       <w:pPr>
         <w:pStyle w:val="Heading2"/>
@@ -8078,18 +8078,18 @@
           <wp:inline>
             <wp:extent cx="3813048" cy="7770093"/>
             <wp:effectExtent b="0" l="0" r="0" t="0"/>
-            <wp:docPr descr="Diagram" title="" id="1661" name="Picture"/>
+            <wp:docPr descr="Diagram" title="" id="1809" name="Picture"/>
             <a:graphic>
               <a:graphicData uri="http://schemas.openxmlformats.org/drawingml/2006/picture">
                 <pic:pic>
                   <pic:nvPicPr>
-                    <pic:cNvPr descr="/private/tmp/claude-502/-Users-keanghok-Desktop-work-startup-hopflows-docs/3d393b65-89b1-46eb-9486-b2f325668eb0/scratchpad/docx/old/media/rId1512.png" id="1662" name="Picture"/>
+                    <pic:cNvPr descr="media/media/rId1660.png" id="1810" name="Picture"/>
                     <pic:cNvPicPr>
                       <a:picLocks noChangeArrowheads="1" noChangeAspect="1"/>
                     </pic:cNvPicPr>
                   </pic:nvPicPr>
                   <pic:blipFill>
-                    <a:blip r:embed="rId1660"/>
+                    <a:blip r:embed="rId1808"/>
                     <a:stretch>
                       <a:fillRect/>
                     </a:stretch>
@@ -8124,8 +8124,8 @@
         <w:t xml:space="preserve">Figure 15. Dragging on the Board follows the same rules as the buttons.</w:t>
       </w:r>
     </w:p>
-    <w:bookmarkEnd w:id="1663"/>
-    <w:bookmarkStart w:id="1664" w:name="workload-view"/>
+    <w:bookmarkEnd w:id="1811"/>
+    <w:bookmarkStart w:id="1812" w:name="workload-view"/>
     <w:p>
       <w:pPr>
         <w:pStyle w:val="Heading2"/>
@@ -8566,8 +8566,8 @@
         <w:t xml:space="preserve">list asks them to look. (Proposed)</w:t>
       </w:r>
     </w:p>
-    <w:bookmarkEnd w:id="1664"/>
-    <w:bookmarkStart w:id="1665" w:name="risk-flags-for-leaders"/>
+    <w:bookmarkEnd w:id="1812"/>
+    <w:bookmarkStart w:id="1813" w:name="risk-flags-for-leaders"/>
     <w:p>
       <w:pPr>
         <w:pStyle w:val="Heading2"/>
@@ -8836,8 +8836,8 @@
         <w:t xml:space="preserve">In a later stage, suggested flags are never set automatically. Flags not looked at for a while (see §14) remind the lead to confirm or clear them.</w:t>
       </w:r>
     </w:p>
-    <w:bookmarkEnd w:id="1665"/>
-    <w:bookmarkStart w:id="1666" w:name="calendar-1"/>
+    <w:bookmarkEnd w:id="1813"/>
+    <w:bookmarkStart w:id="1814" w:name="calendar-1"/>
     <w:p>
       <w:pPr>
         <w:pStyle w:val="Heading2"/>
@@ -9170,8 +9170,8 @@
         <w:t xml:space="preserve">Times show in each person’s local time. Holidays and all-day events stay as dates.</w:t>
       </w:r>
     </w:p>
-    <w:bookmarkEnd w:id="1666"/>
-    <w:bookmarkStart w:id="1667" w:name="alerts-and-the-mobile-app"/>
+    <w:bookmarkEnd w:id="1814"/>
+    <w:bookmarkStart w:id="1815" w:name="alerts-and-the-mobile-app"/>
     <w:p>
       <w:pPr>
         <w:pStyle w:val="Heading2"/>
@@ -9965,8 +9965,8 @@
         <w:t xml:space="preserve">Chat apps (Telegram, Slack and Microsoft Teams, later stage) will all use the same messages, buttons and team chat settings.</w:t>
       </w:r>
     </w:p>
-    <w:bookmarkEnd w:id="1667"/>
-    <w:bookmarkStart w:id="1668" w:name="search-proposed"/>
+    <w:bookmarkEnd w:id="1815"/>
+    <w:bookmarkStart w:id="1816" w:name="search-proposed"/>
     <w:p>
       <w:pPr>
         <w:pStyle w:val="Heading2"/>
@@ -10047,8 +10047,8 @@
         <w:t xml:space="preserve">Without internet, search looks through the items saved on the phone, and says so.</w:t>
       </w:r>
     </w:p>
-    <w:bookmarkEnd w:id="1668"/>
-    <w:bookmarkStart w:id="1672" w:name="working-offline-proposed"/>
+    <w:bookmarkEnd w:id="1816"/>
+    <w:bookmarkStart w:id="1820" w:name="working-offline-proposed"/>
     <w:p>
       <w:pPr>
         <w:pStyle w:val="Heading2"/>
@@ -10125,20 +10125,20 @@
       <w:r>
         <w:drawing>
           <wp:inline>
-            <wp:extent cx="4727448" cy="7773612"/>
+            <wp:extent cx="4727448" cy="7773611"/>
             <wp:effectExtent b="0" l="0" r="0" t="0"/>
-            <wp:docPr descr="Diagram" title="" id="1670" name="Picture"/>
+            <wp:docPr descr="Diagram" title="" id="1818" name="Picture"/>
             <a:graphic>
               <a:graphicData uri="http://schemas.openxmlformats.org/drawingml/2006/picture">
                 <pic:pic>
                   <pic:nvPicPr>
-                    <pic:cNvPr descr="/private/tmp/claude-502/-Users-keanghok-Desktop-work-startup-hopflows-docs/3d393b65-89b1-46eb-9486-b2f325668eb0/scratchpad/docx/old/media/rId1521.png" id="1671" name="Picture"/>
+                    <pic:cNvPr descr="media/media/rId1669.png" id="1819" name="Picture"/>
                     <pic:cNvPicPr>
                       <a:picLocks noChangeArrowheads="1" noChangeAspect="1"/>
                     </pic:cNvPicPr>
                   </pic:nvPicPr>
                   <pic:blipFill>
-                    <a:blip r:embed="rId1669"/>
+                    <a:blip r:embed="rId1817"/>
                     <a:stretch>
                       <a:fillRect/>
                     </a:stretch>
@@ -10146,7 +10146,7 @@
                   <pic:spPr bwMode="auto">
                     <a:xfrm>
                       <a:off x="0" y="0"/>
-                      <a:ext cx="4727448" cy="7773612"/>
+                      <a:ext cx="4727448" cy="7773611"/>
                     </a:xfrm>
                     <a:prstGeom prst="rect">
                       <a:avLst/>
@@ -10173,8 +10173,8 @@
         <w:t xml:space="preserve">Figure 16. Working offline.</w:t>
       </w:r>
     </w:p>
-    <w:bookmarkEnd w:id="1672"/>
-    <w:bookmarkStart w:id="1673" w:name="who-can-do-what-starting-settings"/>
+    <w:bookmarkEnd w:id="1820"/>
+    <w:bookmarkStart w:id="1821" w:name="who-can-do-what-starting-settings"/>
     <w:p>
       <w:pPr>
         <w:pStyle w:val="Heading2"/>
@@ -11754,9 +11754,9 @@
         <w:t xml:space="preserve">rules on top of department and job title.</w:t>
       </w:r>
     </w:p>
-    <w:bookmarkEnd w:id="1673"/>
-    <w:bookmarkEnd w:id="1674"/>
-    <w:bookmarkStart w:id="1679" w:name="time-and-measures"/>
+    <w:bookmarkEnd w:id="1821"/>
+    <w:bookmarkEnd w:id="1822"/>
+    <w:bookmarkStart w:id="1827" w:name="time-and-measures"/>
     <w:p>
       <w:pPr>
         <w:pStyle w:val="Heading1"/>
@@ -11765,7 +11765,7 @@
         <w:t xml:space="preserve">10 Time and measures</w:t>
       </w:r>
     </w:p>
-    <w:bookmarkStart w:id="1675" w:name="talking-about-time"/>
+    <w:bookmarkStart w:id="1823" w:name="talking-about-time"/>
     <w:p>
       <w:pPr>
         <w:pStyle w:val="Heading2"/>
@@ -12000,8 +12000,8 @@
         <w:t xml:space="preserve">Holidays and leave reduce the working week before this calculation. For example, a public holiday on Tuesday cuts the working week to 32 hours for everyone on that holiday calendar, and the weekly planner shows the lower number before the week is locked.</w:t>
       </w:r>
     </w:p>
-    <w:bookmarkEnd w:id="1675"/>
-    <w:bookmarkStart w:id="1676" w:name="measures"/>
+    <w:bookmarkEnd w:id="1823"/>
+    <w:bookmarkStart w:id="1824" w:name="measures"/>
     <w:p>
       <w:pPr>
         <w:pStyle w:val="Heading2"/>
@@ -12389,8 +12389,8 @@
         <w:t xml:space="preserve">until people log real time. Cancelled work is shown separately and never counts as missed.</w:t>
       </w:r>
     </w:p>
-    <w:bookmarkEnd w:id="1676"/>
-    <w:bookmarkStart w:id="1677" w:name="standard-reports-proposed"/>
+    <w:bookmarkEnd w:id="1824"/>
+    <w:bookmarkStart w:id="1825" w:name="standard-reports-proposed"/>
     <w:p>
       <w:pPr>
         <w:pStyle w:val="Heading2"/>
@@ -12643,8 +12643,8 @@
         <w:t xml:space="preserve">, with their own planned, added and finished work.</w:t>
       </w:r>
     </w:p>
-    <w:bookmarkEnd w:id="1677"/>
-    <w:bookmarkStart w:id="1678" w:name="keeping-it-fair"/>
+    <w:bookmarkEnd w:id="1825"/>
+    <w:bookmarkStart w:id="1826" w:name="keeping-it-fair"/>
     <w:p>
       <w:pPr>
         <w:pStyle w:val="Heading2"/>
@@ -12713,9 +12713,9 @@
         <w:t xml:space="preserve">Don’t count a Deliverable that covers several products twice. Use its main product, or set shares.</w:t>
       </w:r>
     </w:p>
-    <w:bookmarkEnd w:id="1678"/>
-    <w:bookmarkEnd w:id="1679"/>
-    <w:bookmarkStart w:id="1697" w:name="rewards-fun-and-the-mascot"/>
+    <w:bookmarkEnd w:id="1826"/>
+    <w:bookmarkEnd w:id="1827"/>
+    <w:bookmarkStart w:id="1845" w:name="rewards-fun-and-the-mascot"/>
     <w:p>
       <w:pPr>
         <w:pStyle w:val="Heading1"/>
@@ -12732,7 +12732,7 @@
         <w:t xml:space="preserve">Rewards help people adopt the app. They should follow real, checked work, and should never encourage splitting tasks, working extra hours or saying work is done when it isn’t.</w:t>
       </w:r>
     </w:p>
-    <w:bookmarkStart w:id="1680" w:name="start-simple-first-version"/>
+    <w:bookmarkStart w:id="1828" w:name="start-simple-first-version"/>
     <w:p>
       <w:pPr>
         <w:pStyle w:val="Heading2"/>
@@ -13000,8 +13000,8 @@
         <w:t xml:space="preserve">Celebrations and streak days come only from real, checked events, each counted once, so repeating or undoing actions can’t be used to game them.</w:t>
       </w:r>
     </w:p>
-    <w:bookmarkEnd w:id="1680"/>
-    <w:bookmarkStart w:id="1690" w:name="mascot-punh-punh"/>
+    <w:bookmarkEnd w:id="1828"/>
+    <w:bookmarkStart w:id="1838" w:name="mascot-punh-punh"/>
     <w:p>
       <w:pPr>
         <w:pStyle w:val="Heading2"/>
@@ -13055,18 +13055,18 @@
                 <wp:inline>
                   <wp:extent cx="6134100" cy="6134100"/>
                   <wp:effectExtent b="0" l="0" r="0" t="0"/>
-                  <wp:docPr descr="Punh Punh holding a blank note" title="" id="1682" name="Picture"/>
+                  <wp:docPr descr="Punh Punh holding a blank note" title="" id="1830" name="Picture"/>
                   <a:graphic>
                     <a:graphicData uri="http://schemas.openxmlformats.org/drawingml/2006/picture">
                       <pic:pic>
                         <pic:nvPicPr>
-                          <pic:cNvPr descr="../design/mascot/punh-punh-A1.png" id="1683" name="Picture"/>
+                          <pic:cNvPr descr="../design/mascot/punh-punh-A1.png" id="1831" name="Picture"/>
                           <pic:cNvPicPr>
                             <a:picLocks noChangeArrowheads="1" noChangeAspect="1"/>
                           </pic:cNvPicPr>
                         </pic:nvPicPr>
                         <pic:blipFill>
-                          <a:blip r:embed="rId1681"/>
+                          <a:blip r:embed="rId1829"/>
                           <a:stretch>
                             <a:fillRect/>
                           </a:stretch>
@@ -13106,18 +13106,18 @@
                 <wp:inline>
                   <wp:extent cx="6134100" cy="6134100"/>
                   <wp:effectExtent b="0" l="0" r="0" t="0"/>
-                  <wp:docPr descr="Punh Punh waving" title="" id="1685" name="Picture"/>
+                  <wp:docPr descr="Punh Punh waving" title="" id="1833" name="Picture"/>
                   <a:graphic>
                     <a:graphicData uri="http://schemas.openxmlformats.org/drawingml/2006/picture">
                       <pic:pic>
                         <pic:nvPicPr>
-                          <pic:cNvPr descr="../design/mascot/punh-punh-B1.png" id="1686" name="Picture"/>
+                          <pic:cNvPr descr="../design/mascot/punh-punh-B1.png" id="1834" name="Picture"/>
                           <pic:cNvPicPr>
                             <a:picLocks noChangeArrowheads="1" noChangeAspect="1"/>
                           </pic:cNvPicPr>
                         </pic:nvPicPr>
                         <pic:blipFill>
-                          <a:blip r:embed="rId1684"/>
+                          <a:blip r:embed="rId1832"/>
                           <a:stretch>
                             <a:fillRect/>
                           </a:stretch>
@@ -13157,18 +13157,18 @@
                 <wp:inline>
                   <wp:extent cx="6134100" cy="6134100"/>
                   <wp:effectExtent b="0" l="0" r="0" t="0"/>
-                  <wp:docPr descr="Punh Punh holding a checked note" title="" id="1688" name="Picture"/>
+                  <wp:docPr descr="Punh Punh holding a checked note" title="" id="1836" name="Picture"/>
                   <a:graphic>
                     <a:graphicData uri="http://schemas.openxmlformats.org/drawingml/2006/picture">
                       <pic:pic>
                         <pic:nvPicPr>
-                          <pic:cNvPr descr="../design/mascot/punh-punh-C1.png" id="1689" name="Picture"/>
+                          <pic:cNvPr descr="../design/mascot/punh-punh-C1.png" id="1837" name="Picture"/>
                           <pic:cNvPicPr>
                             <a:picLocks noChangeArrowheads="1" noChangeAspect="1"/>
                           </pic:cNvPicPr>
                         </pic:nvPicPr>
                         <pic:blipFill>
-                          <a:blip r:embed="rId1687"/>
+                          <a:blip r:embed="rId1835"/>
                           <a:stretch>
                             <a:fillRect/>
                           </a:stretch>
@@ -13604,8 +13604,8 @@
         <w:t xml:space="preserve">Design work for the first version: a character sheet, five main poses (welcome, celebrate, thinking, calm, resting for holidays and leave), light animations. A chat sticker set and the bot’s profile picture come with chat apps, and seasonal outfits come later.</w:t>
       </w:r>
     </w:p>
-    <w:bookmarkEnd w:id="1690"/>
-    <w:bookmarkStart w:id="1694" w:name="app-icon"/>
+    <w:bookmarkEnd w:id="1838"/>
+    <w:bookmarkStart w:id="1842" w:name="app-icon"/>
     <w:p>
       <w:pPr>
         <w:pStyle w:val="Heading2"/>
@@ -13623,18 +13623,18 @@
           <wp:inline>
             <wp:extent cx="6134100" cy="6134100"/>
             <wp:effectExtent b="0" l="0" r="0" t="0"/>
-            <wp:docPr descr="HopFlows app icon: Punh Punh leaning in beside a checklist on a sky tile" title="" id="1692" name="Picture"/>
+            <wp:docPr descr="HopFlows app icon: Punh Punh leaning in beside a checklist on a sky tile" title="" id="1840" name="Picture"/>
             <a:graphic>
               <a:graphicData uri="http://schemas.openxmlformats.org/drawingml/2006/picture">
                 <pic:pic>
                   <pic:nvPicPr>
-                    <pic:cNvPr descr="../design/app-icon/png/icon-512.png" id="1693" name="Picture"/>
+                    <pic:cNvPr descr="../design/app-icon/png/icon-512.png" id="1841" name="Picture"/>
                     <pic:cNvPicPr>
                       <a:picLocks noChangeArrowheads="1" noChangeAspect="1"/>
                     </pic:cNvPicPr>
                   </pic:nvPicPr>
                   <pic:blipFill>
-                    <a:blip r:embed="rId1691"/>
+                    <a:blip r:embed="rId1839"/>
                     <a:stretch>
                       <a:fillRect/>
                     </a:stretch>
@@ -13786,8 +13786,8 @@
         <w:t xml:space="preserve">.</w:t>
       </w:r>
     </w:p>
-    <w:bookmarkEnd w:id="1694"/>
-    <w:bookmarkStart w:id="1695" w:name="more-rewards-later"/>
+    <w:bookmarkEnd w:id="1842"/>
+    <w:bookmarkStart w:id="1843" w:name="more-rewards-later"/>
     <w:p>
       <w:pPr>
         <w:pStyle w:val="Heading2"/>
@@ -14042,8 +14042,8 @@
         </w:tc>
       </w:tr>
     </w:tbl>
-    <w:bookmarkEnd w:id="1695"/>
-    <w:bookmarkStart w:id="1696" w:name="making-it-easy-to-start"/>
+    <w:bookmarkEnd w:id="1843"/>
+    <w:bookmarkStart w:id="1844" w:name="making-it-easy-to-start"/>
     <w:p>
       <w:pPr>
         <w:pStyle w:val="Heading2"/>
@@ -14088,9 +14088,9 @@
         <w:t xml:space="preserve">English and phone-friendly design are included from the start. Other languages can be added later.</w:t>
       </w:r>
     </w:p>
-    <w:bookmarkEnd w:id="1696"/>
-    <w:bookmarkEnd w:id="1697"/>
-    <w:bookmarkStart w:id="1707" w:name="special-cases"/>
+    <w:bookmarkEnd w:id="1844"/>
+    <w:bookmarkEnd w:id="1845"/>
+    <w:bookmarkStart w:id="1855" w:name="special-cases"/>
     <w:p>
       <w:pPr>
         <w:pStyle w:val="Heading1"/>
@@ -14099,7 +14099,7 @@
         <w:t xml:space="preserve">12 Special cases</w:t>
       </w:r>
     </w:p>
-    <w:bookmarkStart w:id="1698" w:name="work-and-requests"/>
+    <w:bookmarkStart w:id="1846" w:name="work-and-requests"/>
     <w:p>
       <w:pPr>
         <w:pStyle w:val="Heading2"/>
@@ -14677,8 +14677,8 @@
         </w:tc>
       </w:tr>
     </w:tbl>
-    <w:bookmarkEnd w:id="1698"/>
-    <w:bookmarkStart w:id="1699" w:name="planning-and-time-1"/>
+    <w:bookmarkEnd w:id="1846"/>
+    <w:bookmarkStart w:id="1847" w:name="planning-and-time-1"/>
     <w:p>
       <w:pPr>
         <w:pStyle w:val="Heading2"/>
@@ -15052,8 +15052,8 @@
         </w:tc>
       </w:tr>
     </w:tbl>
-    <w:bookmarkEnd w:id="1699"/>
-    <w:bookmarkStart w:id="1700" w:name="handover-and-leave"/>
+    <w:bookmarkEnd w:id="1847"/>
+    <w:bookmarkStart w:id="1848" w:name="handover-and-leave"/>
     <w:p>
       <w:pPr>
         <w:pStyle w:val="Heading2"/>
@@ -15277,8 +15277,8 @@
         </w:tc>
       </w:tr>
     </w:tbl>
-    <w:bookmarkEnd w:id="1700"/>
-    <w:bookmarkStart w:id="1701" w:name="risk-flags"/>
+    <w:bookmarkEnd w:id="1848"/>
+    <w:bookmarkStart w:id="1849" w:name="risk-flags"/>
     <w:p>
       <w:pPr>
         <w:pStyle w:val="Heading2"/>
@@ -15454,8 +15454,8 @@
         </w:tc>
       </w:tr>
     </w:tbl>
-    <w:bookmarkEnd w:id="1701"/>
-    <w:bookmarkStart w:id="1702" w:name="calendar-2"/>
+    <w:bookmarkEnd w:id="1849"/>
+    <w:bookmarkStart w:id="1850" w:name="calendar-2"/>
     <w:p>
       <w:pPr>
         <w:pStyle w:val="Heading2"/>
@@ -15619,8 +15619,8 @@
         </w:tc>
       </w:tr>
     </w:tbl>
-    <w:bookmarkEnd w:id="1702"/>
-    <w:bookmarkStart w:id="1703" w:name="alerts-and-chat"/>
+    <w:bookmarkEnd w:id="1850"/>
+    <w:bookmarkStart w:id="1851" w:name="alerts-and-chat"/>
     <w:p>
       <w:pPr>
         <w:pStyle w:val="Heading2"/>
@@ -16005,8 +16005,8 @@
         </w:tc>
       </w:tr>
     </w:tbl>
-    <w:bookmarkEnd w:id="1703"/>
-    <w:bookmarkStart w:id="1704" w:name="leave-routines-and-week-status"/>
+    <w:bookmarkEnd w:id="1851"/>
+    <w:bookmarkStart w:id="1852" w:name="leave-routines-and-week-status"/>
     <w:p>
       <w:pPr>
         <w:pStyle w:val="Heading2"/>
@@ -16374,8 +16374,8 @@
         </w:tc>
       </w:tr>
     </w:tbl>
-    <w:bookmarkEnd w:id="1704"/>
-    <w:bookmarkStart w:id="1705" w:name="reports-search-and-offline"/>
+    <w:bookmarkEnd w:id="1852"/>
+    <w:bookmarkStart w:id="1853" w:name="reports-search-and-offline"/>
     <w:p>
       <w:pPr>
         <w:pStyle w:val="Heading2"/>
@@ -16575,8 +16575,8 @@
         </w:tc>
       </w:tr>
     </w:tbl>
-    <w:bookmarkEnd w:id="1705"/>
-    <w:bookmarkStart w:id="1706" w:name="rewards"/>
+    <w:bookmarkEnd w:id="1853"/>
+    <w:bookmarkStart w:id="1854" w:name="rewards"/>
     <w:p>
       <w:pPr>
         <w:pStyle w:val="Heading2"/>
@@ -16704,9 +16704,9 @@
         </w:tc>
       </w:tr>
     </w:tbl>
-    <w:bookmarkEnd w:id="1706"/>
-    <w:bookmarkEnd w:id="1707"/>
-    <w:bookmarkStart w:id="1711" w:name="what-we-build-first"/>
+    <w:bookmarkEnd w:id="1854"/>
+    <w:bookmarkEnd w:id="1855"/>
+    <w:bookmarkStart w:id="1859" w:name="what-we-build-first"/>
     <w:p>
       <w:pPr>
         <w:pStyle w:val="Heading1"/>
@@ -16715,7 +16715,7 @@
         <w:t xml:space="preserve">13 What we build first</w:t>
       </w:r>
     </w:p>
-    <w:bookmarkStart w:id="1708" w:name="order-of-building"/>
+    <w:bookmarkStart w:id="1856" w:name="order-of-building"/>
     <w:p>
       <w:pPr>
         <w:pStyle w:val="Heading2"/>
@@ -16993,8 +16993,8 @@
         <w:t xml:space="preserve">apply once chat apps ship.</w:t>
       </w:r>
     </w:p>
-    <w:bookmarkEnd w:id="1708"/>
-    <w:bookmarkStart w:id="1709" w:name="seven-key-screens-to-sketch-first"/>
+    <w:bookmarkEnd w:id="1856"/>
+    <w:bookmarkStart w:id="1857" w:name="seven-key-screens-to-sketch-first"/>
     <w:p>
       <w:pPr>
         <w:pStyle w:val="Heading2"/>
@@ -17129,8 +17129,8 @@
         <w:t xml:space="preserve">act on an alert (Start, Done, Need Help, Accept) in one tap, without opening the full app.</w:t>
       </w:r>
     </w:p>
-    <w:bookmarkEnd w:id="1709"/>
-    <w:bookmarkStart w:id="1710" w:name="how-well-know-the-pilot-worked"/>
+    <w:bookmarkEnd w:id="1857"/>
+    <w:bookmarkStart w:id="1858" w:name="how-well-know-the-pilot-worked"/>
     <w:p>
       <w:pPr>
         <w:pStyle w:val="Heading2"/>
@@ -17265,9 +17265,9 @@
         <w:t xml:space="preserve">these targets are new in v1.1 and need a yes before the pilot. We’ll measure them by tracking when Add Work starts and finishes, which buttons people use and where, when alerts are sent and acted on, and how many people use the app each day in each role.</w:t>
       </w:r>
     </w:p>
-    <w:bookmarkEnd w:id="1710"/>
-    <w:bookmarkEnd w:id="1711"/>
-    <w:bookmarkStart w:id="1714" w:name="default-settings-and-launch-tests"/>
+    <w:bookmarkEnd w:id="1858"/>
+    <w:bookmarkEnd w:id="1859"/>
+    <w:bookmarkStart w:id="1862" w:name="default-settings-and-launch-tests"/>
     <w:p>
       <w:pPr>
         <w:pStyle w:val="Heading1"/>
@@ -17276,7 +17276,7 @@
         <w:t xml:space="preserve">14 Default settings and launch tests</w:t>
       </w:r>
     </w:p>
-    <w:bookmarkStart w:id="1712" w:name="default-settings-and-open-decisions"/>
+    <w:bookmarkStart w:id="1860" w:name="default-settings-and-open-decisions"/>
     <w:p>
       <w:pPr>
         <w:pStyle w:val="Heading2"/>
@@ -19038,8 +19038,8 @@
         <w:t xml:space="preserve">The system should be thorough enough to get owners, time and history right, while the employee’s screen stays as simple as possible. Complexity belongs in the system, not on the screen.</w:t>
       </w:r>
     </w:p>
-    <w:bookmarkEnd w:id="1712"/>
-    <w:bookmarkStart w:id="1713" w:name="launch-tests"/>
+    <w:bookmarkEnd w:id="1860"/>
+    <w:bookmarkStart w:id="1861" w:name="launch-tests"/>
     <w:p>
       <w:pPr>
         <w:pStyle w:val="Heading2"/>
@@ -20130,9 +20130,9 @@
         </w:tc>
       </w:tr>
     </w:tbl>
-    <w:bookmarkEnd w:id="1713"/>
-    <w:bookmarkEnd w:id="1714"/>
-    <w:bookmarkStart w:id="1721" w:name="sign-in-access-and-data"/>
+    <w:bookmarkEnd w:id="1861"/>
+    <w:bookmarkEnd w:id="1862"/>
+    <w:bookmarkStart w:id="1869" w:name="sign-in-access-and-data"/>
     <w:p>
       <w:pPr>
         <w:pStyle w:val="Heading1"/>
@@ -20159,7 +20159,7 @@
         <w:t xml:space="preserve">this section is new in v1.1 and needs a yes.</w:t>
       </w:r>
     </w:p>
-    <w:bookmarkStart w:id="1718" w:name="sign-in-and-joining-a-company"/>
+    <w:bookmarkStart w:id="1866" w:name="sign-in-and-joining-a-company"/>
     <w:p>
       <w:pPr>
         <w:pStyle w:val="Heading2"/>
@@ -20235,20 +20235,20 @@
       <w:r>
         <w:drawing>
           <wp:inline>
-            <wp:extent cx="4233672" cy="7768663"/>
+            <wp:extent cx="4233672" cy="7768662"/>
             <wp:effectExtent b="0" l="0" r="0" t="0"/>
-            <wp:docPr descr="Diagram" title="" id="1716" name="Picture"/>
+            <wp:docPr descr="Diagram" title="" id="1864" name="Picture"/>
             <a:graphic>
               <a:graphicData uri="http://schemas.openxmlformats.org/drawingml/2006/picture">
                 <pic:pic>
                   <pic:nvPicPr>
-                    <pic:cNvPr descr="/private/tmp/claude-502/-Users-keanghok-Desktop-work-startup-hopflows-docs/3d393b65-89b1-46eb-9486-b2f325668eb0/scratchpad/docx/old/media/rId1567.png" id="1717" name="Picture"/>
+                    <pic:cNvPr descr="media/media/rId1715.png" id="1865" name="Picture"/>
                     <pic:cNvPicPr>
                       <a:picLocks noChangeArrowheads="1" noChangeAspect="1"/>
                     </pic:cNvPicPr>
                   </pic:nvPicPr>
                   <pic:blipFill>
-                    <a:blip r:embed="rId1715"/>
+                    <a:blip r:embed="rId1863"/>
                     <a:stretch>
                       <a:fillRect/>
                     </a:stretch>
@@ -20256,7 +20256,7 @@
                   <pic:spPr bwMode="auto">
                     <a:xfrm>
                       <a:off x="0" y="0"/>
-                      <a:ext cx="4233672" cy="7768663"/>
+                      <a:ext cx="4233672" cy="7768662"/>
                     </a:xfrm>
                     <a:prstGeom prst="rect">
                       <a:avLst/>
@@ -20283,8 +20283,8 @@
         <w:t xml:space="preserve">Figure 17. Signing in and joining a company.</w:t>
       </w:r>
     </w:p>
-    <w:bookmarkEnd w:id="1718"/>
-    <w:bookmarkStart w:id="1719" w:name="setting-up-a-company-proposed"/>
+    <w:bookmarkEnd w:id="1866"/>
+    <w:bookmarkStart w:id="1867" w:name="setting-up-a-company-proposed"/>
     <w:p>
       <w:pPr>
         <w:pStyle w:val="Heading2"/>
@@ -20516,8 +20516,8 @@
         <w:t xml:space="preserve">on Needs you.</w:t>
       </w:r>
     </w:p>
-    <w:bookmarkEnd w:id="1719"/>
-    <w:bookmarkStart w:id="1720" w:name="looking-after-data"/>
+    <w:bookmarkEnd w:id="1867"/>
+    <w:bookmarkStart w:id="1868" w:name="looking-after-data"/>
     <w:p>
       <w:pPr>
         <w:pStyle w:val="Heading2"/>
@@ -20574,9 +20574,9 @@
         <w:t xml:space="preserve">Where the data is stored, and any promises about which country it stays in, are decided before the first paying customer.</w:t>
       </w:r>
     </w:p>
-    <w:bookmarkEnd w:id="1720"/>
-    <w:bookmarkEnd w:id="1721"/>
-    <w:bookmarkStart w:id="1722" w:name="change-log"/>
+    <w:bookmarkEnd w:id="1868"/>
+    <w:bookmarkEnd w:id="1869"/>
+    <w:bookmarkStart w:id="1870" w:name="change-log"/>
     <w:p>
       <w:pPr>
         <w:pStyle w:val="Heading1"/>
@@ -20774,7 +20774,7 @@
         </w:numPr>
       </w:pPr>
       <w:r>
-        <w:t xml:space="preserve">Mascot renamed from Hop to Punh Punh (14 October).</w:t>
+        <w:t xml:space="preserve">After the lead-flow review (Proposed): approving leave first shows its effect on the person’s week and lets the approver give away or move the Tasks due then; locking a week warns about leave requests still waiting but allows the lock; Handover warns when a receiver is on leave (20 October).</w:t>
       </w:r>
     </w:p>
     <w:p>
@@ -20786,7 +20786,7 @@
         </w:numPr>
       </w:pPr>
       <w:r>
-        <w:t xml:space="preserve">App icon chosen: Punh Checklist, with usage rules in §11 (15 October).</w:t>
+        <w:t xml:space="preserve">Mascot renamed from Hop to Punh Punh (14 October).</w:t>
       </w:r>
     </w:p>
     <w:p>
@@ -20798,28 +20798,7 @@
         </w:numPr>
       </w:pPr>
       <w:r>
-        <w:t xml:space="preserve">First version split into</w:t>
-      </w:r>
-      <w:r>
-        <w:t xml:space="preserve"> </w:t>
-      </w:r>
-      <w:r>
-        <w:t xml:space="preserve">“pilot core”</w:t>
-      </w:r>
-      <w:r>
-        <w:t xml:space="preserve"> </w:t>
-      </w:r>
-      <w:r>
-        <w:t xml:space="preserve">and</w:t>
-      </w:r>
-      <w:r>
-        <w:t xml:space="preserve"> </w:t>
-      </w:r>
-      <w:r>
-        <w:t xml:space="preserve">“soon after”</w:t>
-      </w:r>
-      <w:r>
-        <w:t xml:space="preserve">; later-stage features (Workload view for future weeks, temporary Handover, suggested risk flags) marked in the flows and special cases.</w:t>
+        <w:t xml:space="preserve">App icon chosen: Punh Checklist, with usage rules in §11 (15 October).</w:t>
       </w:r>
     </w:p>
     <w:p>
@@ -20831,7 +20810,28 @@
         </w:numPr>
       </w:pPr>
       <w:r>
-        <w:t xml:space="preserve">Rules for statuses, Confidential Task access, review and blocked markers, giving rights to named people, work schedules, time split across departments, task sizes, time zones, sorting and postponing requests.</w:t>
+        <w:t xml:space="preserve">First version split into</w:t>
+      </w:r>
+      <w:r>
+        <w:t xml:space="preserve"> </w:t>
+      </w:r>
+      <w:r>
+        <w:t xml:space="preserve">“pilot core”</w:t>
+      </w:r>
+      <w:r>
+        <w:t xml:space="preserve"> </w:t>
+      </w:r>
+      <w:r>
+        <w:t xml:space="preserve">and</w:t>
+      </w:r>
+      <w:r>
+        <w:t xml:space="preserve"> </w:t>
+      </w:r>
+      <w:r>
+        <w:t xml:space="preserve">“soon after”</w:t>
+      </w:r>
+      <w:r>
+        <w:t xml:space="preserve">; later-stage features (Workload view for future weeks, temporary Handover, suggested risk flags) marked in the flows and special cases.</w:t>
       </w:r>
     </w:p>
     <w:p>
@@ -20843,7 +20843,7 @@
         </w:numPr>
       </w:pPr>
       <w:r>
-        <w:t xml:space="preserve">Rules for carrying work over, weeks never locked, clearing flags, who gets urgent alerts next, snooze, people in several companies, handover receivers and overlapping time off.</w:t>
+        <w:t xml:space="preserve">Rules for statuses, Confidential Task access, review and blocked markers, giving rights to named people, work schedules, time split across departments, task sizes, time zones, sorting and postponing requests.</w:t>
       </w:r>
     </w:p>
     <w:p>
@@ -20855,7 +20855,7 @@
         </w:numPr>
       </w:pPr>
       <w:r>
-        <w:t xml:space="preserve">Measures, time words and pilot targets written out.</w:t>
+        <w:t xml:space="preserve">Rules for carrying work over, weeks never locked, clearing flags, who gets urgent alerts next, snooze, people in several companies, handover receivers and overlapping time off.</w:t>
       </w:r>
     </w:p>
     <w:p>
@@ -20867,7 +20867,7 @@
         </w:numPr>
       </w:pPr>
       <w:r>
-        <w:t xml:space="preserve">The streak no longer counts just starting work.</w:t>
+        <w:t xml:space="preserve">Measures, time words and pilot targets written out.</w:t>
       </w:r>
     </w:p>
     <w:p>
@@ -20879,7 +20879,7 @@
         </w:numPr>
       </w:pPr>
       <w:r>
-        <w:t xml:space="preserve">Special cases grouped by topic; all default numbers kept in §14; the life of a Task moved before planning.</w:t>
+        <w:t xml:space="preserve">The streak no longer counts just starting work.</w:t>
       </w:r>
     </w:p>
     <w:p>
@@ -20891,7 +20891,7 @@
         </w:numPr>
       </w:pPr>
       <w:r>
-        <w:t xml:space="preserve">New §15 Sign-in, access and data.</w:t>
+        <w:t xml:space="preserve">Special cases grouped by topic; all default numbers kept in §14; the life of a Task moved before planning.</w:t>
       </w:r>
     </w:p>
     <w:p>
@@ -20903,19 +20903,7 @@
         </w:numPr>
       </w:pPr>
       <w:r>
-        <w:t xml:space="preserve">Words on screen: Add Work (employees), Incoming Queue and Sort (leads);</w:t>
-      </w:r>
-      <w:r>
-        <w:t xml:space="preserve"> </w:t>
-      </w:r>
-      <w:r>
-        <w:t xml:space="preserve">“intake”</w:t>
-      </w:r>
-      <w:r>
-        <w:t xml:space="preserve"> </w:t>
-      </w:r>
-      <w:r>
-        <w:t xml:space="preserve">only in reports.</w:t>
+        <w:t xml:space="preserve">New §15 Sign-in, access and data.</w:t>
       </w:r>
     </w:p>
     <w:p>
@@ -20927,19 +20915,19 @@
         </w:numPr>
       </w:pPr>
       <w:r>
-        <w:t xml:space="preserve">The blueprint now covers business and design rules only. The data model and engineering rules moved to</w:t>
+        <w:t xml:space="preserve">Words on screen: Add Work (employees), Incoming Queue and Sort (leads);</w:t>
       </w:r>
       <w:r>
         <w:t xml:space="preserve"> </w:t>
       </w:r>
       <w:r>
-        <w:rPr>
-          <w:rStyle w:val="VerbatimChar"/>
-        </w:rPr>
-        <w:t xml:space="preserve">HopFlows_Technical_Design_v1.1.md</w:t>
-      </w:r>
-      <w:r>
-        <w:t xml:space="preserve">.</w:t>
+        <w:t xml:space="preserve">“intake”</w:t>
+      </w:r>
+      <w:r>
+        <w:t xml:space="preserve"> </w:t>
+      </w:r>
+      <w:r>
+        <w:t xml:space="preserve">only in reports.</w:t>
       </w:r>
     </w:p>
     <w:p>
@@ -20951,7 +20939,19 @@
         </w:numPr>
       </w:pPr>
       <w:r>
-        <w:t xml:space="preserve">Gap fixes (Proposed): updates to request senders, weekly summary for leaders, four standard reports with downloads, week status, leave requests and approval, repeating daily work (moved from a later stage into the first version), working offline and search.</w:t>
+        <w:t xml:space="preserve">The blueprint now covers business and design rules only. The data model and engineering rules moved to</w:t>
+      </w:r>
+      <w:r>
+        <w:t xml:space="preserve"> </w:t>
+      </w:r>
+      <w:r>
+        <w:rPr>
+          <w:rStyle w:val="VerbatimChar"/>
+        </w:rPr>
+        <w:t xml:space="preserve">HopFlows_Technical_Design_v1.1.md</w:t>
+      </w:r>
+      <w:r>
+        <w:t xml:space="preserve">.</w:t>
       </w:r>
     </w:p>
     <w:p>
@@ -20963,7 +20963,7 @@
         </w:numPr>
       </w:pPr>
       <w:r>
-        <w:t xml:space="preserve">List, Board and Table views added for full work lists (Proposed).</w:t>
+        <w:t xml:space="preserve">Gap fixes (Proposed): updates to request senders, weekly summary for leaders, four standard reports with downloads, week status, leave requests and approval, repeating daily work (moved from a later stage into the first version), working offline and search.</w:t>
       </w:r>
     </w:p>
     <w:p>
@@ -20975,7 +20975,7 @@
         </w:numPr>
       </w:pPr>
       <w:r>
-        <w:t xml:space="preserve">Flow diagrams added: the life of a Task, a map of who starts which flow, Flows A–J, Board dragging, working offline, and signing in.</w:t>
+        <w:t xml:space="preserve">List, Board and Table views added for full work lists (Proposed).</w:t>
       </w:r>
     </w:p>
     <w:p>
@@ -20987,6 +20987,18 @@
         </w:numPr>
       </w:pPr>
       <w:r>
+        <w:t xml:space="preserve">Flow diagrams added: the life of a Task, a map of who starts which flow, Flows A–J, Board dragging, working offline, and signing in.</w:t>
+      </w:r>
+    </w:p>
+    <w:p>
+      <w:pPr>
+        <w:pStyle w:val="Compact"/>
+        <w:numPr>
+          <w:ilvl w:val="0"/>
+          <w:numId w:val="1044"/>
+        </w:numPr>
+      </w:pPr>
+      <w:r>
         <w:t xml:space="preserve">Rewritten in simple, everyday language. Words changed:</w:t>
       </w:r>
       <w:r>
@@ -21099,7 +21111,7 @@
         <w:t xml:space="preserve">HopFlows / End of Blueprint</w:t>
       </w:r>
     </w:p>
-    <w:bookmarkEnd w:id="1722"/>
+    <w:bookmarkEnd w:id="1870"/>
     <w:sectPr>
       <w:headerReference r:id="rId9" w:type="default"/>
       <w:footerReference r:id="rId10" w:type="default"/>
@@ -36700,6 +36712,232 @@
     <w:basedOn w:val="VerbatimChar"/>
     <w:rPr/>
   </w:style>
+  <w:style w:customStyle="1" w:styleId="KeywordTok" w:type="character">
+    <w:name w:val="KeywordTok"/>
+    <w:basedOn w:val="VerbatimChar"/>
+    <w:rPr>
+      <w:b/>
+      <w:color w:val="007020"/>
+    </w:rPr>
+  </w:style>
+  <w:style w:customStyle="1" w:styleId="DataTypeTok" w:type="character">
+    <w:name w:val="DataTypeTok"/>
+    <w:basedOn w:val="VerbatimChar"/>
+    <w:rPr>
+      <w:color w:val="902000"/>
+    </w:rPr>
+  </w:style>
+  <w:style w:customStyle="1" w:styleId="DecValTok" w:type="character">
+    <w:name w:val="DecValTok"/>
+    <w:basedOn w:val="VerbatimChar"/>
+    <w:rPr>
+      <w:color w:val="40a070"/>
+    </w:rPr>
+  </w:style>
+  <w:style w:customStyle="1" w:styleId="BaseNTok" w:type="character">
+    <w:name w:val="BaseNTok"/>
+    <w:basedOn w:val="VerbatimChar"/>
+    <w:rPr>
+      <w:color w:val="40a070"/>
+    </w:rPr>
+  </w:style>
+  <w:style w:customStyle="1" w:styleId="FloatTok" w:type="character">
+    <w:name w:val="FloatTok"/>
+    <w:basedOn w:val="VerbatimChar"/>
+    <w:rPr>
+      <w:color w:val="40a070"/>
+    </w:rPr>
+  </w:style>
+  <w:style w:customStyle="1" w:styleId="ConstantTok" w:type="character">
+    <w:name w:val="ConstantTok"/>
+    <w:basedOn w:val="VerbatimChar"/>
+    <w:rPr>
+      <w:color w:val="880000"/>
+    </w:rPr>
+  </w:style>
+  <w:style w:customStyle="1" w:styleId="CharTok" w:type="character">
+    <w:name w:val="CharTok"/>
+    <w:basedOn w:val="VerbatimChar"/>
+    <w:rPr>
+      <w:color w:val="4070a0"/>
+    </w:rPr>
+  </w:style>
+  <w:style w:customStyle="1" w:styleId="SpecialCharTok" w:type="character">
+    <w:name w:val="SpecialCharTok"/>
+    <w:basedOn w:val="VerbatimChar"/>
+    <w:rPr>
+      <w:color w:val="4070a0"/>
+    </w:rPr>
+  </w:style>
+  <w:style w:customStyle="1" w:styleId="StringTok" w:type="character">
+    <w:name w:val="StringTok"/>
+    <w:basedOn w:val="VerbatimChar"/>
+    <w:rPr>
+      <w:color w:val="4070a0"/>
+    </w:rPr>
+  </w:style>
+  <w:style w:customStyle="1" w:styleId="VerbatimStringTok" w:type="character">
+    <w:name w:val="VerbatimStringTok"/>
+    <w:basedOn w:val="VerbatimChar"/>
+    <w:rPr>
+      <w:color w:val="4070a0"/>
+    </w:rPr>
+  </w:style>
+  <w:style w:customStyle="1" w:styleId="SpecialStringTok" w:type="character">
+    <w:name w:val="SpecialStringTok"/>
+    <w:basedOn w:val="VerbatimChar"/>
+    <w:rPr>
+      <w:color w:val="bb6688"/>
+    </w:rPr>
+  </w:style>
+  <w:style w:customStyle="1" w:styleId="ImportTok" w:type="character">
+    <w:name w:val="ImportTok"/>
+    <w:basedOn w:val="VerbatimChar"/>
+    <w:rPr>
+      <w:b/>
+      <w:color w:val="008000"/>
+    </w:rPr>
+  </w:style>
+  <w:style w:customStyle="1" w:styleId="CommentTok" w:type="character">
+    <w:name w:val="CommentTok"/>
+    <w:basedOn w:val="VerbatimChar"/>
+    <w:rPr>
+      <w:i/>
+      <w:color w:val="60a0b0"/>
+    </w:rPr>
+  </w:style>
+  <w:style w:customStyle="1" w:styleId="DocumentationTok" w:type="character">
+    <w:name w:val="DocumentationTok"/>
+    <w:basedOn w:val="VerbatimChar"/>
+    <w:rPr>
+      <w:i/>
+      <w:color w:val="ba2121"/>
+    </w:rPr>
+  </w:style>
+  <w:style w:customStyle="1" w:styleId="AnnotationTok" w:type="character">
+    <w:name w:val="AnnotationTok"/>
+    <w:basedOn w:val="VerbatimChar"/>
+    <w:rPr>
+      <w:b/>
+      <w:i/>
+      <w:color w:val="60a0b0"/>
+    </w:rPr>
+  </w:style>
+  <w:style w:customStyle="1" w:styleId="CommentVarTok" w:type="character">
+    <w:name w:val="CommentVarTok"/>
+    <w:basedOn w:val="VerbatimChar"/>
+    <w:rPr>
+      <w:b/>
+      <w:i/>
+      <w:color w:val="60a0b0"/>
+    </w:rPr>
+  </w:style>
+  <w:style w:customStyle="1" w:styleId="OtherTok" w:type="character">
+    <w:name w:val="OtherTok"/>
+    <w:basedOn w:val="VerbatimChar"/>
+    <w:rPr>
+      <w:color w:val="007020"/>
+    </w:rPr>
+  </w:style>
+  <w:style w:customStyle="1" w:styleId="FunctionTok" w:type="character">
+    <w:name w:val="FunctionTok"/>
+    <w:basedOn w:val="VerbatimChar"/>
+    <w:rPr>
+      <w:color w:val="06287e"/>
+    </w:rPr>
+  </w:style>
+  <w:style w:customStyle="1" w:styleId="VariableTok" w:type="character">
+    <w:name w:val="VariableTok"/>
+    <w:basedOn w:val="VerbatimChar"/>
+    <w:rPr>
+      <w:color w:val="19177c"/>
+    </w:rPr>
+  </w:style>
+  <w:style w:customStyle="1" w:styleId="ControlFlowTok" w:type="character">
+    <w:name w:val="ControlFlowTok"/>
+    <w:basedOn w:val="VerbatimChar"/>
+    <w:rPr>
+      <w:b/>
+      <w:color w:val="007020"/>
+    </w:rPr>
+  </w:style>
+  <w:style w:customStyle="1" w:styleId="OperatorTok" w:type="character">
+    <w:name w:val="OperatorTok"/>
+    <w:basedOn w:val="VerbatimChar"/>
+    <w:rPr>
+      <w:color w:val="666666"/>
+    </w:rPr>
+  </w:style>
+  <w:style w:customStyle="1" w:styleId="BuiltInTok" w:type="character">
+    <w:name w:val="BuiltInTok"/>
+    <w:basedOn w:val="VerbatimChar"/>
+    <w:rPr>
+      <w:color w:val="008000"/>
+    </w:rPr>
+  </w:style>
+  <w:style w:customStyle="1" w:styleId="ExtensionTok" w:type="character">
+    <w:name w:val="ExtensionTok"/>
+    <w:basedOn w:val="VerbatimChar"/>
+    <w:rPr/>
+  </w:style>
+  <w:style w:customStyle="1" w:styleId="PreprocessorTok" w:type="character">
+    <w:name w:val="PreprocessorTok"/>
+    <w:basedOn w:val="VerbatimChar"/>
+    <w:rPr>
+      <w:color w:val="bc7a00"/>
+    </w:rPr>
+  </w:style>
+  <w:style w:customStyle="1" w:styleId="AttributeTok" w:type="character">
+    <w:name w:val="AttributeTok"/>
+    <w:basedOn w:val="VerbatimChar"/>
+    <w:rPr>
+      <w:color w:val="7d9029"/>
+    </w:rPr>
+  </w:style>
+  <w:style w:customStyle="1" w:styleId="RegionMarkerTok" w:type="character">
+    <w:name w:val="RegionMarkerTok"/>
+    <w:basedOn w:val="VerbatimChar"/>
+    <w:rPr/>
+  </w:style>
+  <w:style w:customStyle="1" w:styleId="InformationTok" w:type="character">
+    <w:name w:val="InformationTok"/>
+    <w:basedOn w:val="VerbatimChar"/>
+    <w:rPr>
+      <w:b/>
+      <w:i/>
+      <w:color w:val="60a0b0"/>
+    </w:rPr>
+  </w:style>
+  <w:style w:customStyle="1" w:styleId="WarningTok" w:type="character">
+    <w:name w:val="WarningTok"/>
+    <w:basedOn w:val="VerbatimChar"/>
+    <w:rPr>
+      <w:b/>
+      <w:i/>
+      <w:color w:val="60a0b0"/>
+    </w:rPr>
+  </w:style>
+  <w:style w:customStyle="1" w:styleId="AlertTok" w:type="character">
+    <w:name w:val="AlertTok"/>
+    <w:basedOn w:val="VerbatimChar"/>
+    <w:rPr>
+      <w:b/>
+      <w:color w:val="ff0000"/>
+    </w:rPr>
+  </w:style>
+  <w:style w:customStyle="1" w:styleId="ErrorTok" w:type="character">
+    <w:name w:val="ErrorTok"/>
+    <w:basedOn w:val="VerbatimChar"/>
+    <w:rPr>
+      <w:b/>
+      <w:color w:val="ff0000"/>
+    </w:rPr>
+  </w:style>
+  <w:style w:customStyle="1" w:styleId="NormalTok" w:type="character">
+    <w:name w:val="NormalTok"/>
+    <w:basedOn w:val="VerbatimChar"/>
+    <w:rPr/>
+  </w:style>
   <w:style w:type="character" w:customStyle="1" w:styleId="KeywordTok">
     <w:name w:val="KeywordTok"/>
     <w:basedOn w:val="VerbatimChar"/>

</xml_diff>

<commit_message>
Show load after the move, merge duplicates, undo handover
- Every place that moves work (leave sheet, Handover, Queue owner
  picker) shows the receiver's week after the move and defaults to
  whoever has the most room; leave defaults to moving the task to
  week 44
- Handover starts Mon 19 Oct, moves 7 items to 4 people with
  post-move loads, and can be undone for 10 minutes
- Queue: a request that matches an open task starts on Merge; Make a
  Task lists every owner with their load and blocks people who are away
- Lead screens agree on task names, sizes, hours, statuses and the
  Blocked marker; new LEAD_DATA.md records the agreed week
- Blueprint: post-move loads, Merge first for duplicates, handover undo
- Sync docs/design with canvas version 52 (1792514541-aa5a)

Co-Authored-By: Claude Opus 5.5 <noreply@anthropic.com>
</commit_message>
<xml_diff>
--- a/docs/HopFlows_Product_Blueprint_v1.1.docx
+++ b/docs/HopFlows_Product_Blueprint_v1.1.docx
@@ -2,7 +2,7 @@
 <file path=word/document.xml><?xml version="1.0" encoding="utf-8"?>
 <w:document xmlns:w="http://schemas.openxmlformats.org/wordprocessingml/2006/main" xmlns:m="http://schemas.openxmlformats.org/officeDocument/2006/math" xmlns:r="http://schemas.openxmlformats.org/officeDocument/2006/relationships" xmlns:o="urn:schemas-microsoft-com:office:office" xmlns:v="urn:schemas-microsoft-com:vml" xmlns:w10="urn:schemas-microsoft-com:office:word" xmlns:a="http://schemas.openxmlformats.org/drawingml/2006/main" xmlns:pic="http://schemas.openxmlformats.org/drawingml/2006/picture" xmlns:wp="http://schemas.openxmlformats.org/drawingml/2006/wordprocessingDrawing">
   <w:body>
-    <w:bookmarkStart w:id="1727" w:name="hopflows-product-blueprint"/>
+    <w:bookmarkStart w:id="1875" w:name="hopflows-product-blueprint"/>
     <w:p>
       <w:pPr>
         <w:pStyle w:val="Heading1"/>
@@ -127,7 +127,7 @@
         <w:t xml:space="preserve">For the people who plan the product, design it, build it and roll it out.</w:t>
       </w:r>
     </w:p>
-    <w:bookmarkStart w:id="1724" w:name="about-this-blueprint"/>
+    <w:bookmarkStart w:id="1872" w:name="about-this-blueprint"/>
     <w:p>
       <w:pPr>
         <w:pStyle w:val="Heading2"/>
@@ -375,8 +375,8 @@
         <w:t xml:space="preserve">are new in v1.1 and still need a yes or no. The change log at the end lists what changed.</w:t>
       </w:r>
     </w:p>
-    <w:bookmarkEnd w:id="1724"/>
-    <w:bookmarkStart w:id="1725" w:name="the-big-idea"/>
+    <w:bookmarkEnd w:id="1872"/>
+    <w:bookmarkStart w:id="1873" w:name="the-big-idea"/>
     <w:p>
       <w:pPr>
         <w:pStyle w:val="Heading2"/>
@@ -405,8 +405,8 @@
         <w:t xml:space="preserve">Leaders care about results. Team leads care about getting work done and how busy their team is. Employees care about what to do next. Planned work and surprise work both count, without extra paperwork.</w:t>
       </w:r>
     </w:p>
-    <w:bookmarkEnd w:id="1725"/>
-    <w:bookmarkStart w:id="1726" w:name="decisions-already-made"/>
+    <w:bookmarkEnd w:id="1873"/>
+    <w:bookmarkStart w:id="1874" w:name="decisions-already-made"/>
     <w:p>
       <w:pPr>
         <w:pStyle w:val="Heading2"/>
@@ -628,9 +628,9 @@
         <w:t xml:space="preserve">The app keeps working when the internet is weak: people can add and update work offline, and they can find anything with one search. (Proposed)</w:t>
       </w:r>
     </w:p>
-    <w:bookmarkEnd w:id="1726"/>
-    <w:bookmarkEnd w:id="1727"/>
-    <w:bookmarkStart w:id="1731" w:name="summary"/>
+    <w:bookmarkEnd w:id="1874"/>
+    <w:bookmarkEnd w:id="1875"/>
+    <w:bookmarkStart w:id="1879" w:name="summary"/>
     <w:p>
       <w:pPr>
         <w:pStyle w:val="Heading1"/>
@@ -639,7 +639,7 @@
         <w:t xml:space="preserve">01 Summary</w:t>
       </w:r>
     </w:p>
-    <w:bookmarkStart w:id="1728" w:name="the-problem"/>
+    <w:bookmarkStart w:id="1876" w:name="the-problem"/>
     <w:p>
       <w:pPr>
         <w:pStyle w:val="Heading2"/>
@@ -656,8 +656,8 @@
         <w:t xml:space="preserve">Many teams don’t use task apps because the lists get too long, updating them feels like extra work, screens show too much, and work done outside the app never shows up in the plan. One complicated screen also can’t serve employees, team leads and bosses equally well.</w:t>
       </w:r>
     </w:p>
-    <w:bookmarkEnd w:id="1728"/>
-    <w:bookmarkStart w:id="1729" w:name="how-hopflows-answers-it"/>
+    <w:bookmarkEnd w:id="1876"/>
+    <w:bookmarkStart w:id="1877" w:name="how-hopflows-answers-it"/>
     <w:p>
       <w:pPr>
         <w:pStyle w:val="Heading2"/>
@@ -878,8 +878,8 @@
         </w:tc>
       </w:tr>
     </w:tbl>
-    <w:bookmarkEnd w:id="1729"/>
-    <w:bookmarkStart w:id="1730" w:name="in-one-sentence"/>
+    <w:bookmarkEnd w:id="1877"/>
+    <w:bookmarkStart w:id="1878" w:name="in-one-sentence"/>
     <w:p>
       <w:pPr>
         <w:pStyle w:val="Heading2"/>
@@ -908,9 +908,9 @@
         <w:t xml:space="preserve">A simple task app that makes work easy for employees, clear for managers and measurable for leaders, without making task tracking feel like another job.</w:t>
       </w:r>
     </w:p>
-    <w:bookmarkEnd w:id="1730"/>
-    <w:bookmarkEnd w:id="1731"/>
-    <w:bookmarkStart w:id="1734" w:name="how-the-pieces-fit-together"/>
+    <w:bookmarkEnd w:id="1878"/>
+    <w:bookmarkEnd w:id="1879"/>
+    <w:bookmarkStart w:id="1882" w:name="how-the-pieces-fit-together"/>
     <w:p>
       <w:pPr>
         <w:pStyle w:val="Heading1"/>
@@ -1081,7 +1081,7 @@
         <w:t xml:space="preserve">Figure 1. Three parts of a company linked to one system for work and reports.</w:t>
       </w:r>
     </w:p>
-    <w:bookmarkStart w:id="1732" w:name="linked-not-stacked"/>
+    <w:bookmarkStart w:id="1880" w:name="linked-not-stacked"/>
     <w:p>
       <w:pPr>
         <w:pStyle w:val="Heading2"/>
@@ -1098,8 +1098,8 @@
         <w:t xml:space="preserve">Don’t force everything into one tree. One Goal can help several products. One Deliverable can involve several departments. One person can be in several teams. HopFlows links these things instead of stacking them, and still keeps one clear owner for each Goal, Deliverable and active Task.</w:t>
       </w:r>
     </w:p>
-    <w:bookmarkEnd w:id="1732"/>
-    <w:bookmarkStart w:id="1733" w:name="Xd518698a0b64a922415221525837e1dabd77edc"/>
+    <w:bookmarkEnd w:id="1880"/>
+    <w:bookmarkStart w:id="1881" w:name="Xd518698a0b64a922415221525837e1dabd77edc"/>
     <w:p>
       <w:pPr>
         <w:pStyle w:val="Heading2"/>
@@ -1342,9 +1342,9 @@
         <w:t xml:space="preserve">that never end and fill up with unrelated work.</w:t>
       </w:r>
     </w:p>
-    <w:bookmarkEnd w:id="1733"/>
-    <w:bookmarkEnd w:id="1734"/>
-    <w:bookmarkStart w:id="1737" w:name="main-words-we-use"/>
+    <w:bookmarkEnd w:id="1881"/>
+    <w:bookmarkEnd w:id="1882"/>
+    <w:bookmarkStart w:id="1885" w:name="main-words-we-use"/>
     <w:p>
       <w:pPr>
         <w:pStyle w:val="Heading1"/>
@@ -1778,7 +1778,7 @@
         </w:tc>
       </w:tr>
     </w:tbl>
-    <w:bookmarkStart w:id="1735" w:name="words-on-screen"/>
+    <w:bookmarkStart w:id="1883" w:name="words-on-screen"/>
     <w:p>
       <w:pPr>
         <w:pStyle w:val="Heading2"/>
@@ -1962,8 +1962,8 @@
         <w:t xml:space="preserve">only for checking finished work.</w:t>
       </w:r>
     </w:p>
-    <w:bookmarkEnd w:id="1735"/>
-    <w:bookmarkStart w:id="1736" w:name="words-about-time"/>
+    <w:bookmarkEnd w:id="1883"/>
+    <w:bookmarkStart w:id="1884" w:name="words-about-time"/>
     <w:p>
       <w:pPr>
         <w:pStyle w:val="Heading2"/>
@@ -2244,9 +2244,9 @@
         </w:tc>
       </w:tr>
     </w:tbl>
-    <w:bookmarkEnd w:id="1736"/>
-    <w:bookmarkEnd w:id="1737"/>
-    <w:bookmarkStart w:id="1748" w:name="business-rules"/>
+    <w:bookmarkEnd w:id="1884"/>
+    <w:bookmarkEnd w:id="1885"/>
+    <w:bookmarkStart w:id="1896" w:name="business-rules"/>
     <w:p>
       <w:pPr>
         <w:pStyle w:val="Heading1"/>
@@ -2272,7 +2272,7 @@
         <w:t xml:space="preserve">) shows how they are built.</w:t>
       </w:r>
     </w:p>
-    <w:bookmarkStart w:id="1738" w:name="people-and-access"/>
+    <w:bookmarkStart w:id="1886" w:name="people-and-access"/>
     <w:p>
       <w:pPr>
         <w:pStyle w:val="Heading2"/>
@@ -2341,8 +2341,8 @@
         <w:t xml:space="preserve">People can look at other departments’ work, read-only (Proposed). Anyone in the company can open another department’s Goals, Deliverables and Tasks and see the title, owner, status, due date and the Blocked marker. From there they can only send a request or give kudos. Workload colours, time, reports, weekly plans and reviews stay inside the department, Confidential Tasks follow their own rules, and a Task for me that isn’t linked to a Deliverable is seen only inside its department. An admin can close a department’s work to people outside it (for example HR or Finance).</w:t>
       </w:r>
     </w:p>
-    <w:bookmarkEnd w:id="1738"/>
-    <w:bookmarkStart w:id="1739" w:name="work"/>
+    <w:bookmarkEnd w:id="1886"/>
+    <w:bookmarkStart w:id="1887" w:name="work"/>
     <w:p>
       <w:pPr>
         <w:pStyle w:val="Heading2"/>
@@ -2543,8 +2543,8 @@
         <w:t xml:space="preserve">Kudos: one per person, per teammate, per item. You can’t give kudos to yourself. Kudos are never ranked.</w:t>
       </w:r>
     </w:p>
-    <w:bookmarkEnd w:id="1739"/>
-    <w:bookmarkStart w:id="1740" w:name="new-requests"/>
+    <w:bookmarkEnd w:id="1887"/>
+    <w:bookmarkStart w:id="1888" w:name="new-requests"/>
     <w:p>
       <w:pPr>
         <w:pStyle w:val="Heading2"/>
@@ -2562,7 +2562,7 @@
         </w:numPr>
       </w:pPr>
       <w:r>
-        <w:t xml:space="preserve">When a lead sorts a request, they choose one of: turn it into a Task, merge it with an existing Task, postpone it, or close it.</w:t>
+        <w:t xml:space="preserve">When a lead sorts a request, they choose one of: turn it into a Task, merge it with an existing Task, postpone it, or close it. If the request looks like an open Task, Merge is picked first, and turning it into a new Task is still one tap away. When it becomes a Task, the owner picker shows how busy each person would be after taking it, and people who are away can’t be picked. (Proposed)</w:t>
       </w:r>
     </w:p>
     <w:p>
@@ -2683,8 +2683,8 @@
         <w:t xml:space="preserve">.</w:t>
       </w:r>
     </w:p>
-    <w:bookmarkEnd w:id="1740"/>
-    <w:bookmarkStart w:id="1741" w:name="planning-and-time"/>
+    <w:bookmarkEnd w:id="1888"/>
+    <w:bookmarkStart w:id="1889" w:name="planning-and-time"/>
     <w:p>
       <w:pPr>
         <w:pStyle w:val="Heading2"/>
@@ -2825,8 +2825,8 @@
         <w:t xml:space="preserve">Repeating daily work reserves its time in each week, so the weekly plan and the Workload view include it before any project work is locked.</w:t>
       </w:r>
     </w:p>
-    <w:bookmarkEnd w:id="1741"/>
-    <w:bookmarkStart w:id="1742" w:name="leave-proposed"/>
+    <w:bookmarkEnd w:id="1889"/>
+    <w:bookmarkStart w:id="1890" w:name="leave-proposed"/>
     <w:p>
       <w:pPr>
         <w:pStyle w:val="Heading2"/>
@@ -2940,8 +2940,8 @@
         <w:t xml:space="preserve">HopFlows records leave only for planning. It doesn’t track how many leave days are left, or pay. That stays with the company’s HR process.</w:t>
       </w:r>
     </w:p>
-    <w:bookmarkEnd w:id="1742"/>
-    <w:bookmarkStart w:id="1743" w:name="repeating-daily-work-proposed"/>
+    <w:bookmarkEnd w:id="1890"/>
+    <w:bookmarkStart w:id="1891" w:name="repeating-daily-work-proposed"/>
     <w:p>
       <w:pPr>
         <w:pStyle w:val="Heading2"/>
@@ -3058,8 +3058,8 @@
         <w:t xml:space="preserve">Changing a routine changes only future days. Pausing a routine stops new days until it is turned back on.</w:t>
       </w:r>
     </w:p>
-    <w:bookmarkEnd w:id="1743"/>
-    <w:bookmarkStart w:id="1744" w:name="handover-and-risk"/>
+    <w:bookmarkEnd w:id="1891"/>
+    <w:bookmarkStart w:id="1892" w:name="handover-and-risk"/>
     <w:p>
       <w:pPr>
         <w:pStyle w:val="Heading2"/>
@@ -3128,8 +3128,8 @@
         <w:t xml:space="preserve">A flag can be cleared by the person who set it, the item’s owner, or leaders. A Goal owner can’t clear a flag set by leaders. When a Deliverable is accepted or cancelled, its flag closes. When a Deliverable moves to another Goal, its flag moves with it.</w:t>
       </w:r>
     </w:p>
-    <w:bookmarkEnd w:id="1744"/>
-    <w:bookmarkStart w:id="1745" w:name="calendar"/>
+    <w:bookmarkEnd w:id="1892"/>
+    <w:bookmarkStart w:id="1893" w:name="calendar"/>
     <w:p>
       <w:pPr>
         <w:pStyle w:val="Heading2"/>
@@ -3219,8 +3219,8 @@
         <w:t xml:space="preserve">Each person can set their own reminders for events.</w:t>
       </w:r>
     </w:p>
-    <w:bookmarkEnd w:id="1745"/>
-    <w:bookmarkStart w:id="1746" w:name="notifications"/>
+    <w:bookmarkEnd w:id="1893"/>
+    <w:bookmarkStart w:id="1894" w:name="notifications"/>
     <w:p>
       <w:pPr>
         <w:pStyle w:val="Heading2"/>
@@ -3337,8 +3337,8 @@
         <w:t xml:space="preserve">Messages are in English by default. When other languages are added, each company picks its default and each person can choose their own.</w:t>
       </w:r>
     </w:p>
-    <w:bookmarkEnd w:id="1746"/>
-    <w:bookmarkStart w:id="1747" w:name="reports-search-and-offline-proposed"/>
+    <w:bookmarkEnd w:id="1894"/>
+    <w:bookmarkStart w:id="1895" w:name="reports-search-and-offline-proposed"/>
     <w:p>
       <w:pPr>
         <w:pStyle w:val="Heading2"/>
@@ -3443,9 +3443,9 @@
         <w:t xml:space="preserve">rules, and is deleted when the person signs out or leaves the company.</w:t>
       </w:r>
     </w:p>
-    <w:bookmarkEnd w:id="1747"/>
-    <w:bookmarkEnd w:id="1748"/>
-    <w:bookmarkStart w:id="1750" w:name="how-things-connect"/>
+    <w:bookmarkEnd w:id="1895"/>
+    <w:bookmarkEnd w:id="1896"/>
+    <w:bookmarkStart w:id="1898" w:name="how-things-connect"/>
     <w:p>
       <w:pPr>
         <w:pStyle w:val="Heading1"/>
@@ -4462,7 +4462,7 @@
         </w:tc>
       </w:tr>
     </w:tbl>
-    <w:bookmarkStart w:id="1749" w:name="rules-that-never-change"/>
+    <w:bookmarkStart w:id="1897" w:name="rules-that-never-change"/>
     <w:p>
       <w:pPr>
         <w:pStyle w:val="Heading2"/>
@@ -4660,9 +4660,9 @@
         <w:t xml:space="preserve">A button pressed in a push alert or chat does the same thing as in the app, with the same permission check and history. Buttons work once and expire.</w:t>
       </w:r>
     </w:p>
-    <w:bookmarkEnd w:id="1749"/>
-    <w:bookmarkEnd w:id="1750"/>
-    <w:bookmarkStart w:id="1755" w:name="the-life-of-a-task"/>
+    <w:bookmarkEnd w:id="1897"/>
+    <w:bookmarkEnd w:id="1898"/>
+    <w:bookmarkStart w:id="1903" w:name="the-life-of-a-task"/>
     <w:p>
       <w:pPr>
         <w:pStyle w:val="Heading1"/>
@@ -4742,18 +4742,18 @@
           <wp:inline>
             <wp:extent cx="5486400" cy="4774556"/>
             <wp:effectExtent b="0" l="0" r="0" t="0"/>
-            <wp:docPr descr="Diagram" title="" id="1752" name="Picture"/>
+            <wp:docPr descr="Diagram" title="" id="1900" name="Picture"/>
             <a:graphic>
               <a:graphicData uri="http://schemas.openxmlformats.org/drawingml/2006/picture">
                 <pic:pic>
                   <pic:nvPicPr>
-                    <pic:cNvPr descr="media/media/rId1603.png" id="1753" name="Picture"/>
+                    <pic:cNvPr descr="media/media/rId1751.png" id="1901" name="Picture"/>
                     <pic:cNvPicPr>
                       <a:picLocks noChangeArrowheads="1" noChangeAspect="1"/>
                     </pic:cNvPicPr>
                   </pic:nvPicPr>
                   <pic:blipFill>
-                    <a:blip r:embed="rId1751"/>
+                    <a:blip r:embed="rId1899"/>
                     <a:stretch>
                       <a:fillRect/>
                     </a:stretch>
@@ -4788,7 +4788,7 @@
         <w:t xml:space="preserve">Figure 2. The life of a Task. Blocked and Need Help are markers on a Task, not steps. Missed is only for repeating daily work.</w:t>
       </w:r>
     </w:p>
-    <w:bookmarkStart w:id="1754" w:name="buttons-employees-use"/>
+    <w:bookmarkStart w:id="1902" w:name="buttons-employees-use"/>
     <w:p>
       <w:pPr>
         <w:pStyle w:val="Heading2"/>
@@ -5012,9 +5012,9 @@
         </w:tc>
       </w:tr>
     </w:tbl>
-    <w:bookmarkEnd w:id="1754"/>
-    <w:bookmarkEnd w:id="1755"/>
-    <w:bookmarkStart w:id="1761" w:name="planned-and-unplanned-work"/>
+    <w:bookmarkEnd w:id="1902"/>
+    <w:bookmarkEnd w:id="1903"/>
+    <w:bookmarkStart w:id="1909" w:name="planned-and-unplanned-work"/>
     <w:p>
       <w:pPr>
         <w:pStyle w:val="Heading1"/>
@@ -5141,7 +5141,7 @@
         <w:t xml:space="preserve">Figure 3. Two ways in, one way to do the work.</w:t>
       </w:r>
     </w:p>
-    <w:bookmarkStart w:id="1756" w:name="three-separate-labels"/>
+    <w:bookmarkStart w:id="1904" w:name="three-separate-labels"/>
     <w:p>
       <w:pPr>
         <w:pStyle w:val="Heading2"/>
@@ -5338,8 +5338,8 @@
         <w:t xml:space="preserve">depends on a particular week, so the same Task can be added in one week and planned in the next.</w:t>
       </w:r>
     </w:p>
-    <w:bookmarkEnd w:id="1756"/>
-    <w:bookmarkStart w:id="1760" w:name="the-locking-rule"/>
+    <w:bookmarkEnd w:id="1904"/>
+    <w:bookmarkStart w:id="1908" w:name="the-locking-rule"/>
     <w:p>
       <w:pPr>
         <w:pStyle w:val="Heading2"/>
@@ -5368,7 +5368,7 @@
         <w:t xml:space="preserve">When the lead locks a week, HopFlows saves a copy of the planned work, the estimates and the owners. The live plan can still change, but reports always compare what really happened with that saved copy.</w:t>
       </w:r>
     </w:p>
-    <w:bookmarkStart w:id="1757" w:name="example-something-urgent-arrives-midweek"/>
+    <w:bookmarkStart w:id="1905" w:name="example-something-urgent-arrives-midweek"/>
     <w:p>
       <w:pPr>
         <w:pStyle w:val="Heading3"/>
@@ -5433,8 +5433,8 @@
         <w:t xml:space="preserve">If the same request is planned into next week, it counts as planned there, and HopFlows still remembers it started as a surprise.</w:t>
       </w:r>
     </w:p>
-    <w:bookmarkEnd w:id="1757"/>
-    <w:bookmarkStart w:id="1758" w:name="X6546010788123f30940adaa831be091dcf8e07f"/>
+    <w:bookmarkEnd w:id="1905"/>
+    <w:bookmarkStart w:id="1906" w:name="X6546010788123f30940adaa831be091dcf8e07f"/>
     <w:p>
       <w:pPr>
         <w:pStyle w:val="Heading3"/>
@@ -5463,8 +5463,8 @@
         <w:t xml:space="preserve">and appear in the weekly review. The lead can remove them before locking the new week. If a week is never locked, there is no saved plan: all its work counts as unplanned, and the weekly review points out that the week wasn’t locked.</w:t>
       </w:r>
     </w:p>
-    <w:bookmarkEnd w:id="1758"/>
-    <w:bookmarkStart w:id="1759" w:name="repeating-daily-work-in-the-plan"/>
+    <w:bookmarkEnd w:id="1906"/>
+    <w:bookmarkStart w:id="1907" w:name="repeating-daily-work-in-the-plan"/>
     <w:p>
       <w:pPr>
         <w:pStyle w:val="Heading3"/>
@@ -5481,10 +5481,10 @@
         <w:t xml:space="preserve">When the lead locks a week, that week’s routines are included automatically, so the plan, the Workload view and the reports all include routine time. A routine created after the week is locked counts as added work.</w:t>
       </w:r>
     </w:p>
-    <w:bookmarkEnd w:id="1759"/>
-    <w:bookmarkEnd w:id="1760"/>
-    <w:bookmarkEnd w:id="1761"/>
-    <w:bookmarkStart w:id="1805" w:name="step-by-step-flows"/>
+    <w:bookmarkEnd w:id="1907"/>
+    <w:bookmarkEnd w:id="1908"/>
+    <w:bookmarkEnd w:id="1909"/>
+    <w:bookmarkStart w:id="1953" w:name="step-by-step-flows"/>
     <w:p>
       <w:pPr>
         <w:pStyle w:val="Heading1"/>
@@ -5510,18 +5510,18 @@
           <wp:inline>
             <wp:extent cx="1956816" cy="7760607"/>
             <wp:effectExtent b="0" l="0" r="0" t="0"/>
-            <wp:docPr descr="Diagram" title="" id="1763" name="Picture"/>
+            <wp:docPr descr="Diagram" title="" id="1911" name="Picture"/>
             <a:graphic>
               <a:graphicData uri="http://schemas.openxmlformats.org/drawingml/2006/picture">
                 <pic:pic>
                   <pic:nvPicPr>
-                    <pic:cNvPr descr="media/media/rId1614.png" id="1764" name="Picture"/>
+                    <pic:cNvPr descr="media/media/rId1762.png" id="1912" name="Picture"/>
                     <pic:cNvPicPr>
                       <a:picLocks noChangeArrowheads="1" noChangeAspect="1"/>
                     </pic:cNvPicPr>
                   </pic:nvPicPr>
                   <pic:blipFill>
-                    <a:blip r:embed="rId1762"/>
+                    <a:blip r:embed="rId1910"/>
                     <a:stretch>
                       <a:fillRect/>
                     </a:stretch>
@@ -5556,7 +5556,7 @@
         <w:t xml:space="preserve">Figure 4. Who starts which flow.</w:t>
       </w:r>
     </w:p>
-    <w:bookmarkStart w:id="1768" w:name="flow-a-planned-work"/>
+    <w:bookmarkStart w:id="1916" w:name="flow-a-planned-work"/>
     <w:p>
       <w:pPr>
         <w:pStyle w:val="Heading2"/>
@@ -5670,18 +5670,18 @@
           <wp:inline>
             <wp:extent cx="2953512" cy="7773283"/>
             <wp:effectExtent b="0" l="0" r="0" t="0"/>
-            <wp:docPr descr="Diagram" title="" id="1766" name="Picture"/>
+            <wp:docPr descr="Diagram" title="" id="1914" name="Picture"/>
             <a:graphic>
               <a:graphicData uri="http://schemas.openxmlformats.org/drawingml/2006/picture">
                 <pic:pic>
                   <pic:nvPicPr>
-                    <pic:cNvPr descr="media/media/rId1617.png" id="1767" name="Picture"/>
+                    <pic:cNvPr descr="media/media/rId1765.png" id="1915" name="Picture"/>
                     <pic:cNvPicPr>
                       <a:picLocks noChangeArrowheads="1" noChangeAspect="1"/>
                     </pic:cNvPicPr>
                   </pic:nvPicPr>
                   <pic:blipFill>
-                    <a:blip r:embed="rId1765"/>
+                    <a:blip r:embed="rId1913"/>
                     <a:stretch>
                       <a:fillRect/>
                     </a:stretch>
@@ -5716,8 +5716,8 @@
         <w:t xml:space="preserve">Figure 5. Flow A, planned work.</w:t>
       </w:r>
     </w:p>
-    <w:bookmarkEnd w:id="1768"/>
-    <w:bookmarkStart w:id="1772" w:name="flow-b-surprise-work"/>
+    <w:bookmarkEnd w:id="1916"/>
+    <w:bookmarkStart w:id="1920" w:name="flow-b-surprise-work"/>
     <w:p>
       <w:pPr>
         <w:pStyle w:val="Heading2"/>
@@ -5876,18 +5876,18 @@
           <wp:inline>
             <wp:extent cx="5074920" cy="7767734"/>
             <wp:effectExtent b="0" l="0" r="0" t="0"/>
-            <wp:docPr descr="Diagram" title="" id="1770" name="Picture"/>
+            <wp:docPr descr="Diagram" title="" id="1918" name="Picture"/>
             <a:graphic>
               <a:graphicData uri="http://schemas.openxmlformats.org/drawingml/2006/picture">
                 <pic:pic>
                   <pic:nvPicPr>
-                    <pic:cNvPr descr="media/media/rId1621.png" id="1771" name="Picture"/>
+                    <pic:cNvPr descr="media/media/rId1769.png" id="1919" name="Picture"/>
                     <pic:cNvPicPr>
                       <a:picLocks noChangeArrowheads="1" noChangeAspect="1"/>
                     </pic:cNvPicPr>
                   </pic:nvPicPr>
                   <pic:blipFill>
-                    <a:blip r:embed="rId1769"/>
+                    <a:blip r:embed="rId1917"/>
                     <a:stretch>
                       <a:fillRect/>
                     </a:stretch>
@@ -5922,8 +5922,8 @@
         <w:t xml:space="preserve">Figure 6. Flow B, surprise work.</w:t>
       </w:r>
     </w:p>
-    <w:bookmarkEnd w:id="1772"/>
-    <w:bookmarkStart w:id="1776" w:name="flow-c-weekly-review"/>
+    <w:bookmarkEnd w:id="1920"/>
+    <w:bookmarkStart w:id="1924" w:name="flow-c-weekly-review"/>
     <w:p>
       <w:pPr>
         <w:pStyle w:val="Heading2"/>
@@ -5949,18 +5949,18 @@
           <wp:inline>
             <wp:extent cx="3867912" cy="7769225"/>
             <wp:effectExtent b="0" l="0" r="0" t="0"/>
-            <wp:docPr descr="Diagram" title="" id="1774" name="Picture"/>
+            <wp:docPr descr="Diagram" title="" id="1922" name="Picture"/>
             <a:graphic>
               <a:graphicData uri="http://schemas.openxmlformats.org/drawingml/2006/picture">
                 <pic:pic>
                   <pic:nvPicPr>
-                    <pic:cNvPr descr="media/media/rId1625.png" id="1775" name="Picture"/>
+                    <pic:cNvPr descr="media/media/rId1773.png" id="1923" name="Picture"/>
                     <pic:cNvPicPr>
                       <a:picLocks noChangeArrowheads="1" noChangeAspect="1"/>
                     </pic:cNvPicPr>
                   </pic:nvPicPr>
                   <pic:blipFill>
-                    <a:blip r:embed="rId1773"/>
+                    <a:blip r:embed="rId1921"/>
                     <a:stretch>
                       <a:fillRect/>
                     </a:stretch>
@@ -5995,8 +5995,8 @@
         <w:t xml:space="preserve">Figure 7. Flow C, weekly review.</w:t>
       </w:r>
     </w:p>
-    <w:bookmarkEnd w:id="1776"/>
-    <w:bookmarkStart w:id="1780" w:name="flow-d-handover-leave-or-leaving"/>
+    <w:bookmarkEnd w:id="1924"/>
+    <w:bookmarkStart w:id="1928" w:name="flow-d-handover-leave-or-leaving"/>
     <w:p>
       <w:pPr>
         <w:pStyle w:val="Heading2"/>
@@ -6038,7 +6038,7 @@
         </w:numPr>
       </w:pPr>
       <w:r>
-        <w:t xml:space="preserve">The lead picks one person to receive everything, or a person for each item. The Workload view shows how busy each possible receiver is (this week only at first; future weeks once that view is built) and warns if they would be too busy or are on leave when the work is due. The receiver must be another active team member.</w:t>
+        <w:t xml:space="preserve">The lead picks one person to receive everything, or a person for each item. For each item, HopFlows shows how busy each possible receiver would be after the move (this week only at first; future weeks once the Workload view covers them), suggests whoever has the most room, and warns if they would be too busy or are on leave when the work is due. The receiver must be another active team member.</w:t>
       </w:r>
     </w:p>
     <w:p>
@@ -6050,7 +6050,7 @@
         </w:numPr>
       </w:pPr>
       <w:r>
-        <w:t xml:space="preserve">When the lead confirms, everything moves at once. The new owners get the background (status, blockers, recent comments) and the old owner is told.</w:t>
+        <w:t xml:space="preserve">When the lead confirms, everything moves at once. The new owners get the background (status, blockers, recent comments) and the old owner is told. For 10 minutes afterwards the lead can undo the handover: everything goes back to the old owner and everyone involved is told. (Proposed)</w:t>
       </w:r>
     </w:p>
     <w:p>
@@ -6128,18 +6128,18 @@
           <wp:inline>
             <wp:extent cx="2852928" cy="7781389"/>
             <wp:effectExtent b="0" l="0" r="0" t="0"/>
-            <wp:docPr descr="Diagram" title="" id="1778" name="Picture"/>
+            <wp:docPr descr="Diagram" title="" id="1926" name="Picture"/>
             <a:graphic>
               <a:graphicData uri="http://schemas.openxmlformats.org/drawingml/2006/picture">
                 <pic:pic>
                   <pic:nvPicPr>
-                    <pic:cNvPr descr="media/media/rId1629.png" id="1779" name="Picture"/>
+                    <pic:cNvPr descr="media/media/rId1777.png" id="1927" name="Picture"/>
                     <pic:cNvPicPr>
                       <a:picLocks noChangeArrowheads="1" noChangeAspect="1"/>
                     </pic:cNvPicPr>
                   </pic:nvPicPr>
                   <pic:blipFill>
-                    <a:blip r:embed="rId1777"/>
+                    <a:blip r:embed="rId1925"/>
                     <a:stretch>
                       <a:fillRect/>
                     </a:stretch>
@@ -6174,8 +6174,8 @@
         <w:t xml:space="preserve">Figure 8. Flow D, handover.</w:t>
       </w:r>
     </w:p>
-    <w:bookmarkEnd w:id="1780"/>
-    <w:bookmarkStart w:id="1784" w:name="flow-e-risk-flags"/>
+    <w:bookmarkEnd w:id="1928"/>
+    <w:bookmarkStart w:id="1932" w:name="flow-e-risk-flags"/>
     <w:p>
       <w:pPr>
         <w:pStyle w:val="Heading2"/>
@@ -6253,18 +6253,18 @@
           <wp:inline>
             <wp:extent cx="3118104" cy="7768098"/>
             <wp:effectExtent b="0" l="0" r="0" t="0"/>
-            <wp:docPr descr="Diagram" title="" id="1782" name="Picture"/>
+            <wp:docPr descr="Diagram" title="" id="1930" name="Picture"/>
             <a:graphic>
               <a:graphicData uri="http://schemas.openxmlformats.org/drawingml/2006/picture">
                 <pic:pic>
                   <pic:nvPicPr>
-                    <pic:cNvPr descr="media/media/rId1633.png" id="1783" name="Picture"/>
+                    <pic:cNvPr descr="media/media/rId1781.png" id="1931" name="Picture"/>
                     <pic:cNvPicPr>
                       <a:picLocks noChangeArrowheads="1" noChangeAspect="1"/>
                     </pic:cNvPicPr>
                   </pic:nvPicPr>
                   <pic:blipFill>
-                    <a:blip r:embed="rId1781"/>
+                    <a:blip r:embed="rId1929"/>
                     <a:stretch>
                       <a:fillRect/>
                     </a:stretch>
@@ -6299,8 +6299,8 @@
         <w:t xml:space="preserve">Figure 9. Flow E, risk flags.</w:t>
       </w:r>
     </w:p>
-    <w:bookmarkEnd w:id="1784"/>
-    <w:bookmarkStart w:id="1788" w:name="flow-f-calendar"/>
+    <w:bookmarkEnd w:id="1932"/>
+    <w:bookmarkStart w:id="1936" w:name="flow-f-calendar"/>
     <w:p>
       <w:pPr>
         <w:pStyle w:val="Heading2"/>
@@ -6438,18 +6438,18 @@
           <wp:inline>
             <wp:extent cx="5486400" cy="3673928"/>
             <wp:effectExtent b="0" l="0" r="0" t="0"/>
-            <wp:docPr descr="Diagram" title="" id="1786" name="Picture"/>
+            <wp:docPr descr="Diagram" title="" id="1934" name="Picture"/>
             <a:graphic>
               <a:graphicData uri="http://schemas.openxmlformats.org/drawingml/2006/picture">
                 <pic:pic>
                   <pic:nvPicPr>
-                    <pic:cNvPr descr="media/media/rId1637.png" id="1787" name="Picture"/>
+                    <pic:cNvPr descr="media/media/rId1785.png" id="1935" name="Picture"/>
                     <pic:cNvPicPr>
                       <a:picLocks noChangeArrowheads="1" noChangeAspect="1"/>
                     </pic:cNvPicPr>
                   </pic:nvPicPr>
                   <pic:blipFill>
-                    <a:blip r:embed="rId1785"/>
+                    <a:blip r:embed="rId1933"/>
                     <a:stretch>
                       <a:fillRect/>
                     </a:stretch>
@@ -6484,8 +6484,8 @@
         <w:t xml:space="preserve">Figure 10. Flow F, calendar.</w:t>
       </w:r>
     </w:p>
-    <w:bookmarkEnd w:id="1788"/>
-    <w:bookmarkStart w:id="1792" w:name="flow-g-alerts"/>
+    <w:bookmarkEnd w:id="1936"/>
+    <w:bookmarkStart w:id="1940" w:name="flow-g-alerts"/>
     <w:p>
       <w:pPr>
         <w:pStyle w:val="Heading2"/>
@@ -6575,18 +6575,18 @@
           <wp:inline>
             <wp:extent cx="5486400" cy="5962261"/>
             <wp:effectExtent b="0" l="0" r="0" t="0"/>
-            <wp:docPr descr="Diagram" title="" id="1790" name="Picture"/>
+            <wp:docPr descr="Diagram" title="" id="1938" name="Picture"/>
             <a:graphic>
               <a:graphicData uri="http://schemas.openxmlformats.org/drawingml/2006/picture">
                 <pic:pic>
                   <pic:nvPicPr>
-                    <pic:cNvPr descr="media/media/rId1641.png" id="1791" name="Picture"/>
+                    <pic:cNvPr descr="media/media/rId1789.png" id="1939" name="Picture"/>
                     <pic:cNvPicPr>
                       <a:picLocks noChangeArrowheads="1" noChangeAspect="1"/>
                     </pic:cNvPicPr>
                   </pic:nvPicPr>
                   <pic:blipFill>
-                    <a:blip r:embed="rId1789"/>
+                    <a:blip r:embed="rId1937"/>
                     <a:stretch>
                       <a:fillRect/>
                     </a:stretch>
@@ -6621,8 +6621,8 @@
         <w:t xml:space="preserve">Figure 11. Flow G, alerts.</w:t>
       </w:r>
     </w:p>
-    <w:bookmarkEnd w:id="1792"/>
-    <w:bookmarkStart w:id="1796" w:name="flow-h-leave-proposed"/>
+    <w:bookmarkEnd w:id="1940"/>
+    <w:bookmarkStart w:id="1944" w:name="flow-h-leave-proposed"/>
     <w:p>
       <w:pPr>
         <w:pStyle w:val="Heading2"/>
@@ -6709,18 +6709,18 @@
           <wp:inline>
             <wp:extent cx="3227832" cy="7782867"/>
             <wp:effectExtent b="0" l="0" r="0" t="0"/>
-            <wp:docPr descr="Diagram" title="" id="1794" name="Picture"/>
+            <wp:docPr descr="Diagram" title="" id="1942" name="Picture"/>
             <a:graphic>
               <a:graphicData uri="http://schemas.openxmlformats.org/drawingml/2006/picture">
                 <pic:pic>
                   <pic:nvPicPr>
-                    <pic:cNvPr descr="media/media/rId1645.png" id="1795" name="Picture"/>
+                    <pic:cNvPr descr="media/media/rId1793.png" id="1943" name="Picture"/>
                     <pic:cNvPicPr>
                       <a:picLocks noChangeArrowheads="1" noChangeAspect="1"/>
                     </pic:cNvPicPr>
                   </pic:nvPicPr>
                   <pic:blipFill>
-                    <a:blip r:embed="rId1793"/>
+                    <a:blip r:embed="rId1941"/>
                     <a:stretch>
                       <a:fillRect/>
                     </a:stretch>
@@ -6755,8 +6755,8 @@
         <w:t xml:space="preserve">Figure 12. Flow H, leave.</w:t>
       </w:r>
     </w:p>
-    <w:bookmarkEnd w:id="1796"/>
-    <w:bookmarkStart w:id="1800" w:name="flow-i-repeating-daily-work-proposed"/>
+    <w:bookmarkEnd w:id="1944"/>
+    <w:bookmarkStart w:id="1948" w:name="flow-i-repeating-daily-work-proposed"/>
     <w:p>
       <w:pPr>
         <w:pStyle w:val="Heading2"/>
@@ -6843,18 +6843,18 @@
           <wp:inline>
             <wp:extent cx="2706624" cy="7770950"/>
             <wp:effectExtent b="0" l="0" r="0" t="0"/>
-            <wp:docPr descr="Diagram" title="" id="1798" name="Picture"/>
+            <wp:docPr descr="Diagram" title="" id="1946" name="Picture"/>
             <a:graphic>
               <a:graphicData uri="http://schemas.openxmlformats.org/drawingml/2006/picture">
                 <pic:pic>
                   <pic:nvPicPr>
-                    <pic:cNvPr descr="media/media/rId1649.png" id="1799" name="Picture"/>
+                    <pic:cNvPr descr="media/media/rId1797.png" id="1947" name="Picture"/>
                     <pic:cNvPicPr>
                       <a:picLocks noChangeArrowheads="1" noChangeAspect="1"/>
                     </pic:cNvPicPr>
                   </pic:nvPicPr>
                   <pic:blipFill>
-                    <a:blip r:embed="rId1797"/>
+                    <a:blip r:embed="rId1945"/>
                     <a:stretch>
                       <a:fillRect/>
                     </a:stretch>
@@ -6889,8 +6889,8 @@
         <w:t xml:space="preserve">Figure 13. Flow I, repeating daily work.</w:t>
       </w:r>
     </w:p>
-    <w:bookmarkEnd w:id="1800"/>
-    <w:bookmarkStart w:id="1804" w:name="Xee151c202ff32b2b502fcc1220710a61d3b4311"/>
+    <w:bookmarkEnd w:id="1948"/>
+    <w:bookmarkStart w:id="1952" w:name="Xee151c202ff32b2b502fcc1220710a61d3b4311"/>
     <w:p>
       <w:pPr>
         <w:pStyle w:val="Heading2"/>
@@ -6956,18 +6956,18 @@
           <wp:inline>
             <wp:extent cx="3054096" cy="7769485"/>
             <wp:effectExtent b="0" l="0" r="0" t="0"/>
-            <wp:docPr descr="Diagram" title="" id="1802" name="Picture"/>
+            <wp:docPr descr="Diagram" title="" id="1950" name="Picture"/>
             <a:graphic>
               <a:graphicData uri="http://schemas.openxmlformats.org/drawingml/2006/picture">
                 <pic:pic>
                   <pic:nvPicPr>
-                    <pic:cNvPr descr="media/media/rId1653.png" id="1803" name="Picture"/>
+                    <pic:cNvPr descr="media/media/rId1801.png" id="1951" name="Picture"/>
                     <pic:cNvPicPr>
                       <a:picLocks noChangeArrowheads="1" noChangeAspect="1"/>
                     </pic:cNvPicPr>
                   </pic:nvPicPr>
                   <pic:blipFill>
-                    <a:blip r:embed="rId1801"/>
+                    <a:blip r:embed="rId1949"/>
                     <a:stretch>
                       <a:fillRect/>
                     </a:stretch>
@@ -7002,9 +7002,9 @@
         <w:t xml:space="preserve">Figure 14. Flow J, weekly summary for leaders.</w:t>
       </w:r>
     </w:p>
-    <w:bookmarkEnd w:id="1804"/>
-    <w:bookmarkEnd w:id="1805"/>
-    <w:bookmarkStart w:id="1822" w:name="what-each-role-sees-and-can-do"/>
+    <w:bookmarkEnd w:id="1952"/>
+    <w:bookmarkEnd w:id="1953"/>
+    <w:bookmarkStart w:id="1970" w:name="what-each-role-sees-and-can-do"/>
     <w:p>
       <w:pPr>
         <w:pStyle w:val="Heading1"/>
@@ -7013,7 +7013,7 @@
         <w:t xml:space="preserve">09 What each role sees and can do</w:t>
       </w:r>
     </w:p>
-    <w:bookmarkStart w:id="1806" w:name="main-screens"/>
+    <w:bookmarkStart w:id="1954" w:name="main-screens"/>
     <w:p>
       <w:pPr>
         <w:pStyle w:val="Heading2"/>
@@ -7233,8 +7233,8 @@
         <w:t xml:space="preserve">Managers also get their own Today screen. Different roles get different starting screens, not three separate apps, and nobody is locked out of moving around.</w:t>
       </w:r>
     </w:p>
-    <w:bookmarkEnd w:id="1806"/>
-    <w:bookmarkStart w:id="1807" w:name="simple-by-default-one-question-per-role"/>
+    <w:bookmarkEnd w:id="1954"/>
+    <w:bookmarkStart w:id="1955" w:name="simple-by-default-one-question-per-role"/>
     <w:p>
       <w:pPr>
         <w:pStyle w:val="Heading2"/>
@@ -7689,8 +7689,8 @@
         <w:t xml:space="preserve">One in, one out: every new feature must say which role sees it on their home screen. If it adds something there, something else moves one tap deeper.</w:t>
       </w:r>
     </w:p>
-    <w:bookmarkEnd w:id="1807"/>
-    <w:bookmarkStart w:id="1811" w:name="Xafc6df188b68060a074162f0ed46c452143f4ca"/>
+    <w:bookmarkEnd w:id="1955"/>
+    <w:bookmarkStart w:id="1959" w:name="Xafc6df188b68060a074162f0ed46c452143f4ca"/>
     <w:p>
       <w:pPr>
         <w:pStyle w:val="Heading2"/>
@@ -8078,18 +8078,18 @@
           <wp:inline>
             <wp:extent cx="3813048" cy="7770093"/>
             <wp:effectExtent b="0" l="0" r="0" t="0"/>
-            <wp:docPr descr="Diagram" title="" id="1809" name="Picture"/>
+            <wp:docPr descr="Diagram" title="" id="1957" name="Picture"/>
             <a:graphic>
               <a:graphicData uri="http://schemas.openxmlformats.org/drawingml/2006/picture">
                 <pic:pic>
                   <pic:nvPicPr>
-                    <pic:cNvPr descr="media/media/rId1660.png" id="1810" name="Picture"/>
+                    <pic:cNvPr descr="media/media/rId1808.png" id="1958" name="Picture"/>
                     <pic:cNvPicPr>
                       <a:picLocks noChangeArrowheads="1" noChangeAspect="1"/>
                     </pic:cNvPicPr>
                   </pic:nvPicPr>
                   <pic:blipFill>
-                    <a:blip r:embed="rId1808"/>
+                    <a:blip r:embed="rId1956"/>
                     <a:stretch>
                       <a:fillRect/>
                     </a:stretch>
@@ -8124,8 +8124,8 @@
         <w:t xml:space="preserve">Figure 15. Dragging on the Board follows the same rules as the buttons.</w:t>
       </w:r>
     </w:p>
-    <w:bookmarkEnd w:id="1811"/>
-    <w:bookmarkStart w:id="1812" w:name="workload-view"/>
+    <w:bookmarkEnd w:id="1959"/>
+    <w:bookmarkStart w:id="1960" w:name="workload-view"/>
     <w:p>
       <w:pPr>
         <w:pStyle w:val="Heading2"/>
@@ -8566,8 +8566,8 @@
         <w:t xml:space="preserve">list asks them to look. (Proposed)</w:t>
       </w:r>
     </w:p>
-    <w:bookmarkEnd w:id="1812"/>
-    <w:bookmarkStart w:id="1813" w:name="risk-flags-for-leaders"/>
+    <w:bookmarkEnd w:id="1960"/>
+    <w:bookmarkStart w:id="1961" w:name="risk-flags-for-leaders"/>
     <w:p>
       <w:pPr>
         <w:pStyle w:val="Heading2"/>
@@ -8836,8 +8836,8 @@
         <w:t xml:space="preserve">In a later stage, suggested flags are never set automatically. Flags not looked at for a while (see §14) remind the lead to confirm or clear them.</w:t>
       </w:r>
     </w:p>
-    <w:bookmarkEnd w:id="1813"/>
-    <w:bookmarkStart w:id="1814" w:name="calendar-1"/>
+    <w:bookmarkEnd w:id="1961"/>
+    <w:bookmarkStart w:id="1962" w:name="calendar-1"/>
     <w:p>
       <w:pPr>
         <w:pStyle w:val="Heading2"/>
@@ -9170,8 +9170,8 @@
         <w:t xml:space="preserve">Times show in each person’s local time. Holidays and all-day events stay as dates.</w:t>
       </w:r>
     </w:p>
-    <w:bookmarkEnd w:id="1814"/>
-    <w:bookmarkStart w:id="1815" w:name="alerts-and-the-mobile-app"/>
+    <w:bookmarkEnd w:id="1962"/>
+    <w:bookmarkStart w:id="1963" w:name="alerts-and-the-mobile-app"/>
     <w:p>
       <w:pPr>
         <w:pStyle w:val="Heading2"/>
@@ -9965,8 +9965,8 @@
         <w:t xml:space="preserve">Chat apps (Telegram, Slack and Microsoft Teams, later stage) will all use the same messages, buttons and team chat settings.</w:t>
       </w:r>
     </w:p>
-    <w:bookmarkEnd w:id="1815"/>
-    <w:bookmarkStart w:id="1816" w:name="search-proposed"/>
+    <w:bookmarkEnd w:id="1963"/>
+    <w:bookmarkStart w:id="1964" w:name="search-proposed"/>
     <w:p>
       <w:pPr>
         <w:pStyle w:val="Heading2"/>
@@ -10047,8 +10047,8 @@
         <w:t xml:space="preserve">Without internet, search looks through the items saved on the phone, and says so.</w:t>
       </w:r>
     </w:p>
-    <w:bookmarkEnd w:id="1816"/>
-    <w:bookmarkStart w:id="1820" w:name="working-offline-proposed"/>
+    <w:bookmarkEnd w:id="1964"/>
+    <w:bookmarkStart w:id="1968" w:name="working-offline-proposed"/>
     <w:p>
       <w:pPr>
         <w:pStyle w:val="Heading2"/>
@@ -10127,18 +10127,18 @@
           <wp:inline>
             <wp:extent cx="4727448" cy="7773611"/>
             <wp:effectExtent b="0" l="0" r="0" t="0"/>
-            <wp:docPr descr="Diagram" title="" id="1818" name="Picture"/>
+            <wp:docPr descr="Diagram" title="" id="1966" name="Picture"/>
             <a:graphic>
               <a:graphicData uri="http://schemas.openxmlformats.org/drawingml/2006/picture">
                 <pic:pic>
                   <pic:nvPicPr>
-                    <pic:cNvPr descr="media/media/rId1669.png" id="1819" name="Picture"/>
+                    <pic:cNvPr descr="media/media/rId1817.png" id="1967" name="Picture"/>
                     <pic:cNvPicPr>
                       <a:picLocks noChangeArrowheads="1" noChangeAspect="1"/>
                     </pic:cNvPicPr>
                   </pic:nvPicPr>
                   <pic:blipFill>
-                    <a:blip r:embed="rId1817"/>
+                    <a:blip r:embed="rId1965"/>
                     <a:stretch>
                       <a:fillRect/>
                     </a:stretch>
@@ -10173,8 +10173,8 @@
         <w:t xml:space="preserve">Figure 16. Working offline.</w:t>
       </w:r>
     </w:p>
-    <w:bookmarkEnd w:id="1820"/>
-    <w:bookmarkStart w:id="1821" w:name="who-can-do-what-starting-settings"/>
+    <w:bookmarkEnd w:id="1968"/>
+    <w:bookmarkStart w:id="1969" w:name="who-can-do-what-starting-settings"/>
     <w:p>
       <w:pPr>
         <w:pStyle w:val="Heading2"/>
@@ -11754,9 +11754,9 @@
         <w:t xml:space="preserve">rules on top of department and job title.</w:t>
       </w:r>
     </w:p>
-    <w:bookmarkEnd w:id="1821"/>
-    <w:bookmarkEnd w:id="1822"/>
-    <w:bookmarkStart w:id="1827" w:name="time-and-measures"/>
+    <w:bookmarkEnd w:id="1969"/>
+    <w:bookmarkEnd w:id="1970"/>
+    <w:bookmarkStart w:id="1975" w:name="time-and-measures"/>
     <w:p>
       <w:pPr>
         <w:pStyle w:val="Heading1"/>
@@ -11765,7 +11765,7 @@
         <w:t xml:space="preserve">10 Time and measures</w:t>
       </w:r>
     </w:p>
-    <w:bookmarkStart w:id="1823" w:name="talking-about-time"/>
+    <w:bookmarkStart w:id="1971" w:name="talking-about-time"/>
     <w:p>
       <w:pPr>
         <w:pStyle w:val="Heading2"/>
@@ -12000,8 +12000,8 @@
         <w:t xml:space="preserve">Holidays and leave reduce the working week before this calculation. For example, a public holiday on Tuesday cuts the working week to 32 hours for everyone on that holiday calendar, and the weekly planner shows the lower number before the week is locked.</w:t>
       </w:r>
     </w:p>
-    <w:bookmarkEnd w:id="1823"/>
-    <w:bookmarkStart w:id="1824" w:name="measures"/>
+    <w:bookmarkEnd w:id="1971"/>
+    <w:bookmarkStart w:id="1972" w:name="measures"/>
     <w:p>
       <w:pPr>
         <w:pStyle w:val="Heading2"/>
@@ -12389,8 +12389,8 @@
         <w:t xml:space="preserve">until people log real time. Cancelled work is shown separately and never counts as missed.</w:t>
       </w:r>
     </w:p>
-    <w:bookmarkEnd w:id="1824"/>
-    <w:bookmarkStart w:id="1825" w:name="standard-reports-proposed"/>
+    <w:bookmarkEnd w:id="1972"/>
+    <w:bookmarkStart w:id="1973" w:name="standard-reports-proposed"/>
     <w:p>
       <w:pPr>
         <w:pStyle w:val="Heading2"/>
@@ -12643,8 +12643,8 @@
         <w:t xml:space="preserve">, with their own planned, added and finished work.</w:t>
       </w:r>
     </w:p>
-    <w:bookmarkEnd w:id="1825"/>
-    <w:bookmarkStart w:id="1826" w:name="keeping-it-fair"/>
+    <w:bookmarkEnd w:id="1973"/>
+    <w:bookmarkStart w:id="1974" w:name="keeping-it-fair"/>
     <w:p>
       <w:pPr>
         <w:pStyle w:val="Heading2"/>
@@ -12713,9 +12713,9 @@
         <w:t xml:space="preserve">Don’t count a Deliverable that covers several products twice. Use its main product, or set shares.</w:t>
       </w:r>
     </w:p>
-    <w:bookmarkEnd w:id="1826"/>
-    <w:bookmarkEnd w:id="1827"/>
-    <w:bookmarkStart w:id="1845" w:name="rewards-fun-and-the-mascot"/>
+    <w:bookmarkEnd w:id="1974"/>
+    <w:bookmarkEnd w:id="1975"/>
+    <w:bookmarkStart w:id="1993" w:name="rewards-fun-and-the-mascot"/>
     <w:p>
       <w:pPr>
         <w:pStyle w:val="Heading1"/>
@@ -12732,7 +12732,7 @@
         <w:t xml:space="preserve">Rewards help people adopt the app. They should follow real, checked work, and should never encourage splitting tasks, working extra hours or saying work is done when it isn’t.</w:t>
       </w:r>
     </w:p>
-    <w:bookmarkStart w:id="1828" w:name="start-simple-first-version"/>
+    <w:bookmarkStart w:id="1976" w:name="start-simple-first-version"/>
     <w:p>
       <w:pPr>
         <w:pStyle w:val="Heading2"/>
@@ -13000,8 +13000,8 @@
         <w:t xml:space="preserve">Celebrations and streak days come only from real, checked events, each counted once, so repeating or undoing actions can’t be used to game them.</w:t>
       </w:r>
     </w:p>
-    <w:bookmarkEnd w:id="1828"/>
-    <w:bookmarkStart w:id="1838" w:name="mascot-punh-punh"/>
+    <w:bookmarkEnd w:id="1976"/>
+    <w:bookmarkStart w:id="1986" w:name="mascot-punh-punh"/>
     <w:p>
       <w:pPr>
         <w:pStyle w:val="Heading2"/>
@@ -13055,18 +13055,18 @@
                 <wp:inline>
                   <wp:extent cx="6134100" cy="6134100"/>
                   <wp:effectExtent b="0" l="0" r="0" t="0"/>
-                  <wp:docPr descr="Punh Punh holding a blank note" title="" id="1830" name="Picture"/>
+                  <wp:docPr descr="Punh Punh holding a blank note" title="" id="1978" name="Picture"/>
                   <a:graphic>
                     <a:graphicData uri="http://schemas.openxmlformats.org/drawingml/2006/picture">
                       <pic:pic>
                         <pic:nvPicPr>
-                          <pic:cNvPr descr="../design/mascot/punh-punh-A1.png" id="1831" name="Picture"/>
+                          <pic:cNvPr descr="../design/mascot/punh-punh-A1.png" id="1979" name="Picture"/>
                           <pic:cNvPicPr>
                             <a:picLocks noChangeArrowheads="1" noChangeAspect="1"/>
                           </pic:cNvPicPr>
                         </pic:nvPicPr>
                         <pic:blipFill>
-                          <a:blip r:embed="rId1829"/>
+                          <a:blip r:embed="rId1977"/>
                           <a:stretch>
                             <a:fillRect/>
                           </a:stretch>
@@ -13106,18 +13106,18 @@
                 <wp:inline>
                   <wp:extent cx="6134100" cy="6134100"/>
                   <wp:effectExtent b="0" l="0" r="0" t="0"/>
-                  <wp:docPr descr="Punh Punh waving" title="" id="1833" name="Picture"/>
+                  <wp:docPr descr="Punh Punh waving" title="" id="1981" name="Picture"/>
                   <a:graphic>
                     <a:graphicData uri="http://schemas.openxmlformats.org/drawingml/2006/picture">
                       <pic:pic>
                         <pic:nvPicPr>
-                          <pic:cNvPr descr="../design/mascot/punh-punh-B1.png" id="1834" name="Picture"/>
+                          <pic:cNvPr descr="../design/mascot/punh-punh-B1.png" id="1982" name="Picture"/>
                           <pic:cNvPicPr>
                             <a:picLocks noChangeArrowheads="1" noChangeAspect="1"/>
                           </pic:cNvPicPr>
                         </pic:nvPicPr>
                         <pic:blipFill>
-                          <a:blip r:embed="rId1832"/>
+                          <a:blip r:embed="rId1980"/>
                           <a:stretch>
                             <a:fillRect/>
                           </a:stretch>
@@ -13157,18 +13157,18 @@
                 <wp:inline>
                   <wp:extent cx="6134100" cy="6134100"/>
                   <wp:effectExtent b="0" l="0" r="0" t="0"/>
-                  <wp:docPr descr="Punh Punh holding a checked note" title="" id="1836" name="Picture"/>
+                  <wp:docPr descr="Punh Punh holding a checked note" title="" id="1984" name="Picture"/>
                   <a:graphic>
                     <a:graphicData uri="http://schemas.openxmlformats.org/drawingml/2006/picture">
                       <pic:pic>
                         <pic:nvPicPr>
-                          <pic:cNvPr descr="../design/mascot/punh-punh-C1.png" id="1837" name="Picture"/>
+                          <pic:cNvPr descr="../design/mascot/punh-punh-C1.png" id="1985" name="Picture"/>
                           <pic:cNvPicPr>
                             <a:picLocks noChangeArrowheads="1" noChangeAspect="1"/>
                           </pic:cNvPicPr>
                         </pic:nvPicPr>
                         <pic:blipFill>
-                          <a:blip r:embed="rId1835"/>
+                          <a:blip r:embed="rId1983"/>
                           <a:stretch>
                             <a:fillRect/>
                           </a:stretch>
@@ -13604,8 +13604,8 @@
         <w:t xml:space="preserve">Design work for the first version: a character sheet, five main poses (welcome, celebrate, thinking, calm, resting for holidays and leave), light animations. A chat sticker set and the bot’s profile picture come with chat apps, and seasonal outfits come later.</w:t>
       </w:r>
     </w:p>
-    <w:bookmarkEnd w:id="1838"/>
-    <w:bookmarkStart w:id="1842" w:name="app-icon"/>
+    <w:bookmarkEnd w:id="1986"/>
+    <w:bookmarkStart w:id="1990" w:name="app-icon"/>
     <w:p>
       <w:pPr>
         <w:pStyle w:val="Heading2"/>
@@ -13623,18 +13623,18 @@
           <wp:inline>
             <wp:extent cx="6134100" cy="6134100"/>
             <wp:effectExtent b="0" l="0" r="0" t="0"/>
-            <wp:docPr descr="HopFlows app icon: Punh Punh leaning in beside a checklist on a sky tile" title="" id="1840" name="Picture"/>
+            <wp:docPr descr="HopFlows app icon: Punh Punh leaning in beside a checklist on a sky tile" title="" id="1988" name="Picture"/>
             <a:graphic>
               <a:graphicData uri="http://schemas.openxmlformats.org/drawingml/2006/picture">
                 <pic:pic>
                   <pic:nvPicPr>
-                    <pic:cNvPr descr="../design/app-icon/png/icon-512.png" id="1841" name="Picture"/>
+                    <pic:cNvPr descr="../design/app-icon/png/icon-512.png" id="1989" name="Picture"/>
                     <pic:cNvPicPr>
                       <a:picLocks noChangeArrowheads="1" noChangeAspect="1"/>
                     </pic:cNvPicPr>
                   </pic:nvPicPr>
                   <pic:blipFill>
-                    <a:blip r:embed="rId1839"/>
+                    <a:blip r:embed="rId1987"/>
                     <a:stretch>
                       <a:fillRect/>
                     </a:stretch>
@@ -13786,8 +13786,8 @@
         <w:t xml:space="preserve">.</w:t>
       </w:r>
     </w:p>
-    <w:bookmarkEnd w:id="1842"/>
-    <w:bookmarkStart w:id="1843" w:name="more-rewards-later"/>
+    <w:bookmarkEnd w:id="1990"/>
+    <w:bookmarkStart w:id="1991" w:name="more-rewards-later"/>
     <w:p>
       <w:pPr>
         <w:pStyle w:val="Heading2"/>
@@ -14042,8 +14042,8 @@
         </w:tc>
       </w:tr>
     </w:tbl>
-    <w:bookmarkEnd w:id="1843"/>
-    <w:bookmarkStart w:id="1844" w:name="making-it-easy-to-start"/>
+    <w:bookmarkEnd w:id="1991"/>
+    <w:bookmarkStart w:id="1992" w:name="making-it-easy-to-start"/>
     <w:p>
       <w:pPr>
         <w:pStyle w:val="Heading2"/>
@@ -14088,9 +14088,9 @@
         <w:t xml:space="preserve">English and phone-friendly design are included from the start. Other languages can be added later.</w:t>
       </w:r>
     </w:p>
-    <w:bookmarkEnd w:id="1844"/>
-    <w:bookmarkEnd w:id="1845"/>
-    <w:bookmarkStart w:id="1855" w:name="special-cases"/>
+    <w:bookmarkEnd w:id="1992"/>
+    <w:bookmarkEnd w:id="1993"/>
+    <w:bookmarkStart w:id="2003" w:name="special-cases"/>
     <w:p>
       <w:pPr>
         <w:pStyle w:val="Heading1"/>
@@ -14099,7 +14099,7 @@
         <w:t xml:space="preserve">12 Special cases</w:t>
       </w:r>
     </w:p>
-    <w:bookmarkStart w:id="1846" w:name="work-and-requests"/>
+    <w:bookmarkStart w:id="1994" w:name="work-and-requests"/>
     <w:p>
       <w:pPr>
         <w:pStyle w:val="Heading2"/>
@@ -14677,8 +14677,8 @@
         </w:tc>
       </w:tr>
     </w:tbl>
-    <w:bookmarkEnd w:id="1846"/>
-    <w:bookmarkStart w:id="1847" w:name="planning-and-time-1"/>
+    <w:bookmarkEnd w:id="1994"/>
+    <w:bookmarkStart w:id="1995" w:name="planning-and-time-1"/>
     <w:p>
       <w:pPr>
         <w:pStyle w:val="Heading2"/>
@@ -15052,8 +15052,8 @@
         </w:tc>
       </w:tr>
     </w:tbl>
-    <w:bookmarkEnd w:id="1847"/>
-    <w:bookmarkStart w:id="1848" w:name="handover-and-leave"/>
+    <w:bookmarkEnd w:id="1995"/>
+    <w:bookmarkStart w:id="1996" w:name="handover-and-leave"/>
     <w:p>
       <w:pPr>
         <w:pStyle w:val="Heading2"/>
@@ -15277,8 +15277,8 @@
         </w:tc>
       </w:tr>
     </w:tbl>
-    <w:bookmarkEnd w:id="1848"/>
-    <w:bookmarkStart w:id="1849" w:name="risk-flags"/>
+    <w:bookmarkEnd w:id="1996"/>
+    <w:bookmarkStart w:id="1997" w:name="risk-flags"/>
     <w:p>
       <w:pPr>
         <w:pStyle w:val="Heading2"/>
@@ -15454,8 +15454,8 @@
         </w:tc>
       </w:tr>
     </w:tbl>
-    <w:bookmarkEnd w:id="1849"/>
-    <w:bookmarkStart w:id="1850" w:name="calendar-2"/>
+    <w:bookmarkEnd w:id="1997"/>
+    <w:bookmarkStart w:id="1998" w:name="calendar-2"/>
     <w:p>
       <w:pPr>
         <w:pStyle w:val="Heading2"/>
@@ -15619,8 +15619,8 @@
         </w:tc>
       </w:tr>
     </w:tbl>
-    <w:bookmarkEnd w:id="1850"/>
-    <w:bookmarkStart w:id="1851" w:name="alerts-and-chat"/>
+    <w:bookmarkEnd w:id="1998"/>
+    <w:bookmarkStart w:id="1999" w:name="alerts-and-chat"/>
     <w:p>
       <w:pPr>
         <w:pStyle w:val="Heading2"/>
@@ -16005,8 +16005,8 @@
         </w:tc>
       </w:tr>
     </w:tbl>
-    <w:bookmarkEnd w:id="1851"/>
-    <w:bookmarkStart w:id="1852" w:name="leave-routines-and-week-status"/>
+    <w:bookmarkEnd w:id="1999"/>
+    <w:bookmarkStart w:id="2000" w:name="leave-routines-and-week-status"/>
     <w:p>
       <w:pPr>
         <w:pStyle w:val="Heading2"/>
@@ -16374,8 +16374,8 @@
         </w:tc>
       </w:tr>
     </w:tbl>
-    <w:bookmarkEnd w:id="1852"/>
-    <w:bookmarkStart w:id="1853" w:name="reports-search-and-offline"/>
+    <w:bookmarkEnd w:id="2000"/>
+    <w:bookmarkStart w:id="2001" w:name="reports-search-and-offline"/>
     <w:p>
       <w:pPr>
         <w:pStyle w:val="Heading2"/>
@@ -16575,8 +16575,8 @@
         </w:tc>
       </w:tr>
     </w:tbl>
-    <w:bookmarkEnd w:id="1853"/>
-    <w:bookmarkStart w:id="1854" w:name="rewards"/>
+    <w:bookmarkEnd w:id="2001"/>
+    <w:bookmarkStart w:id="2002" w:name="rewards"/>
     <w:p>
       <w:pPr>
         <w:pStyle w:val="Heading2"/>
@@ -16704,9 +16704,9 @@
         </w:tc>
       </w:tr>
     </w:tbl>
-    <w:bookmarkEnd w:id="1854"/>
-    <w:bookmarkEnd w:id="1855"/>
-    <w:bookmarkStart w:id="1859" w:name="what-we-build-first"/>
+    <w:bookmarkEnd w:id="2002"/>
+    <w:bookmarkEnd w:id="2003"/>
+    <w:bookmarkStart w:id="2007" w:name="what-we-build-first"/>
     <w:p>
       <w:pPr>
         <w:pStyle w:val="Heading1"/>
@@ -16715,7 +16715,7 @@
         <w:t xml:space="preserve">13 What we build first</w:t>
       </w:r>
     </w:p>
-    <w:bookmarkStart w:id="1856" w:name="order-of-building"/>
+    <w:bookmarkStart w:id="2004" w:name="order-of-building"/>
     <w:p>
       <w:pPr>
         <w:pStyle w:val="Heading2"/>
@@ -16993,8 +16993,8 @@
         <w:t xml:space="preserve">apply once chat apps ship.</w:t>
       </w:r>
     </w:p>
-    <w:bookmarkEnd w:id="1856"/>
-    <w:bookmarkStart w:id="1857" w:name="seven-key-screens-to-sketch-first"/>
+    <w:bookmarkEnd w:id="2004"/>
+    <w:bookmarkStart w:id="2005" w:name="seven-key-screens-to-sketch-first"/>
     <w:p>
       <w:pPr>
         <w:pStyle w:val="Heading2"/>
@@ -17129,8 +17129,8 @@
         <w:t xml:space="preserve">act on an alert (Start, Done, Need Help, Accept) in one tap, without opening the full app.</w:t>
       </w:r>
     </w:p>
-    <w:bookmarkEnd w:id="1857"/>
-    <w:bookmarkStart w:id="1858" w:name="how-well-know-the-pilot-worked"/>
+    <w:bookmarkEnd w:id="2005"/>
+    <w:bookmarkStart w:id="2006" w:name="how-well-know-the-pilot-worked"/>
     <w:p>
       <w:pPr>
         <w:pStyle w:val="Heading2"/>
@@ -17265,9 +17265,9 @@
         <w:t xml:space="preserve">these targets are new in v1.1 and need a yes before the pilot. We’ll measure them by tracking when Add Work starts and finishes, which buttons people use and where, when alerts are sent and acted on, and how many people use the app each day in each role.</w:t>
       </w:r>
     </w:p>
-    <w:bookmarkEnd w:id="1858"/>
-    <w:bookmarkEnd w:id="1859"/>
-    <w:bookmarkStart w:id="1862" w:name="default-settings-and-launch-tests"/>
+    <w:bookmarkEnd w:id="2006"/>
+    <w:bookmarkEnd w:id="2007"/>
+    <w:bookmarkStart w:id="2010" w:name="default-settings-and-launch-tests"/>
     <w:p>
       <w:pPr>
         <w:pStyle w:val="Heading1"/>
@@ -17276,7 +17276,7 @@
         <w:t xml:space="preserve">14 Default settings and launch tests</w:t>
       </w:r>
     </w:p>
-    <w:bookmarkStart w:id="1860" w:name="default-settings-and-open-decisions"/>
+    <w:bookmarkStart w:id="2008" w:name="default-settings-and-open-decisions"/>
     <w:p>
       <w:pPr>
         <w:pStyle w:val="Heading2"/>
@@ -19038,8 +19038,8 @@
         <w:t xml:space="preserve">The system should be thorough enough to get owners, time and history right, while the employee’s screen stays as simple as possible. Complexity belongs in the system, not on the screen.</w:t>
       </w:r>
     </w:p>
-    <w:bookmarkEnd w:id="1860"/>
-    <w:bookmarkStart w:id="1861" w:name="launch-tests"/>
+    <w:bookmarkEnd w:id="2008"/>
+    <w:bookmarkStart w:id="2009" w:name="launch-tests"/>
     <w:p>
       <w:pPr>
         <w:pStyle w:val="Heading2"/>
@@ -20130,9 +20130,9 @@
         </w:tc>
       </w:tr>
     </w:tbl>
-    <w:bookmarkEnd w:id="1861"/>
-    <w:bookmarkEnd w:id="1862"/>
-    <w:bookmarkStart w:id="1869" w:name="sign-in-access-and-data"/>
+    <w:bookmarkEnd w:id="2009"/>
+    <w:bookmarkEnd w:id="2010"/>
+    <w:bookmarkStart w:id="2017" w:name="sign-in-access-and-data"/>
     <w:p>
       <w:pPr>
         <w:pStyle w:val="Heading1"/>
@@ -20159,7 +20159,7 @@
         <w:t xml:space="preserve">this section is new in v1.1 and needs a yes.</w:t>
       </w:r>
     </w:p>
-    <w:bookmarkStart w:id="1866" w:name="sign-in-and-joining-a-company"/>
+    <w:bookmarkStart w:id="2014" w:name="sign-in-and-joining-a-company"/>
     <w:p>
       <w:pPr>
         <w:pStyle w:val="Heading2"/>
@@ -20237,18 +20237,18 @@
           <wp:inline>
             <wp:extent cx="4233672" cy="7768662"/>
             <wp:effectExtent b="0" l="0" r="0" t="0"/>
-            <wp:docPr descr="Diagram" title="" id="1864" name="Picture"/>
+            <wp:docPr descr="Diagram" title="" id="2012" name="Picture"/>
             <a:graphic>
               <a:graphicData uri="http://schemas.openxmlformats.org/drawingml/2006/picture">
                 <pic:pic>
                   <pic:nvPicPr>
-                    <pic:cNvPr descr="media/media/rId1715.png" id="1865" name="Picture"/>
+                    <pic:cNvPr descr="media/media/rId1863.png" id="2013" name="Picture"/>
                     <pic:cNvPicPr>
                       <a:picLocks noChangeArrowheads="1" noChangeAspect="1"/>
                     </pic:cNvPicPr>
                   </pic:nvPicPr>
                   <pic:blipFill>
-                    <a:blip r:embed="rId1863"/>
+                    <a:blip r:embed="rId2011"/>
                     <a:stretch>
                       <a:fillRect/>
                     </a:stretch>
@@ -20283,8 +20283,8 @@
         <w:t xml:space="preserve">Figure 17. Signing in and joining a company.</w:t>
       </w:r>
     </w:p>
-    <w:bookmarkEnd w:id="1866"/>
-    <w:bookmarkStart w:id="1867" w:name="setting-up-a-company-proposed"/>
+    <w:bookmarkEnd w:id="2014"/>
+    <w:bookmarkStart w:id="2015" w:name="setting-up-a-company-proposed"/>
     <w:p>
       <w:pPr>
         <w:pStyle w:val="Heading2"/>
@@ -20516,8 +20516,8 @@
         <w:t xml:space="preserve">on Needs you.</w:t>
       </w:r>
     </w:p>
-    <w:bookmarkEnd w:id="1867"/>
-    <w:bookmarkStart w:id="1868" w:name="looking-after-data"/>
+    <w:bookmarkEnd w:id="2015"/>
+    <w:bookmarkStart w:id="2016" w:name="looking-after-data"/>
     <w:p>
       <w:pPr>
         <w:pStyle w:val="Heading2"/>
@@ -20574,9 +20574,9 @@
         <w:t xml:space="preserve">Where the data is stored, and any promises about which country it stays in, are decided before the first paying customer.</w:t>
       </w:r>
     </w:p>
-    <w:bookmarkEnd w:id="1868"/>
-    <w:bookmarkEnd w:id="1869"/>
-    <w:bookmarkStart w:id="1870" w:name="change-log"/>
+    <w:bookmarkEnd w:id="2016"/>
+    <w:bookmarkEnd w:id="2017"/>
+    <w:bookmarkStart w:id="2018" w:name="change-log"/>
     <w:p>
       <w:pPr>
         <w:pStyle w:val="Heading1"/>
@@ -20786,7 +20786,7 @@
         </w:numPr>
       </w:pPr>
       <w:r>
-        <w:t xml:space="preserve">Mascot renamed from Hop to Punh Punh (14 October).</w:t>
+        <w:t xml:space="preserve">After the second lead-flow review (Proposed): every place that moves work to someone shows how busy they would be after the move and suggests whoever has the most room; a request that looks like an open Task starts on Merge; a handover can be undone for 10 minutes (20 October).</w:t>
       </w:r>
     </w:p>
     <w:p>
@@ -20798,7 +20798,7 @@
         </w:numPr>
       </w:pPr>
       <w:r>
-        <w:t xml:space="preserve">App icon chosen: Punh Checklist, with usage rules in §11 (15 October).</w:t>
+        <w:t xml:space="preserve">Mascot renamed from Hop to Punh Punh (14 October).</w:t>
       </w:r>
     </w:p>
     <w:p>
@@ -20810,28 +20810,7 @@
         </w:numPr>
       </w:pPr>
       <w:r>
-        <w:t xml:space="preserve">First version split into</w:t>
-      </w:r>
-      <w:r>
-        <w:t xml:space="preserve"> </w:t>
-      </w:r>
-      <w:r>
-        <w:t xml:space="preserve">“pilot core”</w:t>
-      </w:r>
-      <w:r>
-        <w:t xml:space="preserve"> </w:t>
-      </w:r>
-      <w:r>
-        <w:t xml:space="preserve">and</w:t>
-      </w:r>
-      <w:r>
-        <w:t xml:space="preserve"> </w:t>
-      </w:r>
-      <w:r>
-        <w:t xml:space="preserve">“soon after”</w:t>
-      </w:r>
-      <w:r>
-        <w:t xml:space="preserve">; later-stage features (Workload view for future weeks, temporary Handover, suggested risk flags) marked in the flows and special cases.</w:t>
+        <w:t xml:space="preserve">App icon chosen: Punh Checklist, with usage rules in §11 (15 October).</w:t>
       </w:r>
     </w:p>
     <w:p>
@@ -20843,7 +20822,28 @@
         </w:numPr>
       </w:pPr>
       <w:r>
-        <w:t xml:space="preserve">Rules for statuses, Confidential Task access, review and blocked markers, giving rights to named people, work schedules, time split across departments, task sizes, time zones, sorting and postponing requests.</w:t>
+        <w:t xml:space="preserve">First version split into</w:t>
+      </w:r>
+      <w:r>
+        <w:t xml:space="preserve"> </w:t>
+      </w:r>
+      <w:r>
+        <w:t xml:space="preserve">“pilot core”</w:t>
+      </w:r>
+      <w:r>
+        <w:t xml:space="preserve"> </w:t>
+      </w:r>
+      <w:r>
+        <w:t xml:space="preserve">and</w:t>
+      </w:r>
+      <w:r>
+        <w:t xml:space="preserve"> </w:t>
+      </w:r>
+      <w:r>
+        <w:t xml:space="preserve">“soon after”</w:t>
+      </w:r>
+      <w:r>
+        <w:t xml:space="preserve">; later-stage features (Workload view for future weeks, temporary Handover, suggested risk flags) marked in the flows and special cases.</w:t>
       </w:r>
     </w:p>
     <w:p>
@@ -20855,7 +20855,7 @@
         </w:numPr>
       </w:pPr>
       <w:r>
-        <w:t xml:space="preserve">Rules for carrying work over, weeks never locked, clearing flags, who gets urgent alerts next, snooze, people in several companies, handover receivers and overlapping time off.</w:t>
+        <w:t xml:space="preserve">Rules for statuses, Confidential Task access, review and blocked markers, giving rights to named people, work schedules, time split across departments, task sizes, time zones, sorting and postponing requests.</w:t>
       </w:r>
     </w:p>
     <w:p>
@@ -20867,7 +20867,7 @@
         </w:numPr>
       </w:pPr>
       <w:r>
-        <w:t xml:space="preserve">Measures, time words and pilot targets written out.</w:t>
+        <w:t xml:space="preserve">Rules for carrying work over, weeks never locked, clearing flags, who gets urgent alerts next, snooze, people in several companies, handover receivers and overlapping time off.</w:t>
       </w:r>
     </w:p>
     <w:p>
@@ -20879,7 +20879,7 @@
         </w:numPr>
       </w:pPr>
       <w:r>
-        <w:t xml:space="preserve">The streak no longer counts just starting work.</w:t>
+        <w:t xml:space="preserve">Measures, time words and pilot targets written out.</w:t>
       </w:r>
     </w:p>
     <w:p>
@@ -20891,7 +20891,7 @@
         </w:numPr>
       </w:pPr>
       <w:r>
-        <w:t xml:space="preserve">Special cases grouped by topic; all default numbers kept in §14; the life of a Task moved before planning.</w:t>
+        <w:t xml:space="preserve">The streak no longer counts just starting work.</w:t>
       </w:r>
     </w:p>
     <w:p>
@@ -20903,7 +20903,7 @@
         </w:numPr>
       </w:pPr>
       <w:r>
-        <w:t xml:space="preserve">New §15 Sign-in, access and data.</w:t>
+        <w:t xml:space="preserve">Special cases grouped by topic; all default numbers kept in §14; the life of a Task moved before planning.</w:t>
       </w:r>
     </w:p>
     <w:p>
@@ -20915,19 +20915,7 @@
         </w:numPr>
       </w:pPr>
       <w:r>
-        <w:t xml:space="preserve">Words on screen: Add Work (employees), Incoming Queue and Sort (leads);</w:t>
-      </w:r>
-      <w:r>
-        <w:t xml:space="preserve"> </w:t>
-      </w:r>
-      <w:r>
-        <w:t xml:space="preserve">“intake”</w:t>
-      </w:r>
-      <w:r>
-        <w:t xml:space="preserve"> </w:t>
-      </w:r>
-      <w:r>
-        <w:t xml:space="preserve">only in reports.</w:t>
+        <w:t xml:space="preserve">New §15 Sign-in, access and data.</w:t>
       </w:r>
     </w:p>
     <w:p>
@@ -20939,19 +20927,19 @@
         </w:numPr>
       </w:pPr>
       <w:r>
-        <w:t xml:space="preserve">The blueprint now covers business and design rules only. The data model and engineering rules moved to</w:t>
+        <w:t xml:space="preserve">Words on screen: Add Work (employees), Incoming Queue and Sort (leads);</w:t>
       </w:r>
       <w:r>
         <w:t xml:space="preserve"> </w:t>
       </w:r>
       <w:r>
-        <w:rPr>
-          <w:rStyle w:val="VerbatimChar"/>
-        </w:rPr>
-        <w:t xml:space="preserve">HopFlows_Technical_Design_v1.1.md</w:t>
-      </w:r>
-      <w:r>
-        <w:t xml:space="preserve">.</w:t>
+        <w:t xml:space="preserve">“intake”</w:t>
+      </w:r>
+      <w:r>
+        <w:t xml:space="preserve"> </w:t>
+      </w:r>
+      <w:r>
+        <w:t xml:space="preserve">only in reports.</w:t>
       </w:r>
     </w:p>
     <w:p>
@@ -20963,7 +20951,19 @@
         </w:numPr>
       </w:pPr>
       <w:r>
-        <w:t xml:space="preserve">Gap fixes (Proposed): updates to request senders, weekly summary for leaders, four standard reports with downloads, week status, leave requests and approval, repeating daily work (moved from a later stage into the first version), working offline and search.</w:t>
+        <w:t xml:space="preserve">The blueprint now covers business and design rules only. The data model and engineering rules moved to</w:t>
+      </w:r>
+      <w:r>
+        <w:t xml:space="preserve"> </w:t>
+      </w:r>
+      <w:r>
+        <w:rPr>
+          <w:rStyle w:val="VerbatimChar"/>
+        </w:rPr>
+        <w:t xml:space="preserve">HopFlows_Technical_Design_v1.1.md</w:t>
+      </w:r>
+      <w:r>
+        <w:t xml:space="preserve">.</w:t>
       </w:r>
     </w:p>
     <w:p>
@@ -20975,7 +20975,7 @@
         </w:numPr>
       </w:pPr>
       <w:r>
-        <w:t xml:space="preserve">List, Board and Table views added for full work lists (Proposed).</w:t>
+        <w:t xml:space="preserve">Gap fixes (Proposed): updates to request senders, weekly summary for leaders, four standard reports with downloads, week status, leave requests and approval, repeating daily work (moved from a later stage into the first version), working offline and search.</w:t>
       </w:r>
     </w:p>
     <w:p>
@@ -20987,7 +20987,7 @@
         </w:numPr>
       </w:pPr>
       <w:r>
-        <w:t xml:space="preserve">Flow diagrams added: the life of a Task, a map of who starts which flow, Flows A–J, Board dragging, working offline, and signing in.</w:t>
+        <w:t xml:space="preserve">List, Board and Table views added for full work lists (Proposed).</w:t>
       </w:r>
     </w:p>
     <w:p>
@@ -20999,6 +20999,18 @@
         </w:numPr>
       </w:pPr>
       <w:r>
+        <w:t xml:space="preserve">Flow diagrams added: the life of a Task, a map of who starts which flow, Flows A–J, Board dragging, working offline, and signing in.</w:t>
+      </w:r>
+    </w:p>
+    <w:p>
+      <w:pPr>
+        <w:pStyle w:val="Compact"/>
+        <w:numPr>
+          <w:ilvl w:val="0"/>
+          <w:numId w:val="1044"/>
+        </w:numPr>
+      </w:pPr>
+      <w:r>
         <w:t xml:space="preserve">Rewritten in simple, everyday language. Words changed:</w:t>
       </w:r>
       <w:r>
@@ -21111,7 +21123,7 @@
         <w:t xml:space="preserve">HopFlows / End of Blueprint</w:t>
       </w:r>
     </w:p>
-    <w:bookmarkEnd w:id="1870"/>
+    <w:bookmarkEnd w:id="2018"/>
     <w:sectPr>
       <w:headerReference r:id="rId9" w:type="default"/>
       <w:footerReference r:id="rId10" w:type="default"/>
@@ -36938,6 +36950,232 @@
     <w:basedOn w:val="VerbatimChar"/>
     <w:rPr/>
   </w:style>
+  <w:style w:customStyle="1" w:styleId="KeywordTok" w:type="character">
+    <w:name w:val="KeywordTok"/>
+    <w:basedOn w:val="VerbatimChar"/>
+    <w:rPr>
+      <w:b/>
+      <w:color w:val="007020"/>
+    </w:rPr>
+  </w:style>
+  <w:style w:customStyle="1" w:styleId="DataTypeTok" w:type="character">
+    <w:name w:val="DataTypeTok"/>
+    <w:basedOn w:val="VerbatimChar"/>
+    <w:rPr>
+      <w:color w:val="902000"/>
+    </w:rPr>
+  </w:style>
+  <w:style w:customStyle="1" w:styleId="DecValTok" w:type="character">
+    <w:name w:val="DecValTok"/>
+    <w:basedOn w:val="VerbatimChar"/>
+    <w:rPr>
+      <w:color w:val="40a070"/>
+    </w:rPr>
+  </w:style>
+  <w:style w:customStyle="1" w:styleId="BaseNTok" w:type="character">
+    <w:name w:val="BaseNTok"/>
+    <w:basedOn w:val="VerbatimChar"/>
+    <w:rPr>
+      <w:color w:val="40a070"/>
+    </w:rPr>
+  </w:style>
+  <w:style w:customStyle="1" w:styleId="FloatTok" w:type="character">
+    <w:name w:val="FloatTok"/>
+    <w:basedOn w:val="VerbatimChar"/>
+    <w:rPr>
+      <w:color w:val="40a070"/>
+    </w:rPr>
+  </w:style>
+  <w:style w:customStyle="1" w:styleId="ConstantTok" w:type="character">
+    <w:name w:val="ConstantTok"/>
+    <w:basedOn w:val="VerbatimChar"/>
+    <w:rPr>
+      <w:color w:val="880000"/>
+    </w:rPr>
+  </w:style>
+  <w:style w:customStyle="1" w:styleId="CharTok" w:type="character">
+    <w:name w:val="CharTok"/>
+    <w:basedOn w:val="VerbatimChar"/>
+    <w:rPr>
+      <w:color w:val="4070a0"/>
+    </w:rPr>
+  </w:style>
+  <w:style w:customStyle="1" w:styleId="SpecialCharTok" w:type="character">
+    <w:name w:val="SpecialCharTok"/>
+    <w:basedOn w:val="VerbatimChar"/>
+    <w:rPr>
+      <w:color w:val="4070a0"/>
+    </w:rPr>
+  </w:style>
+  <w:style w:customStyle="1" w:styleId="StringTok" w:type="character">
+    <w:name w:val="StringTok"/>
+    <w:basedOn w:val="VerbatimChar"/>
+    <w:rPr>
+      <w:color w:val="4070a0"/>
+    </w:rPr>
+  </w:style>
+  <w:style w:customStyle="1" w:styleId="VerbatimStringTok" w:type="character">
+    <w:name w:val="VerbatimStringTok"/>
+    <w:basedOn w:val="VerbatimChar"/>
+    <w:rPr>
+      <w:color w:val="4070a0"/>
+    </w:rPr>
+  </w:style>
+  <w:style w:customStyle="1" w:styleId="SpecialStringTok" w:type="character">
+    <w:name w:val="SpecialStringTok"/>
+    <w:basedOn w:val="VerbatimChar"/>
+    <w:rPr>
+      <w:color w:val="bb6688"/>
+    </w:rPr>
+  </w:style>
+  <w:style w:customStyle="1" w:styleId="ImportTok" w:type="character">
+    <w:name w:val="ImportTok"/>
+    <w:basedOn w:val="VerbatimChar"/>
+    <w:rPr>
+      <w:b/>
+      <w:color w:val="008000"/>
+    </w:rPr>
+  </w:style>
+  <w:style w:customStyle="1" w:styleId="CommentTok" w:type="character">
+    <w:name w:val="CommentTok"/>
+    <w:basedOn w:val="VerbatimChar"/>
+    <w:rPr>
+      <w:i/>
+      <w:color w:val="60a0b0"/>
+    </w:rPr>
+  </w:style>
+  <w:style w:customStyle="1" w:styleId="DocumentationTok" w:type="character">
+    <w:name w:val="DocumentationTok"/>
+    <w:basedOn w:val="VerbatimChar"/>
+    <w:rPr>
+      <w:i/>
+      <w:color w:val="ba2121"/>
+    </w:rPr>
+  </w:style>
+  <w:style w:customStyle="1" w:styleId="AnnotationTok" w:type="character">
+    <w:name w:val="AnnotationTok"/>
+    <w:basedOn w:val="VerbatimChar"/>
+    <w:rPr>
+      <w:b/>
+      <w:i/>
+      <w:color w:val="60a0b0"/>
+    </w:rPr>
+  </w:style>
+  <w:style w:customStyle="1" w:styleId="CommentVarTok" w:type="character">
+    <w:name w:val="CommentVarTok"/>
+    <w:basedOn w:val="VerbatimChar"/>
+    <w:rPr>
+      <w:b/>
+      <w:i/>
+      <w:color w:val="60a0b0"/>
+    </w:rPr>
+  </w:style>
+  <w:style w:customStyle="1" w:styleId="OtherTok" w:type="character">
+    <w:name w:val="OtherTok"/>
+    <w:basedOn w:val="VerbatimChar"/>
+    <w:rPr>
+      <w:color w:val="007020"/>
+    </w:rPr>
+  </w:style>
+  <w:style w:customStyle="1" w:styleId="FunctionTok" w:type="character">
+    <w:name w:val="FunctionTok"/>
+    <w:basedOn w:val="VerbatimChar"/>
+    <w:rPr>
+      <w:color w:val="06287e"/>
+    </w:rPr>
+  </w:style>
+  <w:style w:customStyle="1" w:styleId="VariableTok" w:type="character">
+    <w:name w:val="VariableTok"/>
+    <w:basedOn w:val="VerbatimChar"/>
+    <w:rPr>
+      <w:color w:val="19177c"/>
+    </w:rPr>
+  </w:style>
+  <w:style w:customStyle="1" w:styleId="ControlFlowTok" w:type="character">
+    <w:name w:val="ControlFlowTok"/>
+    <w:basedOn w:val="VerbatimChar"/>
+    <w:rPr>
+      <w:b/>
+      <w:color w:val="007020"/>
+    </w:rPr>
+  </w:style>
+  <w:style w:customStyle="1" w:styleId="OperatorTok" w:type="character">
+    <w:name w:val="OperatorTok"/>
+    <w:basedOn w:val="VerbatimChar"/>
+    <w:rPr>
+      <w:color w:val="666666"/>
+    </w:rPr>
+  </w:style>
+  <w:style w:customStyle="1" w:styleId="BuiltInTok" w:type="character">
+    <w:name w:val="BuiltInTok"/>
+    <w:basedOn w:val="VerbatimChar"/>
+    <w:rPr>
+      <w:color w:val="008000"/>
+    </w:rPr>
+  </w:style>
+  <w:style w:customStyle="1" w:styleId="ExtensionTok" w:type="character">
+    <w:name w:val="ExtensionTok"/>
+    <w:basedOn w:val="VerbatimChar"/>
+    <w:rPr/>
+  </w:style>
+  <w:style w:customStyle="1" w:styleId="PreprocessorTok" w:type="character">
+    <w:name w:val="PreprocessorTok"/>
+    <w:basedOn w:val="VerbatimChar"/>
+    <w:rPr>
+      <w:color w:val="bc7a00"/>
+    </w:rPr>
+  </w:style>
+  <w:style w:customStyle="1" w:styleId="AttributeTok" w:type="character">
+    <w:name w:val="AttributeTok"/>
+    <w:basedOn w:val="VerbatimChar"/>
+    <w:rPr>
+      <w:color w:val="7d9029"/>
+    </w:rPr>
+  </w:style>
+  <w:style w:customStyle="1" w:styleId="RegionMarkerTok" w:type="character">
+    <w:name w:val="RegionMarkerTok"/>
+    <w:basedOn w:val="VerbatimChar"/>
+    <w:rPr/>
+  </w:style>
+  <w:style w:customStyle="1" w:styleId="InformationTok" w:type="character">
+    <w:name w:val="InformationTok"/>
+    <w:basedOn w:val="VerbatimChar"/>
+    <w:rPr>
+      <w:b/>
+      <w:i/>
+      <w:color w:val="60a0b0"/>
+    </w:rPr>
+  </w:style>
+  <w:style w:customStyle="1" w:styleId="WarningTok" w:type="character">
+    <w:name w:val="WarningTok"/>
+    <w:basedOn w:val="VerbatimChar"/>
+    <w:rPr>
+      <w:b/>
+      <w:i/>
+      <w:color w:val="60a0b0"/>
+    </w:rPr>
+  </w:style>
+  <w:style w:customStyle="1" w:styleId="AlertTok" w:type="character">
+    <w:name w:val="AlertTok"/>
+    <w:basedOn w:val="VerbatimChar"/>
+    <w:rPr>
+      <w:b/>
+      <w:color w:val="ff0000"/>
+    </w:rPr>
+  </w:style>
+  <w:style w:customStyle="1" w:styleId="ErrorTok" w:type="character">
+    <w:name w:val="ErrorTok"/>
+    <w:basedOn w:val="VerbatimChar"/>
+    <w:rPr>
+      <w:b/>
+      <w:color w:val="ff0000"/>
+    </w:rPr>
+  </w:style>
+  <w:style w:customStyle="1" w:styleId="NormalTok" w:type="character">
+    <w:name w:val="NormalTok"/>
+    <w:basedOn w:val="VerbatimChar"/>
+    <w:rPr/>
+  </w:style>
   <w:style w:type="character" w:customStyle="1" w:styleId="KeywordTok">
     <w:name w:val="KeywordTok"/>
     <w:basedOn w:val="VerbatimChar"/>

</xml_diff>

<commit_message>
Count open changes in the week plan; fix lock dead end and badge
- The Planner counts waiting leave and open handovers, so week 43
  shows as it will really look; the lock check lists the open
  handover and says both are counted
- Sophal's handover now goes to 3 people (Pisey, Chenda, Dara) with
  nobody past their available time except Dara until her leave is
  decided; Handover and the leave sheet use the same counted week
- "Move Vannak's work" moves both tasks to week 44 and works after
  locking, recorded as a change; the saved plan keeps 122h
- Sidebar "Needs you" badge follows the page count
- School App rows no longer link to the wrong Deliverable page
- LEAD_DATA.md and blueprint updated
- Sync docs/design with canvas version 54 (1792517137-bcef)

Co-Authored-By: Claude Opus 5.5 <noreply@anthropic.com>
</commit_message>
<xml_diff>
--- a/docs/HopFlows_Product_Blueprint_v1.1.docx
+++ b/docs/HopFlows_Product_Blueprint_v1.1.docx
@@ -2,7 +2,7 @@
 <file path=word/document.xml><?xml version="1.0" encoding="utf-8"?>
 <w:document xmlns:w="http://schemas.openxmlformats.org/wordprocessingml/2006/main" xmlns:m="http://schemas.openxmlformats.org/officeDocument/2006/math" xmlns:r="http://schemas.openxmlformats.org/officeDocument/2006/relationships" xmlns:o="urn:schemas-microsoft-com:office:office" xmlns:v="urn:schemas-microsoft-com:vml" xmlns:w10="urn:schemas-microsoft-com:office:word" xmlns:a="http://schemas.openxmlformats.org/drawingml/2006/main" xmlns:pic="http://schemas.openxmlformats.org/drawingml/2006/picture" xmlns:wp="http://schemas.openxmlformats.org/drawingml/2006/wordprocessingDrawing">
   <w:body>
-    <w:bookmarkStart w:id="2023" w:name="hopflows-product-blueprint"/>
+    <w:bookmarkStart w:id="2171" w:name="hopflows-product-blueprint"/>
     <w:p>
       <w:pPr>
         <w:pStyle w:val="Heading1"/>
@@ -127,7 +127,7 @@
         <w:t xml:space="preserve">For the people who plan the product, design it, build it and roll it out.</w:t>
       </w:r>
     </w:p>
-    <w:bookmarkStart w:id="2020" w:name="about-this-blueprint"/>
+    <w:bookmarkStart w:id="2168" w:name="about-this-blueprint"/>
     <w:p>
       <w:pPr>
         <w:pStyle w:val="Heading2"/>
@@ -375,8 +375,8 @@
         <w:t xml:space="preserve">are new in v1.1 and still need a yes or no. The change log at the end lists what changed.</w:t>
       </w:r>
     </w:p>
-    <w:bookmarkEnd w:id="2020"/>
-    <w:bookmarkStart w:id="2021" w:name="the-big-idea"/>
+    <w:bookmarkEnd w:id="2168"/>
+    <w:bookmarkStart w:id="2169" w:name="the-big-idea"/>
     <w:p>
       <w:pPr>
         <w:pStyle w:val="Heading2"/>
@@ -405,8 +405,8 @@
         <w:t xml:space="preserve">Leaders care about results. Team leads care about getting work done and how busy their team is. Employees care about what to do next. Planned work and surprise work both count, without extra paperwork.</w:t>
       </w:r>
     </w:p>
-    <w:bookmarkEnd w:id="2021"/>
-    <w:bookmarkStart w:id="2022" w:name="decisions-already-made"/>
+    <w:bookmarkEnd w:id="2169"/>
+    <w:bookmarkStart w:id="2170" w:name="decisions-already-made"/>
     <w:p>
       <w:pPr>
         <w:pStyle w:val="Heading2"/>
@@ -628,9 +628,9 @@
         <w:t xml:space="preserve">The app keeps working when the internet is weak: people can add and update work offline, and they can find anything with one search. (Proposed)</w:t>
       </w:r>
     </w:p>
-    <w:bookmarkEnd w:id="2022"/>
-    <w:bookmarkEnd w:id="2023"/>
-    <w:bookmarkStart w:id="2027" w:name="summary"/>
+    <w:bookmarkEnd w:id="2170"/>
+    <w:bookmarkEnd w:id="2171"/>
+    <w:bookmarkStart w:id="2175" w:name="summary"/>
     <w:p>
       <w:pPr>
         <w:pStyle w:val="Heading1"/>
@@ -639,7 +639,7 @@
         <w:t xml:space="preserve">01 Summary</w:t>
       </w:r>
     </w:p>
-    <w:bookmarkStart w:id="2024" w:name="the-problem"/>
+    <w:bookmarkStart w:id="2172" w:name="the-problem"/>
     <w:p>
       <w:pPr>
         <w:pStyle w:val="Heading2"/>
@@ -656,8 +656,8 @@
         <w:t xml:space="preserve">Many teams don’t use task apps because the lists get too long, updating them feels like extra work, screens show too much, and work done outside the app never shows up in the plan. One complicated screen also can’t serve employees, team leads and bosses equally well.</w:t>
       </w:r>
     </w:p>
-    <w:bookmarkEnd w:id="2024"/>
-    <w:bookmarkStart w:id="2025" w:name="how-hopflows-answers-it"/>
+    <w:bookmarkEnd w:id="2172"/>
+    <w:bookmarkStart w:id="2173" w:name="how-hopflows-answers-it"/>
     <w:p>
       <w:pPr>
         <w:pStyle w:val="Heading2"/>
@@ -878,8 +878,8 @@
         </w:tc>
       </w:tr>
     </w:tbl>
-    <w:bookmarkEnd w:id="2025"/>
-    <w:bookmarkStart w:id="2026" w:name="in-one-sentence"/>
+    <w:bookmarkEnd w:id="2173"/>
+    <w:bookmarkStart w:id="2174" w:name="in-one-sentence"/>
     <w:p>
       <w:pPr>
         <w:pStyle w:val="Heading2"/>
@@ -908,9 +908,9 @@
         <w:t xml:space="preserve">A simple task app that makes work easy for employees, clear for managers and measurable for leaders, without making task tracking feel like another job.</w:t>
       </w:r>
     </w:p>
-    <w:bookmarkEnd w:id="2026"/>
-    <w:bookmarkEnd w:id="2027"/>
-    <w:bookmarkStart w:id="2030" w:name="how-the-pieces-fit-together"/>
+    <w:bookmarkEnd w:id="2174"/>
+    <w:bookmarkEnd w:id="2175"/>
+    <w:bookmarkStart w:id="2178" w:name="how-the-pieces-fit-together"/>
     <w:p>
       <w:pPr>
         <w:pStyle w:val="Heading1"/>
@@ -1081,7 +1081,7 @@
         <w:t xml:space="preserve">Figure 1. Three parts of a company linked to one system for work and reports.</w:t>
       </w:r>
     </w:p>
-    <w:bookmarkStart w:id="2028" w:name="linked-not-stacked"/>
+    <w:bookmarkStart w:id="2176" w:name="linked-not-stacked"/>
     <w:p>
       <w:pPr>
         <w:pStyle w:val="Heading2"/>
@@ -1098,8 +1098,8 @@
         <w:t xml:space="preserve">Don’t force everything into one tree. One Goal can help several products. One Deliverable can involve several departments. One person can be in several teams. HopFlows links these things instead of stacking them, and still keeps one clear owner for each Goal, Deliverable and active Task.</w:t>
       </w:r>
     </w:p>
-    <w:bookmarkEnd w:id="2028"/>
-    <w:bookmarkStart w:id="2029" w:name="Xd518698a0b64a922415221525837e1dabd77edc"/>
+    <w:bookmarkEnd w:id="2176"/>
+    <w:bookmarkStart w:id="2177" w:name="Xd518698a0b64a922415221525837e1dabd77edc"/>
     <w:p>
       <w:pPr>
         <w:pStyle w:val="Heading2"/>
@@ -1342,9 +1342,9 @@
         <w:t xml:space="preserve">that never end and fill up with unrelated work.</w:t>
       </w:r>
     </w:p>
-    <w:bookmarkEnd w:id="2029"/>
-    <w:bookmarkEnd w:id="2030"/>
-    <w:bookmarkStart w:id="2033" w:name="main-words-we-use"/>
+    <w:bookmarkEnd w:id="2177"/>
+    <w:bookmarkEnd w:id="2178"/>
+    <w:bookmarkStart w:id="2181" w:name="main-words-we-use"/>
     <w:p>
       <w:pPr>
         <w:pStyle w:val="Heading1"/>
@@ -1778,7 +1778,7 @@
         </w:tc>
       </w:tr>
     </w:tbl>
-    <w:bookmarkStart w:id="2031" w:name="words-on-screen"/>
+    <w:bookmarkStart w:id="2179" w:name="words-on-screen"/>
     <w:p>
       <w:pPr>
         <w:pStyle w:val="Heading2"/>
@@ -1962,8 +1962,8 @@
         <w:t xml:space="preserve">only for checking finished work.</w:t>
       </w:r>
     </w:p>
-    <w:bookmarkEnd w:id="2031"/>
-    <w:bookmarkStart w:id="2032" w:name="words-about-time"/>
+    <w:bookmarkEnd w:id="2179"/>
+    <w:bookmarkStart w:id="2180" w:name="words-about-time"/>
     <w:p>
       <w:pPr>
         <w:pStyle w:val="Heading2"/>
@@ -2244,9 +2244,9 @@
         </w:tc>
       </w:tr>
     </w:tbl>
-    <w:bookmarkEnd w:id="2032"/>
-    <w:bookmarkEnd w:id="2033"/>
-    <w:bookmarkStart w:id="2044" w:name="business-rules"/>
+    <w:bookmarkEnd w:id="2180"/>
+    <w:bookmarkEnd w:id="2181"/>
+    <w:bookmarkStart w:id="2192" w:name="business-rules"/>
     <w:p>
       <w:pPr>
         <w:pStyle w:val="Heading1"/>
@@ -2272,7 +2272,7 @@
         <w:t xml:space="preserve">) shows how they are built.</w:t>
       </w:r>
     </w:p>
-    <w:bookmarkStart w:id="2034" w:name="people-and-access"/>
+    <w:bookmarkStart w:id="2182" w:name="people-and-access"/>
     <w:p>
       <w:pPr>
         <w:pStyle w:val="Heading2"/>
@@ -2341,8 +2341,8 @@
         <w:t xml:space="preserve">People can look at other departments’ work, read-only (Proposed). Anyone in the company can open another department’s Goals, Deliverables and Tasks and see the title, owner, status, due date and the Blocked marker. From there they can only send a request or give kudos. Workload colours, time, reports, weekly plans and reviews stay inside the department, Confidential Tasks follow their own rules, and a Task for me that isn’t linked to a Deliverable is seen only inside its department. An admin can close a department’s work to people outside it (for example HR or Finance).</w:t>
       </w:r>
     </w:p>
-    <w:bookmarkEnd w:id="2034"/>
-    <w:bookmarkStart w:id="2035" w:name="work"/>
+    <w:bookmarkEnd w:id="2182"/>
+    <w:bookmarkStart w:id="2183" w:name="work"/>
     <w:p>
       <w:pPr>
         <w:pStyle w:val="Heading2"/>
@@ -2543,8 +2543,8 @@
         <w:t xml:space="preserve">Kudos: one per person, per teammate, per item. You can’t give kudos to yourself. Kudos are never ranked.</w:t>
       </w:r>
     </w:p>
-    <w:bookmarkEnd w:id="2035"/>
-    <w:bookmarkStart w:id="2036" w:name="new-requests"/>
+    <w:bookmarkEnd w:id="2183"/>
+    <w:bookmarkStart w:id="2184" w:name="new-requests"/>
     <w:p>
       <w:pPr>
         <w:pStyle w:val="Heading2"/>
@@ -2683,8 +2683,8 @@
         <w:t xml:space="preserve">.</w:t>
       </w:r>
     </w:p>
-    <w:bookmarkEnd w:id="2036"/>
-    <w:bookmarkStart w:id="2037" w:name="planning-and-time"/>
+    <w:bookmarkEnd w:id="2184"/>
+    <w:bookmarkStart w:id="2185" w:name="planning-and-time"/>
     <w:p>
       <w:pPr>
         <w:pStyle w:val="Heading2"/>
@@ -2714,7 +2714,7 @@
         </w:numPr>
       </w:pPr>
       <w:r>
-        <w:t xml:space="preserve">Before a lead locks a week, HopFlows lists anyone with more work than time, any Tasks with no estimate, and any leave request for that week that is still waiting, and asks the lead to confirm. The lead can decide the leave first or lock anyway; leave approved after locking shows as a change in the weekly review, never as a miss. If someone has more work than time, the lead can move their work right there, seeing everyone’s load after the move, before locking. (Proposed)</w:t>
+        <w:t xml:space="preserve">Before a lead locks a week, HopFlows lists anyone with more work than time, any Tasks with no estimate, any leave request for that week that is still waiting, and any open handover, and asks the lead to confirm. Waiting leave and open handovers are counted as if they will happen, so the plan the lead locks is the week as it will really look. (Proposed) The lead can decide the leave first or lock anyway; leave approved after locking shows as a change in the weekly review, never as a miss. If someone has more work than time, the lead can move their work right there, seeing everyone’s load after the move, before or after locking; after locking the move is recorded as a change. (Proposed)</w:t>
       </w:r>
     </w:p>
     <w:p>
@@ -2837,8 +2837,8 @@
         <w:t xml:space="preserve">Repeating daily work reserves its time in each week, so the weekly plan and the Workload view include it before any project work is locked.</w:t>
       </w:r>
     </w:p>
-    <w:bookmarkEnd w:id="2037"/>
-    <w:bookmarkStart w:id="2038" w:name="leave-proposed"/>
+    <w:bookmarkEnd w:id="2185"/>
+    <w:bookmarkStart w:id="2186" w:name="leave-proposed"/>
     <w:p>
       <w:pPr>
         <w:pStyle w:val="Heading2"/>
@@ -2952,8 +2952,8 @@
         <w:t xml:space="preserve">HopFlows records leave only for planning. It doesn’t track how many leave days are left, or pay. That stays with the company’s HR process.</w:t>
       </w:r>
     </w:p>
-    <w:bookmarkEnd w:id="2038"/>
-    <w:bookmarkStart w:id="2039" w:name="repeating-daily-work-proposed"/>
+    <w:bookmarkEnd w:id="2186"/>
+    <w:bookmarkStart w:id="2187" w:name="repeating-daily-work-proposed"/>
     <w:p>
       <w:pPr>
         <w:pStyle w:val="Heading2"/>
@@ -3070,8 +3070,8 @@
         <w:t xml:space="preserve">Changing a routine changes only future days. Pausing a routine stops new days until it is turned back on.</w:t>
       </w:r>
     </w:p>
-    <w:bookmarkEnd w:id="2039"/>
-    <w:bookmarkStart w:id="2040" w:name="handover-and-risk"/>
+    <w:bookmarkEnd w:id="2187"/>
+    <w:bookmarkStart w:id="2188" w:name="handover-and-risk"/>
     <w:p>
       <w:pPr>
         <w:pStyle w:val="Heading2"/>
@@ -3140,8 +3140,8 @@
         <w:t xml:space="preserve">A flag can be cleared by the person who set it, the item’s owner, or leaders. A Goal owner can’t clear a flag set by leaders. When a Deliverable is accepted or cancelled, its flag closes. When a Deliverable moves to another Goal, its flag moves with it.</w:t>
       </w:r>
     </w:p>
-    <w:bookmarkEnd w:id="2040"/>
-    <w:bookmarkStart w:id="2041" w:name="calendar"/>
+    <w:bookmarkEnd w:id="2188"/>
+    <w:bookmarkStart w:id="2189" w:name="calendar"/>
     <w:p>
       <w:pPr>
         <w:pStyle w:val="Heading2"/>
@@ -3231,8 +3231,8 @@
         <w:t xml:space="preserve">Each person can set their own reminders for events.</w:t>
       </w:r>
     </w:p>
-    <w:bookmarkEnd w:id="2041"/>
-    <w:bookmarkStart w:id="2042" w:name="notifications"/>
+    <w:bookmarkEnd w:id="2189"/>
+    <w:bookmarkStart w:id="2190" w:name="notifications"/>
     <w:p>
       <w:pPr>
         <w:pStyle w:val="Heading2"/>
@@ -3349,8 +3349,8 @@
         <w:t xml:space="preserve">Messages are in English by default. When other languages are added, each company picks its default and each person can choose their own.</w:t>
       </w:r>
     </w:p>
-    <w:bookmarkEnd w:id="2042"/>
-    <w:bookmarkStart w:id="2043" w:name="reports-search-and-offline-proposed"/>
+    <w:bookmarkEnd w:id="2190"/>
+    <w:bookmarkStart w:id="2191" w:name="reports-search-and-offline-proposed"/>
     <w:p>
       <w:pPr>
         <w:pStyle w:val="Heading2"/>
@@ -3455,9 +3455,9 @@
         <w:t xml:space="preserve">rules, and is deleted when the person signs out or leaves the company.</w:t>
       </w:r>
     </w:p>
-    <w:bookmarkEnd w:id="2043"/>
-    <w:bookmarkEnd w:id="2044"/>
-    <w:bookmarkStart w:id="2046" w:name="how-things-connect"/>
+    <w:bookmarkEnd w:id="2191"/>
+    <w:bookmarkEnd w:id="2192"/>
+    <w:bookmarkStart w:id="2194" w:name="how-things-connect"/>
     <w:p>
       <w:pPr>
         <w:pStyle w:val="Heading1"/>
@@ -4474,7 +4474,7 @@
         </w:tc>
       </w:tr>
     </w:tbl>
-    <w:bookmarkStart w:id="2045" w:name="rules-that-never-change"/>
+    <w:bookmarkStart w:id="2193" w:name="rules-that-never-change"/>
     <w:p>
       <w:pPr>
         <w:pStyle w:val="Heading2"/>
@@ -4672,9 +4672,9 @@
         <w:t xml:space="preserve">A button pressed in a push alert or chat does the same thing as in the app, with the same permission check and history. Buttons work once and expire.</w:t>
       </w:r>
     </w:p>
-    <w:bookmarkEnd w:id="2045"/>
-    <w:bookmarkEnd w:id="2046"/>
-    <w:bookmarkStart w:id="2051" w:name="the-life-of-a-task"/>
+    <w:bookmarkEnd w:id="2193"/>
+    <w:bookmarkEnd w:id="2194"/>
+    <w:bookmarkStart w:id="2199" w:name="the-life-of-a-task"/>
     <w:p>
       <w:pPr>
         <w:pStyle w:val="Heading1"/>
@@ -4754,18 +4754,18 @@
           <wp:inline>
             <wp:extent cx="5486400" cy="4774556"/>
             <wp:effectExtent b="0" l="0" r="0" t="0"/>
-            <wp:docPr descr="Diagram" title="" id="2048" name="Picture"/>
+            <wp:docPr descr="Diagram" title="" id="2196" name="Picture"/>
             <a:graphic>
               <a:graphicData uri="http://schemas.openxmlformats.org/drawingml/2006/picture">
                 <pic:pic>
                   <pic:nvPicPr>
-                    <pic:cNvPr descr="media/media/rId1899.png" id="2049" name="Picture"/>
+                    <pic:cNvPr descr="media/media/rId2047.png" id="2197" name="Picture"/>
                     <pic:cNvPicPr>
                       <a:picLocks noChangeArrowheads="1" noChangeAspect="1"/>
                     </pic:cNvPicPr>
                   </pic:nvPicPr>
                   <pic:blipFill>
-                    <a:blip r:embed="rId2047"/>
+                    <a:blip r:embed="rId2195"/>
                     <a:stretch>
                       <a:fillRect/>
                     </a:stretch>
@@ -4800,7 +4800,7 @@
         <w:t xml:space="preserve">Figure 2. The life of a Task. Blocked and Need Help are markers on a Task, not steps. Missed is only for repeating daily work.</w:t>
       </w:r>
     </w:p>
-    <w:bookmarkStart w:id="2050" w:name="buttons-employees-use"/>
+    <w:bookmarkStart w:id="2198" w:name="buttons-employees-use"/>
     <w:p>
       <w:pPr>
         <w:pStyle w:val="Heading2"/>
@@ -5024,9 +5024,9 @@
         </w:tc>
       </w:tr>
     </w:tbl>
-    <w:bookmarkEnd w:id="2050"/>
-    <w:bookmarkEnd w:id="2051"/>
-    <w:bookmarkStart w:id="2057" w:name="planned-and-unplanned-work"/>
+    <w:bookmarkEnd w:id="2198"/>
+    <w:bookmarkEnd w:id="2199"/>
+    <w:bookmarkStart w:id="2205" w:name="planned-and-unplanned-work"/>
     <w:p>
       <w:pPr>
         <w:pStyle w:val="Heading1"/>
@@ -5153,7 +5153,7 @@
         <w:t xml:space="preserve">Figure 3. Two ways in, one way to do the work.</w:t>
       </w:r>
     </w:p>
-    <w:bookmarkStart w:id="2052" w:name="three-separate-labels"/>
+    <w:bookmarkStart w:id="2200" w:name="three-separate-labels"/>
     <w:p>
       <w:pPr>
         <w:pStyle w:val="Heading2"/>
@@ -5350,8 +5350,8 @@
         <w:t xml:space="preserve">depends on a particular week, so the same Task can be added in one week and planned in the next.</w:t>
       </w:r>
     </w:p>
-    <w:bookmarkEnd w:id="2052"/>
-    <w:bookmarkStart w:id="2056" w:name="the-locking-rule"/>
+    <w:bookmarkEnd w:id="2200"/>
+    <w:bookmarkStart w:id="2204" w:name="the-locking-rule"/>
     <w:p>
       <w:pPr>
         <w:pStyle w:val="Heading2"/>
@@ -5380,7 +5380,7 @@
         <w:t xml:space="preserve">When the lead locks a week, HopFlows saves a copy of the planned work, the estimates and the owners. The live plan can still change, but reports always compare what really happened with that saved copy.</w:t>
       </w:r>
     </w:p>
-    <w:bookmarkStart w:id="2053" w:name="example-something-urgent-arrives-midweek"/>
+    <w:bookmarkStart w:id="2201" w:name="example-something-urgent-arrives-midweek"/>
     <w:p>
       <w:pPr>
         <w:pStyle w:val="Heading3"/>
@@ -5445,8 +5445,8 @@
         <w:t xml:space="preserve">If the same request is planned into next week, it counts as planned there, and HopFlows still remembers it started as a surprise.</w:t>
       </w:r>
     </w:p>
-    <w:bookmarkEnd w:id="2053"/>
-    <w:bookmarkStart w:id="2054" w:name="X6546010788123f30940adaa831be091dcf8e07f"/>
+    <w:bookmarkEnd w:id="2201"/>
+    <w:bookmarkStart w:id="2202" w:name="X6546010788123f30940adaa831be091dcf8e07f"/>
     <w:p>
       <w:pPr>
         <w:pStyle w:val="Heading3"/>
@@ -5475,8 +5475,8 @@
         <w:t xml:space="preserve">and appear in the weekly review. The lead can remove them before locking the new week. If a week is never locked, there is no saved plan: all its work counts as unplanned, and the weekly review points out that the week wasn’t locked.</w:t>
       </w:r>
     </w:p>
-    <w:bookmarkEnd w:id="2054"/>
-    <w:bookmarkStart w:id="2055" w:name="repeating-daily-work-in-the-plan"/>
+    <w:bookmarkEnd w:id="2202"/>
+    <w:bookmarkStart w:id="2203" w:name="repeating-daily-work-in-the-plan"/>
     <w:p>
       <w:pPr>
         <w:pStyle w:val="Heading3"/>
@@ -5493,10 +5493,10 @@
         <w:t xml:space="preserve">When the lead locks a week, that week’s routines are included automatically, so the plan, the Workload view and the reports all include routine time. A routine created after the week is locked counts as added work.</w:t>
       </w:r>
     </w:p>
-    <w:bookmarkEnd w:id="2055"/>
-    <w:bookmarkEnd w:id="2056"/>
-    <w:bookmarkEnd w:id="2057"/>
-    <w:bookmarkStart w:id="2101" w:name="step-by-step-flows"/>
+    <w:bookmarkEnd w:id="2203"/>
+    <w:bookmarkEnd w:id="2204"/>
+    <w:bookmarkEnd w:id="2205"/>
+    <w:bookmarkStart w:id="2249" w:name="step-by-step-flows"/>
     <w:p>
       <w:pPr>
         <w:pStyle w:val="Heading1"/>
@@ -5522,18 +5522,18 @@
           <wp:inline>
             <wp:extent cx="1956816" cy="7760607"/>
             <wp:effectExtent b="0" l="0" r="0" t="0"/>
-            <wp:docPr descr="Diagram" title="" id="2059" name="Picture"/>
+            <wp:docPr descr="Diagram" title="" id="2207" name="Picture"/>
             <a:graphic>
               <a:graphicData uri="http://schemas.openxmlformats.org/drawingml/2006/picture">
                 <pic:pic>
                   <pic:nvPicPr>
-                    <pic:cNvPr descr="media/media/rId1910.png" id="2060" name="Picture"/>
+                    <pic:cNvPr descr="media/media/rId2058.png" id="2208" name="Picture"/>
                     <pic:cNvPicPr>
                       <a:picLocks noChangeArrowheads="1" noChangeAspect="1"/>
                     </pic:cNvPicPr>
                   </pic:nvPicPr>
                   <pic:blipFill>
-                    <a:blip r:embed="rId2058"/>
+                    <a:blip r:embed="rId2206"/>
                     <a:stretch>
                       <a:fillRect/>
                     </a:stretch>
@@ -5568,7 +5568,7 @@
         <w:t xml:space="preserve">Figure 4. Who starts which flow.</w:t>
       </w:r>
     </w:p>
-    <w:bookmarkStart w:id="2064" w:name="flow-a-planned-work"/>
+    <w:bookmarkStart w:id="2212" w:name="flow-a-planned-work"/>
     <w:p>
       <w:pPr>
         <w:pStyle w:val="Heading2"/>
@@ -5682,18 +5682,18 @@
           <wp:inline>
             <wp:extent cx="2953512" cy="7773283"/>
             <wp:effectExtent b="0" l="0" r="0" t="0"/>
-            <wp:docPr descr="Diagram" title="" id="2062" name="Picture"/>
+            <wp:docPr descr="Diagram" title="" id="2210" name="Picture"/>
             <a:graphic>
               <a:graphicData uri="http://schemas.openxmlformats.org/drawingml/2006/picture">
                 <pic:pic>
                   <pic:nvPicPr>
-                    <pic:cNvPr descr="media/media/rId1913.png" id="2063" name="Picture"/>
+                    <pic:cNvPr descr="media/media/rId2061.png" id="2211" name="Picture"/>
                     <pic:cNvPicPr>
                       <a:picLocks noChangeArrowheads="1" noChangeAspect="1"/>
                     </pic:cNvPicPr>
                   </pic:nvPicPr>
                   <pic:blipFill>
-                    <a:blip r:embed="rId2061"/>
+                    <a:blip r:embed="rId2209"/>
                     <a:stretch>
                       <a:fillRect/>
                     </a:stretch>
@@ -5728,8 +5728,8 @@
         <w:t xml:space="preserve">Figure 5. Flow A, planned work.</w:t>
       </w:r>
     </w:p>
-    <w:bookmarkEnd w:id="2064"/>
-    <w:bookmarkStart w:id="2068" w:name="flow-b-surprise-work"/>
+    <w:bookmarkEnd w:id="2212"/>
+    <w:bookmarkStart w:id="2216" w:name="flow-b-surprise-work"/>
     <w:p>
       <w:pPr>
         <w:pStyle w:val="Heading2"/>
@@ -5888,18 +5888,18 @@
           <wp:inline>
             <wp:extent cx="5074920" cy="7767734"/>
             <wp:effectExtent b="0" l="0" r="0" t="0"/>
-            <wp:docPr descr="Diagram" title="" id="2066" name="Picture"/>
+            <wp:docPr descr="Diagram" title="" id="2214" name="Picture"/>
             <a:graphic>
               <a:graphicData uri="http://schemas.openxmlformats.org/drawingml/2006/picture">
                 <pic:pic>
                   <pic:nvPicPr>
-                    <pic:cNvPr descr="media/media/rId1917.png" id="2067" name="Picture"/>
+                    <pic:cNvPr descr="media/media/rId2065.png" id="2215" name="Picture"/>
                     <pic:cNvPicPr>
                       <a:picLocks noChangeArrowheads="1" noChangeAspect="1"/>
                     </pic:cNvPicPr>
                   </pic:nvPicPr>
                   <pic:blipFill>
-                    <a:blip r:embed="rId2065"/>
+                    <a:blip r:embed="rId2213"/>
                     <a:stretch>
                       <a:fillRect/>
                     </a:stretch>
@@ -5934,8 +5934,8 @@
         <w:t xml:space="preserve">Figure 6. Flow B, surprise work.</w:t>
       </w:r>
     </w:p>
-    <w:bookmarkEnd w:id="2068"/>
-    <w:bookmarkStart w:id="2072" w:name="flow-c-weekly-review"/>
+    <w:bookmarkEnd w:id="2216"/>
+    <w:bookmarkStart w:id="2220" w:name="flow-c-weekly-review"/>
     <w:p>
       <w:pPr>
         <w:pStyle w:val="Heading2"/>
@@ -5961,18 +5961,18 @@
           <wp:inline>
             <wp:extent cx="3867912" cy="7769225"/>
             <wp:effectExtent b="0" l="0" r="0" t="0"/>
-            <wp:docPr descr="Diagram" title="" id="2070" name="Picture"/>
+            <wp:docPr descr="Diagram" title="" id="2218" name="Picture"/>
             <a:graphic>
               <a:graphicData uri="http://schemas.openxmlformats.org/drawingml/2006/picture">
                 <pic:pic>
                   <pic:nvPicPr>
-                    <pic:cNvPr descr="media/media/rId1921.png" id="2071" name="Picture"/>
+                    <pic:cNvPr descr="media/media/rId2069.png" id="2219" name="Picture"/>
                     <pic:cNvPicPr>
                       <a:picLocks noChangeArrowheads="1" noChangeAspect="1"/>
                     </pic:cNvPicPr>
                   </pic:nvPicPr>
                   <pic:blipFill>
-                    <a:blip r:embed="rId2069"/>
+                    <a:blip r:embed="rId2217"/>
                     <a:stretch>
                       <a:fillRect/>
                     </a:stretch>
@@ -6007,8 +6007,8 @@
         <w:t xml:space="preserve">Figure 7. Flow C, weekly review.</w:t>
       </w:r>
     </w:p>
-    <w:bookmarkEnd w:id="2072"/>
-    <w:bookmarkStart w:id="2076" w:name="flow-d-handover-leave-or-leaving"/>
+    <w:bookmarkEnd w:id="2220"/>
+    <w:bookmarkStart w:id="2224" w:name="flow-d-handover-leave-or-leaving"/>
     <w:p>
       <w:pPr>
         <w:pStyle w:val="Heading2"/>
@@ -6140,18 +6140,18 @@
           <wp:inline>
             <wp:extent cx="2852928" cy="7781389"/>
             <wp:effectExtent b="0" l="0" r="0" t="0"/>
-            <wp:docPr descr="Diagram" title="" id="2074" name="Picture"/>
+            <wp:docPr descr="Diagram" title="" id="2222" name="Picture"/>
             <a:graphic>
               <a:graphicData uri="http://schemas.openxmlformats.org/drawingml/2006/picture">
                 <pic:pic>
                   <pic:nvPicPr>
-                    <pic:cNvPr descr="media/media/rId1925.png" id="2075" name="Picture"/>
+                    <pic:cNvPr descr="media/media/rId2073.png" id="2223" name="Picture"/>
                     <pic:cNvPicPr>
                       <a:picLocks noChangeArrowheads="1" noChangeAspect="1"/>
                     </pic:cNvPicPr>
                   </pic:nvPicPr>
                   <pic:blipFill>
-                    <a:blip r:embed="rId2073"/>
+                    <a:blip r:embed="rId2221"/>
                     <a:stretch>
                       <a:fillRect/>
                     </a:stretch>
@@ -6186,8 +6186,8 @@
         <w:t xml:space="preserve">Figure 8. Flow D, handover.</w:t>
       </w:r>
     </w:p>
-    <w:bookmarkEnd w:id="2076"/>
-    <w:bookmarkStart w:id="2080" w:name="flow-e-risk-flags"/>
+    <w:bookmarkEnd w:id="2224"/>
+    <w:bookmarkStart w:id="2228" w:name="flow-e-risk-flags"/>
     <w:p>
       <w:pPr>
         <w:pStyle w:val="Heading2"/>
@@ -6265,18 +6265,18 @@
           <wp:inline>
             <wp:extent cx="3118104" cy="7768098"/>
             <wp:effectExtent b="0" l="0" r="0" t="0"/>
-            <wp:docPr descr="Diagram" title="" id="2078" name="Picture"/>
+            <wp:docPr descr="Diagram" title="" id="2226" name="Picture"/>
             <a:graphic>
               <a:graphicData uri="http://schemas.openxmlformats.org/drawingml/2006/picture">
                 <pic:pic>
                   <pic:nvPicPr>
-                    <pic:cNvPr descr="media/media/rId1929.png" id="2079" name="Picture"/>
+                    <pic:cNvPr descr="media/media/rId2077.png" id="2227" name="Picture"/>
                     <pic:cNvPicPr>
                       <a:picLocks noChangeArrowheads="1" noChangeAspect="1"/>
                     </pic:cNvPicPr>
                   </pic:nvPicPr>
                   <pic:blipFill>
-                    <a:blip r:embed="rId2077"/>
+                    <a:blip r:embed="rId2225"/>
                     <a:stretch>
                       <a:fillRect/>
                     </a:stretch>
@@ -6311,8 +6311,8 @@
         <w:t xml:space="preserve">Figure 9. Flow E, risk flags.</w:t>
       </w:r>
     </w:p>
-    <w:bookmarkEnd w:id="2080"/>
-    <w:bookmarkStart w:id="2084" w:name="flow-f-calendar"/>
+    <w:bookmarkEnd w:id="2228"/>
+    <w:bookmarkStart w:id="2232" w:name="flow-f-calendar"/>
     <w:p>
       <w:pPr>
         <w:pStyle w:val="Heading2"/>
@@ -6450,18 +6450,18 @@
           <wp:inline>
             <wp:extent cx="5486400" cy="3673928"/>
             <wp:effectExtent b="0" l="0" r="0" t="0"/>
-            <wp:docPr descr="Diagram" title="" id="2082" name="Picture"/>
+            <wp:docPr descr="Diagram" title="" id="2230" name="Picture"/>
             <a:graphic>
               <a:graphicData uri="http://schemas.openxmlformats.org/drawingml/2006/picture">
                 <pic:pic>
                   <pic:nvPicPr>
-                    <pic:cNvPr descr="media/media/rId1933.png" id="2083" name="Picture"/>
+                    <pic:cNvPr descr="media/media/rId2081.png" id="2231" name="Picture"/>
                     <pic:cNvPicPr>
                       <a:picLocks noChangeArrowheads="1" noChangeAspect="1"/>
                     </pic:cNvPicPr>
                   </pic:nvPicPr>
                   <pic:blipFill>
-                    <a:blip r:embed="rId2081"/>
+                    <a:blip r:embed="rId2229"/>
                     <a:stretch>
                       <a:fillRect/>
                     </a:stretch>
@@ -6496,8 +6496,8 @@
         <w:t xml:space="preserve">Figure 10. Flow F, calendar.</w:t>
       </w:r>
     </w:p>
-    <w:bookmarkEnd w:id="2084"/>
-    <w:bookmarkStart w:id="2088" w:name="flow-g-alerts"/>
+    <w:bookmarkEnd w:id="2232"/>
+    <w:bookmarkStart w:id="2236" w:name="flow-g-alerts"/>
     <w:p>
       <w:pPr>
         <w:pStyle w:val="Heading2"/>
@@ -6587,18 +6587,18 @@
           <wp:inline>
             <wp:extent cx="5486400" cy="5962261"/>
             <wp:effectExtent b="0" l="0" r="0" t="0"/>
-            <wp:docPr descr="Diagram" title="" id="2086" name="Picture"/>
+            <wp:docPr descr="Diagram" title="" id="2234" name="Picture"/>
             <a:graphic>
               <a:graphicData uri="http://schemas.openxmlformats.org/drawingml/2006/picture">
                 <pic:pic>
                   <pic:nvPicPr>
-                    <pic:cNvPr descr="media/media/rId1937.png" id="2087" name="Picture"/>
+                    <pic:cNvPr descr="media/media/rId2085.png" id="2235" name="Picture"/>
                     <pic:cNvPicPr>
                       <a:picLocks noChangeArrowheads="1" noChangeAspect="1"/>
                     </pic:cNvPicPr>
                   </pic:nvPicPr>
                   <pic:blipFill>
-                    <a:blip r:embed="rId2085"/>
+                    <a:blip r:embed="rId2233"/>
                     <a:stretch>
                       <a:fillRect/>
                     </a:stretch>
@@ -6633,8 +6633,8 @@
         <w:t xml:space="preserve">Figure 11. Flow G, alerts.</w:t>
       </w:r>
     </w:p>
-    <w:bookmarkEnd w:id="2088"/>
-    <w:bookmarkStart w:id="2092" w:name="flow-h-leave-proposed"/>
+    <w:bookmarkEnd w:id="2236"/>
+    <w:bookmarkStart w:id="2240" w:name="flow-h-leave-proposed"/>
     <w:p>
       <w:pPr>
         <w:pStyle w:val="Heading2"/>
@@ -6721,18 +6721,18 @@
           <wp:inline>
             <wp:extent cx="3227832" cy="7782867"/>
             <wp:effectExtent b="0" l="0" r="0" t="0"/>
-            <wp:docPr descr="Diagram" title="" id="2090" name="Picture"/>
+            <wp:docPr descr="Diagram" title="" id="2238" name="Picture"/>
             <a:graphic>
               <a:graphicData uri="http://schemas.openxmlformats.org/drawingml/2006/picture">
                 <pic:pic>
                   <pic:nvPicPr>
-                    <pic:cNvPr descr="media/media/rId1941.png" id="2091" name="Picture"/>
+                    <pic:cNvPr descr="media/media/rId2089.png" id="2239" name="Picture"/>
                     <pic:cNvPicPr>
                       <a:picLocks noChangeArrowheads="1" noChangeAspect="1"/>
                     </pic:cNvPicPr>
                   </pic:nvPicPr>
                   <pic:blipFill>
-                    <a:blip r:embed="rId2089"/>
+                    <a:blip r:embed="rId2237"/>
                     <a:stretch>
                       <a:fillRect/>
                     </a:stretch>
@@ -6767,8 +6767,8 @@
         <w:t xml:space="preserve">Figure 12. Flow H, leave.</w:t>
       </w:r>
     </w:p>
-    <w:bookmarkEnd w:id="2092"/>
-    <w:bookmarkStart w:id="2096" w:name="flow-i-repeating-daily-work-proposed"/>
+    <w:bookmarkEnd w:id="2240"/>
+    <w:bookmarkStart w:id="2244" w:name="flow-i-repeating-daily-work-proposed"/>
     <w:p>
       <w:pPr>
         <w:pStyle w:val="Heading2"/>
@@ -6855,18 +6855,18 @@
           <wp:inline>
             <wp:extent cx="2706624" cy="7770950"/>
             <wp:effectExtent b="0" l="0" r="0" t="0"/>
-            <wp:docPr descr="Diagram" title="" id="2094" name="Picture"/>
+            <wp:docPr descr="Diagram" title="" id="2242" name="Picture"/>
             <a:graphic>
               <a:graphicData uri="http://schemas.openxmlformats.org/drawingml/2006/picture">
                 <pic:pic>
                   <pic:nvPicPr>
-                    <pic:cNvPr descr="media/media/rId1945.png" id="2095" name="Picture"/>
+                    <pic:cNvPr descr="media/media/rId2093.png" id="2243" name="Picture"/>
                     <pic:cNvPicPr>
                       <a:picLocks noChangeArrowheads="1" noChangeAspect="1"/>
                     </pic:cNvPicPr>
                   </pic:nvPicPr>
                   <pic:blipFill>
-                    <a:blip r:embed="rId2093"/>
+                    <a:blip r:embed="rId2241"/>
                     <a:stretch>
                       <a:fillRect/>
                     </a:stretch>
@@ -6901,8 +6901,8 @@
         <w:t xml:space="preserve">Figure 13. Flow I, repeating daily work.</w:t>
       </w:r>
     </w:p>
-    <w:bookmarkEnd w:id="2096"/>
-    <w:bookmarkStart w:id="2100" w:name="Xee151c202ff32b2b502fcc1220710a61d3b4311"/>
+    <w:bookmarkEnd w:id="2244"/>
+    <w:bookmarkStart w:id="2248" w:name="Xee151c202ff32b2b502fcc1220710a61d3b4311"/>
     <w:p>
       <w:pPr>
         <w:pStyle w:val="Heading2"/>
@@ -6968,18 +6968,18 @@
           <wp:inline>
             <wp:extent cx="3054096" cy="7769485"/>
             <wp:effectExtent b="0" l="0" r="0" t="0"/>
-            <wp:docPr descr="Diagram" title="" id="2098" name="Picture"/>
+            <wp:docPr descr="Diagram" title="" id="2246" name="Picture"/>
             <a:graphic>
               <a:graphicData uri="http://schemas.openxmlformats.org/drawingml/2006/picture">
                 <pic:pic>
                   <pic:nvPicPr>
-                    <pic:cNvPr descr="media/media/rId1949.png" id="2099" name="Picture"/>
+                    <pic:cNvPr descr="media/media/rId2097.png" id="2247" name="Picture"/>
                     <pic:cNvPicPr>
                       <a:picLocks noChangeArrowheads="1" noChangeAspect="1"/>
                     </pic:cNvPicPr>
                   </pic:nvPicPr>
                   <pic:blipFill>
-                    <a:blip r:embed="rId2097"/>
+                    <a:blip r:embed="rId2245"/>
                     <a:stretch>
                       <a:fillRect/>
                     </a:stretch>
@@ -7014,9 +7014,9 @@
         <w:t xml:space="preserve">Figure 14. Flow J, weekly summary for leaders.</w:t>
       </w:r>
     </w:p>
-    <w:bookmarkEnd w:id="2100"/>
-    <w:bookmarkEnd w:id="2101"/>
-    <w:bookmarkStart w:id="2118" w:name="what-each-role-sees-and-can-do"/>
+    <w:bookmarkEnd w:id="2248"/>
+    <w:bookmarkEnd w:id="2249"/>
+    <w:bookmarkStart w:id="2266" w:name="what-each-role-sees-and-can-do"/>
     <w:p>
       <w:pPr>
         <w:pStyle w:val="Heading1"/>
@@ -7025,7 +7025,7 @@
         <w:t xml:space="preserve">09 What each role sees and can do</w:t>
       </w:r>
     </w:p>
-    <w:bookmarkStart w:id="2102" w:name="main-screens"/>
+    <w:bookmarkStart w:id="2250" w:name="main-screens"/>
     <w:p>
       <w:pPr>
         <w:pStyle w:val="Heading2"/>
@@ -7245,8 +7245,8 @@
         <w:t xml:space="preserve">Managers also get their own Today screen. Different roles get different starting screens, not three separate apps, and nobody is locked out of moving around.</w:t>
       </w:r>
     </w:p>
-    <w:bookmarkEnd w:id="2102"/>
-    <w:bookmarkStart w:id="2103" w:name="simple-by-default-one-question-per-role"/>
+    <w:bookmarkEnd w:id="2250"/>
+    <w:bookmarkStart w:id="2251" w:name="simple-by-default-one-question-per-role"/>
     <w:p>
       <w:pPr>
         <w:pStyle w:val="Heading2"/>
@@ -7701,8 +7701,8 @@
         <w:t xml:space="preserve">One in, one out: every new feature must say which role sees it on their home screen. If it adds something there, something else moves one tap deeper.</w:t>
       </w:r>
     </w:p>
-    <w:bookmarkEnd w:id="2103"/>
-    <w:bookmarkStart w:id="2107" w:name="Xafc6df188b68060a074162f0ed46c452143f4ca"/>
+    <w:bookmarkEnd w:id="2251"/>
+    <w:bookmarkStart w:id="2255" w:name="Xafc6df188b68060a074162f0ed46c452143f4ca"/>
     <w:p>
       <w:pPr>
         <w:pStyle w:val="Heading2"/>
@@ -8090,18 +8090,18 @@
           <wp:inline>
             <wp:extent cx="3813048" cy="7770093"/>
             <wp:effectExtent b="0" l="0" r="0" t="0"/>
-            <wp:docPr descr="Diagram" title="" id="2105" name="Picture"/>
+            <wp:docPr descr="Diagram" title="" id="2253" name="Picture"/>
             <a:graphic>
               <a:graphicData uri="http://schemas.openxmlformats.org/drawingml/2006/picture">
                 <pic:pic>
                   <pic:nvPicPr>
-                    <pic:cNvPr descr="media/media/rId1956.png" id="2106" name="Picture"/>
+                    <pic:cNvPr descr="media/media/rId2104.png" id="2254" name="Picture"/>
                     <pic:cNvPicPr>
                       <a:picLocks noChangeArrowheads="1" noChangeAspect="1"/>
                     </pic:cNvPicPr>
                   </pic:nvPicPr>
                   <pic:blipFill>
-                    <a:blip r:embed="rId2104"/>
+                    <a:blip r:embed="rId2252"/>
                     <a:stretch>
                       <a:fillRect/>
                     </a:stretch>
@@ -8136,8 +8136,8 @@
         <w:t xml:space="preserve">Figure 15. Dragging on the Board follows the same rules as the buttons.</w:t>
       </w:r>
     </w:p>
-    <w:bookmarkEnd w:id="2107"/>
-    <w:bookmarkStart w:id="2108" w:name="workload-view"/>
+    <w:bookmarkEnd w:id="2255"/>
+    <w:bookmarkStart w:id="2256" w:name="workload-view"/>
     <w:p>
       <w:pPr>
         <w:pStyle w:val="Heading2"/>
@@ -8578,8 +8578,8 @@
         <w:t xml:space="preserve">list asks them to look. (Proposed)</w:t>
       </w:r>
     </w:p>
-    <w:bookmarkEnd w:id="2108"/>
-    <w:bookmarkStart w:id="2109" w:name="risk-flags-for-leaders"/>
+    <w:bookmarkEnd w:id="2256"/>
+    <w:bookmarkStart w:id="2257" w:name="risk-flags-for-leaders"/>
     <w:p>
       <w:pPr>
         <w:pStyle w:val="Heading2"/>
@@ -8848,8 +8848,8 @@
         <w:t xml:space="preserve">In a later stage, suggested flags are never set automatically. Flags not looked at for a while (see §14) remind the lead to confirm or clear them.</w:t>
       </w:r>
     </w:p>
-    <w:bookmarkEnd w:id="2109"/>
-    <w:bookmarkStart w:id="2110" w:name="calendar-1"/>
+    <w:bookmarkEnd w:id="2257"/>
+    <w:bookmarkStart w:id="2258" w:name="calendar-1"/>
     <w:p>
       <w:pPr>
         <w:pStyle w:val="Heading2"/>
@@ -9182,8 +9182,8 @@
         <w:t xml:space="preserve">Times show in each person’s local time. Holidays and all-day events stay as dates.</w:t>
       </w:r>
     </w:p>
-    <w:bookmarkEnd w:id="2110"/>
-    <w:bookmarkStart w:id="2111" w:name="alerts-and-the-mobile-app"/>
+    <w:bookmarkEnd w:id="2258"/>
+    <w:bookmarkStart w:id="2259" w:name="alerts-and-the-mobile-app"/>
     <w:p>
       <w:pPr>
         <w:pStyle w:val="Heading2"/>
@@ -9977,8 +9977,8 @@
         <w:t xml:space="preserve">Chat apps (Telegram, Slack and Microsoft Teams, later stage) will all use the same messages, buttons and team chat settings.</w:t>
       </w:r>
     </w:p>
-    <w:bookmarkEnd w:id="2111"/>
-    <w:bookmarkStart w:id="2112" w:name="search-proposed"/>
+    <w:bookmarkEnd w:id="2259"/>
+    <w:bookmarkStart w:id="2260" w:name="search-proposed"/>
     <w:p>
       <w:pPr>
         <w:pStyle w:val="Heading2"/>
@@ -10059,8 +10059,8 @@
         <w:t xml:space="preserve">Without internet, search looks through the items saved on the phone, and says so.</w:t>
       </w:r>
     </w:p>
-    <w:bookmarkEnd w:id="2112"/>
-    <w:bookmarkStart w:id="2116" w:name="working-offline-proposed"/>
+    <w:bookmarkEnd w:id="2260"/>
+    <w:bookmarkStart w:id="2264" w:name="working-offline-proposed"/>
     <w:p>
       <w:pPr>
         <w:pStyle w:val="Heading2"/>
@@ -10139,18 +10139,18 @@
           <wp:inline>
             <wp:extent cx="4727448" cy="7773611"/>
             <wp:effectExtent b="0" l="0" r="0" t="0"/>
-            <wp:docPr descr="Diagram" title="" id="2114" name="Picture"/>
+            <wp:docPr descr="Diagram" title="" id="2262" name="Picture"/>
             <a:graphic>
               <a:graphicData uri="http://schemas.openxmlformats.org/drawingml/2006/picture">
                 <pic:pic>
                   <pic:nvPicPr>
-                    <pic:cNvPr descr="media/media/rId1965.png" id="2115" name="Picture"/>
+                    <pic:cNvPr descr="media/media/rId2113.png" id="2263" name="Picture"/>
                     <pic:cNvPicPr>
                       <a:picLocks noChangeArrowheads="1" noChangeAspect="1"/>
                     </pic:cNvPicPr>
                   </pic:nvPicPr>
                   <pic:blipFill>
-                    <a:blip r:embed="rId2113"/>
+                    <a:blip r:embed="rId2261"/>
                     <a:stretch>
                       <a:fillRect/>
                     </a:stretch>
@@ -10185,8 +10185,8 @@
         <w:t xml:space="preserve">Figure 16. Working offline.</w:t>
       </w:r>
     </w:p>
-    <w:bookmarkEnd w:id="2116"/>
-    <w:bookmarkStart w:id="2117" w:name="who-can-do-what-starting-settings"/>
+    <w:bookmarkEnd w:id="2264"/>
+    <w:bookmarkStart w:id="2265" w:name="who-can-do-what-starting-settings"/>
     <w:p>
       <w:pPr>
         <w:pStyle w:val="Heading2"/>
@@ -11766,9 +11766,9 @@
         <w:t xml:space="preserve">rules on top of department and job title.</w:t>
       </w:r>
     </w:p>
-    <w:bookmarkEnd w:id="2117"/>
-    <w:bookmarkEnd w:id="2118"/>
-    <w:bookmarkStart w:id="2123" w:name="time-and-measures"/>
+    <w:bookmarkEnd w:id="2265"/>
+    <w:bookmarkEnd w:id="2266"/>
+    <w:bookmarkStart w:id="2271" w:name="time-and-measures"/>
     <w:p>
       <w:pPr>
         <w:pStyle w:val="Heading1"/>
@@ -11777,7 +11777,7 @@
         <w:t xml:space="preserve">10 Time and measures</w:t>
       </w:r>
     </w:p>
-    <w:bookmarkStart w:id="2119" w:name="talking-about-time"/>
+    <w:bookmarkStart w:id="2267" w:name="talking-about-time"/>
     <w:p>
       <w:pPr>
         <w:pStyle w:val="Heading2"/>
@@ -12012,8 +12012,8 @@
         <w:t xml:space="preserve">Holidays and leave reduce the working week before this calculation. For example, a public holiday on Tuesday cuts the working week to 32 hours for everyone on that holiday calendar, and the weekly planner shows the lower number before the week is locked.</w:t>
       </w:r>
     </w:p>
-    <w:bookmarkEnd w:id="2119"/>
-    <w:bookmarkStart w:id="2120" w:name="measures"/>
+    <w:bookmarkEnd w:id="2267"/>
+    <w:bookmarkStart w:id="2268" w:name="measures"/>
     <w:p>
       <w:pPr>
         <w:pStyle w:val="Heading2"/>
@@ -12401,8 +12401,8 @@
         <w:t xml:space="preserve">until people log real time. Cancelled work is shown separately and never counts as missed.</w:t>
       </w:r>
     </w:p>
-    <w:bookmarkEnd w:id="2120"/>
-    <w:bookmarkStart w:id="2121" w:name="standard-reports-proposed"/>
+    <w:bookmarkEnd w:id="2268"/>
+    <w:bookmarkStart w:id="2269" w:name="standard-reports-proposed"/>
     <w:p>
       <w:pPr>
         <w:pStyle w:val="Heading2"/>
@@ -12655,8 +12655,8 @@
         <w:t xml:space="preserve">, with their own planned, added and finished work.</w:t>
       </w:r>
     </w:p>
-    <w:bookmarkEnd w:id="2121"/>
-    <w:bookmarkStart w:id="2122" w:name="keeping-it-fair"/>
+    <w:bookmarkEnd w:id="2269"/>
+    <w:bookmarkStart w:id="2270" w:name="keeping-it-fair"/>
     <w:p>
       <w:pPr>
         <w:pStyle w:val="Heading2"/>
@@ -12725,9 +12725,9 @@
         <w:t xml:space="preserve">Don’t count a Deliverable that covers several products twice. Use its main product, or set shares.</w:t>
       </w:r>
     </w:p>
-    <w:bookmarkEnd w:id="2122"/>
-    <w:bookmarkEnd w:id="2123"/>
-    <w:bookmarkStart w:id="2141" w:name="rewards-fun-and-the-mascot"/>
+    <w:bookmarkEnd w:id="2270"/>
+    <w:bookmarkEnd w:id="2271"/>
+    <w:bookmarkStart w:id="2289" w:name="rewards-fun-and-the-mascot"/>
     <w:p>
       <w:pPr>
         <w:pStyle w:val="Heading1"/>
@@ -12744,7 +12744,7 @@
         <w:t xml:space="preserve">Rewards help people adopt the app. They should follow real, checked work, and should never encourage splitting tasks, working extra hours or saying work is done when it isn’t.</w:t>
       </w:r>
     </w:p>
-    <w:bookmarkStart w:id="2124" w:name="start-simple-first-version"/>
+    <w:bookmarkStart w:id="2272" w:name="start-simple-first-version"/>
     <w:p>
       <w:pPr>
         <w:pStyle w:val="Heading2"/>
@@ -13012,8 +13012,8 @@
         <w:t xml:space="preserve">Celebrations and streak days come only from real, checked events, each counted once, so repeating or undoing actions can’t be used to game them.</w:t>
       </w:r>
     </w:p>
-    <w:bookmarkEnd w:id="2124"/>
-    <w:bookmarkStart w:id="2134" w:name="mascot-punh-punh"/>
+    <w:bookmarkEnd w:id="2272"/>
+    <w:bookmarkStart w:id="2282" w:name="mascot-punh-punh"/>
     <w:p>
       <w:pPr>
         <w:pStyle w:val="Heading2"/>
@@ -13067,18 +13067,18 @@
                 <wp:inline>
                   <wp:extent cx="6134100" cy="6134100"/>
                   <wp:effectExtent b="0" l="0" r="0" t="0"/>
-                  <wp:docPr descr="Punh Punh holding a blank note" title="" id="2126" name="Picture"/>
+                  <wp:docPr descr="Punh Punh holding a blank note" title="" id="2274" name="Picture"/>
                   <a:graphic>
                     <a:graphicData uri="http://schemas.openxmlformats.org/drawingml/2006/picture">
                       <pic:pic>
                         <pic:nvPicPr>
-                          <pic:cNvPr descr="../design/mascot/punh-punh-A1.png" id="2127" name="Picture"/>
+                          <pic:cNvPr descr="../design/mascot/punh-punh-A1.png" id="2275" name="Picture"/>
                           <pic:cNvPicPr>
                             <a:picLocks noChangeArrowheads="1" noChangeAspect="1"/>
                           </pic:cNvPicPr>
                         </pic:nvPicPr>
                         <pic:blipFill>
-                          <a:blip r:embed="rId2125"/>
+                          <a:blip r:embed="rId2273"/>
                           <a:stretch>
                             <a:fillRect/>
                           </a:stretch>
@@ -13118,18 +13118,18 @@
                 <wp:inline>
                   <wp:extent cx="6134100" cy="6134100"/>
                   <wp:effectExtent b="0" l="0" r="0" t="0"/>
-                  <wp:docPr descr="Punh Punh waving" title="" id="2129" name="Picture"/>
+                  <wp:docPr descr="Punh Punh waving" title="" id="2277" name="Picture"/>
                   <a:graphic>
                     <a:graphicData uri="http://schemas.openxmlformats.org/drawingml/2006/picture">
                       <pic:pic>
                         <pic:nvPicPr>
-                          <pic:cNvPr descr="../design/mascot/punh-punh-B1.png" id="2130" name="Picture"/>
+                          <pic:cNvPr descr="../design/mascot/punh-punh-B1.png" id="2278" name="Picture"/>
                           <pic:cNvPicPr>
                             <a:picLocks noChangeArrowheads="1" noChangeAspect="1"/>
                           </pic:cNvPicPr>
                         </pic:nvPicPr>
                         <pic:blipFill>
-                          <a:blip r:embed="rId2128"/>
+                          <a:blip r:embed="rId2276"/>
                           <a:stretch>
                             <a:fillRect/>
                           </a:stretch>
@@ -13169,18 +13169,18 @@
                 <wp:inline>
                   <wp:extent cx="6134100" cy="6134100"/>
                   <wp:effectExtent b="0" l="0" r="0" t="0"/>
-                  <wp:docPr descr="Punh Punh holding a checked note" title="" id="2132" name="Picture"/>
+                  <wp:docPr descr="Punh Punh holding a checked note" title="" id="2280" name="Picture"/>
                   <a:graphic>
                     <a:graphicData uri="http://schemas.openxmlformats.org/drawingml/2006/picture">
                       <pic:pic>
                         <pic:nvPicPr>
-                          <pic:cNvPr descr="../design/mascot/punh-punh-C1.png" id="2133" name="Picture"/>
+                          <pic:cNvPr descr="../design/mascot/punh-punh-C1.png" id="2281" name="Picture"/>
                           <pic:cNvPicPr>
                             <a:picLocks noChangeArrowheads="1" noChangeAspect="1"/>
                           </pic:cNvPicPr>
                         </pic:nvPicPr>
                         <pic:blipFill>
-                          <a:blip r:embed="rId2131"/>
+                          <a:blip r:embed="rId2279"/>
                           <a:stretch>
                             <a:fillRect/>
                           </a:stretch>
@@ -13616,8 +13616,8 @@
         <w:t xml:space="preserve">Design work for the first version: a character sheet, five main poses (welcome, celebrate, thinking, calm, resting for holidays and leave), light animations. A chat sticker set and the bot’s profile picture come with chat apps, and seasonal outfits come later.</w:t>
       </w:r>
     </w:p>
-    <w:bookmarkEnd w:id="2134"/>
-    <w:bookmarkStart w:id="2138" w:name="app-icon"/>
+    <w:bookmarkEnd w:id="2282"/>
+    <w:bookmarkStart w:id="2286" w:name="app-icon"/>
     <w:p>
       <w:pPr>
         <w:pStyle w:val="Heading2"/>
@@ -13635,18 +13635,18 @@
           <wp:inline>
             <wp:extent cx="6134100" cy="6134100"/>
             <wp:effectExtent b="0" l="0" r="0" t="0"/>
-            <wp:docPr descr="HopFlows app icon: Punh Punh leaning in beside a checklist on a sky tile" title="" id="2136" name="Picture"/>
+            <wp:docPr descr="HopFlows app icon: Punh Punh leaning in beside a checklist on a sky tile" title="" id="2284" name="Picture"/>
             <a:graphic>
               <a:graphicData uri="http://schemas.openxmlformats.org/drawingml/2006/picture">
                 <pic:pic>
                   <pic:nvPicPr>
-                    <pic:cNvPr descr="../design/app-icon/png/icon-512.png" id="2137" name="Picture"/>
+                    <pic:cNvPr descr="../design/app-icon/png/icon-512.png" id="2285" name="Picture"/>
                     <pic:cNvPicPr>
                       <a:picLocks noChangeArrowheads="1" noChangeAspect="1"/>
                     </pic:cNvPicPr>
                   </pic:nvPicPr>
                   <pic:blipFill>
-                    <a:blip r:embed="rId2135"/>
+                    <a:blip r:embed="rId2283"/>
                     <a:stretch>
                       <a:fillRect/>
                     </a:stretch>
@@ -13798,8 +13798,8 @@
         <w:t xml:space="preserve">.</w:t>
       </w:r>
     </w:p>
-    <w:bookmarkEnd w:id="2138"/>
-    <w:bookmarkStart w:id="2139" w:name="more-rewards-later"/>
+    <w:bookmarkEnd w:id="2286"/>
+    <w:bookmarkStart w:id="2287" w:name="more-rewards-later"/>
     <w:p>
       <w:pPr>
         <w:pStyle w:val="Heading2"/>
@@ -14054,8 +14054,8 @@
         </w:tc>
       </w:tr>
     </w:tbl>
-    <w:bookmarkEnd w:id="2139"/>
-    <w:bookmarkStart w:id="2140" w:name="making-it-easy-to-start"/>
+    <w:bookmarkEnd w:id="2287"/>
+    <w:bookmarkStart w:id="2288" w:name="making-it-easy-to-start"/>
     <w:p>
       <w:pPr>
         <w:pStyle w:val="Heading2"/>
@@ -14100,9 +14100,9 @@
         <w:t xml:space="preserve">English and phone-friendly design are included from the start. Other languages can be added later.</w:t>
       </w:r>
     </w:p>
-    <w:bookmarkEnd w:id="2140"/>
-    <w:bookmarkEnd w:id="2141"/>
-    <w:bookmarkStart w:id="2151" w:name="special-cases"/>
+    <w:bookmarkEnd w:id="2288"/>
+    <w:bookmarkEnd w:id="2289"/>
+    <w:bookmarkStart w:id="2299" w:name="special-cases"/>
     <w:p>
       <w:pPr>
         <w:pStyle w:val="Heading1"/>
@@ -14111,7 +14111,7 @@
         <w:t xml:space="preserve">12 Special cases</w:t>
       </w:r>
     </w:p>
-    <w:bookmarkStart w:id="2142" w:name="work-and-requests"/>
+    <w:bookmarkStart w:id="2290" w:name="work-and-requests"/>
     <w:p>
       <w:pPr>
         <w:pStyle w:val="Heading2"/>
@@ -14689,8 +14689,8 @@
         </w:tc>
       </w:tr>
     </w:tbl>
-    <w:bookmarkEnd w:id="2142"/>
-    <w:bookmarkStart w:id="2143" w:name="planning-and-time-1"/>
+    <w:bookmarkEnd w:id="2290"/>
+    <w:bookmarkStart w:id="2291" w:name="planning-and-time-1"/>
     <w:p>
       <w:pPr>
         <w:pStyle w:val="Heading2"/>
@@ -15064,8 +15064,8 @@
         </w:tc>
       </w:tr>
     </w:tbl>
-    <w:bookmarkEnd w:id="2143"/>
-    <w:bookmarkStart w:id="2144" w:name="handover-and-leave"/>
+    <w:bookmarkEnd w:id="2291"/>
+    <w:bookmarkStart w:id="2292" w:name="handover-and-leave"/>
     <w:p>
       <w:pPr>
         <w:pStyle w:val="Heading2"/>
@@ -15289,8 +15289,8 @@
         </w:tc>
       </w:tr>
     </w:tbl>
-    <w:bookmarkEnd w:id="2144"/>
-    <w:bookmarkStart w:id="2145" w:name="risk-flags"/>
+    <w:bookmarkEnd w:id="2292"/>
+    <w:bookmarkStart w:id="2293" w:name="risk-flags"/>
     <w:p>
       <w:pPr>
         <w:pStyle w:val="Heading2"/>
@@ -15466,8 +15466,8 @@
         </w:tc>
       </w:tr>
     </w:tbl>
-    <w:bookmarkEnd w:id="2145"/>
-    <w:bookmarkStart w:id="2146" w:name="calendar-2"/>
+    <w:bookmarkEnd w:id="2293"/>
+    <w:bookmarkStart w:id="2294" w:name="calendar-2"/>
     <w:p>
       <w:pPr>
         <w:pStyle w:val="Heading2"/>
@@ -15631,8 +15631,8 @@
         </w:tc>
       </w:tr>
     </w:tbl>
-    <w:bookmarkEnd w:id="2146"/>
-    <w:bookmarkStart w:id="2147" w:name="alerts-and-chat"/>
+    <w:bookmarkEnd w:id="2294"/>
+    <w:bookmarkStart w:id="2295" w:name="alerts-and-chat"/>
     <w:p>
       <w:pPr>
         <w:pStyle w:val="Heading2"/>
@@ -16017,8 +16017,8 @@
         </w:tc>
       </w:tr>
     </w:tbl>
-    <w:bookmarkEnd w:id="2147"/>
-    <w:bookmarkStart w:id="2148" w:name="leave-routines-and-week-status"/>
+    <w:bookmarkEnd w:id="2295"/>
+    <w:bookmarkStart w:id="2296" w:name="leave-routines-and-week-status"/>
     <w:p>
       <w:pPr>
         <w:pStyle w:val="Heading2"/>
@@ -16386,8 +16386,8 @@
         </w:tc>
       </w:tr>
     </w:tbl>
-    <w:bookmarkEnd w:id="2148"/>
-    <w:bookmarkStart w:id="2149" w:name="reports-search-and-offline"/>
+    <w:bookmarkEnd w:id="2296"/>
+    <w:bookmarkStart w:id="2297" w:name="reports-search-and-offline"/>
     <w:p>
       <w:pPr>
         <w:pStyle w:val="Heading2"/>
@@ -16587,8 +16587,8 @@
         </w:tc>
       </w:tr>
     </w:tbl>
-    <w:bookmarkEnd w:id="2149"/>
-    <w:bookmarkStart w:id="2150" w:name="rewards"/>
+    <w:bookmarkEnd w:id="2297"/>
+    <w:bookmarkStart w:id="2298" w:name="rewards"/>
     <w:p>
       <w:pPr>
         <w:pStyle w:val="Heading2"/>
@@ -16716,9 +16716,9 @@
         </w:tc>
       </w:tr>
     </w:tbl>
-    <w:bookmarkEnd w:id="2150"/>
-    <w:bookmarkEnd w:id="2151"/>
-    <w:bookmarkStart w:id="2155" w:name="what-we-build-first"/>
+    <w:bookmarkEnd w:id="2298"/>
+    <w:bookmarkEnd w:id="2299"/>
+    <w:bookmarkStart w:id="2303" w:name="what-we-build-first"/>
     <w:p>
       <w:pPr>
         <w:pStyle w:val="Heading1"/>
@@ -16727,7 +16727,7 @@
         <w:t xml:space="preserve">13 What we build first</w:t>
       </w:r>
     </w:p>
-    <w:bookmarkStart w:id="2152" w:name="order-of-building"/>
+    <w:bookmarkStart w:id="2300" w:name="order-of-building"/>
     <w:p>
       <w:pPr>
         <w:pStyle w:val="Heading2"/>
@@ -17005,8 +17005,8 @@
         <w:t xml:space="preserve">apply once chat apps ship.</w:t>
       </w:r>
     </w:p>
-    <w:bookmarkEnd w:id="2152"/>
-    <w:bookmarkStart w:id="2153" w:name="seven-key-screens-to-sketch-first"/>
+    <w:bookmarkEnd w:id="2300"/>
+    <w:bookmarkStart w:id="2301" w:name="seven-key-screens-to-sketch-first"/>
     <w:p>
       <w:pPr>
         <w:pStyle w:val="Heading2"/>
@@ -17141,8 +17141,8 @@
         <w:t xml:space="preserve">act on an alert (Start, Done, Need Help, Accept) in one tap, without opening the full app.</w:t>
       </w:r>
     </w:p>
-    <w:bookmarkEnd w:id="2153"/>
-    <w:bookmarkStart w:id="2154" w:name="how-well-know-the-pilot-worked"/>
+    <w:bookmarkEnd w:id="2301"/>
+    <w:bookmarkStart w:id="2302" w:name="how-well-know-the-pilot-worked"/>
     <w:p>
       <w:pPr>
         <w:pStyle w:val="Heading2"/>
@@ -17277,9 +17277,9 @@
         <w:t xml:space="preserve">these targets are new in v1.1 and need a yes before the pilot. We’ll measure them by tracking when Add Work starts and finishes, which buttons people use and where, when alerts are sent and acted on, and how many people use the app each day in each role.</w:t>
       </w:r>
     </w:p>
-    <w:bookmarkEnd w:id="2154"/>
-    <w:bookmarkEnd w:id="2155"/>
-    <w:bookmarkStart w:id="2158" w:name="default-settings-and-launch-tests"/>
+    <w:bookmarkEnd w:id="2302"/>
+    <w:bookmarkEnd w:id="2303"/>
+    <w:bookmarkStart w:id="2306" w:name="default-settings-and-launch-tests"/>
     <w:p>
       <w:pPr>
         <w:pStyle w:val="Heading1"/>
@@ -17288,7 +17288,7 @@
         <w:t xml:space="preserve">14 Default settings and launch tests</w:t>
       </w:r>
     </w:p>
-    <w:bookmarkStart w:id="2156" w:name="default-settings-and-open-decisions"/>
+    <w:bookmarkStart w:id="2304" w:name="default-settings-and-open-decisions"/>
     <w:p>
       <w:pPr>
         <w:pStyle w:val="Heading2"/>
@@ -19050,8 +19050,8 @@
         <w:t xml:space="preserve">The system should be thorough enough to get owners, time and history right, while the employee’s screen stays as simple as possible. Complexity belongs in the system, not on the screen.</w:t>
       </w:r>
     </w:p>
-    <w:bookmarkEnd w:id="2156"/>
-    <w:bookmarkStart w:id="2157" w:name="launch-tests"/>
+    <w:bookmarkEnd w:id="2304"/>
+    <w:bookmarkStart w:id="2305" w:name="launch-tests"/>
     <w:p>
       <w:pPr>
         <w:pStyle w:val="Heading2"/>
@@ -20142,9 +20142,9 @@
         </w:tc>
       </w:tr>
     </w:tbl>
-    <w:bookmarkEnd w:id="2157"/>
-    <w:bookmarkEnd w:id="2158"/>
-    <w:bookmarkStart w:id="2165" w:name="sign-in-access-and-data"/>
+    <w:bookmarkEnd w:id="2305"/>
+    <w:bookmarkEnd w:id="2306"/>
+    <w:bookmarkStart w:id="2313" w:name="sign-in-access-and-data"/>
     <w:p>
       <w:pPr>
         <w:pStyle w:val="Heading1"/>
@@ -20171,7 +20171,7 @@
         <w:t xml:space="preserve">this section is new in v1.1 and needs a yes.</w:t>
       </w:r>
     </w:p>
-    <w:bookmarkStart w:id="2162" w:name="sign-in-and-joining-a-company"/>
+    <w:bookmarkStart w:id="2310" w:name="sign-in-and-joining-a-company"/>
     <w:p>
       <w:pPr>
         <w:pStyle w:val="Heading2"/>
@@ -20249,18 +20249,18 @@
           <wp:inline>
             <wp:extent cx="4233672" cy="7768662"/>
             <wp:effectExtent b="0" l="0" r="0" t="0"/>
-            <wp:docPr descr="Diagram" title="" id="2160" name="Picture"/>
+            <wp:docPr descr="Diagram" title="" id="2308" name="Picture"/>
             <a:graphic>
               <a:graphicData uri="http://schemas.openxmlformats.org/drawingml/2006/picture">
                 <pic:pic>
                   <pic:nvPicPr>
-                    <pic:cNvPr descr="media/media/rId2011.png" id="2161" name="Picture"/>
+                    <pic:cNvPr descr="media/media/rId2159.png" id="2309" name="Picture"/>
                     <pic:cNvPicPr>
                       <a:picLocks noChangeArrowheads="1" noChangeAspect="1"/>
                     </pic:cNvPicPr>
                   </pic:nvPicPr>
                   <pic:blipFill>
-                    <a:blip r:embed="rId2159"/>
+                    <a:blip r:embed="rId2307"/>
                     <a:stretch>
                       <a:fillRect/>
                     </a:stretch>
@@ -20295,8 +20295,8 @@
         <w:t xml:space="preserve">Figure 17. Signing in and joining a company.</w:t>
       </w:r>
     </w:p>
-    <w:bookmarkEnd w:id="2162"/>
-    <w:bookmarkStart w:id="2163" w:name="setting-up-a-company-proposed"/>
+    <w:bookmarkEnd w:id="2310"/>
+    <w:bookmarkStart w:id="2311" w:name="setting-up-a-company-proposed"/>
     <w:p>
       <w:pPr>
         <w:pStyle w:val="Heading2"/>
@@ -20528,8 +20528,8 @@
         <w:t xml:space="preserve">on Needs you.</w:t>
       </w:r>
     </w:p>
-    <w:bookmarkEnd w:id="2163"/>
-    <w:bookmarkStart w:id="2164" w:name="looking-after-data"/>
+    <w:bookmarkEnd w:id="2311"/>
+    <w:bookmarkStart w:id="2312" w:name="looking-after-data"/>
     <w:p>
       <w:pPr>
         <w:pStyle w:val="Heading2"/>
@@ -20586,9 +20586,9 @@
         <w:t xml:space="preserve">Where the data is stored, and any promises about which country it stays in, are decided before the first paying customer.</w:t>
       </w:r>
     </w:p>
-    <w:bookmarkEnd w:id="2164"/>
-    <w:bookmarkEnd w:id="2165"/>
-    <w:bookmarkStart w:id="2166" w:name="change-log"/>
+    <w:bookmarkEnd w:id="2312"/>
+    <w:bookmarkEnd w:id="2313"/>
+    <w:bookmarkStart w:id="2314" w:name="change-log"/>
     <w:p>
       <w:pPr>
         <w:pStyle w:val="Heading1"/>
@@ -20798,7 +20798,7 @@
         </w:numPr>
       </w:pPr>
       <w:r>
-        <w:t xml:space="preserve">After the third lead-flow review (Proposed): the lock check lets the lead move an overloaded person’s work in place; the weekly plan keeps one list of the week’s changes; Handover receivers are picked per item with the load after the move; a postponed request gets a return date (20 October).</w:t>
+        <w:t xml:space="preserve">After the fourth lead-flow review (Proposed): the locked plan counts waiting leave and open handovers, so every screen shows week 43 as it will really look; work can still be moved after locking and is recorded as a change (21 October).</w:t>
       </w:r>
     </w:p>
     <w:p>
@@ -20810,7 +20810,7 @@
         </w:numPr>
       </w:pPr>
       <w:r>
-        <w:t xml:space="preserve">After the second lead-flow review (Proposed): every place that moves work to someone shows how busy they would be after the move and suggests whoever has the most room; a request that looks like an open Task starts on Merge; a handover can be undone for 10 minutes (20 October).</w:t>
+        <w:t xml:space="preserve">After the third lead-flow review (Proposed): the lock check lets the lead move an overloaded person’s work in place; the weekly plan keeps one list of the week’s changes; Handover receivers are picked per item with the load after the move; a postponed request gets a return date (20 October).</w:t>
       </w:r>
     </w:p>
     <w:p>
@@ -20822,7 +20822,7 @@
         </w:numPr>
       </w:pPr>
       <w:r>
-        <w:t xml:space="preserve">Mascot renamed from Hop to Punh Punh (14 October).</w:t>
+        <w:t xml:space="preserve">After the second lead-flow review (Proposed): every place that moves work to someone shows how busy they would be after the move and suggests whoever has the most room; a request that looks like an open Task starts on Merge; a handover can be undone for 10 minutes (20 October).</w:t>
       </w:r>
     </w:p>
     <w:p>
@@ -20834,7 +20834,7 @@
         </w:numPr>
       </w:pPr>
       <w:r>
-        <w:t xml:space="preserve">App icon chosen: Punh Checklist, with usage rules in §11 (15 October).</w:t>
+        <w:t xml:space="preserve">Mascot renamed from Hop to Punh Punh (14 October).</w:t>
       </w:r>
     </w:p>
     <w:p>
@@ -20846,28 +20846,7 @@
         </w:numPr>
       </w:pPr>
       <w:r>
-        <w:t xml:space="preserve">First version split into</w:t>
-      </w:r>
-      <w:r>
-        <w:t xml:space="preserve"> </w:t>
-      </w:r>
-      <w:r>
-        <w:t xml:space="preserve">“pilot core”</w:t>
-      </w:r>
-      <w:r>
-        <w:t xml:space="preserve"> </w:t>
-      </w:r>
-      <w:r>
-        <w:t xml:space="preserve">and</w:t>
-      </w:r>
-      <w:r>
-        <w:t xml:space="preserve"> </w:t>
-      </w:r>
-      <w:r>
-        <w:t xml:space="preserve">“soon after”</w:t>
-      </w:r>
-      <w:r>
-        <w:t xml:space="preserve">; later-stage features (Workload view for future weeks, temporary Handover, suggested risk flags) marked in the flows and special cases.</w:t>
+        <w:t xml:space="preserve">App icon chosen: Punh Checklist, with usage rules in §11 (15 October).</w:t>
       </w:r>
     </w:p>
     <w:p>
@@ -20879,7 +20858,28 @@
         </w:numPr>
       </w:pPr>
       <w:r>
-        <w:t xml:space="preserve">Rules for statuses, Confidential Task access, review and blocked markers, giving rights to named people, work schedules, time split across departments, task sizes, time zones, sorting and postponing requests.</w:t>
+        <w:t xml:space="preserve">First version split into</w:t>
+      </w:r>
+      <w:r>
+        <w:t xml:space="preserve"> </w:t>
+      </w:r>
+      <w:r>
+        <w:t xml:space="preserve">“pilot core”</w:t>
+      </w:r>
+      <w:r>
+        <w:t xml:space="preserve"> </w:t>
+      </w:r>
+      <w:r>
+        <w:t xml:space="preserve">and</w:t>
+      </w:r>
+      <w:r>
+        <w:t xml:space="preserve"> </w:t>
+      </w:r>
+      <w:r>
+        <w:t xml:space="preserve">“soon after”</w:t>
+      </w:r>
+      <w:r>
+        <w:t xml:space="preserve">; later-stage features (Workload view for future weeks, temporary Handover, suggested risk flags) marked in the flows and special cases.</w:t>
       </w:r>
     </w:p>
     <w:p>
@@ -20891,7 +20891,7 @@
         </w:numPr>
       </w:pPr>
       <w:r>
-        <w:t xml:space="preserve">Rules for carrying work over, weeks never locked, clearing flags, who gets urgent alerts next, snooze, people in several companies, handover receivers and overlapping time off.</w:t>
+        <w:t xml:space="preserve">Rules for statuses, Confidential Task access, review and blocked markers, giving rights to named people, work schedules, time split across departments, task sizes, time zones, sorting and postponing requests.</w:t>
       </w:r>
     </w:p>
     <w:p>
@@ -20903,7 +20903,7 @@
         </w:numPr>
       </w:pPr>
       <w:r>
-        <w:t xml:space="preserve">Measures, time words and pilot targets written out.</w:t>
+        <w:t xml:space="preserve">Rules for carrying work over, weeks never locked, clearing flags, who gets urgent alerts next, snooze, people in several companies, handover receivers and overlapping time off.</w:t>
       </w:r>
     </w:p>
     <w:p>
@@ -20915,7 +20915,7 @@
         </w:numPr>
       </w:pPr>
       <w:r>
-        <w:t xml:space="preserve">The streak no longer counts just starting work.</w:t>
+        <w:t xml:space="preserve">Measures, time words and pilot targets written out.</w:t>
       </w:r>
     </w:p>
     <w:p>
@@ -20927,7 +20927,7 @@
         </w:numPr>
       </w:pPr>
       <w:r>
-        <w:t xml:space="preserve">Special cases grouped by topic; all default numbers kept in §14; the life of a Task moved before planning.</w:t>
+        <w:t xml:space="preserve">The streak no longer counts just starting work.</w:t>
       </w:r>
     </w:p>
     <w:p>
@@ -20939,7 +20939,7 @@
         </w:numPr>
       </w:pPr>
       <w:r>
-        <w:t xml:space="preserve">New §15 Sign-in, access and data.</w:t>
+        <w:t xml:space="preserve">Special cases grouped by topic; all default numbers kept in §14; the life of a Task moved before planning.</w:t>
       </w:r>
     </w:p>
     <w:p>
@@ -20951,19 +20951,7 @@
         </w:numPr>
       </w:pPr>
       <w:r>
-        <w:t xml:space="preserve">Words on screen: Add Work (employees), Incoming Queue and Sort (leads);</w:t>
-      </w:r>
-      <w:r>
-        <w:t xml:space="preserve"> </w:t>
-      </w:r>
-      <w:r>
-        <w:t xml:space="preserve">“intake”</w:t>
-      </w:r>
-      <w:r>
-        <w:t xml:space="preserve"> </w:t>
-      </w:r>
-      <w:r>
-        <w:t xml:space="preserve">only in reports.</w:t>
+        <w:t xml:space="preserve">New §15 Sign-in, access and data.</w:t>
       </w:r>
     </w:p>
     <w:p>
@@ -20975,19 +20963,19 @@
         </w:numPr>
       </w:pPr>
       <w:r>
-        <w:t xml:space="preserve">The blueprint now covers business and design rules only. The data model and engineering rules moved to</w:t>
+        <w:t xml:space="preserve">Words on screen: Add Work (employees), Incoming Queue and Sort (leads);</w:t>
       </w:r>
       <w:r>
         <w:t xml:space="preserve"> </w:t>
       </w:r>
       <w:r>
-        <w:rPr>
-          <w:rStyle w:val="VerbatimChar"/>
-        </w:rPr>
-        <w:t xml:space="preserve">HopFlows_Technical_Design_v1.1.md</w:t>
-      </w:r>
-      <w:r>
-        <w:t xml:space="preserve">.</w:t>
+        <w:t xml:space="preserve">“intake”</w:t>
+      </w:r>
+      <w:r>
+        <w:t xml:space="preserve"> </w:t>
+      </w:r>
+      <w:r>
+        <w:t xml:space="preserve">only in reports.</w:t>
       </w:r>
     </w:p>
     <w:p>
@@ -20999,7 +20987,19 @@
         </w:numPr>
       </w:pPr>
       <w:r>
-        <w:t xml:space="preserve">Gap fixes (Proposed): updates to request senders, weekly summary for leaders, four standard reports with downloads, week status, leave requests and approval, repeating daily work (moved from a later stage into the first version), working offline and search.</w:t>
+        <w:t xml:space="preserve">The blueprint now covers business and design rules only. The data model and engineering rules moved to</w:t>
+      </w:r>
+      <w:r>
+        <w:t xml:space="preserve"> </w:t>
+      </w:r>
+      <w:r>
+        <w:rPr>
+          <w:rStyle w:val="VerbatimChar"/>
+        </w:rPr>
+        <w:t xml:space="preserve">HopFlows_Technical_Design_v1.1.md</w:t>
+      </w:r>
+      <w:r>
+        <w:t xml:space="preserve">.</w:t>
       </w:r>
     </w:p>
     <w:p>
@@ -21011,7 +21011,7 @@
         </w:numPr>
       </w:pPr>
       <w:r>
-        <w:t xml:space="preserve">List, Board and Table views added for full work lists (Proposed).</w:t>
+        <w:t xml:space="preserve">Gap fixes (Proposed): updates to request senders, weekly summary for leaders, four standard reports with downloads, week status, leave requests and approval, repeating daily work (moved from a later stage into the first version), working offline and search.</w:t>
       </w:r>
     </w:p>
     <w:p>
@@ -21023,7 +21023,7 @@
         </w:numPr>
       </w:pPr>
       <w:r>
-        <w:t xml:space="preserve">Flow diagrams added: the life of a Task, a map of who starts which flow, Flows A–J, Board dragging, working offline, and signing in.</w:t>
+        <w:t xml:space="preserve">List, Board and Table views added for full work lists (Proposed).</w:t>
       </w:r>
     </w:p>
     <w:p>
@@ -21035,6 +21035,18 @@
         </w:numPr>
       </w:pPr>
       <w:r>
+        <w:t xml:space="preserve">Flow diagrams added: the life of a Task, a map of who starts which flow, Flows A–J, Board dragging, working offline, and signing in.</w:t>
+      </w:r>
+    </w:p>
+    <w:p>
+      <w:pPr>
+        <w:pStyle w:val="Compact"/>
+        <w:numPr>
+          <w:ilvl w:val="0"/>
+          <w:numId w:val="1044"/>
+        </w:numPr>
+      </w:pPr>
+      <w:r>
         <w:t xml:space="preserve">Rewritten in simple, everyday language. Words changed:</w:t>
       </w:r>
       <w:r>
@@ -21147,7 +21159,7 @@
         <w:t xml:space="preserve">HopFlows / End of Blueprint</w:t>
       </w:r>
     </w:p>
-    <w:bookmarkEnd w:id="2166"/>
+    <w:bookmarkEnd w:id="2314"/>
     <w:sectPr>
       <w:headerReference r:id="rId9" w:type="default"/>
       <w:footerReference r:id="rId10" w:type="default"/>
@@ -37426,6 +37438,232 @@
     <w:basedOn w:val="VerbatimChar"/>
     <w:rPr/>
   </w:style>
+  <w:style w:customStyle="1" w:styleId="KeywordTok" w:type="character">
+    <w:name w:val="KeywordTok"/>
+    <w:basedOn w:val="VerbatimChar"/>
+    <w:rPr>
+      <w:b/>
+      <w:color w:val="007020"/>
+    </w:rPr>
+  </w:style>
+  <w:style w:customStyle="1" w:styleId="DataTypeTok" w:type="character">
+    <w:name w:val="DataTypeTok"/>
+    <w:basedOn w:val="VerbatimChar"/>
+    <w:rPr>
+      <w:color w:val="902000"/>
+    </w:rPr>
+  </w:style>
+  <w:style w:customStyle="1" w:styleId="DecValTok" w:type="character">
+    <w:name w:val="DecValTok"/>
+    <w:basedOn w:val="VerbatimChar"/>
+    <w:rPr>
+      <w:color w:val="40a070"/>
+    </w:rPr>
+  </w:style>
+  <w:style w:customStyle="1" w:styleId="BaseNTok" w:type="character">
+    <w:name w:val="BaseNTok"/>
+    <w:basedOn w:val="VerbatimChar"/>
+    <w:rPr>
+      <w:color w:val="40a070"/>
+    </w:rPr>
+  </w:style>
+  <w:style w:customStyle="1" w:styleId="FloatTok" w:type="character">
+    <w:name w:val="FloatTok"/>
+    <w:basedOn w:val="VerbatimChar"/>
+    <w:rPr>
+      <w:color w:val="40a070"/>
+    </w:rPr>
+  </w:style>
+  <w:style w:customStyle="1" w:styleId="ConstantTok" w:type="character">
+    <w:name w:val="ConstantTok"/>
+    <w:basedOn w:val="VerbatimChar"/>
+    <w:rPr>
+      <w:color w:val="880000"/>
+    </w:rPr>
+  </w:style>
+  <w:style w:customStyle="1" w:styleId="CharTok" w:type="character">
+    <w:name w:val="CharTok"/>
+    <w:basedOn w:val="VerbatimChar"/>
+    <w:rPr>
+      <w:color w:val="4070a0"/>
+    </w:rPr>
+  </w:style>
+  <w:style w:customStyle="1" w:styleId="SpecialCharTok" w:type="character">
+    <w:name w:val="SpecialCharTok"/>
+    <w:basedOn w:val="VerbatimChar"/>
+    <w:rPr>
+      <w:color w:val="4070a0"/>
+    </w:rPr>
+  </w:style>
+  <w:style w:customStyle="1" w:styleId="StringTok" w:type="character">
+    <w:name w:val="StringTok"/>
+    <w:basedOn w:val="VerbatimChar"/>
+    <w:rPr>
+      <w:color w:val="4070a0"/>
+    </w:rPr>
+  </w:style>
+  <w:style w:customStyle="1" w:styleId="VerbatimStringTok" w:type="character">
+    <w:name w:val="VerbatimStringTok"/>
+    <w:basedOn w:val="VerbatimChar"/>
+    <w:rPr>
+      <w:color w:val="4070a0"/>
+    </w:rPr>
+  </w:style>
+  <w:style w:customStyle="1" w:styleId="SpecialStringTok" w:type="character">
+    <w:name w:val="SpecialStringTok"/>
+    <w:basedOn w:val="VerbatimChar"/>
+    <w:rPr>
+      <w:color w:val="bb6688"/>
+    </w:rPr>
+  </w:style>
+  <w:style w:customStyle="1" w:styleId="ImportTok" w:type="character">
+    <w:name w:val="ImportTok"/>
+    <w:basedOn w:val="VerbatimChar"/>
+    <w:rPr>
+      <w:b/>
+      <w:color w:val="008000"/>
+    </w:rPr>
+  </w:style>
+  <w:style w:customStyle="1" w:styleId="CommentTok" w:type="character">
+    <w:name w:val="CommentTok"/>
+    <w:basedOn w:val="VerbatimChar"/>
+    <w:rPr>
+      <w:i/>
+      <w:color w:val="60a0b0"/>
+    </w:rPr>
+  </w:style>
+  <w:style w:customStyle="1" w:styleId="DocumentationTok" w:type="character">
+    <w:name w:val="DocumentationTok"/>
+    <w:basedOn w:val="VerbatimChar"/>
+    <w:rPr>
+      <w:i/>
+      <w:color w:val="ba2121"/>
+    </w:rPr>
+  </w:style>
+  <w:style w:customStyle="1" w:styleId="AnnotationTok" w:type="character">
+    <w:name w:val="AnnotationTok"/>
+    <w:basedOn w:val="VerbatimChar"/>
+    <w:rPr>
+      <w:b/>
+      <w:i/>
+      <w:color w:val="60a0b0"/>
+    </w:rPr>
+  </w:style>
+  <w:style w:customStyle="1" w:styleId="CommentVarTok" w:type="character">
+    <w:name w:val="CommentVarTok"/>
+    <w:basedOn w:val="VerbatimChar"/>
+    <w:rPr>
+      <w:b/>
+      <w:i/>
+      <w:color w:val="60a0b0"/>
+    </w:rPr>
+  </w:style>
+  <w:style w:customStyle="1" w:styleId="OtherTok" w:type="character">
+    <w:name w:val="OtherTok"/>
+    <w:basedOn w:val="VerbatimChar"/>
+    <w:rPr>
+      <w:color w:val="007020"/>
+    </w:rPr>
+  </w:style>
+  <w:style w:customStyle="1" w:styleId="FunctionTok" w:type="character">
+    <w:name w:val="FunctionTok"/>
+    <w:basedOn w:val="VerbatimChar"/>
+    <w:rPr>
+      <w:color w:val="06287e"/>
+    </w:rPr>
+  </w:style>
+  <w:style w:customStyle="1" w:styleId="VariableTok" w:type="character">
+    <w:name w:val="VariableTok"/>
+    <w:basedOn w:val="VerbatimChar"/>
+    <w:rPr>
+      <w:color w:val="19177c"/>
+    </w:rPr>
+  </w:style>
+  <w:style w:customStyle="1" w:styleId="ControlFlowTok" w:type="character">
+    <w:name w:val="ControlFlowTok"/>
+    <w:basedOn w:val="VerbatimChar"/>
+    <w:rPr>
+      <w:b/>
+      <w:color w:val="007020"/>
+    </w:rPr>
+  </w:style>
+  <w:style w:customStyle="1" w:styleId="OperatorTok" w:type="character">
+    <w:name w:val="OperatorTok"/>
+    <w:basedOn w:val="VerbatimChar"/>
+    <w:rPr>
+      <w:color w:val="666666"/>
+    </w:rPr>
+  </w:style>
+  <w:style w:customStyle="1" w:styleId="BuiltInTok" w:type="character">
+    <w:name w:val="BuiltInTok"/>
+    <w:basedOn w:val="VerbatimChar"/>
+    <w:rPr>
+      <w:color w:val="008000"/>
+    </w:rPr>
+  </w:style>
+  <w:style w:customStyle="1" w:styleId="ExtensionTok" w:type="character">
+    <w:name w:val="ExtensionTok"/>
+    <w:basedOn w:val="VerbatimChar"/>
+    <w:rPr/>
+  </w:style>
+  <w:style w:customStyle="1" w:styleId="PreprocessorTok" w:type="character">
+    <w:name w:val="PreprocessorTok"/>
+    <w:basedOn w:val="VerbatimChar"/>
+    <w:rPr>
+      <w:color w:val="bc7a00"/>
+    </w:rPr>
+  </w:style>
+  <w:style w:customStyle="1" w:styleId="AttributeTok" w:type="character">
+    <w:name w:val="AttributeTok"/>
+    <w:basedOn w:val="VerbatimChar"/>
+    <w:rPr>
+      <w:color w:val="7d9029"/>
+    </w:rPr>
+  </w:style>
+  <w:style w:customStyle="1" w:styleId="RegionMarkerTok" w:type="character">
+    <w:name w:val="RegionMarkerTok"/>
+    <w:basedOn w:val="VerbatimChar"/>
+    <w:rPr/>
+  </w:style>
+  <w:style w:customStyle="1" w:styleId="InformationTok" w:type="character">
+    <w:name w:val="InformationTok"/>
+    <w:basedOn w:val="VerbatimChar"/>
+    <w:rPr>
+      <w:b/>
+      <w:i/>
+      <w:color w:val="60a0b0"/>
+    </w:rPr>
+  </w:style>
+  <w:style w:customStyle="1" w:styleId="WarningTok" w:type="character">
+    <w:name w:val="WarningTok"/>
+    <w:basedOn w:val="VerbatimChar"/>
+    <w:rPr>
+      <w:b/>
+      <w:i/>
+      <w:color w:val="60a0b0"/>
+    </w:rPr>
+  </w:style>
+  <w:style w:customStyle="1" w:styleId="AlertTok" w:type="character">
+    <w:name w:val="AlertTok"/>
+    <w:basedOn w:val="VerbatimChar"/>
+    <w:rPr>
+      <w:b/>
+      <w:color w:val="ff0000"/>
+    </w:rPr>
+  </w:style>
+  <w:style w:customStyle="1" w:styleId="ErrorTok" w:type="character">
+    <w:name w:val="ErrorTok"/>
+    <w:basedOn w:val="VerbatimChar"/>
+    <w:rPr>
+      <w:b/>
+      <w:color w:val="ff0000"/>
+    </w:rPr>
+  </w:style>
+  <w:style w:customStyle="1" w:styleId="NormalTok" w:type="character">
+    <w:name w:val="NormalTok"/>
+    <w:basedOn w:val="VerbatimChar"/>
+    <w:rPr/>
+  </w:style>
   <w:style w:type="character" w:customStyle="1" w:styleId="KeywordTok">
     <w:name w:val="KeywordTok"/>
     <w:basedOn w:val="VerbatimChar"/>

</xml_diff>

<commit_message>
Move focus after key actions, one way of writing hours, handover fixes
- Leave sheet, lock check, Vannak move and handover steps move
  keyboard focus to what just appeared, and Cancel, Not yet and Undo
  return it to the button that started the action; the lock check is
  a modal alertdialog; the leave sheet heading is now an h2
- Hours are always "planned of time to plan", with available time
  added only to explain Too much
- Handover's Data sync weekly goes to Chenda (most room), so 7 items
  move to Pisey and Chenda; Dara has 22h of 12h until her leave is
  decided and 12h of 12h after
- Handover can put an item back in Ready to plan with "No owner"
- LEAD_DATA.md and blueprint updated
- Sync docs/design with canvas version 56 (1792522891-67b7)

Co-Authored-By: Claude Opus 5.5 <noreply@anthropic.com>
</commit_message>
<xml_diff>
--- a/docs/HopFlows_Product_Blueprint_v1.1.docx
+++ b/docs/HopFlows_Product_Blueprint_v1.1.docx
@@ -2,7 +2,7 @@
 <file path=word/document.xml><?xml version="1.0" encoding="utf-8"?>
 <w:document xmlns:w="http://schemas.openxmlformats.org/wordprocessingml/2006/main" xmlns:m="http://schemas.openxmlformats.org/officeDocument/2006/math" xmlns:r="http://schemas.openxmlformats.org/officeDocument/2006/relationships" xmlns:o="urn:schemas-microsoft-com:office:office" xmlns:v="urn:schemas-microsoft-com:vml" xmlns:w10="urn:schemas-microsoft-com:office:word" xmlns:a="http://schemas.openxmlformats.org/drawingml/2006/main" xmlns:pic="http://schemas.openxmlformats.org/drawingml/2006/picture" xmlns:wp="http://schemas.openxmlformats.org/drawingml/2006/wordprocessingDrawing">
   <w:body>
-    <w:bookmarkStart w:id="2171" w:name="hopflows-product-blueprint"/>
+    <w:bookmarkStart w:id="2319" w:name="hopflows-product-blueprint"/>
     <w:p>
       <w:pPr>
         <w:pStyle w:val="Heading1"/>
@@ -127,7 +127,7 @@
         <w:t xml:space="preserve">For the people who plan the product, design it, build it and roll it out.</w:t>
       </w:r>
     </w:p>
-    <w:bookmarkStart w:id="2168" w:name="about-this-blueprint"/>
+    <w:bookmarkStart w:id="2316" w:name="about-this-blueprint"/>
     <w:p>
       <w:pPr>
         <w:pStyle w:val="Heading2"/>
@@ -375,8 +375,8 @@
         <w:t xml:space="preserve">are new in v1.1 and still need a yes or no. The change log at the end lists what changed.</w:t>
       </w:r>
     </w:p>
-    <w:bookmarkEnd w:id="2168"/>
-    <w:bookmarkStart w:id="2169" w:name="the-big-idea"/>
+    <w:bookmarkEnd w:id="2316"/>
+    <w:bookmarkStart w:id="2317" w:name="the-big-idea"/>
     <w:p>
       <w:pPr>
         <w:pStyle w:val="Heading2"/>
@@ -405,8 +405,8 @@
         <w:t xml:space="preserve">Leaders care about results. Team leads care about getting work done and how busy their team is. Employees care about what to do next. Planned work and surprise work both count, without extra paperwork.</w:t>
       </w:r>
     </w:p>
-    <w:bookmarkEnd w:id="2169"/>
-    <w:bookmarkStart w:id="2170" w:name="decisions-already-made"/>
+    <w:bookmarkEnd w:id="2317"/>
+    <w:bookmarkStart w:id="2318" w:name="decisions-already-made"/>
     <w:p>
       <w:pPr>
         <w:pStyle w:val="Heading2"/>
@@ -628,9 +628,9 @@
         <w:t xml:space="preserve">The app keeps working when the internet is weak: people can add and update work offline, and they can find anything with one search. (Proposed)</w:t>
       </w:r>
     </w:p>
-    <w:bookmarkEnd w:id="2170"/>
-    <w:bookmarkEnd w:id="2171"/>
-    <w:bookmarkStart w:id="2175" w:name="summary"/>
+    <w:bookmarkEnd w:id="2318"/>
+    <w:bookmarkEnd w:id="2319"/>
+    <w:bookmarkStart w:id="2323" w:name="summary"/>
     <w:p>
       <w:pPr>
         <w:pStyle w:val="Heading1"/>
@@ -639,7 +639,7 @@
         <w:t xml:space="preserve">01 Summary</w:t>
       </w:r>
     </w:p>
-    <w:bookmarkStart w:id="2172" w:name="the-problem"/>
+    <w:bookmarkStart w:id="2320" w:name="the-problem"/>
     <w:p>
       <w:pPr>
         <w:pStyle w:val="Heading2"/>
@@ -656,8 +656,8 @@
         <w:t xml:space="preserve">Many teams don’t use task apps because the lists get too long, updating them feels like extra work, screens show too much, and work done outside the app never shows up in the plan. One complicated screen also can’t serve employees, team leads and bosses equally well.</w:t>
       </w:r>
     </w:p>
-    <w:bookmarkEnd w:id="2172"/>
-    <w:bookmarkStart w:id="2173" w:name="how-hopflows-answers-it"/>
+    <w:bookmarkEnd w:id="2320"/>
+    <w:bookmarkStart w:id="2321" w:name="how-hopflows-answers-it"/>
     <w:p>
       <w:pPr>
         <w:pStyle w:val="Heading2"/>
@@ -878,8 +878,8 @@
         </w:tc>
       </w:tr>
     </w:tbl>
-    <w:bookmarkEnd w:id="2173"/>
-    <w:bookmarkStart w:id="2174" w:name="in-one-sentence"/>
+    <w:bookmarkEnd w:id="2321"/>
+    <w:bookmarkStart w:id="2322" w:name="in-one-sentence"/>
     <w:p>
       <w:pPr>
         <w:pStyle w:val="Heading2"/>
@@ -908,9 +908,9 @@
         <w:t xml:space="preserve">A simple task app that makes work easy for employees, clear for managers and measurable for leaders, without making task tracking feel like another job.</w:t>
       </w:r>
     </w:p>
-    <w:bookmarkEnd w:id="2174"/>
-    <w:bookmarkEnd w:id="2175"/>
-    <w:bookmarkStart w:id="2178" w:name="how-the-pieces-fit-together"/>
+    <w:bookmarkEnd w:id="2322"/>
+    <w:bookmarkEnd w:id="2323"/>
+    <w:bookmarkStart w:id="2326" w:name="how-the-pieces-fit-together"/>
     <w:p>
       <w:pPr>
         <w:pStyle w:val="Heading1"/>
@@ -1081,7 +1081,7 @@
         <w:t xml:space="preserve">Figure 1. Three parts of a company linked to one system for work and reports.</w:t>
       </w:r>
     </w:p>
-    <w:bookmarkStart w:id="2176" w:name="linked-not-stacked"/>
+    <w:bookmarkStart w:id="2324" w:name="linked-not-stacked"/>
     <w:p>
       <w:pPr>
         <w:pStyle w:val="Heading2"/>
@@ -1098,8 +1098,8 @@
         <w:t xml:space="preserve">Don’t force everything into one tree. One Goal can help several products. One Deliverable can involve several departments. One person can be in several teams. HopFlows links these things instead of stacking them, and still keeps one clear owner for each Goal, Deliverable and active Task.</w:t>
       </w:r>
     </w:p>
-    <w:bookmarkEnd w:id="2176"/>
-    <w:bookmarkStart w:id="2177" w:name="Xd518698a0b64a922415221525837e1dabd77edc"/>
+    <w:bookmarkEnd w:id="2324"/>
+    <w:bookmarkStart w:id="2325" w:name="Xd518698a0b64a922415221525837e1dabd77edc"/>
     <w:p>
       <w:pPr>
         <w:pStyle w:val="Heading2"/>
@@ -1342,9 +1342,9 @@
         <w:t xml:space="preserve">that never end and fill up with unrelated work.</w:t>
       </w:r>
     </w:p>
-    <w:bookmarkEnd w:id="2177"/>
-    <w:bookmarkEnd w:id="2178"/>
-    <w:bookmarkStart w:id="2181" w:name="main-words-we-use"/>
+    <w:bookmarkEnd w:id="2325"/>
+    <w:bookmarkEnd w:id="2326"/>
+    <w:bookmarkStart w:id="2329" w:name="main-words-we-use"/>
     <w:p>
       <w:pPr>
         <w:pStyle w:val="Heading1"/>
@@ -1778,7 +1778,7 @@
         </w:tc>
       </w:tr>
     </w:tbl>
-    <w:bookmarkStart w:id="2179" w:name="words-on-screen"/>
+    <w:bookmarkStart w:id="2327" w:name="words-on-screen"/>
     <w:p>
       <w:pPr>
         <w:pStyle w:val="Heading2"/>
@@ -1962,8 +1962,8 @@
         <w:t xml:space="preserve">only for checking finished work.</w:t>
       </w:r>
     </w:p>
-    <w:bookmarkEnd w:id="2179"/>
-    <w:bookmarkStart w:id="2180" w:name="words-about-time"/>
+    <w:bookmarkEnd w:id="2327"/>
+    <w:bookmarkStart w:id="2328" w:name="words-about-time"/>
     <w:p>
       <w:pPr>
         <w:pStyle w:val="Heading2"/>
@@ -2244,9 +2244,9 @@
         </w:tc>
       </w:tr>
     </w:tbl>
-    <w:bookmarkEnd w:id="2180"/>
-    <w:bookmarkEnd w:id="2181"/>
-    <w:bookmarkStart w:id="2192" w:name="business-rules"/>
+    <w:bookmarkEnd w:id="2328"/>
+    <w:bookmarkEnd w:id="2329"/>
+    <w:bookmarkStart w:id="2340" w:name="business-rules"/>
     <w:p>
       <w:pPr>
         <w:pStyle w:val="Heading1"/>
@@ -2272,7 +2272,7 @@
         <w:t xml:space="preserve">) shows how they are built.</w:t>
       </w:r>
     </w:p>
-    <w:bookmarkStart w:id="2182" w:name="people-and-access"/>
+    <w:bookmarkStart w:id="2330" w:name="people-and-access"/>
     <w:p>
       <w:pPr>
         <w:pStyle w:val="Heading2"/>
@@ -2341,8 +2341,8 @@
         <w:t xml:space="preserve">People can look at other departments’ work, read-only (Proposed). Anyone in the company can open another department’s Goals, Deliverables and Tasks and see the title, owner, status, due date and the Blocked marker. From there they can only send a request or give kudos. Workload colours, time, reports, weekly plans and reviews stay inside the department, Confidential Tasks follow their own rules, and a Task for me that isn’t linked to a Deliverable is seen only inside its department. An admin can close a department’s work to people outside it (for example HR or Finance).</w:t>
       </w:r>
     </w:p>
-    <w:bookmarkEnd w:id="2182"/>
-    <w:bookmarkStart w:id="2183" w:name="work"/>
+    <w:bookmarkEnd w:id="2330"/>
+    <w:bookmarkStart w:id="2331" w:name="work"/>
     <w:p>
       <w:pPr>
         <w:pStyle w:val="Heading2"/>
@@ -2543,8 +2543,8 @@
         <w:t xml:space="preserve">Kudos: one per person, per teammate, per item. You can’t give kudos to yourself. Kudos are never ranked.</w:t>
       </w:r>
     </w:p>
-    <w:bookmarkEnd w:id="2183"/>
-    <w:bookmarkStart w:id="2184" w:name="new-requests"/>
+    <w:bookmarkEnd w:id="2331"/>
+    <w:bookmarkStart w:id="2332" w:name="new-requests"/>
     <w:p>
       <w:pPr>
         <w:pStyle w:val="Heading2"/>
@@ -2683,8 +2683,8 @@
         <w:t xml:space="preserve">.</w:t>
       </w:r>
     </w:p>
-    <w:bookmarkEnd w:id="2184"/>
-    <w:bookmarkStart w:id="2185" w:name="planning-and-time"/>
+    <w:bookmarkEnd w:id="2332"/>
+    <w:bookmarkStart w:id="2333" w:name="planning-and-time"/>
     <w:p>
       <w:pPr>
         <w:pStyle w:val="Heading2"/>
@@ -2837,8 +2837,8 @@
         <w:t xml:space="preserve">Repeating daily work reserves its time in each week, so the weekly plan and the Workload view include it before any project work is locked.</w:t>
       </w:r>
     </w:p>
-    <w:bookmarkEnd w:id="2185"/>
-    <w:bookmarkStart w:id="2186" w:name="leave-proposed"/>
+    <w:bookmarkEnd w:id="2333"/>
+    <w:bookmarkStart w:id="2334" w:name="leave-proposed"/>
     <w:p>
       <w:pPr>
         <w:pStyle w:val="Heading2"/>
@@ -2952,8 +2952,8 @@
         <w:t xml:space="preserve">HopFlows records leave only for planning. It doesn’t track how many leave days are left, or pay. That stays with the company’s HR process.</w:t>
       </w:r>
     </w:p>
-    <w:bookmarkEnd w:id="2186"/>
-    <w:bookmarkStart w:id="2187" w:name="repeating-daily-work-proposed"/>
+    <w:bookmarkEnd w:id="2334"/>
+    <w:bookmarkStart w:id="2335" w:name="repeating-daily-work-proposed"/>
     <w:p>
       <w:pPr>
         <w:pStyle w:val="Heading2"/>
@@ -3070,8 +3070,8 @@
         <w:t xml:space="preserve">Changing a routine changes only future days. Pausing a routine stops new days until it is turned back on.</w:t>
       </w:r>
     </w:p>
-    <w:bookmarkEnd w:id="2187"/>
-    <w:bookmarkStart w:id="2188" w:name="handover-and-risk"/>
+    <w:bookmarkEnd w:id="2335"/>
+    <w:bookmarkStart w:id="2336" w:name="handover-and-risk"/>
     <w:p>
       <w:pPr>
         <w:pStyle w:val="Heading2"/>
@@ -3140,8 +3140,8 @@
         <w:t xml:space="preserve">A flag can be cleared by the person who set it, the item’s owner, or leaders. A Goal owner can’t clear a flag set by leaders. When a Deliverable is accepted or cancelled, its flag closes. When a Deliverable moves to another Goal, its flag moves with it.</w:t>
       </w:r>
     </w:p>
-    <w:bookmarkEnd w:id="2188"/>
-    <w:bookmarkStart w:id="2189" w:name="calendar"/>
+    <w:bookmarkEnd w:id="2336"/>
+    <w:bookmarkStart w:id="2337" w:name="calendar"/>
     <w:p>
       <w:pPr>
         <w:pStyle w:val="Heading2"/>
@@ -3231,8 +3231,8 @@
         <w:t xml:space="preserve">Each person can set their own reminders for events.</w:t>
       </w:r>
     </w:p>
-    <w:bookmarkEnd w:id="2189"/>
-    <w:bookmarkStart w:id="2190" w:name="notifications"/>
+    <w:bookmarkEnd w:id="2337"/>
+    <w:bookmarkStart w:id="2338" w:name="notifications"/>
     <w:p>
       <w:pPr>
         <w:pStyle w:val="Heading2"/>
@@ -3349,8 +3349,8 @@
         <w:t xml:space="preserve">Messages are in English by default. When other languages are added, each company picks its default and each person can choose their own.</w:t>
       </w:r>
     </w:p>
-    <w:bookmarkEnd w:id="2190"/>
-    <w:bookmarkStart w:id="2191" w:name="reports-search-and-offline-proposed"/>
+    <w:bookmarkEnd w:id="2338"/>
+    <w:bookmarkStart w:id="2339" w:name="reports-search-and-offline-proposed"/>
     <w:p>
       <w:pPr>
         <w:pStyle w:val="Heading2"/>
@@ -3455,9 +3455,9 @@
         <w:t xml:space="preserve">rules, and is deleted when the person signs out or leaves the company.</w:t>
       </w:r>
     </w:p>
-    <w:bookmarkEnd w:id="2191"/>
-    <w:bookmarkEnd w:id="2192"/>
-    <w:bookmarkStart w:id="2194" w:name="how-things-connect"/>
+    <w:bookmarkEnd w:id="2339"/>
+    <w:bookmarkEnd w:id="2340"/>
+    <w:bookmarkStart w:id="2342" w:name="how-things-connect"/>
     <w:p>
       <w:pPr>
         <w:pStyle w:val="Heading1"/>
@@ -4474,7 +4474,7 @@
         </w:tc>
       </w:tr>
     </w:tbl>
-    <w:bookmarkStart w:id="2193" w:name="rules-that-never-change"/>
+    <w:bookmarkStart w:id="2341" w:name="rules-that-never-change"/>
     <w:p>
       <w:pPr>
         <w:pStyle w:val="Heading2"/>
@@ -4672,9 +4672,9 @@
         <w:t xml:space="preserve">A button pressed in a push alert or chat does the same thing as in the app, with the same permission check and history. Buttons work once and expire.</w:t>
       </w:r>
     </w:p>
-    <w:bookmarkEnd w:id="2193"/>
-    <w:bookmarkEnd w:id="2194"/>
-    <w:bookmarkStart w:id="2199" w:name="the-life-of-a-task"/>
+    <w:bookmarkEnd w:id="2341"/>
+    <w:bookmarkEnd w:id="2342"/>
+    <w:bookmarkStart w:id="2347" w:name="the-life-of-a-task"/>
     <w:p>
       <w:pPr>
         <w:pStyle w:val="Heading1"/>
@@ -4754,18 +4754,18 @@
           <wp:inline>
             <wp:extent cx="5486400" cy="4774556"/>
             <wp:effectExtent b="0" l="0" r="0" t="0"/>
-            <wp:docPr descr="Diagram" title="" id="2196" name="Picture"/>
+            <wp:docPr descr="Diagram" title="" id="2344" name="Picture"/>
             <a:graphic>
               <a:graphicData uri="http://schemas.openxmlformats.org/drawingml/2006/picture">
                 <pic:pic>
                   <pic:nvPicPr>
-                    <pic:cNvPr descr="media/media/rId2047.png" id="2197" name="Picture"/>
+                    <pic:cNvPr descr="media/media/rId2195.png" id="2345" name="Picture"/>
                     <pic:cNvPicPr>
                       <a:picLocks noChangeArrowheads="1" noChangeAspect="1"/>
                     </pic:cNvPicPr>
                   </pic:nvPicPr>
                   <pic:blipFill>
-                    <a:blip r:embed="rId2195"/>
+                    <a:blip r:embed="rId2343"/>
                     <a:stretch>
                       <a:fillRect/>
                     </a:stretch>
@@ -4800,7 +4800,7 @@
         <w:t xml:space="preserve">Figure 2. The life of a Task. Blocked and Need Help are markers on a Task, not steps. Missed is only for repeating daily work.</w:t>
       </w:r>
     </w:p>
-    <w:bookmarkStart w:id="2198" w:name="buttons-employees-use"/>
+    <w:bookmarkStart w:id="2346" w:name="buttons-employees-use"/>
     <w:p>
       <w:pPr>
         <w:pStyle w:val="Heading2"/>
@@ -5024,9 +5024,9 @@
         </w:tc>
       </w:tr>
     </w:tbl>
-    <w:bookmarkEnd w:id="2198"/>
-    <w:bookmarkEnd w:id="2199"/>
-    <w:bookmarkStart w:id="2205" w:name="planned-and-unplanned-work"/>
+    <w:bookmarkEnd w:id="2346"/>
+    <w:bookmarkEnd w:id="2347"/>
+    <w:bookmarkStart w:id="2353" w:name="planned-and-unplanned-work"/>
     <w:p>
       <w:pPr>
         <w:pStyle w:val="Heading1"/>
@@ -5153,7 +5153,7 @@
         <w:t xml:space="preserve">Figure 3. Two ways in, one way to do the work.</w:t>
       </w:r>
     </w:p>
-    <w:bookmarkStart w:id="2200" w:name="three-separate-labels"/>
+    <w:bookmarkStart w:id="2348" w:name="three-separate-labels"/>
     <w:p>
       <w:pPr>
         <w:pStyle w:val="Heading2"/>
@@ -5350,8 +5350,8 @@
         <w:t xml:space="preserve">depends on a particular week, so the same Task can be added in one week and planned in the next.</w:t>
       </w:r>
     </w:p>
-    <w:bookmarkEnd w:id="2200"/>
-    <w:bookmarkStart w:id="2204" w:name="the-locking-rule"/>
+    <w:bookmarkEnd w:id="2348"/>
+    <w:bookmarkStart w:id="2352" w:name="the-locking-rule"/>
     <w:p>
       <w:pPr>
         <w:pStyle w:val="Heading2"/>
@@ -5380,7 +5380,7 @@
         <w:t xml:space="preserve">When the lead locks a week, HopFlows saves a copy of the planned work, the estimates and the owners. The live plan can still change, but reports always compare what really happened with that saved copy.</w:t>
       </w:r>
     </w:p>
-    <w:bookmarkStart w:id="2201" w:name="example-something-urgent-arrives-midweek"/>
+    <w:bookmarkStart w:id="2349" w:name="example-something-urgent-arrives-midweek"/>
     <w:p>
       <w:pPr>
         <w:pStyle w:val="Heading3"/>
@@ -5445,8 +5445,8 @@
         <w:t xml:space="preserve">If the same request is planned into next week, it counts as planned there, and HopFlows still remembers it started as a surprise.</w:t>
       </w:r>
     </w:p>
-    <w:bookmarkEnd w:id="2201"/>
-    <w:bookmarkStart w:id="2202" w:name="X6546010788123f30940adaa831be091dcf8e07f"/>
+    <w:bookmarkEnd w:id="2349"/>
+    <w:bookmarkStart w:id="2350" w:name="X6546010788123f30940adaa831be091dcf8e07f"/>
     <w:p>
       <w:pPr>
         <w:pStyle w:val="Heading3"/>
@@ -5475,8 +5475,8 @@
         <w:t xml:space="preserve">and appear in the weekly review. The lead can remove them before locking the new week. If a week is never locked, there is no saved plan: all its work counts as unplanned, and the weekly review points out that the week wasn’t locked.</w:t>
       </w:r>
     </w:p>
-    <w:bookmarkEnd w:id="2202"/>
-    <w:bookmarkStart w:id="2203" w:name="repeating-daily-work-in-the-plan"/>
+    <w:bookmarkEnd w:id="2350"/>
+    <w:bookmarkStart w:id="2351" w:name="repeating-daily-work-in-the-plan"/>
     <w:p>
       <w:pPr>
         <w:pStyle w:val="Heading3"/>
@@ -5493,10 +5493,10 @@
         <w:t xml:space="preserve">When the lead locks a week, that week’s routines are included automatically, so the plan, the Workload view and the reports all include routine time. A routine created after the week is locked counts as added work.</w:t>
       </w:r>
     </w:p>
-    <w:bookmarkEnd w:id="2203"/>
-    <w:bookmarkEnd w:id="2204"/>
-    <w:bookmarkEnd w:id="2205"/>
-    <w:bookmarkStart w:id="2249" w:name="step-by-step-flows"/>
+    <w:bookmarkEnd w:id="2351"/>
+    <w:bookmarkEnd w:id="2352"/>
+    <w:bookmarkEnd w:id="2353"/>
+    <w:bookmarkStart w:id="2397" w:name="step-by-step-flows"/>
     <w:p>
       <w:pPr>
         <w:pStyle w:val="Heading1"/>
@@ -5522,18 +5522,18 @@
           <wp:inline>
             <wp:extent cx="1956816" cy="7760607"/>
             <wp:effectExtent b="0" l="0" r="0" t="0"/>
-            <wp:docPr descr="Diagram" title="" id="2207" name="Picture"/>
+            <wp:docPr descr="Diagram" title="" id="2355" name="Picture"/>
             <a:graphic>
               <a:graphicData uri="http://schemas.openxmlformats.org/drawingml/2006/picture">
                 <pic:pic>
                   <pic:nvPicPr>
-                    <pic:cNvPr descr="media/media/rId2058.png" id="2208" name="Picture"/>
+                    <pic:cNvPr descr="media/media/rId2206.png" id="2356" name="Picture"/>
                     <pic:cNvPicPr>
                       <a:picLocks noChangeArrowheads="1" noChangeAspect="1"/>
                     </pic:cNvPicPr>
                   </pic:nvPicPr>
                   <pic:blipFill>
-                    <a:blip r:embed="rId2206"/>
+                    <a:blip r:embed="rId2354"/>
                     <a:stretch>
                       <a:fillRect/>
                     </a:stretch>
@@ -5568,7 +5568,7 @@
         <w:t xml:space="preserve">Figure 4. Who starts which flow.</w:t>
       </w:r>
     </w:p>
-    <w:bookmarkStart w:id="2212" w:name="flow-a-planned-work"/>
+    <w:bookmarkStart w:id="2360" w:name="flow-a-planned-work"/>
     <w:p>
       <w:pPr>
         <w:pStyle w:val="Heading2"/>
@@ -5682,18 +5682,18 @@
           <wp:inline>
             <wp:extent cx="2953512" cy="7773283"/>
             <wp:effectExtent b="0" l="0" r="0" t="0"/>
-            <wp:docPr descr="Diagram" title="" id="2210" name="Picture"/>
+            <wp:docPr descr="Diagram" title="" id="2358" name="Picture"/>
             <a:graphic>
               <a:graphicData uri="http://schemas.openxmlformats.org/drawingml/2006/picture">
                 <pic:pic>
                   <pic:nvPicPr>
-                    <pic:cNvPr descr="media/media/rId2061.png" id="2211" name="Picture"/>
+                    <pic:cNvPr descr="media/media/rId2209.png" id="2359" name="Picture"/>
                     <pic:cNvPicPr>
                       <a:picLocks noChangeArrowheads="1" noChangeAspect="1"/>
                     </pic:cNvPicPr>
                   </pic:nvPicPr>
                   <pic:blipFill>
-                    <a:blip r:embed="rId2209"/>
+                    <a:blip r:embed="rId2357"/>
                     <a:stretch>
                       <a:fillRect/>
                     </a:stretch>
@@ -5728,8 +5728,8 @@
         <w:t xml:space="preserve">Figure 5. Flow A, planned work.</w:t>
       </w:r>
     </w:p>
-    <w:bookmarkEnd w:id="2212"/>
-    <w:bookmarkStart w:id="2216" w:name="flow-b-surprise-work"/>
+    <w:bookmarkEnd w:id="2360"/>
+    <w:bookmarkStart w:id="2364" w:name="flow-b-surprise-work"/>
     <w:p>
       <w:pPr>
         <w:pStyle w:val="Heading2"/>
@@ -5888,18 +5888,18 @@
           <wp:inline>
             <wp:extent cx="5074920" cy="7767734"/>
             <wp:effectExtent b="0" l="0" r="0" t="0"/>
-            <wp:docPr descr="Diagram" title="" id="2214" name="Picture"/>
+            <wp:docPr descr="Diagram" title="" id="2362" name="Picture"/>
             <a:graphic>
               <a:graphicData uri="http://schemas.openxmlformats.org/drawingml/2006/picture">
                 <pic:pic>
                   <pic:nvPicPr>
-                    <pic:cNvPr descr="media/media/rId2065.png" id="2215" name="Picture"/>
+                    <pic:cNvPr descr="media/media/rId2213.png" id="2363" name="Picture"/>
                     <pic:cNvPicPr>
                       <a:picLocks noChangeArrowheads="1" noChangeAspect="1"/>
                     </pic:cNvPicPr>
                   </pic:nvPicPr>
                   <pic:blipFill>
-                    <a:blip r:embed="rId2213"/>
+                    <a:blip r:embed="rId2361"/>
                     <a:stretch>
                       <a:fillRect/>
                     </a:stretch>
@@ -5934,8 +5934,8 @@
         <w:t xml:space="preserve">Figure 6. Flow B, surprise work.</w:t>
       </w:r>
     </w:p>
-    <w:bookmarkEnd w:id="2216"/>
-    <w:bookmarkStart w:id="2220" w:name="flow-c-weekly-review"/>
+    <w:bookmarkEnd w:id="2364"/>
+    <w:bookmarkStart w:id="2368" w:name="flow-c-weekly-review"/>
     <w:p>
       <w:pPr>
         <w:pStyle w:val="Heading2"/>
@@ -5961,18 +5961,18 @@
           <wp:inline>
             <wp:extent cx="3867912" cy="7769225"/>
             <wp:effectExtent b="0" l="0" r="0" t="0"/>
-            <wp:docPr descr="Diagram" title="" id="2218" name="Picture"/>
+            <wp:docPr descr="Diagram" title="" id="2366" name="Picture"/>
             <a:graphic>
               <a:graphicData uri="http://schemas.openxmlformats.org/drawingml/2006/picture">
                 <pic:pic>
                   <pic:nvPicPr>
-                    <pic:cNvPr descr="media/media/rId2069.png" id="2219" name="Picture"/>
+                    <pic:cNvPr descr="media/media/rId2217.png" id="2367" name="Picture"/>
                     <pic:cNvPicPr>
                       <a:picLocks noChangeArrowheads="1" noChangeAspect="1"/>
                     </pic:cNvPicPr>
                   </pic:nvPicPr>
                   <pic:blipFill>
-                    <a:blip r:embed="rId2217"/>
+                    <a:blip r:embed="rId2365"/>
                     <a:stretch>
                       <a:fillRect/>
                     </a:stretch>
@@ -6007,8 +6007,8 @@
         <w:t xml:space="preserve">Figure 7. Flow C, weekly review.</w:t>
       </w:r>
     </w:p>
-    <w:bookmarkEnd w:id="2220"/>
-    <w:bookmarkStart w:id="2224" w:name="flow-d-handover-leave-or-leaving"/>
+    <w:bookmarkEnd w:id="2368"/>
+    <w:bookmarkStart w:id="2372" w:name="flow-d-handover-leave-or-leaving"/>
     <w:p>
       <w:pPr>
         <w:pStyle w:val="Heading2"/>
@@ -6050,7 +6050,7 @@
         </w:numPr>
       </w:pPr>
       <w:r>
-        <w:t xml:space="preserve">The lead picks one person to receive everything, or a person for each item. For each item, HopFlows shows how busy each possible receiver would be after the move (this week only at first; future weeks once the Workload view covers them), suggests whoever has the most room, and warns if they would be too busy or are on leave when the work is due. The receiver must be another active team member.</w:t>
+        <w:t xml:space="preserve">The lead picks one person to receive everything, or a person for each item. Each item can also be left with no owner, which puts it back in Ready to plan so nobody has to take work they have no room for. For each item, HopFlows shows how busy each possible receiver would be after the move (this week only at first; future weeks once the Workload view covers them), suggests whoever has the most room, and warns if they would be too busy or are on leave when the work is due. The receiver must be another active team member.</w:t>
       </w:r>
     </w:p>
     <w:p>
@@ -6140,18 +6140,18 @@
           <wp:inline>
             <wp:extent cx="2852928" cy="7781389"/>
             <wp:effectExtent b="0" l="0" r="0" t="0"/>
-            <wp:docPr descr="Diagram" title="" id="2222" name="Picture"/>
+            <wp:docPr descr="Diagram" title="" id="2370" name="Picture"/>
             <a:graphic>
               <a:graphicData uri="http://schemas.openxmlformats.org/drawingml/2006/picture">
                 <pic:pic>
                   <pic:nvPicPr>
-                    <pic:cNvPr descr="media/media/rId2073.png" id="2223" name="Picture"/>
+                    <pic:cNvPr descr="media/media/rId2221.png" id="2371" name="Picture"/>
                     <pic:cNvPicPr>
                       <a:picLocks noChangeArrowheads="1" noChangeAspect="1"/>
                     </pic:cNvPicPr>
                   </pic:nvPicPr>
                   <pic:blipFill>
-                    <a:blip r:embed="rId2221"/>
+                    <a:blip r:embed="rId2369"/>
                     <a:stretch>
                       <a:fillRect/>
                     </a:stretch>
@@ -6186,8 +6186,8 @@
         <w:t xml:space="preserve">Figure 8. Flow D, handover.</w:t>
       </w:r>
     </w:p>
-    <w:bookmarkEnd w:id="2224"/>
-    <w:bookmarkStart w:id="2228" w:name="flow-e-risk-flags"/>
+    <w:bookmarkEnd w:id="2372"/>
+    <w:bookmarkStart w:id="2376" w:name="flow-e-risk-flags"/>
     <w:p>
       <w:pPr>
         <w:pStyle w:val="Heading2"/>
@@ -6265,18 +6265,18 @@
           <wp:inline>
             <wp:extent cx="3118104" cy="7768098"/>
             <wp:effectExtent b="0" l="0" r="0" t="0"/>
-            <wp:docPr descr="Diagram" title="" id="2226" name="Picture"/>
+            <wp:docPr descr="Diagram" title="" id="2374" name="Picture"/>
             <a:graphic>
               <a:graphicData uri="http://schemas.openxmlformats.org/drawingml/2006/picture">
                 <pic:pic>
                   <pic:nvPicPr>
-                    <pic:cNvPr descr="media/media/rId2077.png" id="2227" name="Picture"/>
+                    <pic:cNvPr descr="media/media/rId2225.png" id="2375" name="Picture"/>
                     <pic:cNvPicPr>
                       <a:picLocks noChangeArrowheads="1" noChangeAspect="1"/>
                     </pic:cNvPicPr>
                   </pic:nvPicPr>
                   <pic:blipFill>
-                    <a:blip r:embed="rId2225"/>
+                    <a:blip r:embed="rId2373"/>
                     <a:stretch>
                       <a:fillRect/>
                     </a:stretch>
@@ -6311,8 +6311,8 @@
         <w:t xml:space="preserve">Figure 9. Flow E, risk flags.</w:t>
       </w:r>
     </w:p>
-    <w:bookmarkEnd w:id="2228"/>
-    <w:bookmarkStart w:id="2232" w:name="flow-f-calendar"/>
+    <w:bookmarkEnd w:id="2376"/>
+    <w:bookmarkStart w:id="2380" w:name="flow-f-calendar"/>
     <w:p>
       <w:pPr>
         <w:pStyle w:val="Heading2"/>
@@ -6450,18 +6450,18 @@
           <wp:inline>
             <wp:extent cx="5486400" cy="3673928"/>
             <wp:effectExtent b="0" l="0" r="0" t="0"/>
-            <wp:docPr descr="Diagram" title="" id="2230" name="Picture"/>
+            <wp:docPr descr="Diagram" title="" id="2378" name="Picture"/>
             <a:graphic>
               <a:graphicData uri="http://schemas.openxmlformats.org/drawingml/2006/picture">
                 <pic:pic>
                   <pic:nvPicPr>
-                    <pic:cNvPr descr="media/media/rId2081.png" id="2231" name="Picture"/>
+                    <pic:cNvPr descr="media/media/rId2229.png" id="2379" name="Picture"/>
                     <pic:cNvPicPr>
                       <a:picLocks noChangeArrowheads="1" noChangeAspect="1"/>
                     </pic:cNvPicPr>
                   </pic:nvPicPr>
                   <pic:blipFill>
-                    <a:blip r:embed="rId2229"/>
+                    <a:blip r:embed="rId2377"/>
                     <a:stretch>
                       <a:fillRect/>
                     </a:stretch>
@@ -6496,8 +6496,8 @@
         <w:t xml:space="preserve">Figure 10. Flow F, calendar.</w:t>
       </w:r>
     </w:p>
-    <w:bookmarkEnd w:id="2232"/>
-    <w:bookmarkStart w:id="2236" w:name="flow-g-alerts"/>
+    <w:bookmarkEnd w:id="2380"/>
+    <w:bookmarkStart w:id="2384" w:name="flow-g-alerts"/>
     <w:p>
       <w:pPr>
         <w:pStyle w:val="Heading2"/>
@@ -6587,18 +6587,18 @@
           <wp:inline>
             <wp:extent cx="5486400" cy="5962261"/>
             <wp:effectExtent b="0" l="0" r="0" t="0"/>
-            <wp:docPr descr="Diagram" title="" id="2234" name="Picture"/>
+            <wp:docPr descr="Diagram" title="" id="2382" name="Picture"/>
             <a:graphic>
               <a:graphicData uri="http://schemas.openxmlformats.org/drawingml/2006/picture">
                 <pic:pic>
                   <pic:nvPicPr>
-                    <pic:cNvPr descr="media/media/rId2085.png" id="2235" name="Picture"/>
+                    <pic:cNvPr descr="media/media/rId2233.png" id="2383" name="Picture"/>
                     <pic:cNvPicPr>
                       <a:picLocks noChangeArrowheads="1" noChangeAspect="1"/>
                     </pic:cNvPicPr>
                   </pic:nvPicPr>
                   <pic:blipFill>
-                    <a:blip r:embed="rId2233"/>
+                    <a:blip r:embed="rId2381"/>
                     <a:stretch>
                       <a:fillRect/>
                     </a:stretch>
@@ -6633,8 +6633,8 @@
         <w:t xml:space="preserve">Figure 11. Flow G, alerts.</w:t>
       </w:r>
     </w:p>
-    <w:bookmarkEnd w:id="2236"/>
-    <w:bookmarkStart w:id="2240" w:name="flow-h-leave-proposed"/>
+    <w:bookmarkEnd w:id="2384"/>
+    <w:bookmarkStart w:id="2388" w:name="flow-h-leave-proposed"/>
     <w:p>
       <w:pPr>
         <w:pStyle w:val="Heading2"/>
@@ -6721,18 +6721,18 @@
           <wp:inline>
             <wp:extent cx="3227832" cy="7782867"/>
             <wp:effectExtent b="0" l="0" r="0" t="0"/>
-            <wp:docPr descr="Diagram" title="" id="2238" name="Picture"/>
+            <wp:docPr descr="Diagram" title="" id="2386" name="Picture"/>
             <a:graphic>
               <a:graphicData uri="http://schemas.openxmlformats.org/drawingml/2006/picture">
                 <pic:pic>
                   <pic:nvPicPr>
-                    <pic:cNvPr descr="media/media/rId2089.png" id="2239" name="Picture"/>
+                    <pic:cNvPr descr="media/media/rId2237.png" id="2387" name="Picture"/>
                     <pic:cNvPicPr>
                       <a:picLocks noChangeArrowheads="1" noChangeAspect="1"/>
                     </pic:cNvPicPr>
                   </pic:nvPicPr>
                   <pic:blipFill>
-                    <a:blip r:embed="rId2237"/>
+                    <a:blip r:embed="rId2385"/>
                     <a:stretch>
                       <a:fillRect/>
                     </a:stretch>
@@ -6767,8 +6767,8 @@
         <w:t xml:space="preserve">Figure 12. Flow H, leave.</w:t>
       </w:r>
     </w:p>
-    <w:bookmarkEnd w:id="2240"/>
-    <w:bookmarkStart w:id="2244" w:name="flow-i-repeating-daily-work-proposed"/>
+    <w:bookmarkEnd w:id="2388"/>
+    <w:bookmarkStart w:id="2392" w:name="flow-i-repeating-daily-work-proposed"/>
     <w:p>
       <w:pPr>
         <w:pStyle w:val="Heading2"/>
@@ -6855,18 +6855,18 @@
           <wp:inline>
             <wp:extent cx="2706624" cy="7770950"/>
             <wp:effectExtent b="0" l="0" r="0" t="0"/>
-            <wp:docPr descr="Diagram" title="" id="2242" name="Picture"/>
+            <wp:docPr descr="Diagram" title="" id="2390" name="Picture"/>
             <a:graphic>
               <a:graphicData uri="http://schemas.openxmlformats.org/drawingml/2006/picture">
                 <pic:pic>
                   <pic:nvPicPr>
-                    <pic:cNvPr descr="media/media/rId2093.png" id="2243" name="Picture"/>
+                    <pic:cNvPr descr="media/media/rId2241.png" id="2391" name="Picture"/>
                     <pic:cNvPicPr>
                       <a:picLocks noChangeArrowheads="1" noChangeAspect="1"/>
                     </pic:cNvPicPr>
                   </pic:nvPicPr>
                   <pic:blipFill>
-                    <a:blip r:embed="rId2241"/>
+                    <a:blip r:embed="rId2389"/>
                     <a:stretch>
                       <a:fillRect/>
                     </a:stretch>
@@ -6901,8 +6901,8 @@
         <w:t xml:space="preserve">Figure 13. Flow I, repeating daily work.</w:t>
       </w:r>
     </w:p>
-    <w:bookmarkEnd w:id="2244"/>
-    <w:bookmarkStart w:id="2248" w:name="Xee151c202ff32b2b502fcc1220710a61d3b4311"/>
+    <w:bookmarkEnd w:id="2392"/>
+    <w:bookmarkStart w:id="2396" w:name="Xee151c202ff32b2b502fcc1220710a61d3b4311"/>
     <w:p>
       <w:pPr>
         <w:pStyle w:val="Heading2"/>
@@ -6968,18 +6968,18 @@
           <wp:inline>
             <wp:extent cx="3054096" cy="7769485"/>
             <wp:effectExtent b="0" l="0" r="0" t="0"/>
-            <wp:docPr descr="Diagram" title="" id="2246" name="Picture"/>
+            <wp:docPr descr="Diagram" title="" id="2394" name="Picture"/>
             <a:graphic>
               <a:graphicData uri="http://schemas.openxmlformats.org/drawingml/2006/picture">
                 <pic:pic>
                   <pic:nvPicPr>
-                    <pic:cNvPr descr="media/media/rId2097.png" id="2247" name="Picture"/>
+                    <pic:cNvPr descr="media/media/rId2245.png" id="2395" name="Picture"/>
                     <pic:cNvPicPr>
                       <a:picLocks noChangeArrowheads="1" noChangeAspect="1"/>
                     </pic:cNvPicPr>
                   </pic:nvPicPr>
                   <pic:blipFill>
-                    <a:blip r:embed="rId2245"/>
+                    <a:blip r:embed="rId2393"/>
                     <a:stretch>
                       <a:fillRect/>
                     </a:stretch>
@@ -7014,9 +7014,9 @@
         <w:t xml:space="preserve">Figure 14. Flow J, weekly summary for leaders.</w:t>
       </w:r>
     </w:p>
-    <w:bookmarkEnd w:id="2248"/>
-    <w:bookmarkEnd w:id="2249"/>
-    <w:bookmarkStart w:id="2266" w:name="what-each-role-sees-and-can-do"/>
+    <w:bookmarkEnd w:id="2396"/>
+    <w:bookmarkEnd w:id="2397"/>
+    <w:bookmarkStart w:id="2414" w:name="what-each-role-sees-and-can-do"/>
     <w:p>
       <w:pPr>
         <w:pStyle w:val="Heading1"/>
@@ -7025,7 +7025,7 @@
         <w:t xml:space="preserve">09 What each role sees and can do</w:t>
       </w:r>
     </w:p>
-    <w:bookmarkStart w:id="2250" w:name="main-screens"/>
+    <w:bookmarkStart w:id="2398" w:name="main-screens"/>
     <w:p>
       <w:pPr>
         <w:pStyle w:val="Heading2"/>
@@ -7245,8 +7245,8 @@
         <w:t xml:space="preserve">Managers also get their own Today screen. Different roles get different starting screens, not three separate apps, and nobody is locked out of moving around.</w:t>
       </w:r>
     </w:p>
-    <w:bookmarkEnd w:id="2250"/>
-    <w:bookmarkStart w:id="2251" w:name="simple-by-default-one-question-per-role"/>
+    <w:bookmarkEnd w:id="2398"/>
+    <w:bookmarkStart w:id="2399" w:name="simple-by-default-one-question-per-role"/>
     <w:p>
       <w:pPr>
         <w:pStyle w:val="Heading2"/>
@@ -7701,8 +7701,8 @@
         <w:t xml:space="preserve">One in, one out: every new feature must say which role sees it on their home screen. If it adds something there, something else moves one tap deeper.</w:t>
       </w:r>
     </w:p>
-    <w:bookmarkEnd w:id="2251"/>
-    <w:bookmarkStart w:id="2255" w:name="Xafc6df188b68060a074162f0ed46c452143f4ca"/>
+    <w:bookmarkEnd w:id="2399"/>
+    <w:bookmarkStart w:id="2403" w:name="Xafc6df188b68060a074162f0ed46c452143f4ca"/>
     <w:p>
       <w:pPr>
         <w:pStyle w:val="Heading2"/>
@@ -8090,18 +8090,18 @@
           <wp:inline>
             <wp:extent cx="3813048" cy="7770093"/>
             <wp:effectExtent b="0" l="0" r="0" t="0"/>
-            <wp:docPr descr="Diagram" title="" id="2253" name="Picture"/>
+            <wp:docPr descr="Diagram" title="" id="2401" name="Picture"/>
             <a:graphic>
               <a:graphicData uri="http://schemas.openxmlformats.org/drawingml/2006/picture">
                 <pic:pic>
                   <pic:nvPicPr>
-                    <pic:cNvPr descr="media/media/rId2104.png" id="2254" name="Picture"/>
+                    <pic:cNvPr descr="media/media/rId2252.png" id="2402" name="Picture"/>
                     <pic:cNvPicPr>
                       <a:picLocks noChangeArrowheads="1" noChangeAspect="1"/>
                     </pic:cNvPicPr>
                   </pic:nvPicPr>
                   <pic:blipFill>
-                    <a:blip r:embed="rId2252"/>
+                    <a:blip r:embed="rId2400"/>
                     <a:stretch>
                       <a:fillRect/>
                     </a:stretch>
@@ -8136,8 +8136,8 @@
         <w:t xml:space="preserve">Figure 15. Dragging on the Board follows the same rules as the buttons.</w:t>
       </w:r>
     </w:p>
-    <w:bookmarkEnd w:id="2255"/>
-    <w:bookmarkStart w:id="2256" w:name="workload-view"/>
+    <w:bookmarkEnd w:id="2403"/>
+    <w:bookmarkStart w:id="2404" w:name="workload-view"/>
     <w:p>
       <w:pPr>
         <w:pStyle w:val="Heading2"/>
@@ -8578,8 +8578,8 @@
         <w:t xml:space="preserve">list asks them to look. (Proposed)</w:t>
       </w:r>
     </w:p>
-    <w:bookmarkEnd w:id="2256"/>
-    <w:bookmarkStart w:id="2257" w:name="risk-flags-for-leaders"/>
+    <w:bookmarkEnd w:id="2404"/>
+    <w:bookmarkStart w:id="2405" w:name="risk-flags-for-leaders"/>
     <w:p>
       <w:pPr>
         <w:pStyle w:val="Heading2"/>
@@ -8848,8 +8848,8 @@
         <w:t xml:space="preserve">In a later stage, suggested flags are never set automatically. Flags not looked at for a while (see §14) remind the lead to confirm or clear them.</w:t>
       </w:r>
     </w:p>
-    <w:bookmarkEnd w:id="2257"/>
-    <w:bookmarkStart w:id="2258" w:name="calendar-1"/>
+    <w:bookmarkEnd w:id="2405"/>
+    <w:bookmarkStart w:id="2406" w:name="calendar-1"/>
     <w:p>
       <w:pPr>
         <w:pStyle w:val="Heading2"/>
@@ -9182,8 +9182,8 @@
         <w:t xml:space="preserve">Times show in each person’s local time. Holidays and all-day events stay as dates.</w:t>
       </w:r>
     </w:p>
-    <w:bookmarkEnd w:id="2258"/>
-    <w:bookmarkStart w:id="2259" w:name="alerts-and-the-mobile-app"/>
+    <w:bookmarkEnd w:id="2406"/>
+    <w:bookmarkStart w:id="2407" w:name="alerts-and-the-mobile-app"/>
     <w:p>
       <w:pPr>
         <w:pStyle w:val="Heading2"/>
@@ -9977,8 +9977,8 @@
         <w:t xml:space="preserve">Chat apps (Telegram, Slack and Microsoft Teams, later stage) will all use the same messages, buttons and team chat settings.</w:t>
       </w:r>
     </w:p>
-    <w:bookmarkEnd w:id="2259"/>
-    <w:bookmarkStart w:id="2260" w:name="search-proposed"/>
+    <w:bookmarkEnd w:id="2407"/>
+    <w:bookmarkStart w:id="2408" w:name="search-proposed"/>
     <w:p>
       <w:pPr>
         <w:pStyle w:val="Heading2"/>
@@ -10059,8 +10059,8 @@
         <w:t xml:space="preserve">Without internet, search looks through the items saved on the phone, and says so.</w:t>
       </w:r>
     </w:p>
-    <w:bookmarkEnd w:id="2260"/>
-    <w:bookmarkStart w:id="2264" w:name="working-offline-proposed"/>
+    <w:bookmarkEnd w:id="2408"/>
+    <w:bookmarkStart w:id="2412" w:name="working-offline-proposed"/>
     <w:p>
       <w:pPr>
         <w:pStyle w:val="Heading2"/>
@@ -10139,18 +10139,18 @@
           <wp:inline>
             <wp:extent cx="4727448" cy="7773611"/>
             <wp:effectExtent b="0" l="0" r="0" t="0"/>
-            <wp:docPr descr="Diagram" title="" id="2262" name="Picture"/>
+            <wp:docPr descr="Diagram" title="" id="2410" name="Picture"/>
             <a:graphic>
               <a:graphicData uri="http://schemas.openxmlformats.org/drawingml/2006/picture">
                 <pic:pic>
                   <pic:nvPicPr>
-                    <pic:cNvPr descr="media/media/rId2113.png" id="2263" name="Picture"/>
+                    <pic:cNvPr descr="media/media/rId2261.png" id="2411" name="Picture"/>
                     <pic:cNvPicPr>
                       <a:picLocks noChangeArrowheads="1" noChangeAspect="1"/>
                     </pic:cNvPicPr>
                   </pic:nvPicPr>
                   <pic:blipFill>
-                    <a:blip r:embed="rId2261"/>
+                    <a:blip r:embed="rId2409"/>
                     <a:stretch>
                       <a:fillRect/>
                     </a:stretch>
@@ -10185,8 +10185,8 @@
         <w:t xml:space="preserve">Figure 16. Working offline.</w:t>
       </w:r>
     </w:p>
-    <w:bookmarkEnd w:id="2264"/>
-    <w:bookmarkStart w:id="2265" w:name="who-can-do-what-starting-settings"/>
+    <w:bookmarkEnd w:id="2412"/>
+    <w:bookmarkStart w:id="2413" w:name="who-can-do-what-starting-settings"/>
     <w:p>
       <w:pPr>
         <w:pStyle w:val="Heading2"/>
@@ -11766,9 +11766,9 @@
         <w:t xml:space="preserve">rules on top of department and job title.</w:t>
       </w:r>
     </w:p>
-    <w:bookmarkEnd w:id="2265"/>
-    <w:bookmarkEnd w:id="2266"/>
-    <w:bookmarkStart w:id="2271" w:name="time-and-measures"/>
+    <w:bookmarkEnd w:id="2413"/>
+    <w:bookmarkEnd w:id="2414"/>
+    <w:bookmarkStart w:id="2419" w:name="time-and-measures"/>
     <w:p>
       <w:pPr>
         <w:pStyle w:val="Heading1"/>
@@ -11777,7 +11777,7 @@
         <w:t xml:space="preserve">10 Time and measures</w:t>
       </w:r>
     </w:p>
-    <w:bookmarkStart w:id="2267" w:name="talking-about-time"/>
+    <w:bookmarkStart w:id="2415" w:name="talking-about-time"/>
     <w:p>
       <w:pPr>
         <w:pStyle w:val="Heading2"/>
@@ -12012,8 +12012,8 @@
         <w:t xml:space="preserve">Holidays and leave reduce the working week before this calculation. For example, a public holiday on Tuesday cuts the working week to 32 hours for everyone on that holiday calendar, and the weekly planner shows the lower number before the week is locked.</w:t>
       </w:r>
     </w:p>
-    <w:bookmarkEnd w:id="2267"/>
-    <w:bookmarkStart w:id="2268" w:name="measures"/>
+    <w:bookmarkEnd w:id="2415"/>
+    <w:bookmarkStart w:id="2416" w:name="measures"/>
     <w:p>
       <w:pPr>
         <w:pStyle w:val="Heading2"/>
@@ -12401,8 +12401,8 @@
         <w:t xml:space="preserve">until people log real time. Cancelled work is shown separately and never counts as missed.</w:t>
       </w:r>
     </w:p>
-    <w:bookmarkEnd w:id="2268"/>
-    <w:bookmarkStart w:id="2269" w:name="standard-reports-proposed"/>
+    <w:bookmarkEnd w:id="2416"/>
+    <w:bookmarkStart w:id="2417" w:name="standard-reports-proposed"/>
     <w:p>
       <w:pPr>
         <w:pStyle w:val="Heading2"/>
@@ -12655,8 +12655,8 @@
         <w:t xml:space="preserve">, with their own planned, added and finished work.</w:t>
       </w:r>
     </w:p>
-    <w:bookmarkEnd w:id="2269"/>
-    <w:bookmarkStart w:id="2270" w:name="keeping-it-fair"/>
+    <w:bookmarkEnd w:id="2417"/>
+    <w:bookmarkStart w:id="2418" w:name="keeping-it-fair"/>
     <w:p>
       <w:pPr>
         <w:pStyle w:val="Heading2"/>
@@ -12725,9 +12725,9 @@
         <w:t xml:space="preserve">Don’t count a Deliverable that covers several products twice. Use its main product, or set shares.</w:t>
       </w:r>
     </w:p>
-    <w:bookmarkEnd w:id="2270"/>
-    <w:bookmarkEnd w:id="2271"/>
-    <w:bookmarkStart w:id="2289" w:name="rewards-fun-and-the-mascot"/>
+    <w:bookmarkEnd w:id="2418"/>
+    <w:bookmarkEnd w:id="2419"/>
+    <w:bookmarkStart w:id="2437" w:name="rewards-fun-and-the-mascot"/>
     <w:p>
       <w:pPr>
         <w:pStyle w:val="Heading1"/>
@@ -12744,7 +12744,7 @@
         <w:t xml:space="preserve">Rewards help people adopt the app. They should follow real, checked work, and should never encourage splitting tasks, working extra hours or saying work is done when it isn’t.</w:t>
       </w:r>
     </w:p>
-    <w:bookmarkStart w:id="2272" w:name="start-simple-first-version"/>
+    <w:bookmarkStart w:id="2420" w:name="start-simple-first-version"/>
     <w:p>
       <w:pPr>
         <w:pStyle w:val="Heading2"/>
@@ -13012,8 +13012,8 @@
         <w:t xml:space="preserve">Celebrations and streak days come only from real, checked events, each counted once, so repeating or undoing actions can’t be used to game them.</w:t>
       </w:r>
     </w:p>
-    <w:bookmarkEnd w:id="2272"/>
-    <w:bookmarkStart w:id="2282" w:name="mascot-punh-punh"/>
+    <w:bookmarkEnd w:id="2420"/>
+    <w:bookmarkStart w:id="2430" w:name="mascot-punh-punh"/>
     <w:p>
       <w:pPr>
         <w:pStyle w:val="Heading2"/>
@@ -13067,18 +13067,18 @@
                 <wp:inline>
                   <wp:extent cx="6134100" cy="6134100"/>
                   <wp:effectExtent b="0" l="0" r="0" t="0"/>
-                  <wp:docPr descr="Punh Punh holding a blank note" title="" id="2274" name="Picture"/>
+                  <wp:docPr descr="Punh Punh holding a blank note" title="" id="2422" name="Picture"/>
                   <a:graphic>
                     <a:graphicData uri="http://schemas.openxmlformats.org/drawingml/2006/picture">
                       <pic:pic>
                         <pic:nvPicPr>
-                          <pic:cNvPr descr="../design/mascot/punh-punh-A1.png" id="2275" name="Picture"/>
+                          <pic:cNvPr descr="../design/mascot/punh-punh-A1.png" id="2423" name="Picture"/>
                           <pic:cNvPicPr>
                             <a:picLocks noChangeArrowheads="1" noChangeAspect="1"/>
                           </pic:cNvPicPr>
                         </pic:nvPicPr>
                         <pic:blipFill>
-                          <a:blip r:embed="rId2273"/>
+                          <a:blip r:embed="rId2421"/>
                           <a:stretch>
                             <a:fillRect/>
                           </a:stretch>
@@ -13118,18 +13118,18 @@
                 <wp:inline>
                   <wp:extent cx="6134100" cy="6134100"/>
                   <wp:effectExtent b="0" l="0" r="0" t="0"/>
-                  <wp:docPr descr="Punh Punh waving" title="" id="2277" name="Picture"/>
+                  <wp:docPr descr="Punh Punh waving" title="" id="2425" name="Picture"/>
                   <a:graphic>
                     <a:graphicData uri="http://schemas.openxmlformats.org/drawingml/2006/picture">
                       <pic:pic>
                         <pic:nvPicPr>
-                          <pic:cNvPr descr="../design/mascot/punh-punh-B1.png" id="2278" name="Picture"/>
+                          <pic:cNvPr descr="../design/mascot/punh-punh-B1.png" id="2426" name="Picture"/>
                           <pic:cNvPicPr>
                             <a:picLocks noChangeArrowheads="1" noChangeAspect="1"/>
                           </pic:cNvPicPr>
                         </pic:nvPicPr>
                         <pic:blipFill>
-                          <a:blip r:embed="rId2276"/>
+                          <a:blip r:embed="rId2424"/>
                           <a:stretch>
                             <a:fillRect/>
                           </a:stretch>
@@ -13169,18 +13169,18 @@
                 <wp:inline>
                   <wp:extent cx="6134100" cy="6134100"/>
                   <wp:effectExtent b="0" l="0" r="0" t="0"/>
-                  <wp:docPr descr="Punh Punh holding a checked note" title="" id="2280" name="Picture"/>
+                  <wp:docPr descr="Punh Punh holding a checked note" title="" id="2428" name="Picture"/>
                   <a:graphic>
                     <a:graphicData uri="http://schemas.openxmlformats.org/drawingml/2006/picture">
                       <pic:pic>
                         <pic:nvPicPr>
-                          <pic:cNvPr descr="../design/mascot/punh-punh-C1.png" id="2281" name="Picture"/>
+                          <pic:cNvPr descr="../design/mascot/punh-punh-C1.png" id="2429" name="Picture"/>
                           <pic:cNvPicPr>
                             <a:picLocks noChangeArrowheads="1" noChangeAspect="1"/>
                           </pic:cNvPicPr>
                         </pic:nvPicPr>
                         <pic:blipFill>
-                          <a:blip r:embed="rId2279"/>
+                          <a:blip r:embed="rId2427"/>
                           <a:stretch>
                             <a:fillRect/>
                           </a:stretch>
@@ -13616,8 +13616,8 @@
         <w:t xml:space="preserve">Design work for the first version: a character sheet, five main poses (welcome, celebrate, thinking, calm, resting for holidays and leave), light animations. A chat sticker set and the bot’s profile picture come with chat apps, and seasonal outfits come later.</w:t>
       </w:r>
     </w:p>
-    <w:bookmarkEnd w:id="2282"/>
-    <w:bookmarkStart w:id="2286" w:name="app-icon"/>
+    <w:bookmarkEnd w:id="2430"/>
+    <w:bookmarkStart w:id="2434" w:name="app-icon"/>
     <w:p>
       <w:pPr>
         <w:pStyle w:val="Heading2"/>
@@ -13635,18 +13635,18 @@
           <wp:inline>
             <wp:extent cx="6134100" cy="6134100"/>
             <wp:effectExtent b="0" l="0" r="0" t="0"/>
-            <wp:docPr descr="HopFlows app icon: Punh Punh leaning in beside a checklist on a sky tile" title="" id="2284" name="Picture"/>
+            <wp:docPr descr="HopFlows app icon: Punh Punh leaning in beside a checklist on a sky tile" title="" id="2432" name="Picture"/>
             <a:graphic>
               <a:graphicData uri="http://schemas.openxmlformats.org/drawingml/2006/picture">
                 <pic:pic>
                   <pic:nvPicPr>
-                    <pic:cNvPr descr="../design/app-icon/png/icon-512.png" id="2285" name="Picture"/>
+                    <pic:cNvPr descr="../design/app-icon/png/icon-512.png" id="2433" name="Picture"/>
                     <pic:cNvPicPr>
                       <a:picLocks noChangeArrowheads="1" noChangeAspect="1"/>
                     </pic:cNvPicPr>
                   </pic:nvPicPr>
                   <pic:blipFill>
-                    <a:blip r:embed="rId2283"/>
+                    <a:blip r:embed="rId2431"/>
                     <a:stretch>
                       <a:fillRect/>
                     </a:stretch>
@@ -13798,8 +13798,8 @@
         <w:t xml:space="preserve">.</w:t>
       </w:r>
     </w:p>
-    <w:bookmarkEnd w:id="2286"/>
-    <w:bookmarkStart w:id="2287" w:name="more-rewards-later"/>
+    <w:bookmarkEnd w:id="2434"/>
+    <w:bookmarkStart w:id="2435" w:name="more-rewards-later"/>
     <w:p>
       <w:pPr>
         <w:pStyle w:val="Heading2"/>
@@ -14054,8 +14054,8 @@
         </w:tc>
       </w:tr>
     </w:tbl>
-    <w:bookmarkEnd w:id="2287"/>
-    <w:bookmarkStart w:id="2288" w:name="making-it-easy-to-start"/>
+    <w:bookmarkEnd w:id="2435"/>
+    <w:bookmarkStart w:id="2436" w:name="making-it-easy-to-start"/>
     <w:p>
       <w:pPr>
         <w:pStyle w:val="Heading2"/>
@@ -14100,9 +14100,9 @@
         <w:t xml:space="preserve">English and phone-friendly design are included from the start. Other languages can be added later.</w:t>
       </w:r>
     </w:p>
-    <w:bookmarkEnd w:id="2288"/>
-    <w:bookmarkEnd w:id="2289"/>
-    <w:bookmarkStart w:id="2299" w:name="special-cases"/>
+    <w:bookmarkEnd w:id="2436"/>
+    <w:bookmarkEnd w:id="2437"/>
+    <w:bookmarkStart w:id="2447" w:name="special-cases"/>
     <w:p>
       <w:pPr>
         <w:pStyle w:val="Heading1"/>
@@ -14111,7 +14111,7 @@
         <w:t xml:space="preserve">12 Special cases</w:t>
       </w:r>
     </w:p>
-    <w:bookmarkStart w:id="2290" w:name="work-and-requests"/>
+    <w:bookmarkStart w:id="2438" w:name="work-and-requests"/>
     <w:p>
       <w:pPr>
         <w:pStyle w:val="Heading2"/>
@@ -14689,8 +14689,8 @@
         </w:tc>
       </w:tr>
     </w:tbl>
-    <w:bookmarkEnd w:id="2290"/>
-    <w:bookmarkStart w:id="2291" w:name="planning-and-time-1"/>
+    <w:bookmarkEnd w:id="2438"/>
+    <w:bookmarkStart w:id="2439" w:name="planning-and-time-1"/>
     <w:p>
       <w:pPr>
         <w:pStyle w:val="Heading2"/>
@@ -15064,8 +15064,8 @@
         </w:tc>
       </w:tr>
     </w:tbl>
-    <w:bookmarkEnd w:id="2291"/>
-    <w:bookmarkStart w:id="2292" w:name="handover-and-leave"/>
+    <w:bookmarkEnd w:id="2439"/>
+    <w:bookmarkStart w:id="2440" w:name="handover-and-leave"/>
     <w:p>
       <w:pPr>
         <w:pStyle w:val="Heading2"/>
@@ -15289,8 +15289,8 @@
         </w:tc>
       </w:tr>
     </w:tbl>
-    <w:bookmarkEnd w:id="2292"/>
-    <w:bookmarkStart w:id="2293" w:name="risk-flags"/>
+    <w:bookmarkEnd w:id="2440"/>
+    <w:bookmarkStart w:id="2441" w:name="risk-flags"/>
     <w:p>
       <w:pPr>
         <w:pStyle w:val="Heading2"/>
@@ -15466,8 +15466,8 @@
         </w:tc>
       </w:tr>
     </w:tbl>
-    <w:bookmarkEnd w:id="2293"/>
-    <w:bookmarkStart w:id="2294" w:name="calendar-2"/>
+    <w:bookmarkEnd w:id="2441"/>
+    <w:bookmarkStart w:id="2442" w:name="calendar-2"/>
     <w:p>
       <w:pPr>
         <w:pStyle w:val="Heading2"/>
@@ -15631,8 +15631,8 @@
         </w:tc>
       </w:tr>
     </w:tbl>
-    <w:bookmarkEnd w:id="2294"/>
-    <w:bookmarkStart w:id="2295" w:name="alerts-and-chat"/>
+    <w:bookmarkEnd w:id="2442"/>
+    <w:bookmarkStart w:id="2443" w:name="alerts-and-chat"/>
     <w:p>
       <w:pPr>
         <w:pStyle w:val="Heading2"/>
@@ -16017,8 +16017,8 @@
         </w:tc>
       </w:tr>
     </w:tbl>
-    <w:bookmarkEnd w:id="2295"/>
-    <w:bookmarkStart w:id="2296" w:name="leave-routines-and-week-status"/>
+    <w:bookmarkEnd w:id="2443"/>
+    <w:bookmarkStart w:id="2444" w:name="leave-routines-and-week-status"/>
     <w:p>
       <w:pPr>
         <w:pStyle w:val="Heading2"/>
@@ -16386,8 +16386,8 @@
         </w:tc>
       </w:tr>
     </w:tbl>
-    <w:bookmarkEnd w:id="2296"/>
-    <w:bookmarkStart w:id="2297" w:name="reports-search-and-offline"/>
+    <w:bookmarkEnd w:id="2444"/>
+    <w:bookmarkStart w:id="2445" w:name="reports-search-and-offline"/>
     <w:p>
       <w:pPr>
         <w:pStyle w:val="Heading2"/>
@@ -16587,8 +16587,8 @@
         </w:tc>
       </w:tr>
     </w:tbl>
-    <w:bookmarkEnd w:id="2297"/>
-    <w:bookmarkStart w:id="2298" w:name="rewards"/>
+    <w:bookmarkEnd w:id="2445"/>
+    <w:bookmarkStart w:id="2446" w:name="rewards"/>
     <w:p>
       <w:pPr>
         <w:pStyle w:val="Heading2"/>
@@ -16716,9 +16716,9 @@
         </w:tc>
       </w:tr>
     </w:tbl>
-    <w:bookmarkEnd w:id="2298"/>
-    <w:bookmarkEnd w:id="2299"/>
-    <w:bookmarkStart w:id="2303" w:name="what-we-build-first"/>
+    <w:bookmarkEnd w:id="2446"/>
+    <w:bookmarkEnd w:id="2447"/>
+    <w:bookmarkStart w:id="2451" w:name="what-we-build-first"/>
     <w:p>
       <w:pPr>
         <w:pStyle w:val="Heading1"/>
@@ -16727,7 +16727,7 @@
         <w:t xml:space="preserve">13 What we build first</w:t>
       </w:r>
     </w:p>
-    <w:bookmarkStart w:id="2300" w:name="order-of-building"/>
+    <w:bookmarkStart w:id="2448" w:name="order-of-building"/>
     <w:p>
       <w:pPr>
         <w:pStyle w:val="Heading2"/>
@@ -17005,8 +17005,8 @@
         <w:t xml:space="preserve">apply once chat apps ship.</w:t>
       </w:r>
     </w:p>
-    <w:bookmarkEnd w:id="2300"/>
-    <w:bookmarkStart w:id="2301" w:name="seven-key-screens-to-sketch-first"/>
+    <w:bookmarkEnd w:id="2448"/>
+    <w:bookmarkStart w:id="2449" w:name="seven-key-screens-to-sketch-first"/>
     <w:p>
       <w:pPr>
         <w:pStyle w:val="Heading2"/>
@@ -17141,8 +17141,8 @@
         <w:t xml:space="preserve">act on an alert (Start, Done, Need Help, Accept) in one tap, without opening the full app.</w:t>
       </w:r>
     </w:p>
-    <w:bookmarkEnd w:id="2301"/>
-    <w:bookmarkStart w:id="2302" w:name="how-well-know-the-pilot-worked"/>
+    <w:bookmarkEnd w:id="2449"/>
+    <w:bookmarkStart w:id="2450" w:name="how-well-know-the-pilot-worked"/>
     <w:p>
       <w:pPr>
         <w:pStyle w:val="Heading2"/>
@@ -17277,9 +17277,9 @@
         <w:t xml:space="preserve">these targets are new in v1.1 and need a yes before the pilot. We’ll measure them by tracking when Add Work starts and finishes, which buttons people use and where, when alerts are sent and acted on, and how many people use the app each day in each role.</w:t>
       </w:r>
     </w:p>
-    <w:bookmarkEnd w:id="2302"/>
-    <w:bookmarkEnd w:id="2303"/>
-    <w:bookmarkStart w:id="2306" w:name="default-settings-and-launch-tests"/>
+    <w:bookmarkEnd w:id="2450"/>
+    <w:bookmarkEnd w:id="2451"/>
+    <w:bookmarkStart w:id="2454" w:name="default-settings-and-launch-tests"/>
     <w:p>
       <w:pPr>
         <w:pStyle w:val="Heading1"/>
@@ -17288,7 +17288,7 @@
         <w:t xml:space="preserve">14 Default settings and launch tests</w:t>
       </w:r>
     </w:p>
-    <w:bookmarkStart w:id="2304" w:name="default-settings-and-open-decisions"/>
+    <w:bookmarkStart w:id="2452" w:name="default-settings-and-open-decisions"/>
     <w:p>
       <w:pPr>
         <w:pStyle w:val="Heading2"/>
@@ -19050,8 +19050,8 @@
         <w:t xml:space="preserve">The system should be thorough enough to get owners, time and history right, while the employee’s screen stays as simple as possible. Complexity belongs in the system, not on the screen.</w:t>
       </w:r>
     </w:p>
-    <w:bookmarkEnd w:id="2304"/>
-    <w:bookmarkStart w:id="2305" w:name="launch-tests"/>
+    <w:bookmarkEnd w:id="2452"/>
+    <w:bookmarkStart w:id="2453" w:name="launch-tests"/>
     <w:p>
       <w:pPr>
         <w:pStyle w:val="Heading2"/>
@@ -20142,9 +20142,9 @@
         </w:tc>
       </w:tr>
     </w:tbl>
-    <w:bookmarkEnd w:id="2305"/>
-    <w:bookmarkEnd w:id="2306"/>
-    <w:bookmarkStart w:id="2313" w:name="sign-in-access-and-data"/>
+    <w:bookmarkEnd w:id="2453"/>
+    <w:bookmarkEnd w:id="2454"/>
+    <w:bookmarkStart w:id="2461" w:name="sign-in-access-and-data"/>
     <w:p>
       <w:pPr>
         <w:pStyle w:val="Heading1"/>
@@ -20171,7 +20171,7 @@
         <w:t xml:space="preserve">this section is new in v1.1 and needs a yes.</w:t>
       </w:r>
     </w:p>
-    <w:bookmarkStart w:id="2310" w:name="sign-in-and-joining-a-company"/>
+    <w:bookmarkStart w:id="2458" w:name="sign-in-and-joining-a-company"/>
     <w:p>
       <w:pPr>
         <w:pStyle w:val="Heading2"/>
@@ -20249,18 +20249,18 @@
           <wp:inline>
             <wp:extent cx="4233672" cy="7768662"/>
             <wp:effectExtent b="0" l="0" r="0" t="0"/>
-            <wp:docPr descr="Diagram" title="" id="2308" name="Picture"/>
+            <wp:docPr descr="Diagram" title="" id="2456" name="Picture"/>
             <a:graphic>
               <a:graphicData uri="http://schemas.openxmlformats.org/drawingml/2006/picture">
                 <pic:pic>
                   <pic:nvPicPr>
-                    <pic:cNvPr descr="media/media/rId2159.png" id="2309" name="Picture"/>
+                    <pic:cNvPr descr="media/media/rId2307.png" id="2457" name="Picture"/>
                     <pic:cNvPicPr>
                       <a:picLocks noChangeArrowheads="1" noChangeAspect="1"/>
                     </pic:cNvPicPr>
                   </pic:nvPicPr>
                   <pic:blipFill>
-                    <a:blip r:embed="rId2307"/>
+                    <a:blip r:embed="rId2455"/>
                     <a:stretch>
                       <a:fillRect/>
                     </a:stretch>
@@ -20295,8 +20295,8 @@
         <w:t xml:space="preserve">Figure 17. Signing in and joining a company.</w:t>
       </w:r>
     </w:p>
-    <w:bookmarkEnd w:id="2310"/>
-    <w:bookmarkStart w:id="2311" w:name="setting-up-a-company-proposed"/>
+    <w:bookmarkEnd w:id="2458"/>
+    <w:bookmarkStart w:id="2459" w:name="setting-up-a-company-proposed"/>
     <w:p>
       <w:pPr>
         <w:pStyle w:val="Heading2"/>
@@ -20528,8 +20528,8 @@
         <w:t xml:space="preserve">on Needs you.</w:t>
       </w:r>
     </w:p>
-    <w:bookmarkEnd w:id="2311"/>
-    <w:bookmarkStart w:id="2312" w:name="looking-after-data"/>
+    <w:bookmarkEnd w:id="2459"/>
+    <w:bookmarkStart w:id="2460" w:name="looking-after-data"/>
     <w:p>
       <w:pPr>
         <w:pStyle w:val="Heading2"/>
@@ -20586,9 +20586,9 @@
         <w:t xml:space="preserve">Where the data is stored, and any promises about which country it stays in, are decided before the first paying customer.</w:t>
       </w:r>
     </w:p>
-    <w:bookmarkEnd w:id="2312"/>
-    <w:bookmarkEnd w:id="2313"/>
-    <w:bookmarkStart w:id="2314" w:name="change-log"/>
+    <w:bookmarkEnd w:id="2460"/>
+    <w:bookmarkEnd w:id="2461"/>
+    <w:bookmarkStart w:id="2462" w:name="change-log"/>
     <w:p>
       <w:pPr>
         <w:pStyle w:val="Heading1"/>
@@ -20798,7 +20798,7 @@
         </w:numPr>
       </w:pPr>
       <w:r>
-        <w:t xml:space="preserve">After the fourth lead-flow review (Proposed): the locked plan counts waiting leave and open handovers, so every screen shows week 43 as it will really look; work can still be moved after locking and is recorded as a change (21 October).</w:t>
+        <w:t xml:space="preserve">After the fifth lead-flow review (Proposed): Handover can put an item back in Ready to plan with no owner; hours are always written as planned of time to plan (21 October).</w:t>
       </w:r>
     </w:p>
     <w:p>
@@ -20810,7 +20810,7 @@
         </w:numPr>
       </w:pPr>
       <w:r>
-        <w:t xml:space="preserve">After the third lead-flow review (Proposed): the lock check lets the lead move an overloaded person’s work in place; the weekly plan keeps one list of the week’s changes; Handover receivers are picked per item with the load after the move; a postponed request gets a return date (20 October).</w:t>
+        <w:t xml:space="preserve">After the fourth lead-flow review (Proposed): the locked plan counts waiting leave and open handovers, so every screen shows week 43 as it will really look; work can still be moved after locking and is recorded as a change (21 October).</w:t>
       </w:r>
     </w:p>
     <w:p>
@@ -20822,7 +20822,7 @@
         </w:numPr>
       </w:pPr>
       <w:r>
-        <w:t xml:space="preserve">After the second lead-flow review (Proposed): every place that moves work to someone shows how busy they would be after the move and suggests whoever has the most room; a request that looks like an open Task starts on Merge; a handover can be undone for 10 minutes (20 October).</w:t>
+        <w:t xml:space="preserve">After the third lead-flow review (Proposed): the lock check lets the lead move an overloaded person’s work in place; the weekly plan keeps one list of the week’s changes; Handover receivers are picked per item with the load after the move; a postponed request gets a return date (20 October).</w:t>
       </w:r>
     </w:p>
     <w:p>
@@ -20834,7 +20834,7 @@
         </w:numPr>
       </w:pPr>
       <w:r>
-        <w:t xml:space="preserve">Mascot renamed from Hop to Punh Punh (14 October).</w:t>
+        <w:t xml:space="preserve">After the second lead-flow review (Proposed): every place that moves work to someone shows how busy they would be after the move and suggests whoever has the most room; a request that looks like an open Task starts on Merge; a handover can be undone for 10 minutes (20 October).</w:t>
       </w:r>
     </w:p>
     <w:p>
@@ -20846,7 +20846,7 @@
         </w:numPr>
       </w:pPr>
       <w:r>
-        <w:t xml:space="preserve">App icon chosen: Punh Checklist, with usage rules in §11 (15 October).</w:t>
+        <w:t xml:space="preserve">Mascot renamed from Hop to Punh Punh (14 October).</w:t>
       </w:r>
     </w:p>
     <w:p>
@@ -20858,28 +20858,7 @@
         </w:numPr>
       </w:pPr>
       <w:r>
-        <w:t xml:space="preserve">First version split into</w:t>
-      </w:r>
-      <w:r>
-        <w:t xml:space="preserve"> </w:t>
-      </w:r>
-      <w:r>
-        <w:t xml:space="preserve">“pilot core”</w:t>
-      </w:r>
-      <w:r>
-        <w:t xml:space="preserve"> </w:t>
-      </w:r>
-      <w:r>
-        <w:t xml:space="preserve">and</w:t>
-      </w:r>
-      <w:r>
-        <w:t xml:space="preserve"> </w:t>
-      </w:r>
-      <w:r>
-        <w:t xml:space="preserve">“soon after”</w:t>
-      </w:r>
-      <w:r>
-        <w:t xml:space="preserve">; later-stage features (Workload view for future weeks, temporary Handover, suggested risk flags) marked in the flows and special cases.</w:t>
+        <w:t xml:space="preserve">App icon chosen: Punh Checklist, with usage rules in §11 (15 October).</w:t>
       </w:r>
     </w:p>
     <w:p>
@@ -20891,7 +20870,28 @@
         </w:numPr>
       </w:pPr>
       <w:r>
-        <w:t xml:space="preserve">Rules for statuses, Confidential Task access, review and blocked markers, giving rights to named people, work schedules, time split across departments, task sizes, time zones, sorting and postponing requests.</w:t>
+        <w:t xml:space="preserve">First version split into</w:t>
+      </w:r>
+      <w:r>
+        <w:t xml:space="preserve"> </w:t>
+      </w:r>
+      <w:r>
+        <w:t xml:space="preserve">“pilot core”</w:t>
+      </w:r>
+      <w:r>
+        <w:t xml:space="preserve"> </w:t>
+      </w:r>
+      <w:r>
+        <w:t xml:space="preserve">and</w:t>
+      </w:r>
+      <w:r>
+        <w:t xml:space="preserve"> </w:t>
+      </w:r>
+      <w:r>
+        <w:t xml:space="preserve">“soon after”</w:t>
+      </w:r>
+      <w:r>
+        <w:t xml:space="preserve">; later-stage features (Workload view for future weeks, temporary Handover, suggested risk flags) marked in the flows and special cases.</w:t>
       </w:r>
     </w:p>
     <w:p>
@@ -20903,7 +20903,7 @@
         </w:numPr>
       </w:pPr>
       <w:r>
-        <w:t xml:space="preserve">Rules for carrying work over, weeks never locked, clearing flags, who gets urgent alerts next, snooze, people in several companies, handover receivers and overlapping time off.</w:t>
+        <w:t xml:space="preserve">Rules for statuses, Confidential Task access, review and blocked markers, giving rights to named people, work schedules, time split across departments, task sizes, time zones, sorting and postponing requests.</w:t>
       </w:r>
     </w:p>
     <w:p>
@@ -20915,7 +20915,7 @@
         </w:numPr>
       </w:pPr>
       <w:r>
-        <w:t xml:space="preserve">Measures, time words and pilot targets written out.</w:t>
+        <w:t xml:space="preserve">Rules for carrying work over, weeks never locked, clearing flags, who gets urgent alerts next, snooze, people in several companies, handover receivers and overlapping time off.</w:t>
       </w:r>
     </w:p>
     <w:p>
@@ -20927,7 +20927,7 @@
         </w:numPr>
       </w:pPr>
       <w:r>
-        <w:t xml:space="preserve">The streak no longer counts just starting work.</w:t>
+        <w:t xml:space="preserve">Measures, time words and pilot targets written out.</w:t>
       </w:r>
     </w:p>
     <w:p>
@@ -20939,7 +20939,7 @@
         </w:numPr>
       </w:pPr>
       <w:r>
-        <w:t xml:space="preserve">Special cases grouped by topic; all default numbers kept in §14; the life of a Task moved before planning.</w:t>
+        <w:t xml:space="preserve">The streak no longer counts just starting work.</w:t>
       </w:r>
     </w:p>
     <w:p>
@@ -20951,7 +20951,7 @@
         </w:numPr>
       </w:pPr>
       <w:r>
-        <w:t xml:space="preserve">New §15 Sign-in, access and data.</w:t>
+        <w:t xml:space="preserve">Special cases grouped by topic; all default numbers kept in §14; the life of a Task moved before planning.</w:t>
       </w:r>
     </w:p>
     <w:p>
@@ -20963,19 +20963,7 @@
         </w:numPr>
       </w:pPr>
       <w:r>
-        <w:t xml:space="preserve">Words on screen: Add Work (employees), Incoming Queue and Sort (leads);</w:t>
-      </w:r>
-      <w:r>
-        <w:t xml:space="preserve"> </w:t>
-      </w:r>
-      <w:r>
-        <w:t xml:space="preserve">“intake”</w:t>
-      </w:r>
-      <w:r>
-        <w:t xml:space="preserve"> </w:t>
-      </w:r>
-      <w:r>
-        <w:t xml:space="preserve">only in reports.</w:t>
+        <w:t xml:space="preserve">New §15 Sign-in, access and data.</w:t>
       </w:r>
     </w:p>
     <w:p>
@@ -20987,19 +20975,19 @@
         </w:numPr>
       </w:pPr>
       <w:r>
-        <w:t xml:space="preserve">The blueprint now covers business and design rules only. The data model and engineering rules moved to</w:t>
+        <w:t xml:space="preserve">Words on screen: Add Work (employees), Incoming Queue and Sort (leads);</w:t>
       </w:r>
       <w:r>
         <w:t xml:space="preserve"> </w:t>
       </w:r>
       <w:r>
-        <w:rPr>
-          <w:rStyle w:val="VerbatimChar"/>
-        </w:rPr>
-        <w:t xml:space="preserve">HopFlows_Technical_Design_v1.1.md</w:t>
-      </w:r>
-      <w:r>
-        <w:t xml:space="preserve">.</w:t>
+        <w:t xml:space="preserve">“intake”</w:t>
+      </w:r>
+      <w:r>
+        <w:t xml:space="preserve"> </w:t>
+      </w:r>
+      <w:r>
+        <w:t xml:space="preserve">only in reports.</w:t>
       </w:r>
     </w:p>
     <w:p>
@@ -21011,7 +20999,19 @@
         </w:numPr>
       </w:pPr>
       <w:r>
-        <w:t xml:space="preserve">Gap fixes (Proposed): updates to request senders, weekly summary for leaders, four standard reports with downloads, week status, leave requests and approval, repeating daily work (moved from a later stage into the first version), working offline and search.</w:t>
+        <w:t xml:space="preserve">The blueprint now covers business and design rules only. The data model and engineering rules moved to</w:t>
+      </w:r>
+      <w:r>
+        <w:t xml:space="preserve"> </w:t>
+      </w:r>
+      <w:r>
+        <w:rPr>
+          <w:rStyle w:val="VerbatimChar"/>
+        </w:rPr>
+        <w:t xml:space="preserve">HopFlows_Technical_Design_v1.1.md</w:t>
+      </w:r>
+      <w:r>
+        <w:t xml:space="preserve">.</w:t>
       </w:r>
     </w:p>
     <w:p>
@@ -21023,7 +21023,7 @@
         </w:numPr>
       </w:pPr>
       <w:r>
-        <w:t xml:space="preserve">List, Board and Table views added for full work lists (Proposed).</w:t>
+        <w:t xml:space="preserve">Gap fixes (Proposed): updates to request senders, weekly summary for leaders, four standard reports with downloads, week status, leave requests and approval, repeating daily work (moved from a later stage into the first version), working offline and search.</w:t>
       </w:r>
     </w:p>
     <w:p>
@@ -21035,7 +21035,7 @@
         </w:numPr>
       </w:pPr>
       <w:r>
-        <w:t xml:space="preserve">Flow diagrams added: the life of a Task, a map of who starts which flow, Flows A–J, Board dragging, working offline, and signing in.</w:t>
+        <w:t xml:space="preserve">List, Board and Table views added for full work lists (Proposed).</w:t>
       </w:r>
     </w:p>
     <w:p>
@@ -21047,6 +21047,18 @@
         </w:numPr>
       </w:pPr>
       <w:r>
+        <w:t xml:space="preserve">Flow diagrams added: the life of a Task, a map of who starts which flow, Flows A–J, Board dragging, working offline, and signing in.</w:t>
+      </w:r>
+    </w:p>
+    <w:p>
+      <w:pPr>
+        <w:pStyle w:val="Compact"/>
+        <w:numPr>
+          <w:ilvl w:val="0"/>
+          <w:numId w:val="1044"/>
+        </w:numPr>
+      </w:pPr>
+      <w:r>
         <w:t xml:space="preserve">Rewritten in simple, everyday language. Words changed:</w:t>
       </w:r>
       <w:r>
@@ -21159,7 +21171,7 @@
         <w:t xml:space="preserve">HopFlows / End of Blueprint</w:t>
       </w:r>
     </w:p>
-    <w:bookmarkEnd w:id="2314"/>
+    <w:bookmarkEnd w:id="2462"/>
     <w:sectPr>
       <w:headerReference r:id="rId9" w:type="default"/>
       <w:footerReference r:id="rId10" w:type="default"/>
@@ -37664,6 +37676,232 @@
     <w:basedOn w:val="VerbatimChar"/>
     <w:rPr/>
   </w:style>
+  <w:style w:customStyle="1" w:styleId="KeywordTok" w:type="character">
+    <w:name w:val="KeywordTok"/>
+    <w:basedOn w:val="VerbatimChar"/>
+    <w:rPr>
+      <w:b/>
+      <w:color w:val="007020"/>
+    </w:rPr>
+  </w:style>
+  <w:style w:customStyle="1" w:styleId="DataTypeTok" w:type="character">
+    <w:name w:val="DataTypeTok"/>
+    <w:basedOn w:val="VerbatimChar"/>
+    <w:rPr>
+      <w:color w:val="902000"/>
+    </w:rPr>
+  </w:style>
+  <w:style w:customStyle="1" w:styleId="DecValTok" w:type="character">
+    <w:name w:val="DecValTok"/>
+    <w:basedOn w:val="VerbatimChar"/>
+    <w:rPr>
+      <w:color w:val="40a070"/>
+    </w:rPr>
+  </w:style>
+  <w:style w:customStyle="1" w:styleId="BaseNTok" w:type="character">
+    <w:name w:val="BaseNTok"/>
+    <w:basedOn w:val="VerbatimChar"/>
+    <w:rPr>
+      <w:color w:val="40a070"/>
+    </w:rPr>
+  </w:style>
+  <w:style w:customStyle="1" w:styleId="FloatTok" w:type="character">
+    <w:name w:val="FloatTok"/>
+    <w:basedOn w:val="VerbatimChar"/>
+    <w:rPr>
+      <w:color w:val="40a070"/>
+    </w:rPr>
+  </w:style>
+  <w:style w:customStyle="1" w:styleId="ConstantTok" w:type="character">
+    <w:name w:val="ConstantTok"/>
+    <w:basedOn w:val="VerbatimChar"/>
+    <w:rPr>
+      <w:color w:val="880000"/>
+    </w:rPr>
+  </w:style>
+  <w:style w:customStyle="1" w:styleId="CharTok" w:type="character">
+    <w:name w:val="CharTok"/>
+    <w:basedOn w:val="VerbatimChar"/>
+    <w:rPr>
+      <w:color w:val="4070a0"/>
+    </w:rPr>
+  </w:style>
+  <w:style w:customStyle="1" w:styleId="SpecialCharTok" w:type="character">
+    <w:name w:val="SpecialCharTok"/>
+    <w:basedOn w:val="VerbatimChar"/>
+    <w:rPr>
+      <w:color w:val="4070a0"/>
+    </w:rPr>
+  </w:style>
+  <w:style w:customStyle="1" w:styleId="StringTok" w:type="character">
+    <w:name w:val="StringTok"/>
+    <w:basedOn w:val="VerbatimChar"/>
+    <w:rPr>
+      <w:color w:val="4070a0"/>
+    </w:rPr>
+  </w:style>
+  <w:style w:customStyle="1" w:styleId="VerbatimStringTok" w:type="character">
+    <w:name w:val="VerbatimStringTok"/>
+    <w:basedOn w:val="VerbatimChar"/>
+    <w:rPr>
+      <w:color w:val="4070a0"/>
+    </w:rPr>
+  </w:style>
+  <w:style w:customStyle="1" w:styleId="SpecialStringTok" w:type="character">
+    <w:name w:val="SpecialStringTok"/>
+    <w:basedOn w:val="VerbatimChar"/>
+    <w:rPr>
+      <w:color w:val="bb6688"/>
+    </w:rPr>
+  </w:style>
+  <w:style w:customStyle="1" w:styleId="ImportTok" w:type="character">
+    <w:name w:val="ImportTok"/>
+    <w:basedOn w:val="VerbatimChar"/>
+    <w:rPr>
+      <w:b/>
+      <w:color w:val="008000"/>
+    </w:rPr>
+  </w:style>
+  <w:style w:customStyle="1" w:styleId="CommentTok" w:type="character">
+    <w:name w:val="CommentTok"/>
+    <w:basedOn w:val="VerbatimChar"/>
+    <w:rPr>
+      <w:i/>
+      <w:color w:val="60a0b0"/>
+    </w:rPr>
+  </w:style>
+  <w:style w:customStyle="1" w:styleId="DocumentationTok" w:type="character">
+    <w:name w:val="DocumentationTok"/>
+    <w:basedOn w:val="VerbatimChar"/>
+    <w:rPr>
+      <w:i/>
+      <w:color w:val="ba2121"/>
+    </w:rPr>
+  </w:style>
+  <w:style w:customStyle="1" w:styleId="AnnotationTok" w:type="character">
+    <w:name w:val="AnnotationTok"/>
+    <w:basedOn w:val="VerbatimChar"/>
+    <w:rPr>
+      <w:b/>
+      <w:i/>
+      <w:color w:val="60a0b0"/>
+    </w:rPr>
+  </w:style>
+  <w:style w:customStyle="1" w:styleId="CommentVarTok" w:type="character">
+    <w:name w:val="CommentVarTok"/>
+    <w:basedOn w:val="VerbatimChar"/>
+    <w:rPr>
+      <w:b/>
+      <w:i/>
+      <w:color w:val="60a0b0"/>
+    </w:rPr>
+  </w:style>
+  <w:style w:customStyle="1" w:styleId="OtherTok" w:type="character">
+    <w:name w:val="OtherTok"/>
+    <w:basedOn w:val="VerbatimChar"/>
+    <w:rPr>
+      <w:color w:val="007020"/>
+    </w:rPr>
+  </w:style>
+  <w:style w:customStyle="1" w:styleId="FunctionTok" w:type="character">
+    <w:name w:val="FunctionTok"/>
+    <w:basedOn w:val="VerbatimChar"/>
+    <w:rPr>
+      <w:color w:val="06287e"/>
+    </w:rPr>
+  </w:style>
+  <w:style w:customStyle="1" w:styleId="VariableTok" w:type="character">
+    <w:name w:val="VariableTok"/>
+    <w:basedOn w:val="VerbatimChar"/>
+    <w:rPr>
+      <w:color w:val="19177c"/>
+    </w:rPr>
+  </w:style>
+  <w:style w:customStyle="1" w:styleId="ControlFlowTok" w:type="character">
+    <w:name w:val="ControlFlowTok"/>
+    <w:basedOn w:val="VerbatimChar"/>
+    <w:rPr>
+      <w:b/>
+      <w:color w:val="007020"/>
+    </w:rPr>
+  </w:style>
+  <w:style w:customStyle="1" w:styleId="OperatorTok" w:type="character">
+    <w:name w:val="OperatorTok"/>
+    <w:basedOn w:val="VerbatimChar"/>
+    <w:rPr>
+      <w:color w:val="666666"/>
+    </w:rPr>
+  </w:style>
+  <w:style w:customStyle="1" w:styleId="BuiltInTok" w:type="character">
+    <w:name w:val="BuiltInTok"/>
+    <w:basedOn w:val="VerbatimChar"/>
+    <w:rPr>
+      <w:color w:val="008000"/>
+    </w:rPr>
+  </w:style>
+  <w:style w:customStyle="1" w:styleId="ExtensionTok" w:type="character">
+    <w:name w:val="ExtensionTok"/>
+    <w:basedOn w:val="VerbatimChar"/>
+    <w:rPr/>
+  </w:style>
+  <w:style w:customStyle="1" w:styleId="PreprocessorTok" w:type="character">
+    <w:name w:val="PreprocessorTok"/>
+    <w:basedOn w:val="VerbatimChar"/>
+    <w:rPr>
+      <w:color w:val="bc7a00"/>
+    </w:rPr>
+  </w:style>
+  <w:style w:customStyle="1" w:styleId="AttributeTok" w:type="character">
+    <w:name w:val="AttributeTok"/>
+    <w:basedOn w:val="VerbatimChar"/>
+    <w:rPr>
+      <w:color w:val="7d9029"/>
+    </w:rPr>
+  </w:style>
+  <w:style w:customStyle="1" w:styleId="RegionMarkerTok" w:type="character">
+    <w:name w:val="RegionMarkerTok"/>
+    <w:basedOn w:val="VerbatimChar"/>
+    <w:rPr/>
+  </w:style>
+  <w:style w:customStyle="1" w:styleId="InformationTok" w:type="character">
+    <w:name w:val="InformationTok"/>
+    <w:basedOn w:val="VerbatimChar"/>
+    <w:rPr>
+      <w:b/>
+      <w:i/>
+      <w:color w:val="60a0b0"/>
+    </w:rPr>
+  </w:style>
+  <w:style w:customStyle="1" w:styleId="WarningTok" w:type="character">
+    <w:name w:val="WarningTok"/>
+    <w:basedOn w:val="VerbatimChar"/>
+    <w:rPr>
+      <w:b/>
+      <w:i/>
+      <w:color w:val="60a0b0"/>
+    </w:rPr>
+  </w:style>
+  <w:style w:customStyle="1" w:styleId="AlertTok" w:type="character">
+    <w:name w:val="AlertTok"/>
+    <w:basedOn w:val="VerbatimChar"/>
+    <w:rPr>
+      <w:b/>
+      <w:color w:val="ff0000"/>
+    </w:rPr>
+  </w:style>
+  <w:style w:customStyle="1" w:styleId="ErrorTok" w:type="character">
+    <w:name w:val="ErrorTok"/>
+    <w:basedOn w:val="VerbatimChar"/>
+    <w:rPr>
+      <w:b/>
+      <w:color w:val="ff0000"/>
+    </w:rPr>
+  </w:style>
+  <w:style w:customStyle="1" w:styleId="NormalTok" w:type="character">
+    <w:name w:val="NormalTok"/>
+    <w:basedOn w:val="VerbatimChar"/>
+    <w:rPr/>
+  </w:style>
   <w:style w:type="character" w:customStyle="1" w:styleId="KeywordTok">
     <w:name w:val="KeywordTok"/>
     <w:basedOn w:val="VerbatimChar"/>

</xml_diff>

<commit_message>
Rebuild blueprint Word file; record canvas version 57
Co-Authored-By: Claude Opus 5.5 <noreply@anthropic.com>
</commit_message>
<xml_diff>
--- a/docs/HopFlows_Product_Blueprint_v1.1.docx
+++ b/docs/HopFlows_Product_Blueprint_v1.1.docx
@@ -4747,7 +4747,7 @@
     </w:p>
     <w:p>
       <w:pPr>
-        <w:pStyle w:val="BodyText"/>
+        <w:pStyle w:val="CaptionedFigure"/>
       </w:pPr>
       <w:r>
         <w:drawing>
@@ -4759,7 +4759,7 @@
               <a:graphicData uri="http://schemas.openxmlformats.org/drawingml/2006/picture">
                 <pic:pic>
                   <pic:nvPicPr>
-                    <pic:cNvPr descr="media/media/rId2195.png" id="2345" name="Picture"/>
+                    <pic:cNvPr descr="/private/tmp/claude-502/-Users-keanghok-Desktop-work-startup-hopflows-docs/3d393b65-89b1-46eb-9486-b2f325668eb0/scratchpad/docx/media/media/rId2195.png" id="2345" name="Picture"/>
                     <pic:cNvPicPr>
                       <a:picLocks noChangeArrowheads="1" noChangeAspect="1"/>
                     </pic:cNvPicPr>
@@ -4794,6 +4794,14 @@
     </w:p>
     <w:p>
       <w:pPr>
+        <w:pStyle w:val="ImageCaption"/>
+      </w:pPr>
+      <w:r>
+        <w:t xml:space="preserve">Diagram</w:t>
+      </w:r>
+    </w:p>
+    <w:p>
+      <w:pPr>
         <w:pStyle w:val="BodyText"/>
       </w:pPr>
       <w:r>
@@ -5515,7 +5523,7 @@
     </w:p>
     <w:p>
       <w:pPr>
-        <w:pStyle w:val="BodyText"/>
+        <w:pStyle w:val="CaptionedFigure"/>
       </w:pPr>
       <w:r>
         <w:drawing>
@@ -5527,7 +5535,7 @@
               <a:graphicData uri="http://schemas.openxmlformats.org/drawingml/2006/picture">
                 <pic:pic>
                   <pic:nvPicPr>
-                    <pic:cNvPr descr="media/media/rId2206.png" id="2356" name="Picture"/>
+                    <pic:cNvPr descr="/private/tmp/claude-502/-Users-keanghok-Desktop-work-startup-hopflows-docs/3d393b65-89b1-46eb-9486-b2f325668eb0/scratchpad/docx/media/media/rId2206.png" id="2356" name="Picture"/>
                     <pic:cNvPicPr>
                       <a:picLocks noChangeArrowheads="1" noChangeAspect="1"/>
                     </pic:cNvPicPr>
@@ -5562,6 +5570,14 @@
     </w:p>
     <w:p>
       <w:pPr>
+        <w:pStyle w:val="ImageCaption"/>
+      </w:pPr>
+      <w:r>
+        <w:t xml:space="preserve">Diagram</w:t>
+      </w:r>
+    </w:p>
+    <w:p>
+      <w:pPr>
         <w:pStyle w:val="BodyText"/>
       </w:pPr>
       <w:r>
@@ -5675,7 +5691,7 @@
     </w:p>
     <w:p>
       <w:pPr>
-        <w:pStyle w:val="FirstParagraph"/>
+        <w:pStyle w:val="CaptionedFigure"/>
       </w:pPr>
       <w:r>
         <w:drawing>
@@ -5687,7 +5703,7 @@
               <a:graphicData uri="http://schemas.openxmlformats.org/drawingml/2006/picture">
                 <pic:pic>
                   <pic:nvPicPr>
-                    <pic:cNvPr descr="media/media/rId2209.png" id="2359" name="Picture"/>
+                    <pic:cNvPr descr="/private/tmp/claude-502/-Users-keanghok-Desktop-work-startup-hopflows-docs/3d393b65-89b1-46eb-9486-b2f325668eb0/scratchpad/docx/media/media/rId2209.png" id="2359" name="Picture"/>
                     <pic:cNvPicPr>
                       <a:picLocks noChangeArrowheads="1" noChangeAspect="1"/>
                     </pic:cNvPicPr>
@@ -5722,6 +5738,14 @@
     </w:p>
     <w:p>
       <w:pPr>
+        <w:pStyle w:val="ImageCaption"/>
+      </w:pPr>
+      <w:r>
+        <w:t xml:space="preserve">Diagram</w:t>
+      </w:r>
+    </w:p>
+    <w:p>
+      <w:pPr>
         <w:pStyle w:val="BodyText"/>
       </w:pPr>
       <w:r>
@@ -5881,7 +5905,7 @@
     </w:p>
     <w:p>
       <w:pPr>
-        <w:pStyle w:val="FirstParagraph"/>
+        <w:pStyle w:val="CaptionedFigure"/>
       </w:pPr>
       <w:r>
         <w:drawing>
@@ -5893,7 +5917,7 @@
               <a:graphicData uri="http://schemas.openxmlformats.org/drawingml/2006/picture">
                 <pic:pic>
                   <pic:nvPicPr>
-                    <pic:cNvPr descr="media/media/rId2213.png" id="2363" name="Picture"/>
+                    <pic:cNvPr descr="/private/tmp/claude-502/-Users-keanghok-Desktop-work-startup-hopflows-docs/3d393b65-89b1-46eb-9486-b2f325668eb0/scratchpad/docx/media/media/rId2213.png" id="2363" name="Picture"/>
                     <pic:cNvPicPr>
                       <a:picLocks noChangeArrowheads="1" noChangeAspect="1"/>
                     </pic:cNvPicPr>
@@ -5928,6 +5952,14 @@
     </w:p>
     <w:p>
       <w:pPr>
+        <w:pStyle w:val="ImageCaption"/>
+      </w:pPr>
+      <w:r>
+        <w:t xml:space="preserve">Diagram</w:t>
+      </w:r>
+    </w:p>
+    <w:p>
+      <w:pPr>
         <w:pStyle w:val="BodyText"/>
       </w:pPr>
       <w:r>
@@ -5954,7 +5986,7 @@
     </w:p>
     <w:p>
       <w:pPr>
-        <w:pStyle w:val="BodyText"/>
+        <w:pStyle w:val="CaptionedFigure"/>
       </w:pPr>
       <w:r>
         <w:drawing>
@@ -5966,7 +5998,7 @@
               <a:graphicData uri="http://schemas.openxmlformats.org/drawingml/2006/picture">
                 <pic:pic>
                   <pic:nvPicPr>
-                    <pic:cNvPr descr="media/media/rId2217.png" id="2367" name="Picture"/>
+                    <pic:cNvPr descr="/private/tmp/claude-502/-Users-keanghok-Desktop-work-startup-hopflows-docs/3d393b65-89b1-46eb-9486-b2f325668eb0/scratchpad/docx/media/media/rId2217.png" id="2367" name="Picture"/>
                     <pic:cNvPicPr>
                       <a:picLocks noChangeArrowheads="1" noChangeAspect="1"/>
                     </pic:cNvPicPr>
@@ -6001,6 +6033,14 @@
     </w:p>
     <w:p>
       <w:pPr>
+        <w:pStyle w:val="ImageCaption"/>
+      </w:pPr>
+      <w:r>
+        <w:t xml:space="preserve">Diagram</w:t>
+      </w:r>
+    </w:p>
+    <w:p>
+      <w:pPr>
         <w:pStyle w:val="BodyText"/>
       </w:pPr>
       <w:r>
@@ -6133,7 +6173,7 @@
     </w:p>
     <w:p>
       <w:pPr>
-        <w:pStyle w:val="FirstParagraph"/>
+        <w:pStyle w:val="CaptionedFigure"/>
       </w:pPr>
       <w:r>
         <w:drawing>
@@ -6145,7 +6185,7 @@
               <a:graphicData uri="http://schemas.openxmlformats.org/drawingml/2006/picture">
                 <pic:pic>
                   <pic:nvPicPr>
-                    <pic:cNvPr descr="media/media/rId2221.png" id="2371" name="Picture"/>
+                    <pic:cNvPr descr="/private/tmp/claude-502/-Users-keanghok-Desktop-work-startup-hopflows-docs/3d393b65-89b1-46eb-9486-b2f325668eb0/scratchpad/docx/media/media/rId2221.png" id="2371" name="Picture"/>
                     <pic:cNvPicPr>
                       <a:picLocks noChangeArrowheads="1" noChangeAspect="1"/>
                     </pic:cNvPicPr>
@@ -6180,6 +6220,14 @@
     </w:p>
     <w:p>
       <w:pPr>
+        <w:pStyle w:val="ImageCaption"/>
+      </w:pPr>
+      <w:r>
+        <w:t xml:space="preserve">Diagram</w:t>
+      </w:r>
+    </w:p>
+    <w:p>
+      <w:pPr>
         <w:pStyle w:val="BodyText"/>
       </w:pPr>
       <w:r>
@@ -6229,7 +6277,28 @@
         </w:numPr>
       </w:pPr>
       <w:r>
-        <w:t xml:space="preserve">Each Goal shows the most serious flag from itself and its Deliverables. Leaders can filter Goals by flag, product and department, and see the reason and how long the flag has been there.</w:t>
+        <w:t xml:space="preserve">Each Goal shows the most serious flag from itself and its Deliverables. Leaders can filter Goals by flag, product and department, and see the reason and how long the flag has been there. On a Goal’s page the flag shows its reason, note, who set it and when, and the back-on-track date, with a button to ask that person for an update. Whether the result is on pace for its target is shown separately from the flag, so a Goal can read</w:t>
+      </w:r>
+      <w:r>
+        <w:t xml:space="preserve"> </w:t>
+      </w:r>
+      <w:r>
+        <w:t xml:space="preserve">“At risk · delivery”</w:t>
+      </w:r>
+      <w:r>
+        <w:t xml:space="preserve"> </w:t>
+      </w:r>
+      <w:r>
+        <w:t xml:space="preserve">next to</w:t>
+      </w:r>
+      <w:r>
+        <w:t xml:space="preserve"> </w:t>
+      </w:r>
+      <w:r>
+        <w:t xml:space="preserve">“Result ahead of pace”</w:t>
+      </w:r>
+      <w:r>
+        <w:t xml:space="preserve">.</w:t>
       </w:r>
     </w:p>
     <w:p>
@@ -6258,7 +6327,7 @@
     </w:p>
     <w:p>
       <w:pPr>
-        <w:pStyle w:val="FirstParagraph"/>
+        <w:pStyle w:val="CaptionedFigure"/>
       </w:pPr>
       <w:r>
         <w:drawing>
@@ -6270,7 +6339,7 @@
               <a:graphicData uri="http://schemas.openxmlformats.org/drawingml/2006/picture">
                 <pic:pic>
                   <pic:nvPicPr>
-                    <pic:cNvPr descr="media/media/rId2225.png" id="2375" name="Picture"/>
+                    <pic:cNvPr descr="/private/tmp/claude-502/-Users-keanghok-Desktop-work-startup-hopflows-docs/3d393b65-89b1-46eb-9486-b2f325668eb0/scratchpad/docx/media/media/rId2225.png" id="2375" name="Picture"/>
                     <pic:cNvPicPr>
                       <a:picLocks noChangeArrowheads="1" noChangeAspect="1"/>
                     </pic:cNvPicPr>
@@ -6305,6 +6374,14 @@
     </w:p>
     <w:p>
       <w:pPr>
+        <w:pStyle w:val="ImageCaption"/>
+      </w:pPr>
+      <w:r>
+        <w:t xml:space="preserve">Diagram</w:t>
+      </w:r>
+    </w:p>
+    <w:p>
+      <w:pPr>
         <w:pStyle w:val="BodyText"/>
       </w:pPr>
       <w:r>
@@ -6443,7 +6520,7 @@
     </w:p>
     <w:p>
       <w:pPr>
-        <w:pStyle w:val="FirstParagraph"/>
+        <w:pStyle w:val="CaptionedFigure"/>
       </w:pPr>
       <w:r>
         <w:drawing>
@@ -6455,7 +6532,7 @@
               <a:graphicData uri="http://schemas.openxmlformats.org/drawingml/2006/picture">
                 <pic:pic>
                   <pic:nvPicPr>
-                    <pic:cNvPr descr="media/media/rId2229.png" id="2379" name="Picture"/>
+                    <pic:cNvPr descr="/private/tmp/claude-502/-Users-keanghok-Desktop-work-startup-hopflows-docs/3d393b65-89b1-46eb-9486-b2f325668eb0/scratchpad/docx/media/media/rId2229.png" id="2379" name="Picture"/>
                     <pic:cNvPicPr>
                       <a:picLocks noChangeArrowheads="1" noChangeAspect="1"/>
                     </pic:cNvPicPr>
@@ -6490,6 +6567,14 @@
     </w:p>
     <w:p>
       <w:pPr>
+        <w:pStyle w:val="ImageCaption"/>
+      </w:pPr>
+      <w:r>
+        <w:t xml:space="preserve">Diagram</w:t>
+      </w:r>
+    </w:p>
+    <w:p>
+      <w:pPr>
         <w:pStyle w:val="BodyText"/>
       </w:pPr>
       <w:r>
@@ -6580,7 +6665,7 @@
     </w:p>
     <w:p>
       <w:pPr>
-        <w:pStyle w:val="FirstParagraph"/>
+        <w:pStyle w:val="CaptionedFigure"/>
       </w:pPr>
       <w:r>
         <w:drawing>
@@ -6592,7 +6677,7 @@
               <a:graphicData uri="http://schemas.openxmlformats.org/drawingml/2006/picture">
                 <pic:pic>
                   <pic:nvPicPr>
-                    <pic:cNvPr descr="media/media/rId2233.png" id="2383" name="Picture"/>
+                    <pic:cNvPr descr="/private/tmp/claude-502/-Users-keanghok-Desktop-work-startup-hopflows-docs/3d393b65-89b1-46eb-9486-b2f325668eb0/scratchpad/docx/media/media/rId2233.png" id="2383" name="Picture"/>
                     <pic:cNvPicPr>
                       <a:picLocks noChangeArrowheads="1" noChangeAspect="1"/>
                     </pic:cNvPicPr>
@@ -6627,6 +6712,14 @@
     </w:p>
     <w:p>
       <w:pPr>
+        <w:pStyle w:val="ImageCaption"/>
+      </w:pPr>
+      <w:r>
+        <w:t xml:space="preserve">Diagram</w:t>
+      </w:r>
+    </w:p>
+    <w:p>
+      <w:pPr>
         <w:pStyle w:val="BodyText"/>
       </w:pPr>
       <w:r>
@@ -6714,7 +6807,7 @@
     </w:p>
     <w:p>
       <w:pPr>
-        <w:pStyle w:val="FirstParagraph"/>
+        <w:pStyle w:val="CaptionedFigure"/>
       </w:pPr>
       <w:r>
         <w:drawing>
@@ -6726,7 +6819,7 @@
               <a:graphicData uri="http://schemas.openxmlformats.org/drawingml/2006/picture">
                 <pic:pic>
                   <pic:nvPicPr>
-                    <pic:cNvPr descr="media/media/rId2237.png" id="2387" name="Picture"/>
+                    <pic:cNvPr descr="/private/tmp/claude-502/-Users-keanghok-Desktop-work-startup-hopflows-docs/3d393b65-89b1-46eb-9486-b2f325668eb0/scratchpad/docx/media/media/rId2237.png" id="2387" name="Picture"/>
                     <pic:cNvPicPr>
                       <a:picLocks noChangeArrowheads="1" noChangeAspect="1"/>
                     </pic:cNvPicPr>
@@ -6761,6 +6854,14 @@
     </w:p>
     <w:p>
       <w:pPr>
+        <w:pStyle w:val="ImageCaption"/>
+      </w:pPr>
+      <w:r>
+        <w:t xml:space="preserve">Diagram</w:t>
+      </w:r>
+    </w:p>
+    <w:p>
+      <w:pPr>
         <w:pStyle w:val="BodyText"/>
       </w:pPr>
       <w:r>
@@ -6848,7 +6949,7 @@
     </w:p>
     <w:p>
       <w:pPr>
-        <w:pStyle w:val="FirstParagraph"/>
+        <w:pStyle w:val="CaptionedFigure"/>
       </w:pPr>
       <w:r>
         <w:drawing>
@@ -6860,7 +6961,7 @@
               <a:graphicData uri="http://schemas.openxmlformats.org/drawingml/2006/picture">
                 <pic:pic>
                   <pic:nvPicPr>
-                    <pic:cNvPr descr="media/media/rId2241.png" id="2391" name="Picture"/>
+                    <pic:cNvPr descr="/private/tmp/claude-502/-Users-keanghok-Desktop-work-startup-hopflows-docs/3d393b65-89b1-46eb-9486-b2f325668eb0/scratchpad/docx/media/media/rId2241.png" id="2391" name="Picture"/>
                     <pic:cNvPicPr>
                       <a:picLocks noChangeArrowheads="1" noChangeAspect="1"/>
                     </pic:cNvPicPr>
@@ -6895,6 +6996,14 @@
     </w:p>
     <w:p>
       <w:pPr>
+        <w:pStyle w:val="ImageCaption"/>
+      </w:pPr>
+      <w:r>
+        <w:t xml:space="preserve">Diagram</w:t>
+      </w:r>
+    </w:p>
+    <w:p>
+      <w:pPr>
         <w:pStyle w:val="BodyText"/>
       </w:pPr>
       <w:r>
@@ -6946,6 +7055,48 @@
       <w:r>
         <w:t xml:space="preserve">Each line opens the item in the app. The summary never shows individual Tasks or how busy individual people are.</w:t>
       </w:r>
+      <w:r>
+        <w:t xml:space="preserve"> </w:t>
+      </w:r>
+      <w:r>
+        <w:t xml:space="preserve">Each decision opens where it can be made. Decisions waiting are also the first thing on the leader’s Goals page:</w:t>
+      </w:r>
+    </w:p>
+    <w:p>
+      <w:pPr>
+        <w:pStyle w:val="Compact"/>
+        <w:numPr>
+          <w:ilvl w:val="1"/>
+          <w:numId w:val="1026"/>
+        </w:numPr>
+      </w:pPr>
+      <w:r>
+        <w:t xml:space="preserve">To approve a Goal, the leader sees its result, date, product, planned Deliverables and the proposer’s note, then picks Approve or Send back with a note.</w:t>
+      </w:r>
+    </w:p>
+    <w:p>
+      <w:pPr>
+        <w:pStyle w:val="Compact"/>
+        <w:numPr>
+          <w:ilvl w:val="1"/>
+          <w:numId w:val="1026"/>
+        </w:numPr>
+      </w:pPr>
+      <w:r>
+        <w:t xml:space="preserve">For a date-or-scope question, the leader sees both choices and what each one changes. The answer goes to the person who asked, and the risk flag stays until they update the plan.</w:t>
+      </w:r>
+    </w:p>
+    <w:p>
+      <w:pPr>
+        <w:pStyle w:val="Compact"/>
+        <w:numPr>
+          <w:ilvl w:val="1"/>
+          <w:numId w:val="1026"/>
+        </w:numPr>
+      </w:pPr>
+      <w:r>
+        <w:t xml:space="preserve">Each decision can be undone straight after it is made.</w:t>
+      </w:r>
     </w:p>
     <w:p>
       <w:pPr>
@@ -6961,7 +7112,7 @@
     </w:p>
     <w:p>
       <w:pPr>
-        <w:pStyle w:val="FirstParagraph"/>
+        <w:pStyle w:val="CaptionedFigure"/>
       </w:pPr>
       <w:r>
         <w:drawing>
@@ -6973,7 +7124,7 @@
               <a:graphicData uri="http://schemas.openxmlformats.org/drawingml/2006/picture">
                 <pic:pic>
                   <pic:nvPicPr>
-                    <pic:cNvPr descr="media/media/rId2245.png" id="2395" name="Picture"/>
+                    <pic:cNvPr descr="/private/tmp/claude-502/-Users-keanghok-Desktop-work-startup-hopflows-docs/3d393b65-89b1-46eb-9486-b2f325668eb0/scratchpad/docx/media/media/rId2245.png" id="2395" name="Picture"/>
                     <pic:cNvPicPr>
                       <a:picLocks noChangeArrowheads="1" noChangeAspect="1"/>
                     </pic:cNvPicPr>
@@ -7008,6 +7159,14 @@
     </w:p>
     <w:p>
       <w:pPr>
+        <w:pStyle w:val="ImageCaption"/>
+      </w:pPr>
+      <w:r>
+        <w:t xml:space="preserve">Diagram</w:t>
+      </w:r>
+    </w:p>
+    <w:p>
+      <w:pPr>
         <w:pStyle w:val="BodyText"/>
       </w:pPr>
       <w:r>
@@ -7466,7 +7625,7 @@
         <w:pStyle w:val="Compact"/>
         <w:numPr>
           <w:ilvl w:val="0"/>
-          <w:numId w:val="1026"/>
+          <w:numId w:val="1027"/>
         </w:numPr>
       </w:pPr>
       <w:r>
@@ -7490,7 +7649,7 @@
         <w:pStyle w:val="Compact"/>
         <w:numPr>
           <w:ilvl w:val="0"/>
-          <w:numId w:val="1026"/>
+          <w:numId w:val="1027"/>
         </w:numPr>
       </w:pPr>
       <w:r>
@@ -7502,7 +7661,7 @@
         <w:pStyle w:val="Compact"/>
         <w:numPr>
           <w:ilvl w:val="0"/>
-          <w:numId w:val="1026"/>
+          <w:numId w:val="1027"/>
         </w:numPr>
       </w:pPr>
       <w:r>
@@ -7538,7 +7697,7 @@
         <w:pStyle w:val="Compact"/>
         <w:numPr>
           <w:ilvl w:val="0"/>
-          <w:numId w:val="1026"/>
+          <w:numId w:val="1027"/>
         </w:numPr>
       </w:pPr>
       <w:r>
@@ -7574,7 +7733,7 @@
         <w:pStyle w:val="Compact"/>
         <w:numPr>
           <w:ilvl w:val="0"/>
-          <w:numId w:val="1026"/>
+          <w:numId w:val="1027"/>
         </w:numPr>
       </w:pPr>
       <w:r>
@@ -7634,7 +7793,7 @@
         <w:pStyle w:val="Compact"/>
         <w:numPr>
           <w:ilvl w:val="0"/>
-          <w:numId w:val="1026"/>
+          <w:numId w:val="1027"/>
         </w:numPr>
       </w:pPr>
       <w:r>
@@ -7646,7 +7805,7 @@
         <w:pStyle w:val="Compact"/>
         <w:numPr>
           <w:ilvl w:val="0"/>
-          <w:numId w:val="1026"/>
+          <w:numId w:val="1027"/>
         </w:numPr>
       </w:pPr>
       <w:r>
@@ -7658,7 +7817,7 @@
         <w:pStyle w:val="Compact"/>
         <w:numPr>
           <w:ilvl w:val="0"/>
-          <w:numId w:val="1026"/>
+          <w:numId w:val="1027"/>
         </w:numPr>
       </w:pPr>
       <w:r>
@@ -7670,7 +7829,7 @@
         <w:pStyle w:val="Compact"/>
         <w:numPr>
           <w:ilvl w:val="0"/>
-          <w:numId w:val="1026"/>
+          <w:numId w:val="1027"/>
         </w:numPr>
       </w:pPr>
       <w:r>
@@ -7682,7 +7841,7 @@
         <w:pStyle w:val="Compact"/>
         <w:numPr>
           <w:ilvl w:val="0"/>
-          <w:numId w:val="1026"/>
+          <w:numId w:val="1027"/>
         </w:numPr>
       </w:pPr>
       <w:r>
@@ -7694,7 +7853,7 @@
         <w:pStyle w:val="Compact"/>
         <w:numPr>
           <w:ilvl w:val="0"/>
-          <w:numId w:val="1026"/>
+          <w:numId w:val="1027"/>
         </w:numPr>
       </w:pPr>
       <w:r>
@@ -7901,7 +8060,7 @@
         <w:pStyle w:val="Compact"/>
         <w:numPr>
           <w:ilvl w:val="0"/>
-          <w:numId w:val="1027"/>
+          <w:numId w:val="1028"/>
         </w:numPr>
       </w:pPr>
       <w:r>
@@ -7932,7 +8091,7 @@
         <w:pStyle w:val="Compact"/>
         <w:numPr>
           <w:ilvl w:val="0"/>
-          <w:numId w:val="1027"/>
+          <w:numId w:val="1028"/>
         </w:numPr>
       </w:pPr>
       <w:r>
@@ -7954,7 +8113,7 @@
         <w:pStyle w:val="Compact"/>
         <w:numPr>
           <w:ilvl w:val="0"/>
-          <w:numId w:val="1027"/>
+          <w:numId w:val="1028"/>
         </w:numPr>
       </w:pPr>
       <w:r>
@@ -7976,7 +8135,7 @@
         <w:pStyle w:val="Compact"/>
         <w:numPr>
           <w:ilvl w:val="0"/>
-          <w:numId w:val="1027"/>
+          <w:numId w:val="1028"/>
         </w:numPr>
       </w:pPr>
       <w:r>
@@ -7998,7 +8157,7 @@
         <w:pStyle w:val="Compact"/>
         <w:numPr>
           <w:ilvl w:val="0"/>
-          <w:numId w:val="1027"/>
+          <w:numId w:val="1028"/>
         </w:numPr>
       </w:pPr>
       <w:r>
@@ -8020,7 +8179,7 @@
         <w:pStyle w:val="Compact"/>
         <w:numPr>
           <w:ilvl w:val="0"/>
-          <w:numId w:val="1027"/>
+          <w:numId w:val="1028"/>
         </w:numPr>
       </w:pPr>
       <w:r>
@@ -8042,7 +8201,7 @@
         <w:pStyle w:val="Compact"/>
         <w:numPr>
           <w:ilvl w:val="0"/>
-          <w:numId w:val="1027"/>
+          <w:numId w:val="1028"/>
         </w:numPr>
       </w:pPr>
       <w:r>
@@ -8064,7 +8223,7 @@
         <w:pStyle w:val="Compact"/>
         <w:numPr>
           <w:ilvl w:val="0"/>
-          <w:numId w:val="1027"/>
+          <w:numId w:val="1028"/>
         </w:numPr>
       </w:pPr>
       <w:r>
@@ -8083,7 +8242,7 @@
     </w:p>
     <w:p>
       <w:pPr>
-        <w:pStyle w:val="FirstParagraph"/>
+        <w:pStyle w:val="CaptionedFigure"/>
       </w:pPr>
       <w:r>
         <w:drawing>
@@ -8095,7 +8254,7 @@
               <a:graphicData uri="http://schemas.openxmlformats.org/drawingml/2006/picture">
                 <pic:pic>
                   <pic:nvPicPr>
-                    <pic:cNvPr descr="media/media/rId2252.png" id="2402" name="Picture"/>
+                    <pic:cNvPr descr="/private/tmp/claude-502/-Users-keanghok-Desktop-work-startup-hopflows-docs/3d393b65-89b1-46eb-9486-b2f325668eb0/scratchpad/docx/media/media/rId2252.png" id="2402" name="Picture"/>
                     <pic:cNvPicPr>
                       <a:picLocks noChangeArrowheads="1" noChangeAspect="1"/>
                     </pic:cNvPicPr>
@@ -8130,6 +8289,14 @@
     </w:p>
     <w:p>
       <w:pPr>
+        <w:pStyle w:val="ImageCaption"/>
+      </w:pPr>
+      <w:r>
+        <w:t xml:space="preserve">Diagram</w:t>
+      </w:r>
+    </w:p>
+    <w:p>
+      <w:pPr>
         <w:pStyle w:val="BodyText"/>
       </w:pPr>
       <w:r>
@@ -8397,7 +8564,7 @@
         <w:pStyle w:val="Compact"/>
         <w:numPr>
           <w:ilvl w:val="0"/>
-          <w:numId w:val="1028"/>
+          <w:numId w:val="1029"/>
         </w:numPr>
       </w:pPr>
       <w:r>
@@ -8409,7 +8576,7 @@
         <w:pStyle w:val="Compact"/>
         <w:numPr>
           <w:ilvl w:val="0"/>
-          <w:numId w:val="1028"/>
+          <w:numId w:val="1029"/>
         </w:numPr>
       </w:pPr>
       <w:r>
@@ -8421,7 +8588,7 @@
         <w:pStyle w:val="Compact"/>
         <w:numPr>
           <w:ilvl w:val="0"/>
-          <w:numId w:val="1028"/>
+          <w:numId w:val="1029"/>
         </w:numPr>
       </w:pPr>
       <w:r>
@@ -8433,7 +8600,7 @@
         <w:pStyle w:val="Compact"/>
         <w:numPr>
           <w:ilvl w:val="0"/>
-          <w:numId w:val="1028"/>
+          <w:numId w:val="1029"/>
         </w:numPr>
       </w:pPr>
       <w:r>
@@ -8457,7 +8624,7 @@
         <w:pStyle w:val="Compact"/>
         <w:numPr>
           <w:ilvl w:val="0"/>
-          <w:numId w:val="1028"/>
+          <w:numId w:val="1029"/>
         </w:numPr>
       </w:pPr>
       <w:r>
@@ -8481,7 +8648,7 @@
         <w:pStyle w:val="Compact"/>
         <w:numPr>
           <w:ilvl w:val="0"/>
-          <w:numId w:val="1028"/>
+          <w:numId w:val="1029"/>
         </w:numPr>
       </w:pPr>
       <w:r>
@@ -8511,7 +8678,7 @@
         <w:pStyle w:val="Compact"/>
         <w:numPr>
           <w:ilvl w:val="0"/>
-          <w:numId w:val="1028"/>
+          <w:numId w:val="1029"/>
         </w:numPr>
       </w:pPr>
       <w:r>
@@ -8523,7 +8690,7 @@
         <w:pStyle w:val="Compact"/>
         <w:numPr>
           <w:ilvl w:val="0"/>
-          <w:numId w:val="1028"/>
+          <w:numId w:val="1029"/>
         </w:numPr>
       </w:pPr>
       <w:r>
@@ -8535,7 +8702,7 @@
         <w:pStyle w:val="Compact"/>
         <w:numPr>
           <w:ilvl w:val="0"/>
-          <w:numId w:val="1028"/>
+          <w:numId w:val="1029"/>
         </w:numPr>
       </w:pPr>
       <w:r>
@@ -8769,7 +8936,7 @@
         <w:pStyle w:val="Compact"/>
         <w:numPr>
           <w:ilvl w:val="0"/>
-          <w:numId w:val="1029"/>
+          <w:numId w:val="1030"/>
         </w:numPr>
       </w:pPr>
       <w:r>
@@ -8793,7 +8960,7 @@
         <w:pStyle w:val="Compact"/>
         <w:numPr>
           <w:ilvl w:val="0"/>
-          <w:numId w:val="1029"/>
+          <w:numId w:val="1030"/>
         </w:numPr>
       </w:pPr>
       <w:r>
@@ -8805,7 +8972,7 @@
         <w:pStyle w:val="Compact"/>
         <w:numPr>
           <w:ilvl w:val="0"/>
-          <w:numId w:val="1029"/>
+          <w:numId w:val="1030"/>
         </w:numPr>
       </w:pPr>
       <w:r>
@@ -8829,7 +8996,7 @@
         <w:pStyle w:val="Compact"/>
         <w:numPr>
           <w:ilvl w:val="0"/>
-          <w:numId w:val="1029"/>
+          <w:numId w:val="1030"/>
         </w:numPr>
       </w:pPr>
       <w:r>
@@ -8841,7 +9008,7 @@
         <w:pStyle w:val="Compact"/>
         <w:numPr>
           <w:ilvl w:val="0"/>
-          <w:numId w:val="1029"/>
+          <w:numId w:val="1030"/>
         </w:numPr>
       </w:pPr>
       <w:r>
@@ -9115,7 +9282,7 @@
         <w:pStyle w:val="Compact"/>
         <w:numPr>
           <w:ilvl w:val="0"/>
-          <w:numId w:val="1030"/>
+          <w:numId w:val="1031"/>
         </w:numPr>
       </w:pPr>
       <w:r>
@@ -9127,7 +9294,7 @@
         <w:pStyle w:val="Compact"/>
         <w:numPr>
           <w:ilvl w:val="0"/>
-          <w:numId w:val="1030"/>
+          <w:numId w:val="1031"/>
         </w:numPr>
       </w:pPr>
       <w:r>
@@ -9139,7 +9306,7 @@
         <w:pStyle w:val="Compact"/>
         <w:numPr>
           <w:ilvl w:val="0"/>
-          <w:numId w:val="1030"/>
+          <w:numId w:val="1031"/>
         </w:numPr>
       </w:pPr>
       <w:r>
@@ -9163,7 +9330,7 @@
         <w:pStyle w:val="Compact"/>
         <w:numPr>
           <w:ilvl w:val="0"/>
-          <w:numId w:val="1030"/>
+          <w:numId w:val="1031"/>
         </w:numPr>
       </w:pPr>
       <w:r>
@@ -9175,7 +9342,7 @@
         <w:pStyle w:val="Compact"/>
         <w:numPr>
           <w:ilvl w:val="0"/>
-          <w:numId w:val="1030"/>
+          <w:numId w:val="1031"/>
         </w:numPr>
       </w:pPr>
       <w:r>
@@ -9910,81 +10077,11 @@
         <w:pStyle w:val="Compact"/>
         <w:numPr>
           <w:ilvl w:val="0"/>
-          <w:numId w:val="1031"/>
+          <w:numId w:val="1032"/>
         </w:numPr>
       </w:pPr>
       <w:r>
         <w:t xml:space="preserve">Morning summary: one message at the summary time (see §14), in the person’s time zone, on working days. It lists the top three priorities, today’s meetings, deadlines in the next two days and upcoming holidays. No summary on holidays or leave.</w:t>
-      </w:r>
-    </w:p>
-    <w:p>
-      <w:pPr>
-        <w:pStyle w:val="Compact"/>
-        <w:numPr>
-          <w:ilvl w:val="0"/>
-          <w:numId w:val="1031"/>
-        </w:numPr>
-      </w:pPr>
-      <w:r>
-        <w:t xml:space="preserve">Fun, not noisy: a friendly Punh Punh voice, a little emoji and short celebrations for finished work and team milestones, in English by default, with other languages as they are added. Celebrations follow the rules in §11 (only for real finished work, team before individual, no rankings in group chats). Urgent alerts are always plain and clear.</w:t>
-      </w:r>
-    </w:p>
-    <w:p>
-      <w:pPr>
-        <w:pStyle w:val="Compact"/>
-        <w:numPr>
-          <w:ilvl w:val="0"/>
-          <w:numId w:val="1031"/>
-        </w:numPr>
-      </w:pPr>
-      <w:r>
-        <w:t xml:space="preserve">Hard to miss: urgent alerts have their own sound, are never bundled, and ignore quiet hours (see §14). Everything else waits.</w:t>
-      </w:r>
-    </w:p>
-    <w:p>
-      <w:pPr>
-        <w:pStyle w:val="Compact"/>
-        <w:numPr>
-          <w:ilvl w:val="0"/>
-          <w:numId w:val="1031"/>
-        </w:numPr>
-      </w:pPr>
-      <w:r>
-        <w:t xml:space="preserve">Daily push limit: there’s a limit on normal push alerts per person per day (see §14). Extra alerts go to the Inbox and the next morning summary. Urgent alerts have no limit.</w:t>
-      </w:r>
-    </w:p>
-    <w:p>
-      <w:pPr>
-        <w:pStyle w:val="Compact"/>
-        <w:numPr>
-          <w:ilvl w:val="0"/>
-          <w:numId w:val="1031"/>
-        </w:numPr>
-      </w:pPr>
-      <w:r>
-        <w:t xml:space="preserve">Each person picks channels for each kind of alert. The company sets the starting choices and can turn a channel off or limit what outside apps receive.</w:t>
-      </w:r>
-    </w:p>
-    <w:p>
-      <w:pPr>
-        <w:pStyle w:val="Compact"/>
-        <w:numPr>
-          <w:ilvl w:val="0"/>
-          <w:numId w:val="1031"/>
-        </w:numPr>
-      </w:pPr>
-      <w:r>
-        <w:t xml:space="preserve">Chat apps (Telegram, Slack and Microsoft Teams, later stage) will all use the same messages, buttons and team chat settings.</w:t>
-      </w:r>
-    </w:p>
-    <w:bookmarkEnd w:id="2407"/>
-    <w:bookmarkStart w:id="2408" w:name="search-proposed"/>
-    <w:p>
-      <w:pPr>
-        <w:pStyle w:val="Heading2"/>
-      </w:pPr>
-      <w:r>
-        <w:t xml:space="preserve">Search (Proposed)</w:t>
       </w:r>
     </w:p>
     <w:p>
@@ -9996,7 +10093,7 @@
         </w:numPr>
       </w:pPr>
       <w:r>
-        <w:t xml:space="preserve">One search box at the top of every screen finds Tasks, Deliverables, Goals, requests, routines, people and events.</w:t>
+        <w:t xml:space="preserve">Fun, not noisy: a friendly Punh Punh voice, a little emoji and short celebrations for finished work and team milestones, in English by default, with other languages as they are added. Celebrations follow the rules in §11 (only for real finished work, team before individual, no rankings in group chats). Urgent alerts are always plain and clear.</w:t>
       </w:r>
     </w:p>
     <w:p>
@@ -10008,7 +10105,7 @@
         </w:numPr>
       </w:pPr>
       <w:r>
-        <w:t xml:space="preserve">Before typing, it shows recently opened items and the person’s own open work, so most of the time no typing is needed.</w:t>
+        <w:t xml:space="preserve">Hard to miss: urgent alerts have their own sound, are never bundled, and ignore quiet hours (see §14). Everything else waits.</w:t>
       </w:r>
     </w:p>
     <w:p>
@@ -10020,7 +10117,7 @@
         </w:numPr>
       </w:pPr>
       <w:r>
-        <w:t xml:space="preserve">Results are grouped by type, show status and owner, and can be filtered by type, status, person, department and date.</w:t>
+        <w:t xml:space="preserve">Daily push limit: there’s a limit on normal push alerts per person per day (see §14). Extra alerts go to the Inbox and the next morning summary. Urgent alerts have no limit.</w:t>
       </w:r>
     </w:p>
     <w:p>
@@ -10032,19 +10129,7 @@
         </w:numPr>
       </w:pPr>
       <w:r>
-        <w:t xml:space="preserve">Results follow the</w:t>
-      </w:r>
-      <w:r>
-        <w:t xml:space="preserve"> </w:t>
-      </w:r>
-      <w:r>
-        <w:t xml:space="preserve">“who can see it”</w:t>
-      </w:r>
-      <w:r>
-        <w:t xml:space="preserve"> </w:t>
-      </w:r>
-      <w:r>
-        <w:t xml:space="preserve">rules: a Confidential Task appears only to people allowed to see it.</w:t>
+        <w:t xml:space="preserve">Each person picks channels for each kind of alert. The company sets the starting choices and can turn a channel off or limit what outside apps receive.</w:t>
       </w:r>
     </w:p>
     <w:p>
@@ -10056,25 +10141,17 @@
         </w:numPr>
       </w:pPr>
       <w:r>
-        <w:t xml:space="preserve">Without internet, search looks through the items saved on the phone, and says so.</w:t>
-      </w:r>
-    </w:p>
-    <w:bookmarkEnd w:id="2408"/>
-    <w:bookmarkStart w:id="2412" w:name="working-offline-proposed"/>
+        <w:t xml:space="preserve">Chat apps (Telegram, Slack and Microsoft Teams, later stage) will all use the same messages, buttons and team chat settings.</w:t>
+      </w:r>
+    </w:p>
+    <w:bookmarkEnd w:id="2407"/>
+    <w:bookmarkStart w:id="2408" w:name="search-proposed"/>
     <w:p>
       <w:pPr>
         <w:pStyle w:val="Heading2"/>
       </w:pPr>
       <w:r>
-        <w:t xml:space="preserve">Working offline (Proposed)</w:t>
-      </w:r>
-    </w:p>
-    <w:p>
-      <w:pPr>
-        <w:pStyle w:val="FirstParagraph"/>
-      </w:pPr>
-      <w:r>
-        <w:t xml:space="preserve">The mobile app is built for weak internet. Without a connection, a person can:</w:t>
+        <w:t xml:space="preserve">Search (Proposed)</w:t>
       </w:r>
     </w:p>
     <w:p>
@@ -10086,7 +10163,7 @@
         </w:numPr>
       </w:pPr>
       <w:r>
-        <w:t xml:space="preserve">Open Today, Routine today, their Tasks, the calendar for the next seven days and recent search results.</w:t>
+        <w:t xml:space="preserve">One search box at the top of every screen finds Tasks, Deliverables, Goals, requests, routines, people and events.</w:t>
       </w:r>
     </w:p>
     <w:p>
@@ -10098,7 +10175,7 @@
         </w:numPr>
       </w:pPr>
       <w:r>
-        <w:t xml:space="preserve">Use Add Work (with photos) and request leave.</w:t>
+        <w:t xml:space="preserve">Before typing, it shows recently opened items and the person’s own open work, so most of the time no typing is needed.</w:t>
       </w:r>
     </w:p>
     <w:p>
@@ -10110,6 +10187,96 @@
         </w:numPr>
       </w:pPr>
       <w:r>
+        <w:t xml:space="preserve">Results are grouped by type, show status and owner, and can be filtered by type, status, person, department and date.</w:t>
+      </w:r>
+    </w:p>
+    <w:p>
+      <w:pPr>
+        <w:pStyle w:val="Compact"/>
+        <w:numPr>
+          <w:ilvl w:val="0"/>
+          <w:numId w:val="1033"/>
+        </w:numPr>
+      </w:pPr>
+      <w:r>
+        <w:t xml:space="preserve">Results follow the</w:t>
+      </w:r>
+      <w:r>
+        <w:t xml:space="preserve"> </w:t>
+      </w:r>
+      <w:r>
+        <w:t xml:space="preserve">“who can see it”</w:t>
+      </w:r>
+      <w:r>
+        <w:t xml:space="preserve"> </w:t>
+      </w:r>
+      <w:r>
+        <w:t xml:space="preserve">rules: a Confidential Task appears only to people allowed to see it.</w:t>
+      </w:r>
+    </w:p>
+    <w:p>
+      <w:pPr>
+        <w:pStyle w:val="Compact"/>
+        <w:numPr>
+          <w:ilvl w:val="0"/>
+          <w:numId w:val="1033"/>
+        </w:numPr>
+      </w:pPr>
+      <w:r>
+        <w:t xml:space="preserve">Without internet, search looks through the items saved on the phone, and says so.</w:t>
+      </w:r>
+    </w:p>
+    <w:bookmarkEnd w:id="2408"/>
+    <w:bookmarkStart w:id="2412" w:name="working-offline-proposed"/>
+    <w:p>
+      <w:pPr>
+        <w:pStyle w:val="Heading2"/>
+      </w:pPr>
+      <w:r>
+        <w:t xml:space="preserve">Working offline (Proposed)</w:t>
+      </w:r>
+    </w:p>
+    <w:p>
+      <w:pPr>
+        <w:pStyle w:val="FirstParagraph"/>
+      </w:pPr>
+      <w:r>
+        <w:t xml:space="preserve">The mobile app is built for weak internet. Without a connection, a person can:</w:t>
+      </w:r>
+    </w:p>
+    <w:p>
+      <w:pPr>
+        <w:pStyle w:val="Compact"/>
+        <w:numPr>
+          <w:ilvl w:val="0"/>
+          <w:numId w:val="1034"/>
+        </w:numPr>
+      </w:pPr>
+      <w:r>
+        <w:t xml:space="preserve">Open Today, Routine today, their Tasks, the calendar for the next seven days and recent search results.</w:t>
+      </w:r>
+    </w:p>
+    <w:p>
+      <w:pPr>
+        <w:pStyle w:val="Compact"/>
+        <w:numPr>
+          <w:ilvl w:val="0"/>
+          <w:numId w:val="1034"/>
+        </w:numPr>
+      </w:pPr>
+      <w:r>
+        <w:t xml:space="preserve">Use Add Work (with photos) and request leave.</w:t>
+      </w:r>
+    </w:p>
+    <w:p>
+      <w:pPr>
+        <w:pStyle w:val="Compact"/>
+        <w:numPr>
+          <w:ilvl w:val="0"/>
+          <w:numId w:val="1034"/>
+        </w:numPr>
+      </w:pPr>
+      <w:r>
         <w:t xml:space="preserve">Start a Task, mark it Done, tick checklist steps and finish routines.</w:t>
       </w:r>
     </w:p>
@@ -10132,7 +10299,7 @@
     </w:p>
     <w:p>
       <w:pPr>
-        <w:pStyle w:val="BodyText"/>
+        <w:pStyle w:val="CaptionedFigure"/>
       </w:pPr>
       <w:r>
         <w:drawing>
@@ -10144,7 +10311,7 @@
               <a:graphicData uri="http://schemas.openxmlformats.org/drawingml/2006/picture">
                 <pic:pic>
                   <pic:nvPicPr>
-                    <pic:cNvPr descr="media/media/rId2261.png" id="2411" name="Picture"/>
+                    <pic:cNvPr descr="/private/tmp/claude-502/-Users-keanghok-Desktop-work-startup-hopflows-docs/3d393b65-89b1-46eb-9486-b2f325668eb0/scratchpad/docx/media/media/rId2261.png" id="2411" name="Picture"/>
                     <pic:cNvPicPr>
                       <a:picLocks noChangeArrowheads="1" noChangeAspect="1"/>
                     </pic:cNvPicPr>
@@ -10179,6 +10346,14 @@
     </w:p>
     <w:p>
       <w:pPr>
+        <w:pStyle w:val="ImageCaption"/>
+      </w:pPr>
+      <w:r>
+        <w:t xml:space="preserve">Diagram</w:t>
+      </w:r>
+    </w:p>
+    <w:p>
+      <w:pPr>
         <w:pStyle w:val="BodyText"/>
       </w:pPr>
       <w:r>
@@ -12670,7 +12845,7 @@
         <w:pStyle w:val="Compact"/>
         <w:numPr>
           <w:ilvl w:val="0"/>
-          <w:numId w:val="1034"/>
+          <w:numId w:val="1035"/>
         </w:numPr>
       </w:pPr>
       <w:r>
@@ -12682,7 +12857,7 @@
         <w:pStyle w:val="Compact"/>
         <w:numPr>
           <w:ilvl w:val="0"/>
-          <w:numId w:val="1034"/>
+          <w:numId w:val="1035"/>
         </w:numPr>
       </w:pPr>
       <w:r>
@@ -12694,7 +12869,7 @@
         <w:pStyle w:val="Compact"/>
         <w:numPr>
           <w:ilvl w:val="0"/>
-          <w:numId w:val="1034"/>
+          <w:numId w:val="1035"/>
         </w:numPr>
       </w:pPr>
       <w:r>
@@ -12706,7 +12881,7 @@
         <w:pStyle w:val="Compact"/>
         <w:numPr>
           <w:ilvl w:val="0"/>
-          <w:numId w:val="1034"/>
+          <w:numId w:val="1035"/>
         </w:numPr>
       </w:pPr>
       <w:r>
@@ -12718,7 +12893,7 @@
         <w:pStyle w:val="Compact"/>
         <w:numPr>
           <w:ilvl w:val="0"/>
-          <w:numId w:val="1034"/>
+          <w:numId w:val="1035"/>
         </w:numPr>
       </w:pPr>
       <w:r>
@@ -12981,7 +13156,7 @@
         <w:pStyle w:val="Compact"/>
         <w:numPr>
           <w:ilvl w:val="0"/>
-          <w:numId w:val="1035"/>
+          <w:numId w:val="1036"/>
         </w:numPr>
       </w:pPr>
       <w:r>
@@ -12993,7 +13168,7 @@
         <w:pStyle w:val="Compact"/>
         <w:numPr>
           <w:ilvl w:val="0"/>
-          <w:numId w:val="1035"/>
+          <w:numId w:val="1036"/>
         </w:numPr>
       </w:pPr>
       <w:r>
@@ -13005,7 +13180,7 @@
         <w:pStyle w:val="Compact"/>
         <w:numPr>
           <w:ilvl w:val="0"/>
-          <w:numId w:val="1035"/>
+          <w:numId w:val="1036"/>
         </w:numPr>
       </w:pPr>
       <w:r>
@@ -13573,7 +13748,7 @@
         <w:pStyle w:val="Compact"/>
         <w:numPr>
           <w:ilvl w:val="0"/>
-          <w:numId w:val="1036"/>
+          <w:numId w:val="1037"/>
         </w:numPr>
       </w:pPr>
       <w:r>
@@ -13585,7 +13760,7 @@
         <w:pStyle w:val="Compact"/>
         <w:numPr>
           <w:ilvl w:val="0"/>
-          <w:numId w:val="1036"/>
+          <w:numId w:val="1037"/>
         </w:numPr>
       </w:pPr>
       <w:r>
@@ -13597,7 +13772,7 @@
         <w:pStyle w:val="Compact"/>
         <w:numPr>
           <w:ilvl w:val="0"/>
-          <w:numId w:val="1036"/>
+          <w:numId w:val="1037"/>
         </w:numPr>
       </w:pPr>
       <w:r>
@@ -13609,7 +13784,7 @@
         <w:pStyle w:val="Compact"/>
         <w:numPr>
           <w:ilvl w:val="0"/>
-          <w:numId w:val="1036"/>
+          <w:numId w:val="1037"/>
         </w:numPr>
       </w:pPr>
       <w:r>
@@ -13628,7 +13803,7 @@
     </w:p>
     <w:p>
       <w:pPr>
-        <w:pStyle w:val="FirstParagraph"/>
+        <w:pStyle w:val="CaptionedFigure"/>
       </w:pPr>
       <w:r>
         <w:drawing>
@@ -13675,6 +13850,14 @@
     </w:p>
     <w:p>
       <w:pPr>
+        <w:pStyle w:val="ImageCaption"/>
+      </w:pPr>
+      <w:r>
+        <w:t xml:space="preserve">HopFlows app icon: Punh Punh leaning in beside a checklist on a sky tile</w:t>
+      </w:r>
+    </w:p>
+    <w:p>
+      <w:pPr>
         <w:pStyle w:val="BodyText"/>
       </w:pPr>
       <w:r>
@@ -13711,7 +13894,7 @@
         <w:pStyle w:val="Compact"/>
         <w:numPr>
           <w:ilvl w:val="0"/>
-          <w:numId w:val="1037"/>
+          <w:numId w:val="1038"/>
         </w:numPr>
       </w:pPr>
       <w:r>
@@ -13723,7 +13906,7 @@
         <w:pStyle w:val="Compact"/>
         <w:numPr>
           <w:ilvl w:val="0"/>
-          <w:numId w:val="1037"/>
+          <w:numId w:val="1038"/>
         </w:numPr>
       </w:pPr>
       <w:r>
@@ -13735,7 +13918,7 @@
         <w:pStyle w:val="Compact"/>
         <w:numPr>
           <w:ilvl w:val="0"/>
-          <w:numId w:val="1037"/>
+          <w:numId w:val="1038"/>
         </w:numPr>
       </w:pPr>
       <w:r>
@@ -13747,7 +13930,7 @@
         <w:pStyle w:val="Compact"/>
         <w:numPr>
           <w:ilvl w:val="0"/>
-          <w:numId w:val="1037"/>
+          <w:numId w:val="1038"/>
         </w:numPr>
       </w:pPr>
       <w:r>
@@ -13759,7 +13942,7 @@
         <w:pStyle w:val="Compact"/>
         <w:numPr>
           <w:ilvl w:val="0"/>
-          <w:numId w:val="1037"/>
+          <w:numId w:val="1038"/>
         </w:numPr>
       </w:pPr>
       <w:r>
@@ -14069,7 +14252,7 @@
         <w:pStyle w:val="Compact"/>
         <w:numPr>
           <w:ilvl w:val="0"/>
-          <w:numId w:val="1038"/>
+          <w:numId w:val="1039"/>
         </w:numPr>
       </w:pPr>
       <w:r>
@@ -14081,7 +14264,7 @@
         <w:pStyle w:val="Compact"/>
         <w:numPr>
           <w:ilvl w:val="0"/>
-          <w:numId w:val="1038"/>
+          <w:numId w:val="1039"/>
         </w:numPr>
       </w:pPr>
       <w:r>
@@ -14093,7 +14276,7 @@
         <w:pStyle w:val="Compact"/>
         <w:numPr>
           <w:ilvl w:val="0"/>
-          <w:numId w:val="1038"/>
+          <w:numId w:val="1039"/>
         </w:numPr>
       </w:pPr>
       <w:r>
@@ -17156,7 +17339,7 @@
         <w:pStyle w:val="Compact"/>
         <w:numPr>
           <w:ilvl w:val="0"/>
-          <w:numId w:val="1039"/>
+          <w:numId w:val="1040"/>
         </w:numPr>
       </w:pPr>
       <w:r>
@@ -17168,7 +17351,7 @@
         <w:pStyle w:val="Compact"/>
         <w:numPr>
           <w:ilvl w:val="0"/>
-          <w:numId w:val="1039"/>
+          <w:numId w:val="1040"/>
         </w:numPr>
       </w:pPr>
       <w:r>
@@ -17180,7 +17363,7 @@
         <w:pStyle w:val="Compact"/>
         <w:numPr>
           <w:ilvl w:val="0"/>
-          <w:numId w:val="1039"/>
+          <w:numId w:val="1040"/>
         </w:numPr>
       </w:pPr>
       <w:r>
@@ -17192,7 +17375,7 @@
         <w:pStyle w:val="Compact"/>
         <w:numPr>
           <w:ilvl w:val="0"/>
-          <w:numId w:val="1039"/>
+          <w:numId w:val="1040"/>
         </w:numPr>
       </w:pPr>
       <w:r>
@@ -17204,7 +17387,7 @@
         <w:pStyle w:val="Compact"/>
         <w:numPr>
           <w:ilvl w:val="0"/>
-          <w:numId w:val="1039"/>
+          <w:numId w:val="1040"/>
         </w:numPr>
       </w:pPr>
       <w:r>
@@ -17216,7 +17399,7 @@
         <w:pStyle w:val="Compact"/>
         <w:numPr>
           <w:ilvl w:val="0"/>
-          <w:numId w:val="1039"/>
+          <w:numId w:val="1040"/>
         </w:numPr>
       </w:pPr>
       <w:r>
@@ -17228,7 +17411,7 @@
         <w:pStyle w:val="Compact"/>
         <w:numPr>
           <w:ilvl w:val="0"/>
-          <w:numId w:val="1039"/>
+          <w:numId w:val="1040"/>
         </w:numPr>
       </w:pPr>
       <w:r>
@@ -17240,7 +17423,7 @@
         <w:pStyle w:val="Compact"/>
         <w:numPr>
           <w:ilvl w:val="0"/>
-          <w:numId w:val="1039"/>
+          <w:numId w:val="1040"/>
         </w:numPr>
       </w:pPr>
       <w:r>
@@ -17252,7 +17435,7 @@
         <w:pStyle w:val="Compact"/>
         <w:numPr>
           <w:ilvl w:val="0"/>
-          <w:numId w:val="1039"/>
+          <w:numId w:val="1040"/>
         </w:numPr>
       </w:pPr>
       <w:r>
@@ -20185,7 +20368,7 @@
         <w:pStyle w:val="Compact"/>
         <w:numPr>
           <w:ilvl w:val="0"/>
-          <w:numId w:val="1040"/>
+          <w:numId w:val="1041"/>
         </w:numPr>
       </w:pPr>
       <w:r>
@@ -20197,7 +20380,7 @@
         <w:pStyle w:val="Compact"/>
         <w:numPr>
           <w:ilvl w:val="0"/>
-          <w:numId w:val="1040"/>
+          <w:numId w:val="1041"/>
         </w:numPr>
       </w:pPr>
       <w:r>
@@ -20209,7 +20392,7 @@
         <w:pStyle w:val="Compact"/>
         <w:numPr>
           <w:ilvl w:val="0"/>
-          <w:numId w:val="1040"/>
+          <w:numId w:val="1041"/>
         </w:numPr>
       </w:pPr>
       <w:r>
@@ -20221,7 +20404,7 @@
         <w:pStyle w:val="Compact"/>
         <w:numPr>
           <w:ilvl w:val="0"/>
-          <w:numId w:val="1040"/>
+          <w:numId w:val="1041"/>
         </w:numPr>
       </w:pPr>
       <w:r>
@@ -20242,7 +20425,7 @@
     </w:p>
     <w:p>
       <w:pPr>
-        <w:pStyle w:val="FirstParagraph"/>
+        <w:pStyle w:val="CaptionedFigure"/>
       </w:pPr>
       <w:r>
         <w:drawing>
@@ -20254,7 +20437,7 @@
               <a:graphicData uri="http://schemas.openxmlformats.org/drawingml/2006/picture">
                 <pic:pic>
                   <pic:nvPicPr>
-                    <pic:cNvPr descr="media/media/rId2307.png" id="2457" name="Picture"/>
+                    <pic:cNvPr descr="/private/tmp/claude-502/-Users-keanghok-Desktop-work-startup-hopflows-docs/3d393b65-89b1-46eb-9486-b2f325668eb0/scratchpad/docx/media/media/rId2307.png" id="2457" name="Picture"/>
                     <pic:cNvPicPr>
                       <a:picLocks noChangeArrowheads="1" noChangeAspect="1"/>
                     </pic:cNvPicPr>
@@ -20289,6 +20472,14 @@
     </w:p>
     <w:p>
       <w:pPr>
+        <w:pStyle w:val="ImageCaption"/>
+      </w:pPr>
+      <w:r>
+        <w:t xml:space="preserve">Diagram</w:t>
+      </w:r>
+    </w:p>
+    <w:p>
+      <w:pPr>
         <w:pStyle w:val="BodyText"/>
       </w:pPr>
       <w:r>
@@ -20327,7 +20518,7 @@
         <w:pStyle w:val="Compact"/>
         <w:numPr>
           <w:ilvl w:val="0"/>
-          <w:numId w:val="1041"/>
+          <w:numId w:val="1042"/>
         </w:numPr>
       </w:pPr>
       <w:r>
@@ -20349,7 +20540,7 @@
         <w:pStyle w:val="Compact"/>
         <w:numPr>
           <w:ilvl w:val="0"/>
-          <w:numId w:val="1041"/>
+          <w:numId w:val="1042"/>
         </w:numPr>
       </w:pPr>
       <w:r>
@@ -20383,7 +20574,7 @@
         <w:pStyle w:val="Compact"/>
         <w:numPr>
           <w:ilvl w:val="0"/>
-          <w:numId w:val="1041"/>
+          <w:numId w:val="1042"/>
         </w:numPr>
       </w:pPr>
       <w:r>
@@ -20405,7 +20596,7 @@
         <w:pStyle w:val="Compact"/>
         <w:numPr>
           <w:ilvl w:val="0"/>
-          <w:numId w:val="1041"/>
+          <w:numId w:val="1042"/>
         </w:numPr>
       </w:pPr>
       <w:r>
@@ -20427,7 +20618,7 @@
         <w:pStyle w:val="Compact"/>
         <w:numPr>
           <w:ilvl w:val="0"/>
-          <w:numId w:val="1041"/>
+          <w:numId w:val="1042"/>
         </w:numPr>
       </w:pPr>
       <w:r>
@@ -20449,7 +20640,7 @@
         <w:pStyle w:val="Compact"/>
         <w:numPr>
           <w:ilvl w:val="0"/>
-          <w:numId w:val="1042"/>
+          <w:numId w:val="1043"/>
         </w:numPr>
       </w:pPr>
       <w:r>
@@ -20478,64 +20669,6 @@
       </w:r>
       <w:r>
         <w:t xml:space="preserve">card stays on the admin’s home screen until all five are done.</w:t>
-      </w:r>
-    </w:p>
-    <w:p>
-      <w:pPr>
-        <w:pStyle w:val="Compact"/>
-        <w:numPr>
-          <w:ilvl w:val="0"/>
-          <w:numId w:val="1042"/>
-        </w:numPr>
-      </w:pPr>
-      <w:r>
-        <w:t xml:space="preserve">Nothing is sent before step 5, so the team gets their invites together and nobody signs in to an empty company.</w:t>
-      </w:r>
-    </w:p>
-    <w:p>
-      <w:pPr>
-        <w:pStyle w:val="Compact"/>
-        <w:numPr>
-          <w:ilvl w:val="0"/>
-          <w:numId w:val="1042"/>
-        </w:numPr>
-      </w:pPr>
-      <w:r>
-        <w:t xml:space="preserve">Everything set here can be changed later in Admin: People, Holiday calendars, and Products &amp; teams.</w:t>
-      </w:r>
-    </w:p>
-    <w:p>
-      <w:pPr>
-        <w:pStyle w:val="Compact"/>
-        <w:numPr>
-          <w:ilvl w:val="0"/>
-          <w:numId w:val="1042"/>
-        </w:numPr>
-      </w:pPr>
-      <w:r>
-        <w:t xml:space="preserve">After the invites: employees see First steps with Punh Punh, then Today; leads also see</w:t>
-      </w:r>
-      <w:r>
-        <w:t xml:space="preserve"> </w:t>
-      </w:r>
-      <w:r>
-        <w:t xml:space="preserve">“Plan week”</w:t>
-      </w:r>
-      <w:r>
-        <w:t xml:space="preserve"> </w:t>
-      </w:r>
-      <w:r>
-        <w:t xml:space="preserve">on Needs you.</w:t>
-      </w:r>
-    </w:p>
-    <w:bookmarkEnd w:id="2459"/>
-    <w:bookmarkStart w:id="2460" w:name="looking-after-data"/>
-    <w:p>
-      <w:pPr>
-        <w:pStyle w:val="Heading2"/>
-      </w:pPr>
-      <w:r>
-        <w:t xml:space="preserve">Looking after data</w:t>
       </w:r>
     </w:p>
     <w:p>
@@ -20547,7 +20680,7 @@
         </w:numPr>
       </w:pPr>
       <w:r>
-        <w:t xml:space="preserve">History is never edited. If a person asks for their data to be deleted, their profile is removed and their name in the history is replaced with a made-up name, so reports still add up.</w:t>
+        <w:t xml:space="preserve">Nothing is sent before step 5, so the team gets their invites together and nobody signs in to an empty company.</w:t>
       </w:r>
     </w:p>
     <w:p>
@@ -20559,7 +20692,7 @@
         </w:numPr>
       </w:pPr>
       <w:r>
-        <w:t xml:space="preserve">History and locked plans are kept while the company uses HopFlows. A company can download its data, and ask for it to be deleted when it leaves.</w:t>
+        <w:t xml:space="preserve">Everything set here can be changed later in Admin: People, Holiday calendars, and Products &amp; teams.</w:t>
       </w:r>
     </w:p>
     <w:p>
@@ -20571,7 +20704,29 @@
         </w:numPr>
       </w:pPr>
       <w:r>
-        <w:t xml:space="preserve">Telegram and other chat apps are outside services: they get only the information allowed in §05, and the company can turn any channel off.</w:t>
+        <w:t xml:space="preserve">After the invites: employees see First steps with Punh Punh, then Today; leads also see</w:t>
+      </w:r>
+      <w:r>
+        <w:t xml:space="preserve"> </w:t>
+      </w:r>
+      <w:r>
+        <w:t xml:space="preserve">“Plan week”</w:t>
+      </w:r>
+      <w:r>
+        <w:t xml:space="preserve"> </w:t>
+      </w:r>
+      <w:r>
+        <w:t xml:space="preserve">on Needs you.</w:t>
+      </w:r>
+    </w:p>
+    <w:bookmarkEnd w:id="2459"/>
+    <w:bookmarkStart w:id="2460" w:name="looking-after-data"/>
+    <w:p>
+      <w:pPr>
+        <w:pStyle w:val="Heading2"/>
+      </w:pPr>
+      <w:r>
+        <w:t xml:space="preserve">Looking after data</w:t>
       </w:r>
     </w:p>
     <w:p>
@@ -20579,7 +20734,43 @@
         <w:pStyle w:val="Compact"/>
         <w:numPr>
           <w:ilvl w:val="0"/>
-          <w:numId w:val="1043"/>
+          <w:numId w:val="1044"/>
+        </w:numPr>
+      </w:pPr>
+      <w:r>
+        <w:t xml:space="preserve">History is never edited. If a person asks for their data to be deleted, their profile is removed and their name in the history is replaced with a made-up name, so reports still add up.</w:t>
+      </w:r>
+    </w:p>
+    <w:p>
+      <w:pPr>
+        <w:pStyle w:val="Compact"/>
+        <w:numPr>
+          <w:ilvl w:val="0"/>
+          <w:numId w:val="1044"/>
+        </w:numPr>
+      </w:pPr>
+      <w:r>
+        <w:t xml:space="preserve">History and locked plans are kept while the company uses HopFlows. A company can download its data, and ask for it to be deleted when it leaves.</w:t>
+      </w:r>
+    </w:p>
+    <w:p>
+      <w:pPr>
+        <w:pStyle w:val="Compact"/>
+        <w:numPr>
+          <w:ilvl w:val="0"/>
+          <w:numId w:val="1044"/>
+        </w:numPr>
+      </w:pPr>
+      <w:r>
+        <w:t xml:space="preserve">Telegram and other chat apps are outside services: they get only the information allowed in §05, and the company can turn any channel off.</w:t>
+      </w:r>
+    </w:p>
+    <w:p>
+      <w:pPr>
+        <w:pStyle w:val="Compact"/>
+        <w:numPr>
+          <w:ilvl w:val="0"/>
+          <w:numId w:val="1044"/>
         </w:numPr>
       </w:pPr>
       <w:r>
@@ -20614,7 +20805,7 @@
         <w:pStyle w:val="Compact"/>
         <w:numPr>
           <w:ilvl w:val="0"/>
-          <w:numId w:val="1044"/>
+          <w:numId w:val="1045"/>
         </w:numPr>
       </w:pPr>
       <w:r>
@@ -20626,7 +20817,7 @@
         <w:pStyle w:val="Compact"/>
         <w:numPr>
           <w:ilvl w:val="0"/>
-          <w:numId w:val="1044"/>
+          <w:numId w:val="1045"/>
         </w:numPr>
       </w:pPr>
       <w:r>
@@ -20638,7 +20829,7 @@
         <w:pStyle w:val="Compact"/>
         <w:numPr>
           <w:ilvl w:val="0"/>
-          <w:numId w:val="1044"/>
+          <w:numId w:val="1045"/>
         </w:numPr>
       </w:pPr>
       <w:r>
@@ -20656,7 +20847,7 @@
         <w:pStyle w:val="Compact"/>
         <w:numPr>
           <w:ilvl w:val="0"/>
-          <w:numId w:val="1044"/>
+          <w:numId w:val="1045"/>
         </w:numPr>
       </w:pPr>
       <w:r>
@@ -20677,7 +20868,7 @@
         <w:pStyle w:val="Compact"/>
         <w:numPr>
           <w:ilvl w:val="0"/>
-          <w:numId w:val="1044"/>
+          <w:numId w:val="1045"/>
         </w:numPr>
       </w:pPr>
       <w:r>
@@ -20689,7 +20880,7 @@
         <w:pStyle w:val="Compact"/>
         <w:numPr>
           <w:ilvl w:val="0"/>
-          <w:numId w:val="1044"/>
+          <w:numId w:val="1045"/>
         </w:numPr>
       </w:pPr>
       <w:r>
@@ -20716,7 +20907,7 @@
         <w:pStyle w:val="Compact"/>
         <w:numPr>
           <w:ilvl w:val="0"/>
-          <w:numId w:val="1044"/>
+          <w:numId w:val="1045"/>
         </w:numPr>
       </w:pPr>
       <w:r>
@@ -20734,7 +20925,7 @@
         <w:pStyle w:val="Compact"/>
         <w:numPr>
           <w:ilvl w:val="0"/>
-          <w:numId w:val="1044"/>
+          <w:numId w:val="1045"/>
         </w:numPr>
       </w:pPr>
       <w:r>
@@ -20746,7 +20937,7 @@
         <w:pStyle w:val="Compact"/>
         <w:numPr>
           <w:ilvl w:val="0"/>
-          <w:numId w:val="1044"/>
+          <w:numId w:val="1045"/>
         </w:numPr>
       </w:pPr>
       <w:r>
@@ -20758,7 +20949,7 @@
         <w:pStyle w:val="Compact"/>
         <w:numPr>
           <w:ilvl w:val="0"/>
-          <w:numId w:val="1044"/>
+          <w:numId w:val="1045"/>
         </w:numPr>
       </w:pPr>
       <w:r>
@@ -20770,7 +20961,7 @@
         <w:pStyle w:val="Compact"/>
         <w:numPr>
           <w:ilvl w:val="0"/>
-          <w:numId w:val="1044"/>
+          <w:numId w:val="1045"/>
         </w:numPr>
       </w:pPr>
       <w:r>
@@ -20782,7 +20973,7 @@
         <w:pStyle w:val="Compact"/>
         <w:numPr>
           <w:ilvl w:val="0"/>
-          <w:numId w:val="1044"/>
+          <w:numId w:val="1045"/>
         </w:numPr>
       </w:pPr>
       <w:r>
@@ -20794,11 +20985,11 @@
         <w:pStyle w:val="Compact"/>
         <w:numPr>
           <w:ilvl w:val="0"/>
-          <w:numId w:val="1044"/>
+          <w:numId w:val="1045"/>
         </w:numPr>
       </w:pPr>
       <w:r>
-        <w:t xml:space="preserve">After the fifth lead-flow review (Proposed): Handover can put an item back in Ready to plan with no owner; hours are always written as planned of time to plan (21 October).</w:t>
+        <w:t xml:space="preserve">After the first leader-flow review (Proposed): decisions waiting open in place on the Goals page and from the weekly summary, with Approve or Send back for a Goal and a choice of date or scope for an off-track Deliverable; a Goal’s page shows why it is flagged (reason, note, who set it and when, back-on-track date) with a way to ask for an update, and keeps whether the result is on pace apart from whether delivery is at risk (21 October).</w:t>
       </w:r>
     </w:p>
     <w:p>
@@ -20806,11 +20997,11 @@
         <w:pStyle w:val="Compact"/>
         <w:numPr>
           <w:ilvl w:val="0"/>
-          <w:numId w:val="1044"/>
+          <w:numId w:val="1045"/>
         </w:numPr>
       </w:pPr>
       <w:r>
-        <w:t xml:space="preserve">After the fourth lead-flow review (Proposed): the locked plan counts waiting leave and open handovers, so every screen shows week 43 as it will really look; work can still be moved after locking and is recorded as a change (21 October).</w:t>
+        <w:t xml:space="preserve">After the fifth lead-flow review (Proposed): Handover can put an item back in Ready to plan with no owner; hours are always written as planned of time to plan (21 October).</w:t>
       </w:r>
     </w:p>
     <w:p>
@@ -20818,11 +21009,11 @@
         <w:pStyle w:val="Compact"/>
         <w:numPr>
           <w:ilvl w:val="0"/>
-          <w:numId w:val="1044"/>
+          <w:numId w:val="1045"/>
         </w:numPr>
       </w:pPr>
       <w:r>
-        <w:t xml:space="preserve">After the third lead-flow review (Proposed): the lock check lets the lead move an overloaded person’s work in place; the weekly plan keeps one list of the week’s changes; Handover receivers are picked per item with the load after the move; a postponed request gets a return date (20 October).</w:t>
+        <w:t xml:space="preserve">After the fourth lead-flow review (Proposed): the locked plan counts waiting leave and open handovers, so every screen shows week 43 as it will really look; work can still be moved after locking and is recorded as a change (21 October).</w:t>
       </w:r>
     </w:p>
     <w:p>
@@ -20830,11 +21021,11 @@
         <w:pStyle w:val="Compact"/>
         <w:numPr>
           <w:ilvl w:val="0"/>
-          <w:numId w:val="1044"/>
+          <w:numId w:val="1045"/>
         </w:numPr>
       </w:pPr>
       <w:r>
-        <w:t xml:space="preserve">After the second lead-flow review (Proposed): every place that moves work to someone shows how busy they would be after the move and suggests whoever has the most room; a request that looks like an open Task starts on Merge; a handover can be undone for 10 minutes (20 October).</w:t>
+        <w:t xml:space="preserve">After the third lead-flow review (Proposed): the lock check lets the lead move an overloaded person’s work in place; the weekly plan keeps one list of the week’s changes; Handover receivers are picked per item with the load after the move; a postponed request gets a return date (20 October).</w:t>
       </w:r>
     </w:p>
     <w:p>
@@ -20842,11 +21033,11 @@
         <w:pStyle w:val="Compact"/>
         <w:numPr>
           <w:ilvl w:val="0"/>
-          <w:numId w:val="1044"/>
+          <w:numId w:val="1045"/>
         </w:numPr>
       </w:pPr>
       <w:r>
-        <w:t xml:space="preserve">Mascot renamed from Hop to Punh Punh (14 October).</w:t>
+        <w:t xml:space="preserve">After the second lead-flow review (Proposed): every place that moves work to someone shows how busy they would be after the move and suggests whoever has the most room; a request that looks like an open Task starts on Merge; a handover can be undone for 10 minutes (20 October).</w:t>
       </w:r>
     </w:p>
     <w:p>
@@ -20854,11 +21045,11 @@
         <w:pStyle w:val="Compact"/>
         <w:numPr>
           <w:ilvl w:val="0"/>
-          <w:numId w:val="1044"/>
+          <w:numId w:val="1045"/>
         </w:numPr>
       </w:pPr>
       <w:r>
-        <w:t xml:space="preserve">App icon chosen: Punh Checklist, with usage rules in §11 (15 October).</w:t>
+        <w:t xml:space="preserve">Mascot renamed from Hop to Punh Punh (14 October).</w:t>
       </w:r>
     </w:p>
     <w:p>
@@ -20866,32 +21057,11 @@
         <w:pStyle w:val="Compact"/>
         <w:numPr>
           <w:ilvl w:val="0"/>
-          <w:numId w:val="1044"/>
+          <w:numId w:val="1045"/>
         </w:numPr>
       </w:pPr>
       <w:r>
-        <w:t xml:space="preserve">First version split into</w:t>
-      </w:r>
-      <w:r>
-        <w:t xml:space="preserve"> </w:t>
-      </w:r>
-      <w:r>
-        <w:t xml:space="preserve">“pilot core”</w:t>
-      </w:r>
-      <w:r>
-        <w:t xml:space="preserve"> </w:t>
-      </w:r>
-      <w:r>
-        <w:t xml:space="preserve">and</w:t>
-      </w:r>
-      <w:r>
-        <w:t xml:space="preserve"> </w:t>
-      </w:r>
-      <w:r>
-        <w:t xml:space="preserve">“soon after”</w:t>
-      </w:r>
-      <w:r>
-        <w:t xml:space="preserve">; later-stage features (Workload view for future weeks, temporary Handover, suggested risk flags) marked in the flows and special cases.</w:t>
+        <w:t xml:space="preserve">App icon chosen: Punh Checklist, with usage rules in §11 (15 October).</w:t>
       </w:r>
     </w:p>
     <w:p>
@@ -20899,11 +21069,32 @@
         <w:pStyle w:val="Compact"/>
         <w:numPr>
           <w:ilvl w:val="0"/>
-          <w:numId w:val="1044"/>
+          <w:numId w:val="1045"/>
         </w:numPr>
       </w:pPr>
       <w:r>
-        <w:t xml:space="preserve">Rules for statuses, Confidential Task access, review and blocked markers, giving rights to named people, work schedules, time split across departments, task sizes, time zones, sorting and postponing requests.</w:t>
+        <w:t xml:space="preserve">First version split into</w:t>
+      </w:r>
+      <w:r>
+        <w:t xml:space="preserve"> </w:t>
+      </w:r>
+      <w:r>
+        <w:t xml:space="preserve">“pilot core”</w:t>
+      </w:r>
+      <w:r>
+        <w:t xml:space="preserve"> </w:t>
+      </w:r>
+      <w:r>
+        <w:t xml:space="preserve">and</w:t>
+      </w:r>
+      <w:r>
+        <w:t xml:space="preserve"> </w:t>
+      </w:r>
+      <w:r>
+        <w:t xml:space="preserve">“soon after”</w:t>
+      </w:r>
+      <w:r>
+        <w:t xml:space="preserve">; later-stage features (Workload view for future weeks, temporary Handover, suggested risk flags) marked in the flows and special cases.</w:t>
       </w:r>
     </w:p>
     <w:p>
@@ -20911,11 +21102,11 @@
         <w:pStyle w:val="Compact"/>
         <w:numPr>
           <w:ilvl w:val="0"/>
-          <w:numId w:val="1044"/>
+          <w:numId w:val="1045"/>
         </w:numPr>
       </w:pPr>
       <w:r>
-        <w:t xml:space="preserve">Rules for carrying work over, weeks never locked, clearing flags, who gets urgent alerts next, snooze, people in several companies, handover receivers and overlapping time off.</w:t>
+        <w:t xml:space="preserve">Rules for statuses, Confidential Task access, review and blocked markers, giving rights to named people, work schedules, time split across departments, task sizes, time zones, sorting and postponing requests.</w:t>
       </w:r>
     </w:p>
     <w:p>
@@ -20923,11 +21114,11 @@
         <w:pStyle w:val="Compact"/>
         <w:numPr>
           <w:ilvl w:val="0"/>
-          <w:numId w:val="1044"/>
+          <w:numId w:val="1045"/>
         </w:numPr>
       </w:pPr>
       <w:r>
-        <w:t xml:space="preserve">Measures, time words and pilot targets written out.</w:t>
+        <w:t xml:space="preserve">Rules for carrying work over, weeks never locked, clearing flags, who gets urgent alerts next, snooze, people in several companies, handover receivers and overlapping time off.</w:t>
       </w:r>
     </w:p>
     <w:p>
@@ -20935,11 +21126,11 @@
         <w:pStyle w:val="Compact"/>
         <w:numPr>
           <w:ilvl w:val="0"/>
-          <w:numId w:val="1044"/>
+          <w:numId w:val="1045"/>
         </w:numPr>
       </w:pPr>
       <w:r>
-        <w:t xml:space="preserve">The streak no longer counts just starting work.</w:t>
+        <w:t xml:space="preserve">Measures, time words and pilot targets written out.</w:t>
       </w:r>
     </w:p>
     <w:p>
@@ -20947,11 +21138,11 @@
         <w:pStyle w:val="Compact"/>
         <w:numPr>
           <w:ilvl w:val="0"/>
-          <w:numId w:val="1044"/>
+          <w:numId w:val="1045"/>
         </w:numPr>
       </w:pPr>
       <w:r>
-        <w:t xml:space="preserve">Special cases grouped by topic; all default numbers kept in §14; the life of a Task moved before planning.</w:t>
+        <w:t xml:space="preserve">The streak no longer counts just starting work.</w:t>
       </w:r>
     </w:p>
     <w:p>
@@ -20959,11 +21150,11 @@
         <w:pStyle w:val="Compact"/>
         <w:numPr>
           <w:ilvl w:val="0"/>
-          <w:numId w:val="1044"/>
+          <w:numId w:val="1045"/>
         </w:numPr>
       </w:pPr>
       <w:r>
-        <w:t xml:space="preserve">New §15 Sign-in, access and data.</w:t>
+        <w:t xml:space="preserve">Special cases grouped by topic; all default numbers kept in §14; the life of a Task moved before planning.</w:t>
       </w:r>
     </w:p>
     <w:p>
@@ -20971,23 +21162,11 @@
         <w:pStyle w:val="Compact"/>
         <w:numPr>
           <w:ilvl w:val="0"/>
-          <w:numId w:val="1044"/>
+          <w:numId w:val="1045"/>
         </w:numPr>
       </w:pPr>
       <w:r>
-        <w:t xml:space="preserve">Words on screen: Add Work (employees), Incoming Queue and Sort (leads);</w:t>
-      </w:r>
-      <w:r>
-        <w:t xml:space="preserve"> </w:t>
-      </w:r>
-      <w:r>
-        <w:t xml:space="preserve">“intake”</w:t>
-      </w:r>
-      <w:r>
-        <w:t xml:space="preserve"> </w:t>
-      </w:r>
-      <w:r>
-        <w:t xml:space="preserve">only in reports.</w:t>
+        <w:t xml:space="preserve">New §15 Sign-in, access and data.</w:t>
       </w:r>
     </w:p>
     <w:p>
@@ -20995,7 +21174,31 @@
         <w:pStyle w:val="Compact"/>
         <w:numPr>
           <w:ilvl w:val="0"/>
-          <w:numId w:val="1044"/>
+          <w:numId w:val="1045"/>
+        </w:numPr>
+      </w:pPr>
+      <w:r>
+        <w:t xml:space="preserve">Words on screen: Add Work (employees), Incoming Queue and Sort (leads);</w:t>
+      </w:r>
+      <w:r>
+        <w:t xml:space="preserve"> </w:t>
+      </w:r>
+      <w:r>
+        <w:t xml:space="preserve">“intake”</w:t>
+      </w:r>
+      <w:r>
+        <w:t xml:space="preserve"> </w:t>
+      </w:r>
+      <w:r>
+        <w:t xml:space="preserve">only in reports.</w:t>
+      </w:r>
+    </w:p>
+    <w:p>
+      <w:pPr>
+        <w:pStyle w:val="Compact"/>
+        <w:numPr>
+          <w:ilvl w:val="0"/>
+          <w:numId w:val="1045"/>
         </w:numPr>
       </w:pPr>
       <w:r>
@@ -21019,7 +21222,7 @@
         <w:pStyle w:val="Compact"/>
         <w:numPr>
           <w:ilvl w:val="0"/>
-          <w:numId w:val="1044"/>
+          <w:numId w:val="1045"/>
         </w:numPr>
       </w:pPr>
       <w:r>
@@ -21031,7 +21234,7 @@
         <w:pStyle w:val="Compact"/>
         <w:numPr>
           <w:ilvl w:val="0"/>
-          <w:numId w:val="1044"/>
+          <w:numId w:val="1045"/>
         </w:numPr>
       </w:pPr>
       <w:r>
@@ -21043,7 +21246,7 @@
         <w:pStyle w:val="Compact"/>
         <w:numPr>
           <w:ilvl w:val="0"/>
-          <w:numId w:val="1044"/>
+          <w:numId w:val="1045"/>
         </w:numPr>
       </w:pPr>
       <w:r>
@@ -21055,7 +21258,7 @@
         <w:pStyle w:val="Compact"/>
         <w:numPr>
           <w:ilvl w:val="0"/>
-          <w:numId w:val="1044"/>
+          <w:numId w:val="1045"/>
         </w:numPr>
       </w:pPr>
       <w:r>
@@ -22134,6 +22337,9 @@
     <w:abstractNumId w:val="991"/>
   </w:num>
   <w:num w:numId="1041">
+    <w:abstractNumId w:val="991"/>
+  </w:num>
+  <w:num w:numId="1042">
     <w:abstractNumId w:val="99411"/>
     <w:lvlOverride w:ilvl="0">
       <w:startOverride w:val="1"/>
@@ -22163,13 +22369,13 @@
       <w:startOverride w:val="1"/>
     </w:lvlOverride>
   </w:num>
-  <w:num w:numId="1042">
-    <w:abstractNumId w:val="991"/>
-  </w:num>
   <w:num w:numId="1043">
     <w:abstractNumId w:val="991"/>
   </w:num>
   <w:num w:numId="1044">
+    <w:abstractNumId w:val="991"/>
+  </w:num>
+  <w:num w:numId="1045">
     <w:abstractNumId w:val="991"/>
   </w:num>
 </w:numbering>

</xml_diff>

<commit_message>
Rebuild blueprint Word file; record canvas version 58
Co-Authored-By: Claude Opus 5.5 <noreply@anthropic.com>
</commit_message>
<xml_diff>
--- a/docs/HopFlows_Product_Blueprint_v1.1.docx
+++ b/docs/HopFlows_Product_Blueprint_v1.1.docx
@@ -20978,6 +20978,18 @@
       </w:pPr>
       <w:r>
         <w:t xml:space="preserve">After the lead-flow review (Proposed): approving leave first shows its effect on the person’s week and lets the approver give away or move the Tasks due then; locking a week warns about leave requests still waiting but allows the lock; Handover warns when a receiver is on leave (20 October).</w:t>
+      </w:r>
+    </w:p>
+    <w:p>
+      <w:pPr>
+        <w:pStyle w:val="Compact"/>
+        <w:numPr>
+          <w:ilvl w:val="0"/>
+          <w:numId w:val="1045"/>
+        </w:numPr>
+      </w:pPr>
+      <w:r>
+        <w:t xml:space="preserve">After the second pass on the leader flow (Proposed): Goals can be filtered by flag, product and department; the weekly summary keeps a list of earlier summaries, saves as PDF, and says when a holiday moves it to the next working day; on phones, decisions come right after the Goal count (21 October).</w:t>
       </w:r>
     </w:p>
     <w:p>

</xml_diff>

<commit_message>
Rebuild blueprint Word file; record canvas version 59
Co-Authored-By: Claude Opus 5.5 <noreply@anthropic.com>
</commit_message>
<xml_diff>
--- a/docs/HopFlows_Product_Blueprint_v1.1.docx
+++ b/docs/HopFlows_Product_Blueprint_v1.1.docx
@@ -12830,6 +12830,14 @@
         <w:t xml:space="preserve">, with their own planned, added and finished work.</w:t>
       </w:r>
     </w:p>
+    <w:p>
+      <w:pPr>
+        <w:pStyle w:val="BodyText"/>
+      </w:pPr>
+      <w:r>
+        <w:t xml:space="preserve">Leaders open Reports on the company view: Goal status first, then plan vs. reality by department. Leads open the same reports for their own department.</w:t>
+      </w:r>
+    </w:p>
     <w:bookmarkEnd w:id="2417"/>
     <w:bookmarkStart w:id="2418" w:name="keeping-it-fair"/>
     <w:p>
@@ -20978,6 +20986,18 @@
       </w:pPr>
       <w:r>
         <w:t xml:space="preserve">After the lead-flow review (Proposed): approving leave first shows its effect on the person’s week and lets the approver give away or move the Tasks due then; locking a week warns about leave requests still waiting but allows the lock; Handover warns when a receiver is on leave (20 October).</w:t>
+      </w:r>
+    </w:p>
+    <w:p>
+      <w:pPr>
+        <w:pStyle w:val="Compact"/>
+        <w:numPr>
+          <w:ilvl w:val="0"/>
+          <w:numId w:val="1045"/>
+        </w:numPr>
+      </w:pPr>
+      <w:r>
+        <w:t xml:space="preserve">After the third pass on the leader flow (Proposed): a leader’s Reports opens the company view; on a Goal’s page, Update result shows the new percentage before saving and Set flag uses the same reason types as Deliverables, both with Undo (21 October).</w:t>
       </w:r>
     </w:p>
     <w:p>

</xml_diff>

<commit_message>
Rebuild blueprint Word file; record canvas version 60
Co-Authored-By: Claude Opus 5.5 <noreply@anthropic.com>
</commit_message>
<xml_diff>
--- a/docs/HopFlows_Product_Blueprint_v1.1.docx
+++ b/docs/HopFlows_Product_Blueprint_v1.1.docx
@@ -6312,6 +6312,12 @@
       <w:r>
         <w:t xml:space="preserve">If a flag isn’t looked at for a while (see §14), the lead is asked to confirm or clear it. Flagged items appear in the weekly review.</w:t>
       </w:r>
+      <w:r>
+        <w:t xml:space="preserve"> </w:t>
+      </w:r>
+      <w:r>
+        <w:t xml:space="preserve">A flag on a Goal or its Deliverables that stays open for 3 weeks also goes to leaders as a decision, with choices such as lending people, moving the date or waiting. The answer goes to the owner, and the flag stays until they update the plan.</w:t>
+      </w:r>
     </w:p>
     <w:p>
       <w:pPr>
@@ -7059,7 +7065,7 @@
         <w:t xml:space="preserve"> </w:t>
       </w:r>
       <w:r>
-        <w:t xml:space="preserve">Each decision opens where it can be made. Decisions waiting are also the first thing on the leader’s Goals page:</w:t>
+        <w:t xml:space="preserve">Every flag line names who to ask. Each decision opens where it can be made. Decisions waiting are also the first thing on the leader’s Goals page:</w:t>
       </w:r>
     </w:p>
     <w:p>
@@ -20986,6 +20992,18 @@
       </w:pPr>
       <w:r>
         <w:t xml:space="preserve">After the lead-flow review (Proposed): approving leave first shows its effect on the person’s week and lets the approver give away or move the Tasks due then; locking a week warns about leave requests still waiting but allows the lock; Handover warns when a receiver is on leave (20 October).</w:t>
+      </w:r>
+    </w:p>
+    <w:p>
+      <w:pPr>
+        <w:pStyle w:val="Compact"/>
+        <w:numPr>
+          <w:ilvl w:val="0"/>
+          <w:numId w:val="1045"/>
+        </w:numPr>
+      </w:pPr>
+      <w:r>
+        <w:t xml:space="preserve">After the second leader-flow review (Proposed): every Goal card and flag line names its owner and who to ask; a flag open 3 weeks becomes a leader decision; approving a Goal shows the department’s current load; a Goal page shows one status pill for its most serious flag and works out pace from the latest result; a leader’s own flag needs a note to set and to clear; each Goal card marks where its result needs to be by now and cards are sorted most serious first (21 October).</w:t>
       </w:r>
     </w:p>
     <w:p>

</xml_diff>

<commit_message>
Rebuild blueprint Word file; record canvas version 61
Co-Authored-By: Claude Opus 5.5 <noreply@anthropic.com>
</commit_message>
<xml_diff>
--- a/docs/HopFlows_Product_Blueprint_v1.1.docx
+++ b/docs/HopFlows_Product_Blueprint_v1.1.docx
@@ -6277,28 +6277,19 @@
         </w:numPr>
       </w:pPr>
       <w:r>
-        <w:t xml:space="preserve">Each Goal shows the most serious flag from itself and its Deliverables. Leaders can filter Goals by flag, product and department, and see the reason and how long the flag has been there. On a Goal’s page the flag shows its reason, note, who set it and when, and the back-on-track date, with a button to ask that person for an update. Whether the result is on pace for its target is shown separately from the flag, so a Goal can read</w:t>
+        <w:t xml:space="preserve">Each Goal shows the most serious flag from itself and its Deliverables. Leaders can filter Goals by flag, product and department, and see the reason and how long the flag has been there. On a Goal’s page the flag shows its reason, note, who set it and when, and the back-on-track date, with a button to ask that person for an update. Whether the result is on pace for its target is shown separately from the flag, in one plain sentence on the Goal card and page, for example</w:t>
       </w:r>
       <w:r>
         <w:t xml:space="preserve"> </w:t>
       </w:r>
       <w:r>
-        <w:t xml:space="preserve">“At risk · delivery”</w:t>
+        <w:t xml:space="preserve">“Result ahead of pace; launch date at risk (payment keys late, back by Fri 23 Oct).”</w:t>
       </w:r>
       <w:r>
         <w:t xml:space="preserve"> </w:t>
       </w:r>
       <w:r>
-        <w:t xml:space="preserve">next to</w:t>
-      </w:r>
-      <w:r>
-        <w:t xml:space="preserve"> </w:t>
-      </w:r>
-      <w:r>
-        <w:t xml:space="preserve">“Result ahead of pace”</w:t>
-      </w:r>
-      <w:r>
-        <w:t xml:space="preserve">.</w:t>
+        <w:t xml:space="preserve">When a Goal has more than one open flag, its page lists them all, most serious first, each with its own Ask or Clear.</w:t>
       </w:r>
     </w:p>
     <w:p>
@@ -20992,6 +20983,18 @@
       </w:pPr>
       <w:r>
         <w:t xml:space="preserve">After the lead-flow review (Proposed): approving leave first shows its effect on the person’s week and lets the approver give away or move the Tasks due then; locking a week warns about leave requests still waiting but allows the lock; Handover warns when a receiver is on leave (20 October).</w:t>
+      </w:r>
+    </w:p>
+    <w:p>
+      <w:pPr>
+        <w:pStyle w:val="Compact"/>
+        <w:numPr>
+          <w:ilvl w:val="0"/>
+          <w:numId w:val="1045"/>
+        </w:numPr>
+      </w:pPr>
+      <w:r>
+        <w:t xml:space="preserve">After the third leader-flow review (Proposed): each Goal gets one verdict sentence instead of two coloured pills; a Goal page lists all open flags, including the leader’s own, with their notes; Escape closes panels, and clearing a flag or asking for an update can be undone (21 October).</w:t>
       </w:r>
     </w:p>
     <w:p>

</xml_diff>

<commit_message>
Rebuild blueprint Word file; record canvas version 62
Co-Authored-By: Claude Opus 5.5 <noreply@anthropic.com>
</commit_message>
<xml_diff>
--- a/docs/HopFlows_Product_Blueprint_v1.1.docx
+++ b/docs/HopFlows_Product_Blueprint_v1.1.docx
@@ -20983,6 +20983,18 @@
       </w:pPr>
       <w:r>
         <w:t xml:space="preserve">After the lead-flow review (Proposed): approving leave first shows its effect on the person’s week and lets the approver give away or move the Tasks due then; locking a week warns about leave requests still waiting but allows the lock; Handover warns when a receiver is on leave (20 October).</w:t>
+      </w:r>
+    </w:p>
+    <w:p>
+      <w:pPr>
+        <w:pStyle w:val="Compact"/>
+        <w:numPr>
+          <w:ilvl w:val="0"/>
+          <w:numId w:val="1045"/>
+        </w:numPr>
+      </w:pPr>
+      <w:r>
+        <w:t xml:space="preserve">Leader-flow P2 pass (Proposed): Company reports picks a week and shows locked, done, not done, cancelled, added and reassigned work by department, and the Goal table shows done vs needed, owner and who to ask; on phones, report rows stack as cards, and Goal filters sit with the Goal list so decisions come first (21 October).</w:t>
       </w:r>
     </w:p>
     <w:p>

</xml_diff>

<commit_message>
Rebuild blueprint Word file; record canvas version 64
Co-Authored-By: Claude Opus 5.5 <noreply@anthropic.com>
</commit_message>
<xml_diff>
--- a/docs/HopFlows_Product_Blueprint_v1.1.docx
+++ b/docs/HopFlows_Product_Blueprint_v1.1.docx
@@ -7080,7 +7080,7 @@
         </w:numPr>
       </w:pPr>
       <w:r>
-        <w:t xml:space="preserve">For a date-or-scope question, the leader sees both choices and what each one changes. The answer goes to the person who asked, and the risk flag stays until they update the plan.</w:t>
+        <w:t xml:space="preserve">For a date-or-scope question, the leader sees both choices and what each one changes, for the Deliverable and for its Goal (for example how many pilot schools by the Goal’s end date). A choice that moves people says how much free time the lending department has. The answer goes to the person who asked, and the risk flag stays until they update the plan.</w:t>
       </w:r>
     </w:p>
     <w:p>
@@ -20983,6 +20983,18 @@
       </w:pPr>
       <w:r>
         <w:t xml:space="preserve">After the lead-flow review (Proposed): approving leave first shows its effect on the person’s week and lets the approver give away or move the Tasks due then; locking a week warns about leave requests still waiting but allows the lock; Handover warns when a receiver is on leave (20 October).</w:t>
+      </w:r>
+    </w:p>
+    <w:p>
+      <w:pPr>
+        <w:pStyle w:val="Compact"/>
+        <w:numPr>
+          <w:ilvl w:val="0"/>
+          <w:numId w:val="1045"/>
+        </w:numPr>
+      </w:pPr>
+      <w:r>
+        <w:t xml:space="preserve">After the fourth leader-flow review (Proposed): each decision option shows its effect on the Goal; Goal cards show who set a flag, how long it has been open and its back-on-track date; one term, surprise work, is used everywhere; choice groups work with arrow keys and Escape closes decision panels (21 October).</w:t>
       </w:r>
     </w:p>
     <w:p>

</xml_diff>

<commit_message>
Rebuild blueprint Word file; record canvas version 65
Co-Authored-By: Claude Opus 5.5 <noreply@anthropic.com>
</commit_message>
<xml_diff>
--- a/docs/HopFlows_Product_Blueprint_v1.1.docx
+++ b/docs/HopFlows_Product_Blueprint_v1.1.docx
@@ -20983,6 +20983,18 @@
       </w:pPr>
       <w:r>
         <w:t xml:space="preserve">After the lead-flow review (Proposed): approving leave first shows its effect on the person’s week and lets the approver give away or move the Tasks due then; locking a week warns about leave requests still waiting but allows the lock; Handover warns when a receiver is on leave (20 October).</w:t>
+      </w:r>
+    </w:p>
+    <w:p>
+      <w:pPr>
+        <w:pStyle w:val="Compact"/>
+        <w:numPr>
+          <w:ilvl w:val="0"/>
+          <w:numId w:val="1045"/>
+        </w:numPr>
+      </w:pPr>
+      <w:r>
+        <w:t xml:space="preserve">Company reports trend (Proposed): leaders see surprise work and work done for each department over the last three weeks side by side, with the change since the first week and a way to ask the department lead about it (21 October).</w:t>
       </w:r>
     </w:p>
     <w:p>

</xml_diff>

<commit_message>
Rebuild blueprint Word file; record canvas version 66
Co-Authored-By: Claude Opus 5.5 <noreply@anthropic.com>
</commit_message>
<xml_diff>
--- a/docs/HopFlows_Product_Blueprint_v1.1.docx
+++ b/docs/HopFlows_Product_Blueprint_v1.1.docx
@@ -7068,7 +7068,31 @@
         </w:numPr>
       </w:pPr>
       <w:r>
-        <w:t xml:space="preserve">To approve a Goal, the leader sees its result, date, product, planned Deliverables and the proposer’s note, then picks Approve or Send back with a note.</w:t>
+        <w:t xml:space="preserve">To approve a Goal, the leader sees its result, date, product, planned Deliverables, the proposer’s note and the effect on the department that will do the work. When that department is over its buffer, Send back is suggested.</w:t>
+      </w:r>
+    </w:p>
+    <w:p>
+      <w:pPr>
+        <w:pStyle w:val="Compact"/>
+        <w:numPr>
+          <w:ilvl w:val="1"/>
+          <w:numId w:val="1026"/>
+        </w:numPr>
+      </w:pPr>
+      <w:r>
+        <w:t xml:space="preserve">An answer goes to everyone it affects: the Deliverable lead, the Goal owner, and any lead whose people are lent.</w:t>
+      </w:r>
+    </w:p>
+    <w:p>
+      <w:pPr>
+        <w:pStyle w:val="Compact"/>
+        <w:numPr>
+          <w:ilvl w:val="1"/>
+          <w:numId w:val="1026"/>
+        </w:numPr>
+      </w:pPr>
+      <w:r>
+        <w:t xml:space="preserve">In the summary, each Goal line uses the same verdict as the Goal card, and each waiting decision shows a one-line preview of its effects.</w:t>
       </w:r>
     </w:p>
     <w:p>
@@ -20983,6 +21007,18 @@
       </w:pPr>
       <w:r>
         <w:t xml:space="preserve">After the lead-flow review (Proposed): approving leave first shows its effect on the person’s week and lets the approver give away or move the Tasks due then; locking a week warns about leave requests still waiting but allows the lock; Handover warns when a receiver is on leave (20 October).</w:t>
+      </w:r>
+    </w:p>
+    <w:p>
+      <w:pPr>
+        <w:pStyle w:val="Compact"/>
+        <w:numPr>
+          <w:ilvl w:val="0"/>
+          <w:numId w:val="1045"/>
+        </w:numPr>
+      </w:pPr>
+      <w:r>
+        <w:t xml:space="preserve">After the fifth leader-flow review (Proposed): approving a Goal shows the effect on the department and suggests Send back when it is over its buffer; decisions go to every lead and owner they affect, and a date-or-scope question can also lower the target with the Goal owner’s agreement; the weekly summary shows the pace verdict for each Goal and an effect preview for each decision (22 October).</w:t>
       </w:r>
     </w:p>
     <w:p>

</xml_diff>

<commit_message>
Rebuild blueprint Word file; record canvas version 67
Co-Authored-By: Claude Opus 5.5 <noreply@anthropic.com>
</commit_message>
<xml_diff>
--- a/docs/HopFlows_Product_Blueprint_v1.1.docx
+++ b/docs/HopFlows_Product_Blueprint_v1.1.docx
@@ -2890,6 +2890,18 @@
       </w:pPr>
       <w:r>
         <w:t xml:space="preserve">A person can withdraw a leave request while it is waiting for approval. (Proposed)</w:t>
+      </w:r>
+    </w:p>
+    <w:p>
+      <w:pPr>
+        <w:pStyle w:val="Compact"/>
+        <w:numPr>
+          <w:ilvl w:val="0"/>
+          <w:numId w:val="1009"/>
+        </w:numPr>
+      </w:pPr>
+      <w:r>
+        <w:t xml:space="preserve">While a request waits, the person sees what it changes in the same numbers their lead plans with: next week’s time to plan and planned hours, which Tasks the lead is moving, and which Tasks due during the leave still need a new date or owner. Each such Task can be moved or handed to the lead to give away. (Proposed)</w:t>
       </w:r>
     </w:p>
     <w:p>
@@ -21007,6 +21019,18 @@
       </w:pPr>
       <w:r>
         <w:t xml:space="preserve">After the lead-flow review (Proposed): approving leave first shows its effect on the person’s week and lets the approver give away or move the Tasks due then; locking a week warns about leave requests still waiting but allows the lock; Handover warns when a receiver is on leave (20 October).</w:t>
+      </w:r>
+    </w:p>
+    <w:p>
+      <w:pPr>
+        <w:pStyle w:val="Compact"/>
+        <w:numPr>
+          <w:ilvl w:val="0"/>
+          <w:numId w:val="1045"/>
+        </w:numPr>
+      </w:pPr>
+      <w:r>
+        <w:t xml:space="preserve">After the first employee-flow review (Proposed): an employee sees what their leave changes to next week’s plan and can move or hand away Tasks due during it; leave requests, help requests, new routines and Add Work all confirm what was sent, with Undo; dialogs keep keyboard focus inside and close with Escape (22 October).</w:t>
       </w:r>
     </w:p>
     <w:p>

</xml_diff>

<commit_message>
Rebuild blueprint Word file; record canvas version 68
Co-Authored-By: Claude Opus 5.5 <noreply@anthropic.com>
</commit_message>
<xml_diff>
--- a/docs/HopFlows_Product_Blueprint_v1.1.docx
+++ b/docs/HopFlows_Product_Blueprint_v1.1.docx
@@ -4754,6 +4754,14 @@
         <w:pStyle w:val="BodyText"/>
       </w:pPr>
       <w:r>
+        <w:t xml:space="preserve">If the owner sends a Task to Review with a checklist step still unticked, HopFlows names the step and asks first: keep working, or send anyway. Sending to Review can be undone until the reviewer opens it. (Proposed)</w:t>
+      </w:r>
+    </w:p>
+    <w:p>
+      <w:pPr>
+        <w:pStyle w:val="BodyText"/>
+      </w:pPr>
+      <w:r>
         <w:t xml:space="preserve">A repeating daily task (routine) follows the same steps, plus one more ending: Missed. It is set automatically when the time to do it runs out. A Missed routine can’t be reopened; the next day starts fresh.</w:t>
       </w:r>
     </w:p>
@@ -4771,7 +4779,7 @@
               <a:graphicData uri="http://schemas.openxmlformats.org/drawingml/2006/picture">
                 <pic:pic>
                   <pic:nvPicPr>
-                    <pic:cNvPr descr="/private/tmp/claude-502/-Users-keanghok-Desktop-work-startup-hopflows-docs/3d393b65-89b1-46eb-9486-b2f325668eb0/scratchpad/docx/media/media/rId2195.png" id="2345" name="Picture"/>
+                    <pic:cNvPr descr="media/media/rId2195.png" id="2345" name="Picture"/>
                     <pic:cNvPicPr>
                       <a:picLocks noChangeArrowheads="1" noChangeAspect="1"/>
                     </pic:cNvPicPr>
@@ -5547,7 +5555,7 @@
               <a:graphicData uri="http://schemas.openxmlformats.org/drawingml/2006/picture">
                 <pic:pic>
                   <pic:nvPicPr>
-                    <pic:cNvPr descr="/private/tmp/claude-502/-Users-keanghok-Desktop-work-startup-hopflows-docs/3d393b65-89b1-46eb-9486-b2f325668eb0/scratchpad/docx/media/media/rId2206.png" id="2356" name="Picture"/>
+                    <pic:cNvPr descr="media/media/rId2206.png" id="2356" name="Picture"/>
                     <pic:cNvPicPr>
                       <a:picLocks noChangeArrowheads="1" noChangeAspect="1"/>
                     </pic:cNvPicPr>
@@ -5715,7 +5723,7 @@
               <a:graphicData uri="http://schemas.openxmlformats.org/drawingml/2006/picture">
                 <pic:pic>
                   <pic:nvPicPr>
-                    <pic:cNvPr descr="/private/tmp/claude-502/-Users-keanghok-Desktop-work-startup-hopflows-docs/3d393b65-89b1-46eb-9486-b2f325668eb0/scratchpad/docx/media/media/rId2209.png" id="2359" name="Picture"/>
+                    <pic:cNvPr descr="media/media/rId2209.png" id="2359" name="Picture"/>
                     <pic:cNvPicPr>
                       <a:picLocks noChangeArrowheads="1" noChangeAspect="1"/>
                     </pic:cNvPicPr>
@@ -5929,7 +5937,7 @@
               <a:graphicData uri="http://schemas.openxmlformats.org/drawingml/2006/picture">
                 <pic:pic>
                   <pic:nvPicPr>
-                    <pic:cNvPr descr="/private/tmp/claude-502/-Users-keanghok-Desktop-work-startup-hopflows-docs/3d393b65-89b1-46eb-9486-b2f325668eb0/scratchpad/docx/media/media/rId2213.png" id="2363" name="Picture"/>
+                    <pic:cNvPr descr="media/media/rId2213.png" id="2363" name="Picture"/>
                     <pic:cNvPicPr>
                       <a:picLocks noChangeArrowheads="1" noChangeAspect="1"/>
                     </pic:cNvPicPr>
@@ -6010,7 +6018,7 @@
               <a:graphicData uri="http://schemas.openxmlformats.org/drawingml/2006/picture">
                 <pic:pic>
                   <pic:nvPicPr>
-                    <pic:cNvPr descr="/private/tmp/claude-502/-Users-keanghok-Desktop-work-startup-hopflows-docs/3d393b65-89b1-46eb-9486-b2f325668eb0/scratchpad/docx/media/media/rId2217.png" id="2367" name="Picture"/>
+                    <pic:cNvPr descr="media/media/rId2217.png" id="2367" name="Picture"/>
                     <pic:cNvPicPr>
                       <a:picLocks noChangeArrowheads="1" noChangeAspect="1"/>
                     </pic:cNvPicPr>
@@ -6197,7 +6205,7 @@
               <a:graphicData uri="http://schemas.openxmlformats.org/drawingml/2006/picture">
                 <pic:pic>
                   <pic:nvPicPr>
-                    <pic:cNvPr descr="/private/tmp/claude-502/-Users-keanghok-Desktop-work-startup-hopflows-docs/3d393b65-89b1-46eb-9486-b2f325668eb0/scratchpad/docx/media/media/rId2221.png" id="2371" name="Picture"/>
+                    <pic:cNvPr descr="media/media/rId2221.png" id="2371" name="Picture"/>
                     <pic:cNvPicPr>
                       <a:picLocks noChangeArrowheads="1" noChangeAspect="1"/>
                     </pic:cNvPicPr>
@@ -6348,7 +6356,7 @@
               <a:graphicData uri="http://schemas.openxmlformats.org/drawingml/2006/picture">
                 <pic:pic>
                   <pic:nvPicPr>
-                    <pic:cNvPr descr="/private/tmp/claude-502/-Users-keanghok-Desktop-work-startup-hopflows-docs/3d393b65-89b1-46eb-9486-b2f325668eb0/scratchpad/docx/media/media/rId2225.png" id="2375" name="Picture"/>
+                    <pic:cNvPr descr="media/media/rId2225.png" id="2375" name="Picture"/>
                     <pic:cNvPicPr>
                       <a:picLocks noChangeArrowheads="1" noChangeAspect="1"/>
                     </pic:cNvPicPr>
@@ -6541,7 +6549,7 @@
               <a:graphicData uri="http://schemas.openxmlformats.org/drawingml/2006/picture">
                 <pic:pic>
                   <pic:nvPicPr>
-                    <pic:cNvPr descr="/private/tmp/claude-502/-Users-keanghok-Desktop-work-startup-hopflows-docs/3d393b65-89b1-46eb-9486-b2f325668eb0/scratchpad/docx/media/media/rId2229.png" id="2379" name="Picture"/>
+                    <pic:cNvPr descr="media/media/rId2229.png" id="2379" name="Picture"/>
                     <pic:cNvPicPr>
                       <a:picLocks noChangeArrowheads="1" noChangeAspect="1"/>
                     </pic:cNvPicPr>
@@ -6686,7 +6694,7 @@
               <a:graphicData uri="http://schemas.openxmlformats.org/drawingml/2006/picture">
                 <pic:pic>
                   <pic:nvPicPr>
-                    <pic:cNvPr descr="/private/tmp/claude-502/-Users-keanghok-Desktop-work-startup-hopflows-docs/3d393b65-89b1-46eb-9486-b2f325668eb0/scratchpad/docx/media/media/rId2233.png" id="2383" name="Picture"/>
+                    <pic:cNvPr descr="media/media/rId2233.png" id="2383" name="Picture"/>
                     <pic:cNvPicPr>
                       <a:picLocks noChangeArrowheads="1" noChangeAspect="1"/>
                     </pic:cNvPicPr>
@@ -6828,7 +6836,7 @@
               <a:graphicData uri="http://schemas.openxmlformats.org/drawingml/2006/picture">
                 <pic:pic>
                   <pic:nvPicPr>
-                    <pic:cNvPr descr="/private/tmp/claude-502/-Users-keanghok-Desktop-work-startup-hopflows-docs/3d393b65-89b1-46eb-9486-b2f325668eb0/scratchpad/docx/media/media/rId2237.png" id="2387" name="Picture"/>
+                    <pic:cNvPr descr="media/media/rId2237.png" id="2387" name="Picture"/>
                     <pic:cNvPicPr>
                       <a:picLocks noChangeArrowheads="1" noChangeAspect="1"/>
                     </pic:cNvPicPr>
@@ -6970,7 +6978,7 @@
               <a:graphicData uri="http://schemas.openxmlformats.org/drawingml/2006/picture">
                 <pic:pic>
                   <pic:nvPicPr>
-                    <pic:cNvPr descr="/private/tmp/claude-502/-Users-keanghok-Desktop-work-startup-hopflows-docs/3d393b65-89b1-46eb-9486-b2f325668eb0/scratchpad/docx/media/media/rId2241.png" id="2391" name="Picture"/>
+                    <pic:cNvPr descr="media/media/rId2241.png" id="2391" name="Picture"/>
                     <pic:cNvPicPr>
                       <a:picLocks noChangeArrowheads="1" noChangeAspect="1"/>
                     </pic:cNvPicPr>
@@ -7157,7 +7165,7 @@
               <a:graphicData uri="http://schemas.openxmlformats.org/drawingml/2006/picture">
                 <pic:pic>
                   <pic:nvPicPr>
-                    <pic:cNvPr descr="/private/tmp/claude-502/-Users-keanghok-Desktop-work-startup-hopflows-docs/3d393b65-89b1-46eb-9486-b2f325668eb0/scratchpad/docx/media/media/rId2245.png" id="2395" name="Picture"/>
+                    <pic:cNvPr descr="media/media/rId2245.png" id="2395" name="Picture"/>
                     <pic:cNvPicPr>
                       <a:picLocks noChangeArrowheads="1" noChangeAspect="1"/>
                     </pic:cNvPicPr>
@@ -7698,6 +7706,42 @@
         </w:numPr>
       </w:pPr>
       <w:r>
+        <w:t xml:space="preserve">Today has one way to the rest of the work: the short</w:t>
+      </w:r>
+      <w:r>
+        <w:t xml:space="preserve"> </w:t>
+      </w:r>
+      <w:r>
+        <w:t xml:space="preserve">“Beyond your Top 3”</w:t>
+      </w:r>
+      <w:r>
+        <w:t xml:space="preserve"> </w:t>
+      </w:r>
+      <w:r>
+        <w:t xml:space="preserve">list and its</w:t>
+      </w:r>
+      <w:r>
+        <w:t xml:space="preserve"> </w:t>
+      </w:r>
+      <w:r>
+        <w:t xml:space="preserve">“View all my tasks”</w:t>
+      </w:r>
+      <w:r>
+        <w:t xml:space="preserve"> </w:t>
+      </w:r>
+      <w:r>
+        <w:t xml:space="preserve">link. Add Work stays in the top bar (and the middle button on mobile), not repeated on the page. (Proposed)</w:t>
+      </w:r>
+    </w:p>
+    <w:p>
+      <w:pPr>
+        <w:pStyle w:val="Compact"/>
+        <w:numPr>
+          <w:ilvl w:val="0"/>
+          <w:numId w:val="1027"/>
+        </w:numPr>
+      </w:pPr>
+      <w:r>
         <w:t xml:space="preserve">Routine work never competes with the top three priorities. It sits in its own folded</w:t>
       </w:r>
       <w:r>
@@ -8287,7 +8331,7 @@
               <a:graphicData uri="http://schemas.openxmlformats.org/drawingml/2006/picture">
                 <pic:pic>
                   <pic:nvPicPr>
-                    <pic:cNvPr descr="/private/tmp/claude-502/-Users-keanghok-Desktop-work-startup-hopflows-docs/3d393b65-89b1-46eb-9486-b2f325668eb0/scratchpad/docx/media/media/rId2252.png" id="2402" name="Picture"/>
+                    <pic:cNvPr descr="media/media/rId2252.png" id="2402" name="Picture"/>
                     <pic:cNvPicPr>
                       <a:picLocks noChangeArrowheads="1" noChangeAspect="1"/>
                     </pic:cNvPicPr>
@@ -10344,7 +10388,7 @@
               <a:graphicData uri="http://schemas.openxmlformats.org/drawingml/2006/picture">
                 <pic:pic>
                   <pic:nvPicPr>
-                    <pic:cNvPr descr="/private/tmp/claude-502/-Users-keanghok-Desktop-work-startup-hopflows-docs/3d393b65-89b1-46eb-9486-b2f325668eb0/scratchpad/docx/media/media/rId2261.png" id="2411" name="Picture"/>
+                    <pic:cNvPr descr="media/media/rId2261.png" id="2411" name="Picture"/>
                     <pic:cNvPicPr>
                       <a:picLocks noChangeArrowheads="1" noChangeAspect="1"/>
                     </pic:cNvPicPr>
@@ -20478,7 +20522,7 @@
               <a:graphicData uri="http://schemas.openxmlformats.org/drawingml/2006/picture">
                 <pic:pic>
                   <pic:nvPicPr>
-                    <pic:cNvPr descr="/private/tmp/claude-502/-Users-keanghok-Desktop-work-startup-hopflows-docs/3d393b65-89b1-46eb-9486-b2f325668eb0/scratchpad/docx/media/media/rId2307.png" id="2457" name="Picture"/>
+                    <pic:cNvPr descr="media/media/rId2307.png" id="2457" name="Picture"/>
                     <pic:cNvPicPr>
                       <a:picLocks noChangeArrowheads="1" noChangeAspect="1"/>
                     </pic:cNvPicPr>
@@ -21031,6 +21075,18 @@
       </w:pPr>
       <w:r>
         <w:t xml:space="preserve">After the first employee-flow review (Proposed): an employee sees what their leave changes to next week’s plan and can move or hand away Tasks due during it; leave requests, help requests, new routines and Add Work all confirm what was sent, with Undo; dialogs keep keyboard focus inside and close with Escape (22 October).</w:t>
+      </w:r>
+    </w:p>
+    <w:p>
+      <w:pPr>
+        <w:pStyle w:val="Compact"/>
+        <w:numPr>
+          <w:ilvl w:val="0"/>
+          <w:numId w:val="1045"/>
+        </w:numPr>
+      </w:pPr>
+      <w:r>
+        <w:t xml:space="preserve">After the employee-flow P2 fixes (Proposed): sending a Task to Review with an unticked step asks first and can be undone; Today keeps one route to the rest of the work and drops the repeated links; My routines is in the employee menu; on phones the last item on a page clears the bottom navigation (22 October).</w:t>
       </w:r>
     </w:p>
     <w:p>

</xml_diff>

<commit_message>
Sign-in: Google is the main way in on web and phone, email code as fallback; blueprint §15, Figure 17 and Word file updated (canvas version 97)
Co-Authored-By: Claude Opus 5.5 <noreply@anthropic.com>
</commit_message>
<xml_diff>
--- a/docs/HopFlows_Product_Blueprint_v1.1.docx
+++ b/docs/HopFlows_Product_Blueprint_v1.1.docx
@@ -20457,7 +20457,19 @@
         </w:numPr>
       </w:pPr>
       <w:r>
-        <w:t xml:space="preserve">In the first version, people sign in with an email code or a Google account. Company single sign-on (SSO) comes in a later stage.</w:t>
+        <w:t xml:space="preserve">In the first version, Google is the main way to sign in: “Continue with Google” is the first and largest button on the web and phone sign-in screens. People without a Google work account sign in with a one-time code sent to their email instead. Company single sign-on (SSO) comes in a later stage.</w:t>
+      </w:r>
+    </w:p>
+    <w:p>
+      <w:pPr>
+        <w:pStyle w:val="Compact"/>
+        <w:numPr>
+          <w:ilvl w:val="0"/>
+          <w:numId w:val="1041"/>
+        </w:numPr>
+      </w:pPr>
+      <w:r>
+        <w:t xml:space="preserve">An invited person signs in with the Google account, or the email, the invite was sent to; a Google account with a different email does not join the company.</w:t>
       </w:r>
     </w:p>
     <w:p>
@@ -21075,6 +21087,18 @@
       </w:pPr>
       <w:r>
         <w:t xml:space="preserve">After the first employee-flow review (Proposed): an employee sees what their leave changes to next week’s plan and can move or hand away Tasks due during it; leave requests, help requests, new routines and Add Work all confirm what was sent, with Undo; dialogs keep keyboard focus inside and close with Escape (22 October).</w:t>
+      </w:r>
+    </w:p>
+    <w:p>
+      <w:pPr>
+        <w:pStyle w:val="Compact"/>
+        <w:numPr>
+          <w:ilvl w:val="0"/>
+          <w:numId w:val="1045"/>
+        </w:numPr>
+      </w:pPr>
+      <w:r>
+        <w:t xml:space="preserve">Google sign-in first (Proposed): “Continue with Google” is the main sign-in on web and phone; a one-time email code is the fallback for people without a Google work account (27 October).</w:t>
       </w:r>
     </w:p>
     <w:p>

</xml_diff>